<commit_message>
Revisi Draf BAB 1
</commit_message>
<xml_diff>
--- a/BAB I Skripsi draf.docx
+++ b/BAB I Skripsi draf.docx
@@ -163,7 +163,21 @@
           <w:rFonts w:ascii="Times New Roman" w:hAnsi="Times New Roman" w:cs="Times New Roman"/>
           <w:lang w:val="sv-SE"/>
         </w:rPr>
-        <w:t>Diajukan untuk memenuhi syarat untuk memperoleh gelar Sarjana Teknik Elektr</w:t>
+        <w:t xml:space="preserve">Diajukan untuk memenuhi </w:t>
+      </w:r>
+      <w:r>
+        <w:rPr>
+          <w:rFonts w:ascii="Times New Roman" w:hAnsi="Times New Roman" w:cs="Times New Roman"/>
+          <w:lang w:val="sv-SE"/>
+        </w:rPr>
+        <w:t xml:space="preserve">salah satu </w:t>
+      </w:r>
+      <w:r>
+        <w:rPr>
+          <w:rFonts w:ascii="Times New Roman" w:hAnsi="Times New Roman" w:cs="Times New Roman"/>
+          <w:lang w:val="sv-SE"/>
+        </w:rPr>
+        <w:t>syarat untuk memperoleh gelar Sarjana Teknik Elektr</w:t>
       </w:r>
       <w:r>
         <w:rPr>
@@ -206,9 +220,9 @@
           <w:lang w:val="sv-SE"/>
         </w:rPr>
         <w:drawing>
-          <wp:inline distT="0" distB="0" distL="0" distR="0" wp14:anchorId="7983DE2D" wp14:editId="4D450920">
-            <wp:extent cx="2142699" cy="2142699"/>
-            <wp:effectExtent l="0" t="0" r="0" b="0"/>
+          <wp:inline distT="0" distB="0" distL="0" distR="0" wp14:anchorId="7983DE2D" wp14:editId="2AE969DF">
+            <wp:extent cx="1842447" cy="1842447"/>
+            <wp:effectExtent l="0" t="0" r="5715" b="0"/>
             <wp:docPr id="95934836" name="Picture 1"/>
             <wp:cNvGraphicFramePr>
               <a:graphicFrameLocks xmlns:a="http://schemas.openxmlformats.org/drawingml/2006/main" noChangeAspect="1"/>
@@ -221,7 +235,7 @@
                     <pic:cNvPicPr/>
                   </pic:nvPicPr>
                   <pic:blipFill>
-                    <a:blip r:embed="rId5" cstate="print">
+                    <a:blip r:embed="rId8" cstate="print">
                       <a:extLst>
                         <a:ext uri="{28A0092B-C50C-407E-A947-70E740481C1C}">
                           <a14:useLocalDpi xmlns:a14="http://schemas.microsoft.com/office/drawing/2010/main" val="0"/>
@@ -235,7 +249,7 @@
                   <pic:spPr>
                     <a:xfrm>
                       <a:off x="0" y="0"/>
-                      <a:ext cx="2157944" cy="2157944"/>
+                      <a:ext cx="1864178" cy="1864178"/>
                     </a:xfrm>
                     <a:prstGeom prst="rect">
                       <a:avLst/>
@@ -254,15 +268,21 @@
         <w:jc w:val="center"/>
         <w:rPr>
           <w:rFonts w:ascii="Times New Roman" w:hAnsi="Times New Roman" w:cs="Times New Roman"/>
-          <w:lang w:val="sv-SE"/>
-        </w:rPr>
-      </w:pPr>
-      <w:r>
-        <w:rPr>
-          <w:rFonts w:ascii="Times New Roman" w:hAnsi="Times New Roman" w:cs="Times New Roman"/>
-          <w:lang w:val="sv-SE"/>
-        </w:rPr>
-        <w:t>Disusun Oleh:</w:t>
+        </w:rPr>
+      </w:pPr>
+      <w:proofErr w:type="spellStart"/>
+      <w:r>
+        <w:rPr>
+          <w:rFonts w:ascii="Times New Roman" w:hAnsi="Times New Roman" w:cs="Times New Roman"/>
+        </w:rPr>
+        <w:t>Disusun</w:t>
+      </w:r>
+      <w:proofErr w:type="spellEnd"/>
+      <w:r>
+        <w:rPr>
+          <w:rFonts w:ascii="Times New Roman" w:hAnsi="Times New Roman" w:cs="Times New Roman"/>
+        </w:rPr>
+        <w:t xml:space="preserve"> Oleh:</w:t>
       </w:r>
     </w:p>
     <w:p>
@@ -273,7 +293,6 @@
           <w:rFonts w:ascii="Times New Roman" w:hAnsi="Times New Roman" w:cs="Times New Roman"/>
           <w:b/>
           <w:bCs/>
-          <w:lang w:val="sv-SE"/>
         </w:rPr>
       </w:pPr>
       <w:r>
@@ -281,7 +300,6 @@
           <w:rFonts w:ascii="Times New Roman" w:hAnsi="Times New Roman" w:cs="Times New Roman"/>
           <w:b/>
           <w:bCs/>
-          <w:lang w:val="sv-SE"/>
         </w:rPr>
         <w:t>Ridho Ismail Nurpalah</w:t>
       </w:r>
@@ -294,7 +312,6 @@
           <w:rFonts w:ascii="Times New Roman" w:hAnsi="Times New Roman" w:cs="Times New Roman"/>
           <w:b/>
           <w:bCs/>
-          <w:lang w:val="sv-SE"/>
         </w:rPr>
       </w:pPr>
       <w:r>
@@ -302,7 +319,6 @@
           <w:rFonts w:ascii="Times New Roman" w:hAnsi="Times New Roman" w:cs="Times New Roman"/>
           <w:b/>
           <w:bCs/>
-          <w:lang w:val="sv-SE"/>
         </w:rPr>
         <w:t>E.5051.2209466</w:t>
       </w:r>
@@ -315,7 +331,6 @@
           <w:rFonts w:ascii="Times New Roman" w:hAnsi="Times New Roman" w:cs="Times New Roman"/>
           <w:b/>
           <w:bCs/>
-          <w:lang w:val="sv-SE"/>
         </w:rPr>
       </w:pPr>
     </w:p>
@@ -433,6 +448,23 @@
         <w:rPr>
           <w:lang w:val="sv-SE"/>
         </w:rPr>
+        <w:sectPr>
+          <w:pgSz w:w="11906" w:h="16838" w:code="9"/>
+          <w:pgMar w:top="2268" w:right="1701" w:bottom="1701" w:left="2268" w:header="720" w:footer="720" w:gutter="0"/>
+          <w:cols w:space="720"/>
+          <w:docGrid w:linePitch="360"/>
+        </w:sectPr>
+      </w:pPr>
+    </w:p>
+    <w:p>
+      <w:pPr>
+        <w:pStyle w:val="Heading1"/>
+        <w:spacing w:line="360" w:lineRule="auto"/>
+        <w:ind w:left="0" w:firstLine="0"/>
+        <w:jc w:val="center"/>
+        <w:rPr>
+          <w:lang w:val="sv-SE"/>
+        </w:rPr>
       </w:pPr>
       <w:r>
         <w:rPr>
@@ -449,11 +481,15 @@
         <w:spacing w:line="360" w:lineRule="auto"/>
         <w:ind w:hanging="720"/>
         <w:rPr>
-          <w:lang w:val="sv-SE"/>
-        </w:rPr>
-      </w:pPr>
-      <w:r>
-        <w:rPr>
+          <w:sz w:val="24"/>
+          <w:szCs w:val="28"/>
+          <w:lang w:val="sv-SE"/>
+        </w:rPr>
+      </w:pPr>
+      <w:r>
+        <w:rPr>
+          <w:sz w:val="24"/>
+          <w:szCs w:val="28"/>
           <w:lang w:val="sv-SE"/>
         </w:rPr>
         <w:t>Latar Belakang</w:t>
@@ -765,7 +801,15 @@
           <w:rFonts w:ascii="Times New Roman" w:hAnsi="Times New Roman" w:cs="Times New Roman"/>
           <w:lang w:val="sv-SE"/>
         </w:rPr>
-        <w:t>adar otomotif pada umumnya beroperasi pada pita frekuensi gelombang mikro seperti 24 GHz dan 77 GHz yang memungkinkan sistem radar memiliki resolusi jarak yang tinggi serta ukuran perangkat yang relatif kecil sehingga dapat dengan mudah diintegrasikan pada kendaraan</w:t>
+        <w:t xml:space="preserve">adar otomotif pada umumnya beroperasi pada pita frekuensi gelombang mikro seperti 24 GHz dan 77 GHz yang memungkinkan sistem radar memiliki resolusi jarak yang tinggi serta ukuran perangkat yang relatif kecil sehingga dapat </w:t>
+      </w:r>
+      <w:r>
+        <w:rPr>
+          <w:rFonts w:ascii="Times New Roman" w:hAnsi="Times New Roman" w:cs="Times New Roman"/>
+          <w:lang w:val="sv-SE"/>
+        </w:rPr>
+        <w:lastRenderedPageBreak/>
+        <w:t>dengan mudah diintegrasikan pada kendaraan</w:t>
       </w:r>
       <w:r>
         <w:rPr>
@@ -800,15 +844,7 @@
           <w:rFonts w:ascii="Times New Roman" w:hAnsi="Times New Roman" w:cs="Times New Roman"/>
           <w:lang w:val="sv-SE"/>
         </w:rPr>
-        <w:t xml:space="preserve">(Hasch dkk., 2012; Patole dkk., </w:t>
-      </w:r>
-      <w:r>
-        <w:rPr>
-          <w:rFonts w:ascii="Times New Roman" w:hAnsi="Times New Roman" w:cs="Times New Roman"/>
-          <w:lang w:val="sv-SE"/>
-        </w:rPr>
-        <w:lastRenderedPageBreak/>
-        <w:t>2017)</w:t>
+        <w:t>(Hasch dkk., 2012; Patole dkk., 2017)</w:t>
       </w:r>
       <w:r>
         <w:rPr>
@@ -1133,14 +1169,7 @@
           <w:rFonts w:ascii="Times New Roman" w:hAnsi="Times New Roman" w:cs="Times New Roman"/>
           <w:lang w:val="sv-SE"/>
         </w:rPr>
-        <w:t xml:space="preserve"> sangat sesuai untuk sistem radar otomotif yang memiliki keterbatasan ruang pemasangan serta membutuhkan performa deteksi yang andal dan efisien</w:t>
-      </w:r>
-      <w:r>
-        <w:rPr>
-          <w:rFonts w:ascii="Times New Roman" w:hAnsi="Times New Roman" w:cs="Times New Roman"/>
-          <w:lang w:val="sv-SE"/>
-        </w:rPr>
-        <w:t>.</w:t>
+        <w:t xml:space="preserve"> sangat sesuai untuk sistem radar otomotif yang memiliki keterbatasan ruang pemasangan serta membutuhkan performa deteksi yang andal dan efisien.</w:t>
       </w:r>
     </w:p>
     <w:p>
@@ -1272,6 +1301,7 @@
       <w:r>
         <w:rPr>
           <w:rFonts w:ascii="Times New Roman" w:hAnsi="Times New Roman" w:cs="Times New Roman"/>
+          <w:lang w:val="sv-SE"/>
         </w:rPr>
         <w:t>(Balanis, 2005; Tseng &amp; Chang, 2019)</w:t>
       </w:r>
@@ -1347,6 +1377,7 @@
           <w:rFonts w:ascii="Times New Roman" w:hAnsi="Times New Roman" w:cs="Times New Roman"/>
           <w:lang w:val="sv-SE"/>
         </w:rPr>
+        <w:lastRenderedPageBreak/>
         <w:fldChar w:fldCharType="begin"/>
       </w:r>
       <w:r>
@@ -1396,15 +1427,7 @@
           <w:rFonts w:ascii="Times New Roman" w:hAnsi="Times New Roman" w:cs="Times New Roman"/>
           <w:lang w:val="sv-SE"/>
         </w:rPr>
-        <w:t xml:space="preserve">Meskipun antena memiliki peran penting dalam </w:t>
-      </w:r>
-      <w:r>
-        <w:rPr>
-          <w:rFonts w:ascii="Times New Roman" w:hAnsi="Times New Roman" w:cs="Times New Roman"/>
-          <w:lang w:val="sv-SE"/>
-        </w:rPr>
-        <w:lastRenderedPageBreak/>
-        <w:t>sistem radar, perancangan antena untuk aplikasi radar frekuensi tinggi tidaklah sederhana. Antena yang digunakan pada sistem radar diharapkan memiliki ukuran yang relatif compact agar dapat diintegrasikan dengan perangkat radar, namun tetap mampu menghasilkan performa radiasi yang baik. Oleh karena itu, perancangan antena radar perlu mempertimbangkan beberapa parameter penting seperti gain yang tinggi, bandwidth yang lebar, serta pola radiasi yang stabil agar sistem radar mampu bekerja secara optimal dalam mendeteksi objek.</w:t>
+        <w:t>Meskipun antena memiliki peran penting dalam sistem radar, perancangan antena untuk aplikasi radar frekuensi tinggi tidaklah sederhana. Antena yang digunakan pada sistem radar diharapkan memiliki ukuran yang relatif compact agar dapat diintegrasikan dengan perangkat radar, namun tetap mampu menghasilkan performa radiasi yang baik. Oleh karena itu, perancangan antena radar perlu mempertimbangkan beberapa parameter penting seperti gain yang tinggi, bandwidth yang lebar, serta pola radiasi yang stabil agar sistem radar mampu bekerja secara optimal dalam mendeteksi objek.</w:t>
       </w:r>
     </w:p>
     <w:p>
@@ -1459,7 +1482,7 @@
           <w:rFonts w:ascii="Times New Roman" w:hAnsi="Times New Roman" w:cs="Times New Roman"/>
           <w:lang w:val="sv-SE"/>
         </w:rPr>
-        <w:instrText xml:space="preserve"> ADDIN ZOTERO_ITEM CSL_CITATION {"citationID":"TTwxcwbr","properties":{"formattedCitation":"(Balanis, 2005; Skolnik, 1986)","plainCitation":"(Balanis, 2005; Skolnik, 1986)","noteIndex":0},"citationItems":[{"id":218,"uris":["http://zotero.org/users/local/GXnJfy3L/items/2FG3RDRU"],"itemData":{"id":218,"type":"book","edition":"3. ed","ISBN":"978-0-471-66782-7","language":"en","number-of-pages":"1117","publisher":"Wiley-Interscience","publisher-place":"Hoboken, N.J","source":"K10plus ISBN","title":"Antenna theory: analysis and design","title-short":"Antenna theory","author":[{"family":"Balanis","given":"Constantine A."}],"issued":{"date-parts":[["2005"]]}}},{"id":173,"uris":["http://zotero.org/users/local/GXnJfy3L/items/F9JKIGYT"],"itemData":{"id":173,"type":"book","edition":"2nd ed., 9th print","ISBN":"978-0-07-057909-5","language":"en","number-of-pages":"581","publisher":"McGraw-Hill","publisher-place":"New York","source":"K10plus ISBN","title":"Introduction to radar systems: international student edition","title-short":"Introduction to radar systems","author":[{"family":"Skolnik","given":"Merrill I."}],"issued":{"date-parts":[["1986"]]}}}],"schema":"https://github.com/citation-style-language/schema/raw/master/csl-citation.json"} </w:instrText>
+        <w:instrText xml:space="preserve"> ADDIN ZOTERO_ITEM CSL_CITATION {"citationID":"eeiNzSGf","properties":{"formattedCitation":"(Balanis, 2005; Skolnik, 1986)","plainCitation":"(Balanis, 2005; Skolnik, 1986)","noteIndex":0},"citationItems":[{"id":218,"uris":["http://zotero.org/users/local/GXnJfy3L/items/2FG3RDRU"],"itemData":{"id":218,"type":"book","edition":"3. ed","ISBN":"978-0-471-66782-7","language":"en","number-of-pages":"1117","publisher":"Wiley-Interscience","publisher-place":"Hoboken, N.J","source":"K10plus ISBN","title":"Antenna theory: analysis and design","title-short":"Antenna theory","author":[{"family":"Balanis","given":"Constantine A."}],"issued":{"date-parts":[["2005"]]}}},{"id":173,"uris":["http://zotero.org/users/local/GXnJfy3L/items/F9JKIGYT"],"itemData":{"id":173,"type":"book","edition":"2nd ed., 9th print","ISBN":"978-0-07-057909-5","language":"en","number-of-pages":"581","publisher":"McGraw-Hill","publisher-place":"New York","source":"K10plus ISBN","title":"Introduction to radar systems: international student edition","title-short":"Introduction to radar systems","author":[{"family":"Skolnik","given":"Merrill I."}],"issued":{"date-parts":[["1986"]]}}}],"schema":"https://github.com/citation-style-language/schema/raw/master/csl-citation.json"} </w:instrText>
       </w:r>
       <w:r>
         <w:rPr>
@@ -1860,7 +1883,15 @@
           <w:rFonts w:ascii="Times New Roman" w:hAnsi="Times New Roman" w:cs="Times New Roman"/>
           <w:lang w:val="sv-SE"/>
         </w:rPr>
-        <w:t xml:space="preserve">eksponensial untuk mengurangi kompleksitas fabrikasi sambil mempertahankan VSWR &lt; 2 pada </w:t>
+        <w:t xml:space="preserve">eksponensial untuk mengurangi kompleksitas fabrikasi sambil mempertahankan </w:t>
+      </w:r>
+      <w:r>
+        <w:rPr>
+          <w:rFonts w:ascii="Times New Roman" w:hAnsi="Times New Roman" w:cs="Times New Roman"/>
+          <w:lang w:val="sv-SE"/>
+        </w:rPr>
+        <w:lastRenderedPageBreak/>
+        <w:t xml:space="preserve">VSWR &lt; 2 pada </w:t>
       </w:r>
       <w:r>
         <w:rPr>
@@ -1876,15 +1907,7 @@
           <w:rFonts w:ascii="Times New Roman" w:hAnsi="Times New Roman" w:cs="Times New Roman"/>
           <w:lang w:val="sv-SE"/>
         </w:rPr>
-        <w:t xml:space="preserve">. Penelitian terbaru oleh Ni dkk. (2023) juga </w:t>
-      </w:r>
-      <w:r>
-        <w:rPr>
-          <w:rFonts w:ascii="Times New Roman" w:hAnsi="Times New Roman" w:cs="Times New Roman"/>
-          <w:lang w:val="sv-SE"/>
-        </w:rPr>
-        <w:lastRenderedPageBreak/>
-        <w:t xml:space="preserve">mengembangkan </w:t>
+        <w:t xml:space="preserve">. Penelitian terbaru oleh Ni dkk. (2023) juga mengembangkan </w:t>
       </w:r>
       <w:r>
         <w:rPr>
@@ -2080,7 +2103,53 @@
           <w:rFonts w:ascii="Times New Roman" w:hAnsi="Times New Roman" w:cs="Times New Roman"/>
           <w:lang w:val="sv-SE"/>
         </w:rPr>
-        <w:t xml:space="preserve">Meskipun Tapered Slot Antenna (TSA) telah banyak digunakan dan diteliti untuk berbagai aplikasi radar frekuensi tinggi, beberapa keterbatasan teknis masih ditemukan dalam implementasinya, khususnya ketika antena dioperasikan pada frekuensi K-Band bagian bawah (18–20 GHz). Salah satu kendala utama adalah sensitivitas terhadap toleransi fabrikasi pada profil </w:t>
+        <w:t xml:space="preserve">Meskipun </w:t>
+      </w:r>
+      <w:r>
+        <w:rPr>
+          <w:rFonts w:ascii="Times New Roman" w:hAnsi="Times New Roman" w:cs="Times New Roman"/>
+          <w:i/>
+          <w:iCs/>
+          <w:lang w:val="sv-SE"/>
+        </w:rPr>
+        <w:t>Tapered Slot Antenna</w:t>
+      </w:r>
+      <w:r>
+        <w:rPr>
+          <w:rFonts w:ascii="Times New Roman" w:hAnsi="Times New Roman" w:cs="Times New Roman"/>
+          <w:lang w:val="sv-SE"/>
+        </w:rPr>
+        <w:t xml:space="preserve"> (TSA) telah banyak digunakan dan diteliti untuk berbagai aplikasi radar frekuensi tinggi, beberapa keterbatasan teknis masih ditemukan dalam implementasinya, khususnya ketika antena dioperasikan pada frekuensi </w:t>
+      </w:r>
+      <w:r>
+        <w:rPr>
+          <w:rFonts w:ascii="Times New Roman" w:hAnsi="Times New Roman" w:cs="Times New Roman"/>
+          <w:i/>
+          <w:iCs/>
+          <w:lang w:val="sv-SE"/>
+        </w:rPr>
+        <w:t>K-Band</w:t>
+      </w:r>
+      <w:r>
+        <w:rPr>
+          <w:rFonts w:ascii="Times New Roman" w:hAnsi="Times New Roman" w:cs="Times New Roman"/>
+          <w:lang w:val="sv-SE"/>
+        </w:rPr>
+        <w:t xml:space="preserve"> bagian bawah</w:t>
+      </w:r>
+      <w:r>
+        <w:rPr>
+          <w:rFonts w:ascii="Times New Roman" w:hAnsi="Times New Roman" w:cs="Times New Roman"/>
+          <w:lang w:val="sv-SE"/>
+        </w:rPr>
+        <w:t>.</w:t>
+      </w:r>
+      <w:r>
+        <w:rPr>
+          <w:rFonts w:ascii="Times New Roman" w:hAnsi="Times New Roman" w:cs="Times New Roman"/>
+          <w:lang w:val="sv-SE"/>
+        </w:rPr>
+        <w:t xml:space="preserve"> Salah satu kendala utama adalah sensitivitas terhadap toleransi fabrikasi pada profil </w:t>
       </w:r>
       <w:r>
         <w:rPr>
@@ -2096,7 +2165,144 @@
           <w:rFonts w:ascii="Times New Roman" w:hAnsi="Times New Roman" w:cs="Times New Roman"/>
           <w:lang w:val="sv-SE"/>
         </w:rPr>
-        <w:t xml:space="preserve"> eksponensial yang umum digunakan pada antena Vivaldi, di mana variasi kecil pada dimensi geometris dapat mempengaruhi karakteristik impedansi dan performa radiasi antena. Selain itu, pada frekuensi tinggi rugi-rugi konduktor dan dielektrik pada substrat dapat meningkat sehingga menurunkan efisiensi radiasi, serta menimbulkan tantangan dalam mencapai matching impedansi yang optimal pada bandwidth tertentu, terutama ketika antena digunakan dalam konfigurasi array atau pada rentang frekuensi yang relatif sempit. </w:t>
+        <w:t xml:space="preserve"> eksponensial yang umum digunakan pada antena Vivaldi, di mana variasi kecil pada dimensi geometris dapat mempengaruhi karakteristik impedansi dan performa radiasi antena</w:t>
+      </w:r>
+      <w:r>
+        <w:rPr>
+          <w:rFonts w:ascii="Times New Roman" w:hAnsi="Times New Roman" w:cs="Times New Roman"/>
+          <w:lang w:val="sv-SE"/>
+        </w:rPr>
+        <w:t xml:space="preserve"> </w:t>
+      </w:r>
+      <w:r>
+        <w:rPr>
+          <w:rFonts w:ascii="Times New Roman" w:hAnsi="Times New Roman" w:cs="Times New Roman"/>
+          <w:lang w:val="sv-SE"/>
+        </w:rPr>
+        <w:fldChar w:fldCharType="begin"/>
+      </w:r>
+      <w:r>
+        <w:rPr>
+          <w:rFonts w:ascii="Times New Roman" w:hAnsi="Times New Roman" w:cs="Times New Roman"/>
+          <w:lang w:val="sv-SE"/>
+        </w:rPr>
+        <w:instrText xml:space="preserve"> ADDIN ZOTERO_ITEM CSL_CITATION {"citationID":"i4VvdKZi","properties":{"formattedCitation":"(Dae-Heon Lee dkk., 2012)","plainCitation":"(Dae-Heon Lee dkk., 2012)","noteIndex":0},"citationItems":[{"id":112,"uris":["http://zotero.org/users/local/GXnJfy3L/items/G32HZATK"],"itemData":{"id":112,"type":"article-journal","abstract":"A novel tapered slot antenna (TSA) with a band-notched function for ultrawideband (UWB) radios is proposed in this letter. By inserting an Archimedean spiral-shaped slot into a microstrip open-circuit circular stub of microstrip–slotline transition, a UWB operation with a notched frequency band can be obtained. Measured data for the optimized case show the bandwidth for the to be 8.8 GHz (from 2.4 to 11.2 GHz) with a notched band frequency from 4.6 to 6.2 GHz. By inserting the resonance slot on the nonradiating part of the antenna, the proposed antenna is capable of avoiding the spatial-dependent bandstop characteristics. Also, the designed antenna has a small size of 50 50 mm , which is a size reduction of 40% with respect to previous similar antennas.","container-title":"IEEE Antennas and Wireless Propagation Letters","DOI":"10.1109/LAWP.2012.2204718","ISSN":"1536-1225, 1548-5757","journalAbbreviation":"Antennas Wirel. Propag. Lett.","language":"en","page":"682-685","source":"DOI.org (Crossref)","title":"Tapered Slot Antenna With Band-Notched Function for Ultrawideband Radios","volume":"11","author":[{"literal":"Dae-Heon Lee"},{"literal":"Hae-Yong Yang"},{"literal":"Young-Ki Cho"}],"issued":{"date-parts":[["2012"]]}}}],"schema":"https://github.com/citation-style-language/schema/raw/master/csl-citation.json"} </w:instrText>
+      </w:r>
+      <w:r>
+        <w:rPr>
+          <w:rFonts w:ascii="Times New Roman" w:hAnsi="Times New Roman" w:cs="Times New Roman"/>
+          <w:lang w:val="sv-SE"/>
+        </w:rPr>
+        <w:fldChar w:fldCharType="separate"/>
+      </w:r>
+      <w:r>
+        <w:rPr>
+          <w:rFonts w:ascii="Times New Roman" w:hAnsi="Times New Roman" w:cs="Times New Roman"/>
+          <w:lang w:val="sv-SE"/>
+        </w:rPr>
+        <w:t>(Dae-Heon Lee dkk., 2012)</w:t>
+      </w:r>
+      <w:r>
+        <w:rPr>
+          <w:rFonts w:ascii="Times New Roman" w:hAnsi="Times New Roman" w:cs="Times New Roman"/>
+          <w:lang w:val="sv-SE"/>
+        </w:rPr>
+        <w:fldChar w:fldCharType="end"/>
+      </w:r>
+      <w:r>
+        <w:rPr>
+          <w:rFonts w:ascii="Times New Roman" w:hAnsi="Times New Roman" w:cs="Times New Roman"/>
+          <w:lang w:val="sv-SE"/>
+        </w:rPr>
+        <w:t xml:space="preserve">. Selain itu, pada frekuensi tinggi rugi-rugi konduktor dan dielektrik pada substrat dapat meningkat sehingga menurunkan efisiensi radiasi, serta menimbulkan tantangan dalam mencapai </w:t>
+      </w:r>
+      <w:r>
+        <w:rPr>
+          <w:rFonts w:ascii="Times New Roman" w:hAnsi="Times New Roman" w:cs="Times New Roman"/>
+          <w:i/>
+          <w:iCs/>
+          <w:lang w:val="sv-SE"/>
+        </w:rPr>
+        <w:t>matching</w:t>
+      </w:r>
+      <w:r>
+        <w:rPr>
+          <w:rFonts w:ascii="Times New Roman" w:hAnsi="Times New Roman" w:cs="Times New Roman"/>
+          <w:lang w:val="sv-SE"/>
+        </w:rPr>
+        <w:t xml:space="preserve"> impedansi yang optimal pada </w:t>
+      </w:r>
+      <w:r>
+        <w:rPr>
+          <w:rFonts w:ascii="Times New Roman" w:hAnsi="Times New Roman" w:cs="Times New Roman"/>
+          <w:i/>
+          <w:iCs/>
+          <w:lang w:val="sv-SE"/>
+        </w:rPr>
+        <w:t>bandwidth</w:t>
+      </w:r>
+      <w:r>
+        <w:rPr>
+          <w:rFonts w:ascii="Times New Roman" w:hAnsi="Times New Roman" w:cs="Times New Roman"/>
+          <w:lang w:val="sv-SE"/>
+        </w:rPr>
+        <w:t xml:space="preserve"> tertentu, terutama ketika antena digunakan dalam konfigurasi array atau pada rentang frekuensi yang relatif sempit</w:t>
+      </w:r>
+      <w:r>
+        <w:rPr>
+          <w:rFonts w:ascii="Times New Roman" w:hAnsi="Times New Roman" w:cs="Times New Roman"/>
+          <w:lang w:val="sv-SE"/>
+        </w:rPr>
+        <w:t xml:space="preserve"> </w:t>
+      </w:r>
+      <w:r>
+        <w:rPr>
+          <w:rFonts w:ascii="Times New Roman" w:hAnsi="Times New Roman" w:cs="Times New Roman"/>
+          <w:lang w:val="sv-SE"/>
+        </w:rPr>
+        <w:t>s</w:t>
+      </w:r>
+      <w:r>
+        <w:rPr>
+          <w:rFonts w:ascii="Times New Roman" w:hAnsi="Times New Roman" w:cs="Times New Roman"/>
+          <w:lang w:val="sv-SE"/>
+        </w:rPr>
+        <w:fldChar w:fldCharType="begin"/>
+      </w:r>
+      <w:r>
+        <w:rPr>
+          <w:rFonts w:ascii="Times New Roman" w:hAnsi="Times New Roman" w:cs="Times New Roman"/>
+          <w:lang w:val="sv-SE"/>
+        </w:rPr>
+        <w:instrText xml:space="preserve"> ADDIN ZOTERO_ITEM CSL_CITATION {"citationID":"BQCvIkSf","properties":{"formattedCitation":"(Ohm dkk., 2023)","plainCitation":"(Ohm dkk., 2023)","noteIndex":0},"citationItems":[{"id":236,"uris":["http://zotero.org/users/local/GXnJfy3L/items/TGLZWPWS"],"itemData":{"id":236,"type":"article-journal","abstract":"This paper proposes an all-metal Vivaldi array antenna with a wide-angle impedance matching (WAIM) layer for high-power jamming systems. To reduce fabrication complexity and time, the proposed array antenna is manufactured using a metal 3D printing method. The Vivaldi unit cell, composed of a radiating flare part and an inner cavity, is extended into an 8 × 8 array with a ±45◦ slant configuration. To further enhance the beam steering angle, the WAIM layer is placed on top of the proposed array antenna. The performances of the proposed array antenna, such as its active reflection coefficients (ARCs), gains, and array radiation patterns, are investigated in a full anechoic chamber. At a steering angle of (θ0 = 45◦, φ0 = 25◦), the measured and simulated average ARCs of the center element (Port 36) with the WAIM layer are −13.2 dB and −18.5 dB, respectively. At 4 GHz, the measured and simulated boresight gains of the proposed array antenna are 19 dBi and 20.6 dBi, respectively. In addition, the measured and simulated boresight gains for the (θ0 = 45◦, φ0 = 0◦) steering angle in the zx-plane are 18 dBi and 21 dBi, respectively. In the zy-plane, boresight gains for the (θ0 = 45◦, φ0 = 0◦) steering angle are 19.3 dBi by measurement and 19.1 dBi by simulation. These results demonstrate that the proposed array antenna is suitable for high-power jamming systems because stable boresight gains are observed even at wide steering angles without unwanted grating lobes.","container-title":"IEEE Access","DOI":"10.1109/ACCESS.2023.3262463","ISSN":"2169-3536","journalAbbreviation":"IEEE Access","language":"en","license":"https://creativecommons.org/licenses/by-nc-nd/4.0/","page":"35175-35181","source":"DOI.org (Crossref)","title":"Design of a Dual-Polarization All-Metal Vivaldi Array Antenna Using a Metal 3D Printing Method for High-Power Jamming Systems","volume":"11","author":[{"family":"Ohm","given":"Sungsik"},{"family":"Kang","given":"Eunjung"},{"family":"Lim","given":"Tae Heung"},{"family":"Choo","given":"Hosung"}],"issued":{"date-parts":[["2023"]]}}}],"schema":"https://github.com/citation-style-language/schema/raw/master/csl-citation.json"} </w:instrText>
+      </w:r>
+      <w:r>
+        <w:rPr>
+          <w:rFonts w:ascii="Times New Roman" w:hAnsi="Times New Roman" w:cs="Times New Roman"/>
+          <w:lang w:val="sv-SE"/>
+        </w:rPr>
+        <w:fldChar w:fldCharType="separate"/>
+      </w:r>
+      <w:r>
+        <w:rPr>
+          <w:rFonts w:ascii="Times New Roman" w:hAnsi="Times New Roman" w:cs="Times New Roman"/>
+          <w:lang w:val="sv-SE"/>
+        </w:rPr>
+        <w:t>(Ohm dkk., 2023)</w:t>
+      </w:r>
+      <w:r>
+        <w:rPr>
+          <w:rFonts w:ascii="Times New Roman" w:hAnsi="Times New Roman" w:cs="Times New Roman"/>
+          <w:lang w:val="sv-SE"/>
+        </w:rPr>
+        <w:fldChar w:fldCharType="end"/>
+      </w:r>
+      <w:r>
+        <w:rPr>
+          <w:rFonts w:ascii="Times New Roman" w:hAnsi="Times New Roman" w:cs="Times New Roman"/>
+          <w:lang w:val="sv-SE"/>
+        </w:rPr>
+        <w:t xml:space="preserve">. </w:t>
       </w:r>
     </w:p>
     <w:p>
@@ -2162,23 +2368,51 @@
           <w:rFonts w:ascii="Times New Roman" w:hAnsi="Times New Roman" w:cs="Times New Roman"/>
           <w:lang w:val="sv-SE"/>
         </w:rPr>
-        <w:t xml:space="preserve"> eksponensial digantikan dengan struktur bertingkat yang terdiri dari beberapa segmen linier diskrit. Pendekatan ini memungkinkan kontrol distribusi impedansi yang lebih baik sepanjang aperture antena sehingga dapat meningkatkan </w:t>
-      </w:r>
-      <w:r>
-        <w:rPr>
-          <w:rFonts w:ascii="Times New Roman" w:hAnsi="Times New Roman" w:cs="Times New Roman"/>
-          <w:i/>
-          <w:iCs/>
-          <w:lang w:val="sv-SE"/>
-        </w:rPr>
-        <w:t>matching</w:t>
-      </w:r>
-      <w:r>
-        <w:rPr>
-          <w:rFonts w:ascii="Times New Roman" w:hAnsi="Times New Roman" w:cs="Times New Roman"/>
-          <w:lang w:val="sv-SE"/>
-        </w:rPr>
-        <w:t xml:space="preserve"> impedansi, </w:t>
+        <w:t xml:space="preserve"> eksponensial digantikan dengan struktur bertingkat yang terdiri dari beberapa segmen linier diskrit. </w:t>
+      </w:r>
+      <w:r>
+        <w:rPr>
+          <w:rFonts w:ascii="Times New Roman" w:hAnsi="Times New Roman" w:cs="Times New Roman"/>
+          <w:lang w:val="sv-SE"/>
+        </w:rPr>
+        <w:t>Sebelumnya</w:t>
+      </w:r>
+      <w:r>
+        <w:rPr>
+          <w:rFonts w:ascii="Times New Roman" w:hAnsi="Times New Roman" w:cs="Times New Roman"/>
+          <w:lang w:val="sv-SE"/>
+        </w:rPr>
+        <w:t>, penelitian mengenai STSA telah dilakukan oleh Shen dkk. (2010</w:t>
+      </w:r>
+      <w:r>
+        <w:rPr>
+          <w:rFonts w:ascii="Times New Roman" w:hAnsi="Times New Roman" w:cs="Times New Roman"/>
+          <w:lang w:val="sv-SE"/>
+        </w:rPr>
+        <w:t xml:space="preserve">) </w:t>
+      </w:r>
+      <w:r>
+        <w:rPr>
+          <w:rFonts w:ascii="Times New Roman" w:hAnsi="Times New Roman" w:cs="Times New Roman"/>
+          <w:lang w:val="sv-SE"/>
+        </w:rPr>
+        <w:t xml:space="preserve">yang mengusulkan desain antena STSA berbasis slot bertingkat untuk aplikasi </w:t>
+      </w:r>
+      <w:r>
+        <w:rPr>
+          <w:rFonts w:ascii="Times New Roman" w:hAnsi="Times New Roman" w:cs="Times New Roman"/>
+          <w:i/>
+          <w:iCs/>
+          <w:lang w:val="sv-SE"/>
+        </w:rPr>
+        <w:t>wideband phased-array</w:t>
+      </w:r>
+      <w:r>
+        <w:rPr>
+          <w:rFonts w:ascii="Times New Roman" w:hAnsi="Times New Roman" w:cs="Times New Roman"/>
+          <w:lang w:val="sv-SE"/>
+        </w:rPr>
+        <w:t xml:space="preserve"> radar. Hasil penelitian tersebut menunjukkan bahwa antena yang diusulkan mampu menghasilkan </w:t>
       </w:r>
       <w:r>
         <w:rPr>
@@ -2194,7 +2428,170 @@
           <w:rFonts w:ascii="Times New Roman" w:hAnsi="Times New Roman" w:cs="Times New Roman"/>
           <w:lang w:val="sv-SE"/>
         </w:rPr>
-        <w:t xml:space="preserve">, dan </w:t>
+        <w:t xml:space="preserve"> yang luas dengan nilai VSWR kurang dari 2 pada rentang frekuensi 6–18 GHz, serta memiliki karakteristik radiasi yang mendukung kemampuan </w:t>
+      </w:r>
+      <w:r>
+        <w:rPr>
+          <w:rFonts w:ascii="Times New Roman" w:hAnsi="Times New Roman" w:cs="Times New Roman"/>
+          <w:i/>
+          <w:iCs/>
+          <w:lang w:val="sv-SE"/>
+        </w:rPr>
+        <w:t>wide-angle scanning</w:t>
+      </w:r>
+      <w:r>
+        <w:rPr>
+          <w:rFonts w:ascii="Times New Roman" w:hAnsi="Times New Roman" w:cs="Times New Roman"/>
+          <w:lang w:val="sv-SE"/>
+        </w:rPr>
+        <w:t xml:space="preserve"> pada sistem antena </w:t>
+      </w:r>
+      <w:r>
+        <w:rPr>
+          <w:rFonts w:ascii="Times New Roman" w:hAnsi="Times New Roman" w:cs="Times New Roman"/>
+          <w:i/>
+          <w:iCs/>
+          <w:lang w:val="sv-SE"/>
+        </w:rPr>
+        <w:t>array</w:t>
+      </w:r>
+      <w:r>
+        <w:rPr>
+          <w:rFonts w:ascii="Times New Roman" w:hAnsi="Times New Roman" w:cs="Times New Roman"/>
+          <w:i/>
+          <w:iCs/>
+          <w:lang w:val="sv-SE"/>
+        </w:rPr>
+        <w:fldChar w:fldCharType="begin"/>
+      </w:r>
+      <w:r>
+        <w:rPr>
+          <w:rFonts w:ascii="Times New Roman" w:hAnsi="Times New Roman" w:cs="Times New Roman"/>
+          <w:i/>
+          <w:iCs/>
+          <w:lang w:val="sv-SE"/>
+        </w:rPr>
+        <w:instrText xml:space="preserve"> ADDIN ZOTERO_ITEM CSL_CITATION {"citationID":"KTJLcQ1T","properties":{"formattedCitation":"(Shen dkk., 2010)","plainCitation":"(Shen dkk., 2010)","noteIndex":0},"citationItems":[{"id":233,"uris":["http://zotero.org/users/local/GXnJfy3L/items/L9ITFG3K"],"itemData":{"id":233,"type":"paper-conference","container-title":"2010 IEEE International Conference on Ultra-Wideband","DOI":"10.1109/ICUWB.2010.5614085","event-title":"2010 IEEE International Conference on Ultra-Wideband (ICUWB)","ISBN":"978-1-4244-5305-4","language":"en","page":"1-4","publisher":"IEEE","publisher-place":"Nanjing, China","source":"DOI.org (Crossref)","title":"Design and mutual coupling analysis on wideband wide-angle scan step-constant tapered slot antenna array","URL":"http://ieeexplore.ieee.org/document/5614085/","author":[{"family":"Shen","given":"Jing"},{"family":"Xu","given":"Zhi"},{"family":"Zheng","given":"Ting"}],"accessed":{"date-parts":[["2026",4,8]]},"issued":{"date-parts":[["2010",9]]}}}],"schema":"https://github.com/citation-style-language/schema/raw/master/csl-citation.json"} </w:instrText>
+      </w:r>
+      <w:r>
+        <w:rPr>
+          <w:rFonts w:ascii="Times New Roman" w:hAnsi="Times New Roman" w:cs="Times New Roman"/>
+          <w:i/>
+          <w:iCs/>
+          <w:lang w:val="sv-SE"/>
+        </w:rPr>
+        <w:fldChar w:fldCharType="separate"/>
+      </w:r>
+      <w:r>
+        <w:rPr>
+          <w:rFonts w:ascii="Times New Roman" w:hAnsi="Times New Roman" w:cs="Times New Roman"/>
+          <w:lang w:val="sv-SE"/>
+        </w:rPr>
+        <w:t>(Shen dkk., 2010)</w:t>
+      </w:r>
+      <w:r>
+        <w:rPr>
+          <w:rFonts w:ascii="Times New Roman" w:hAnsi="Times New Roman" w:cs="Times New Roman"/>
+          <w:i/>
+          <w:iCs/>
+          <w:lang w:val="sv-SE"/>
+        </w:rPr>
+        <w:fldChar w:fldCharType="end"/>
+      </w:r>
+      <w:r>
+        <w:rPr>
+          <w:rFonts w:ascii="Times New Roman" w:hAnsi="Times New Roman" w:cs="Times New Roman"/>
+          <w:lang w:val="sv-SE"/>
+        </w:rPr>
+        <w:t>.</w:t>
+      </w:r>
+    </w:p>
+    <w:p>
+      <w:pPr>
+        <w:spacing w:after="0" w:line="360" w:lineRule="auto"/>
+        <w:ind w:firstLine="720"/>
+        <w:jc w:val="both"/>
+        <w:rPr>
+          <w:rFonts w:ascii="Times New Roman" w:hAnsi="Times New Roman" w:cs="Times New Roman"/>
+          <w:lang w:val="sv-SE"/>
+        </w:rPr>
+      </w:pPr>
+      <w:r>
+        <w:rPr>
+          <w:rFonts w:ascii="Times New Roman" w:hAnsi="Times New Roman" w:cs="Times New Roman"/>
+          <w:lang w:val="sv-SE"/>
+        </w:rPr>
+        <w:t xml:space="preserve">Selain itu, penelitian lain yang dilakukan oleh Aktar dkk. </w:t>
+      </w:r>
+      <w:r>
+        <w:rPr>
+          <w:rFonts w:ascii="Times New Roman" w:hAnsi="Times New Roman" w:cs="Times New Roman"/>
+          <w:lang w:val="sv-SE"/>
+        </w:rPr>
+        <w:t xml:space="preserve">(2019) </w:t>
+      </w:r>
+      <w:r>
+        <w:rPr>
+          <w:rFonts w:ascii="Times New Roman" w:hAnsi="Times New Roman" w:cs="Times New Roman"/>
+          <w:lang w:val="sv-SE"/>
+        </w:rPr>
+        <w:t xml:space="preserve">mengembangkan desain STSA untuk aplikasi </w:t>
+      </w:r>
+      <w:r>
+        <w:rPr>
+          <w:rFonts w:ascii="Times New Roman" w:hAnsi="Times New Roman" w:cs="Times New Roman"/>
+          <w:i/>
+          <w:iCs/>
+          <w:lang w:val="sv-SE"/>
+        </w:rPr>
+        <w:t>ultra-wideband</w:t>
+      </w:r>
+      <w:r>
+        <w:rPr>
+          <w:rFonts w:ascii="Times New Roman" w:hAnsi="Times New Roman" w:cs="Times New Roman"/>
+          <w:lang w:val="sv-SE"/>
+        </w:rPr>
+        <w:t xml:space="preserve"> (UWB) pada rentang frekuensi 3.1–10.6 GHz, dengan hasil simulasi menunjukkan bahwa konfigurasi </w:t>
+      </w:r>
+      <w:r>
+        <w:rPr>
+          <w:rFonts w:ascii="Times New Roman" w:hAnsi="Times New Roman" w:cs="Times New Roman"/>
+          <w:lang w:val="sv-SE"/>
+        </w:rPr>
+        <w:lastRenderedPageBreak/>
+        <w:t xml:space="preserve">dengan 15 </w:t>
+      </w:r>
+      <w:r>
+        <w:rPr>
+          <w:rFonts w:ascii="Times New Roman" w:hAnsi="Times New Roman" w:cs="Times New Roman"/>
+          <w:i/>
+          <w:iCs/>
+          <w:lang w:val="sv-SE"/>
+        </w:rPr>
+        <w:t>step</w:t>
+      </w:r>
+      <w:r>
+        <w:rPr>
+          <w:rFonts w:ascii="Times New Roman" w:hAnsi="Times New Roman" w:cs="Times New Roman"/>
+          <w:lang w:val="sv-SE"/>
+        </w:rPr>
+        <w:t xml:space="preserve"> mampu menghasilkan </w:t>
+      </w:r>
+      <w:r>
+        <w:rPr>
+          <w:rFonts w:ascii="Times New Roman" w:hAnsi="Times New Roman" w:cs="Times New Roman"/>
+          <w:i/>
+          <w:iCs/>
+          <w:lang w:val="sv-SE"/>
+        </w:rPr>
+        <w:t>return loss</w:t>
+      </w:r>
+      <w:r>
+        <w:rPr>
+          <w:rFonts w:ascii="Times New Roman" w:hAnsi="Times New Roman" w:cs="Times New Roman"/>
+          <w:lang w:val="sv-SE"/>
+        </w:rPr>
+        <w:t xml:space="preserve"> sekitar −46 dB, </w:t>
       </w:r>
       <w:r>
         <w:rPr>
@@ -2210,7 +2607,855 @@
           <w:rFonts w:ascii="Times New Roman" w:hAnsi="Times New Roman" w:cs="Times New Roman"/>
           <w:lang w:val="sv-SE"/>
         </w:rPr>
-        <w:t xml:space="preserve">, serta memberikan keuntungan dari sisi fabrikasi karena struktur bertingkat lebih toleran terhadap variasi proses manufaktur dibandingkan profil eksponensial kontinu. Beberapa penelitian menunjukkan bahwa antena dengan profil </w:t>
+        <w:t xml:space="preserve"> sekitar 10 dB, serta VSWR mendekati 1, yang menunjukkan performa impedansi yang sangat baik</w:t>
+      </w:r>
+      <w:r>
+        <w:rPr>
+          <w:rFonts w:ascii="Times New Roman" w:hAnsi="Times New Roman" w:cs="Times New Roman"/>
+          <w:lang w:val="sv-SE"/>
+        </w:rPr>
+        <w:t xml:space="preserve"> </w:t>
+      </w:r>
+      <w:r>
+        <w:rPr>
+          <w:rFonts w:ascii="Times New Roman" w:hAnsi="Times New Roman" w:cs="Times New Roman"/>
+          <w:lang w:val="sv-SE"/>
+        </w:rPr>
+        <w:fldChar w:fldCharType="begin"/>
+      </w:r>
+      <w:r>
+        <w:rPr>
+          <w:rFonts w:ascii="Times New Roman" w:hAnsi="Times New Roman" w:cs="Times New Roman"/>
+          <w:lang w:val="sv-SE"/>
+        </w:rPr>
+        <w:instrText xml:space="preserve"> ADDIN ZOTERO_ITEM CSL_CITATION {"citationID":"p6STGYVi","properties":{"formattedCitation":"(Aktar dkk., 2019)","plainCitation":"(Aktar dkk., 2019)","noteIndex":0},"citationItems":[{"id":117,"uris":["http://zotero.org/users/local/GXnJfy3L/items/HQIXU9KW"],"itemData":{"id":117,"type":"article-journal","abstract":"This paper presents the analytical design and high performance of step-constant tapered slot antenna (STSA) for ultra-wideband application. The return loss, radiation pattern, antenna gain, and level of cross polarization of this antenna are presented and analyzed. Utilizing Rogers (RO3006) substrate having a relative permittivity of 6.15, the proposed antenna provides the ultra-wideband (UWB) from 3.1 GHz to 10.6 GHz. It is observed that the return loss and gain are increased with increasing the step size. It has been observed from the simulation results incorporating CST microwave studio commercial software version 2015, the optimum return loss, directivity and gain are −43 dB, 10.52 dBi and 10.20 dB, respectively, for 15 step size. Therefore, the newly proposed antenna will be a decent candidate for ultra-wideband application.","container-title":"Journal of Sensor Technology","DOI":"10.4236/jst.2019.94008","ISSN":"2161-122X, 2161-1238","issue":"04","journalAbbreviation":"JST","language":"en","license":"http://creativecommons.org/licenses/by/4.0/","page":"91-100","source":"DOI.org (Crossref)","title":"Design and Implementation of Step-Constant Tapered Slot Antennas for UWB Application","volume":"09","author":[{"family":"Aktar","given":"Mousumi"},{"family":"Rana","given":"Md. Masud"},{"family":"Hossain","given":"Md. Sanwar"},{"family":"Hossain","given":"Md. Biplob"}],"issued":{"date-parts":[["2019"]]}}}],"schema":"https://github.com/citation-style-language/schema/raw/master/csl-citation.json"} </w:instrText>
+      </w:r>
+      <w:r>
+        <w:rPr>
+          <w:rFonts w:ascii="Times New Roman" w:hAnsi="Times New Roman" w:cs="Times New Roman"/>
+          <w:lang w:val="sv-SE"/>
+        </w:rPr>
+        <w:fldChar w:fldCharType="separate"/>
+      </w:r>
+      <w:r>
+        <w:rPr>
+          <w:rFonts w:ascii="Times New Roman" w:hAnsi="Times New Roman" w:cs="Times New Roman"/>
+          <w:lang w:val="sv-SE"/>
+        </w:rPr>
+        <w:t>(Aktar dkk., 2019)</w:t>
+      </w:r>
+      <w:r>
+        <w:rPr>
+          <w:rFonts w:ascii="Times New Roman" w:hAnsi="Times New Roman" w:cs="Times New Roman"/>
+          <w:lang w:val="sv-SE"/>
+        </w:rPr>
+        <w:fldChar w:fldCharType="end"/>
+      </w:r>
+      <w:r>
+        <w:rPr>
+          <w:rFonts w:ascii="Times New Roman" w:hAnsi="Times New Roman" w:cs="Times New Roman"/>
+          <w:lang w:val="sv-SE"/>
+        </w:rPr>
+        <w:t>.</w:t>
+      </w:r>
+    </w:p>
+    <w:p>
+      <w:pPr>
+        <w:spacing w:after="0" w:line="360" w:lineRule="auto"/>
+        <w:ind w:firstLine="720"/>
+        <w:jc w:val="both"/>
+        <w:rPr>
+          <w:rFonts w:ascii="Times New Roman" w:hAnsi="Times New Roman" w:cs="Times New Roman"/>
+          <w:lang w:val="sv-SE"/>
+        </w:rPr>
+      </w:pPr>
+      <w:r>
+        <w:rPr>
+          <w:rFonts w:ascii="Times New Roman" w:hAnsi="Times New Roman" w:cs="Times New Roman"/>
+          <w:lang w:val="sv-SE"/>
+        </w:rPr>
+        <w:t xml:space="preserve">Berdasarkan permasalahan dan potensi solusi tersebut, penelitian ini berfokus pada ”Antena Step-Constant Tapered Slot Pita Lebar dengan Gain Tinggi pada Frekuensi K-Band untuk Aplikasi Radar Otomotif ", khususnya dalam rentang 18–20 GHz. </w:t>
+      </w:r>
+      <w:r>
+        <w:rPr>
+          <w:rFonts w:ascii="Times New Roman" w:hAnsi="Times New Roman" w:cs="Times New Roman"/>
+          <w:lang w:val="sv-SE"/>
+        </w:rPr>
+        <w:t>Berbeda dengan penelitian sebelumnya</w:t>
+      </w:r>
+      <w:r>
+        <w:rPr>
+          <w:rFonts w:ascii="Times New Roman" w:hAnsi="Times New Roman" w:cs="Times New Roman"/>
+          <w:lang w:val="sv-SE"/>
+        </w:rPr>
+        <w:t>,</w:t>
+      </w:r>
+      <w:r>
+        <w:rPr>
+          <w:rFonts w:ascii="Times New Roman" w:hAnsi="Times New Roman" w:cs="Times New Roman"/>
+          <w:lang w:val="sv-SE"/>
+        </w:rPr>
+        <w:t xml:space="preserve"> </w:t>
+      </w:r>
+      <w:r>
+        <w:rPr>
+          <w:rFonts w:ascii="Times New Roman" w:hAnsi="Times New Roman" w:cs="Times New Roman"/>
+          <w:lang w:val="sv-SE"/>
+        </w:rPr>
+        <w:t>sebagian besar penelitian yang ada masih berfokus pada aplikasi ultra-wideband komunikasi atau konfigurasi antena array untuk sistem radar pita lebar, seperti yang ditunjukkan pada penelitian Shen dkk.</w:t>
+      </w:r>
+      <w:r>
+        <w:rPr>
+          <w:rFonts w:ascii="Times New Roman" w:hAnsi="Times New Roman" w:cs="Times New Roman"/>
+          <w:lang w:val="sv-SE"/>
+        </w:rPr>
+        <w:t xml:space="preserve"> (2010)</w:t>
+      </w:r>
+      <w:r>
+        <w:rPr>
+          <w:rFonts w:ascii="Times New Roman" w:hAnsi="Times New Roman" w:cs="Times New Roman"/>
+          <w:lang w:val="sv-SE"/>
+        </w:rPr>
+        <w:t xml:space="preserve"> dan Aktar dkk</w:t>
+      </w:r>
+      <w:r>
+        <w:rPr>
+          <w:rFonts w:ascii="Times New Roman" w:hAnsi="Times New Roman" w:cs="Times New Roman"/>
+          <w:lang w:val="sv-SE"/>
+        </w:rPr>
+        <w:t xml:space="preserve"> (2019)</w:t>
+      </w:r>
+      <w:r>
+        <w:rPr>
+          <w:rFonts w:ascii="Times New Roman" w:hAnsi="Times New Roman" w:cs="Times New Roman"/>
+          <w:lang w:val="sv-SE"/>
+        </w:rPr>
+        <w:t xml:space="preserve">. Penelitian tersebut belum secara spesifik mengkaji penerapan STSA pada pita frekuensi </w:t>
+      </w:r>
+      <w:r>
+        <w:rPr>
+          <w:rFonts w:ascii="Times New Roman" w:hAnsi="Times New Roman" w:cs="Times New Roman"/>
+          <w:i/>
+          <w:iCs/>
+          <w:lang w:val="sv-SE"/>
+        </w:rPr>
+        <w:t>K-Band</w:t>
+      </w:r>
+      <w:r>
+        <w:rPr>
+          <w:rFonts w:ascii="Times New Roman" w:hAnsi="Times New Roman" w:cs="Times New Roman"/>
+          <w:lang w:val="sv-SE"/>
+        </w:rPr>
+        <w:t xml:space="preserve">, khususnya pada rentang 18–20 GHz, yang memiliki potensi penting dalam pengembangan sistem radar otomotif jarak dekat. Selain itu, sebagian besar penelitian sebelumnya lebih menitikberatkan pada desain </w:t>
+      </w:r>
+      <w:r>
+        <w:rPr>
+          <w:rFonts w:ascii="Times New Roman" w:hAnsi="Times New Roman" w:cs="Times New Roman"/>
+          <w:i/>
+          <w:lang w:val="sv-SE"/>
+        </w:rPr>
+        <w:t>array</w:t>
+      </w:r>
+      <w:r>
+        <w:rPr>
+          <w:rFonts w:ascii="Times New Roman" w:hAnsi="Times New Roman" w:cs="Times New Roman"/>
+          <w:lang w:val="sv-SE"/>
+        </w:rPr>
+        <w:t xml:space="preserve"> antena, sehingga kajian mengenai optimasi geometri </w:t>
+      </w:r>
+      <w:r>
+        <w:rPr>
+          <w:rFonts w:ascii="Times New Roman" w:hAnsi="Times New Roman" w:cs="Times New Roman"/>
+          <w:i/>
+          <w:iCs/>
+          <w:lang w:val="sv-SE"/>
+        </w:rPr>
+        <w:t>step-constant</w:t>
+      </w:r>
+      <w:r>
+        <w:rPr>
+          <w:rFonts w:ascii="Times New Roman" w:hAnsi="Times New Roman" w:cs="Times New Roman"/>
+          <w:lang w:val="sv-SE"/>
+        </w:rPr>
+        <w:t xml:space="preserve"> pada antena elemen tunggal pada pita </w:t>
+      </w:r>
+      <w:r>
+        <w:rPr>
+          <w:rFonts w:ascii="Times New Roman" w:hAnsi="Times New Roman" w:cs="Times New Roman"/>
+          <w:i/>
+          <w:iCs/>
+          <w:lang w:val="sv-SE"/>
+        </w:rPr>
+        <w:t>K-Band</w:t>
+      </w:r>
+      <w:r>
+        <w:rPr>
+          <w:rFonts w:ascii="Times New Roman" w:hAnsi="Times New Roman" w:cs="Times New Roman"/>
+          <w:lang w:val="sv-SE"/>
+        </w:rPr>
+        <w:t xml:space="preserve"> masih relatif terbatas.</w:t>
+      </w:r>
+      <w:r>
+        <w:rPr>
+          <w:rFonts w:ascii="Times New Roman" w:hAnsi="Times New Roman" w:cs="Times New Roman"/>
+          <w:lang w:val="sv-SE"/>
+        </w:rPr>
+        <w:t xml:space="preserve"> Penelitian ini berfokus pada pengembangan geometri </w:t>
+      </w:r>
+      <w:r>
+        <w:rPr>
+          <w:rFonts w:ascii="Times New Roman" w:hAnsi="Times New Roman" w:cs="Times New Roman"/>
+          <w:i/>
+          <w:iCs/>
+          <w:lang w:val="sv-SE"/>
+        </w:rPr>
+        <w:t>taper</w:t>
+      </w:r>
+      <w:r>
+        <w:rPr>
+          <w:rFonts w:ascii="Times New Roman" w:hAnsi="Times New Roman" w:cs="Times New Roman"/>
+          <w:lang w:val="sv-SE"/>
+        </w:rPr>
+        <w:t xml:space="preserve"> bertingkat untuk meningkatkan performa antena elemen tunggal pada frekuensi </w:t>
+      </w:r>
+      <w:r>
+        <w:rPr>
+          <w:rFonts w:ascii="Times New Roman" w:hAnsi="Times New Roman" w:cs="Times New Roman"/>
+          <w:i/>
+          <w:iCs/>
+          <w:lang w:val="sv-SE"/>
+        </w:rPr>
+        <w:t>K-Band</w:t>
+      </w:r>
+      <w:r>
+        <w:rPr>
+          <w:rFonts w:ascii="Times New Roman" w:hAnsi="Times New Roman" w:cs="Times New Roman"/>
+          <w:lang w:val="sv-SE"/>
+        </w:rPr>
+        <w:t xml:space="preserve">. Dengan mengoptimalkan profil </w:t>
+      </w:r>
+      <w:r>
+        <w:rPr>
+          <w:rFonts w:ascii="Times New Roman" w:hAnsi="Times New Roman" w:cs="Times New Roman"/>
+          <w:i/>
+          <w:iCs/>
+          <w:lang w:val="sv-SE"/>
+        </w:rPr>
+        <w:t>taper step-constant</w:t>
+      </w:r>
+      <w:r>
+        <w:rPr>
+          <w:rFonts w:ascii="Times New Roman" w:hAnsi="Times New Roman" w:cs="Times New Roman"/>
+          <w:lang w:val="sv-SE"/>
+        </w:rPr>
+        <w:t xml:space="preserve">, diharapkan antena yang dirancang dapat menghasilkan karakteristik impedansi yang baik, </w:t>
+      </w:r>
+      <w:r>
+        <w:rPr>
+          <w:rFonts w:ascii="Times New Roman" w:hAnsi="Times New Roman" w:cs="Times New Roman"/>
+          <w:i/>
+          <w:iCs/>
+          <w:lang w:val="sv-SE"/>
+        </w:rPr>
+        <w:t>gain</w:t>
+      </w:r>
+      <w:r>
+        <w:rPr>
+          <w:rFonts w:ascii="Times New Roman" w:hAnsi="Times New Roman" w:cs="Times New Roman"/>
+          <w:lang w:val="sv-SE"/>
+        </w:rPr>
+        <w:t xml:space="preserve"> tinggi, serta pola radiasi yang stabil, sehingga mendukung kebutuhan sistem radar otomotif modern.</w:t>
+      </w:r>
+    </w:p>
+    <w:p>
+      <w:pPr>
+        <w:pStyle w:val="Heading2"/>
+        <w:spacing w:line="360" w:lineRule="auto"/>
+        <w:ind w:hanging="720"/>
+        <w:rPr>
+          <w:sz w:val="24"/>
+          <w:szCs w:val="28"/>
+          <w:lang w:val="sv-SE"/>
+        </w:rPr>
+      </w:pPr>
+      <w:r>
+        <w:rPr>
+          <w:sz w:val="24"/>
+          <w:szCs w:val="28"/>
+          <w:lang w:val="sv-SE"/>
+        </w:rPr>
+        <w:t>Rumusan Masalah</w:t>
+      </w:r>
+    </w:p>
+    <w:p>
+      <w:pPr>
+        <w:spacing w:after="0" w:line="360" w:lineRule="auto"/>
+        <w:rPr>
+          <w:rFonts w:ascii="Times New Roman" w:hAnsi="Times New Roman" w:cs="Times New Roman"/>
+          <w:lang w:val="sv-SE"/>
+        </w:rPr>
+      </w:pPr>
+      <w:r>
+        <w:rPr>
+          <w:rFonts w:ascii="Times New Roman" w:hAnsi="Times New Roman" w:cs="Times New Roman"/>
+          <w:lang w:val="sv-SE"/>
+        </w:rPr>
+        <w:t>Rumusan masalah dalam penelitian ini i</w:t>
+      </w:r>
+      <w:r>
+        <w:rPr>
+          <w:rFonts w:ascii="Times New Roman" w:hAnsi="Times New Roman" w:cs="Times New Roman"/>
+          <w:lang w:val="sv-SE"/>
+        </w:rPr>
+        <w:t>alah sebagai berikut:</w:t>
+      </w:r>
+    </w:p>
+    <w:p>
+      <w:pPr>
+        <w:pStyle w:val="ListParagraph"/>
+        <w:numPr>
+          <w:ilvl w:val="6"/>
+          <w:numId w:val="2"/>
+        </w:numPr>
+        <w:spacing w:line="360" w:lineRule="auto"/>
+        <w:ind w:left="567" w:hanging="283"/>
+        <w:jc w:val="both"/>
+        <w:rPr>
+          <w:rFonts w:ascii="Times New Roman" w:hAnsi="Times New Roman" w:cs="Times New Roman"/>
+          <w:lang w:val="sv-SE"/>
+        </w:rPr>
+      </w:pPr>
+      <w:r>
+        <w:rPr>
+          <w:rFonts w:ascii="Times New Roman" w:hAnsi="Times New Roman" w:cs="Times New Roman"/>
+          <w:lang w:val="sv-SE"/>
+        </w:rPr>
+        <w:t xml:space="preserve">Bagaimana merancang geometri </w:t>
+      </w:r>
+      <w:r>
+        <w:rPr>
+          <w:rFonts w:ascii="Times New Roman" w:hAnsi="Times New Roman" w:cs="Times New Roman"/>
+          <w:i/>
+          <w:iCs/>
+          <w:lang w:val="sv-SE"/>
+        </w:rPr>
+        <w:t>Step-Constant Tapered Slot Antenna</w:t>
+      </w:r>
+      <w:r>
+        <w:rPr>
+          <w:rFonts w:ascii="Times New Roman" w:hAnsi="Times New Roman" w:cs="Times New Roman"/>
+          <w:lang w:val="sv-SE"/>
+        </w:rPr>
+        <w:t xml:space="preserve"> yang mampu bekerja secara efektif pada frekuensi </w:t>
+      </w:r>
+      <w:r>
+        <w:rPr>
+          <w:rFonts w:ascii="Times New Roman" w:hAnsi="Times New Roman" w:cs="Times New Roman"/>
+          <w:i/>
+          <w:iCs/>
+          <w:lang w:val="sv-SE"/>
+        </w:rPr>
+        <w:t>K-Band</w:t>
+      </w:r>
+      <w:r>
+        <w:rPr>
+          <w:rFonts w:ascii="Times New Roman" w:hAnsi="Times New Roman" w:cs="Times New Roman"/>
+          <w:lang w:val="sv-SE"/>
+        </w:rPr>
+        <w:t xml:space="preserve"> untuk aplikasi radar otomotif? </w:t>
+      </w:r>
+    </w:p>
+    <w:p>
+      <w:pPr>
+        <w:pStyle w:val="ListParagraph"/>
+        <w:numPr>
+          <w:ilvl w:val="6"/>
+          <w:numId w:val="2"/>
+        </w:numPr>
+        <w:spacing w:line="360" w:lineRule="auto"/>
+        <w:ind w:left="567" w:hanging="283"/>
+        <w:jc w:val="both"/>
+        <w:rPr>
+          <w:rFonts w:ascii="Times New Roman" w:hAnsi="Times New Roman" w:cs="Times New Roman"/>
+          <w:lang w:val="sv-SE"/>
+        </w:rPr>
+      </w:pPr>
+      <w:r>
+        <w:rPr>
+          <w:rFonts w:ascii="Times New Roman" w:hAnsi="Times New Roman" w:cs="Times New Roman"/>
+          <w:lang w:val="sv-SE"/>
+        </w:rPr>
+        <w:t xml:space="preserve">Bagaimana performa antena hasil rancangan berdasarkan simulasi elektromagnetik ditinjau dari parameter </w:t>
+      </w:r>
+      <w:r>
+        <w:rPr>
+          <w:rFonts w:ascii="Times New Roman" w:hAnsi="Times New Roman" w:cs="Times New Roman"/>
+          <w:i/>
+          <w:iCs/>
+          <w:lang w:val="sv-SE"/>
+        </w:rPr>
+        <w:t>return loss</w:t>
+      </w:r>
+      <w:r>
+        <w:rPr>
+          <w:rFonts w:ascii="Times New Roman" w:hAnsi="Times New Roman" w:cs="Times New Roman"/>
+          <w:lang w:val="sv-SE"/>
+        </w:rPr>
+        <w:t xml:space="preserve">, </w:t>
+      </w:r>
+      <w:r>
+        <w:rPr>
+          <w:rFonts w:ascii="Times New Roman" w:hAnsi="Times New Roman" w:cs="Times New Roman"/>
+          <w:i/>
+          <w:iCs/>
+          <w:lang w:val="sv-SE"/>
+        </w:rPr>
+        <w:t>bandwidth</w:t>
+      </w:r>
+      <w:r>
+        <w:rPr>
+          <w:rFonts w:ascii="Times New Roman" w:hAnsi="Times New Roman" w:cs="Times New Roman"/>
+          <w:lang w:val="sv-SE"/>
+        </w:rPr>
+        <w:t xml:space="preserve">, </w:t>
+      </w:r>
+      <w:r>
+        <w:rPr>
+          <w:rFonts w:ascii="Times New Roman" w:hAnsi="Times New Roman" w:cs="Times New Roman"/>
+          <w:lang w:val="sv-SE"/>
+        </w:rPr>
+        <w:t xml:space="preserve">dan </w:t>
+      </w:r>
+      <w:r>
+        <w:rPr>
+          <w:rFonts w:ascii="Times New Roman" w:hAnsi="Times New Roman" w:cs="Times New Roman"/>
+          <w:i/>
+          <w:iCs/>
+          <w:lang w:val="sv-SE"/>
+        </w:rPr>
+        <w:t>gain</w:t>
+      </w:r>
+      <w:r>
+        <w:rPr>
+          <w:rFonts w:ascii="Times New Roman" w:hAnsi="Times New Roman" w:cs="Times New Roman"/>
+          <w:lang w:val="sv-SE"/>
+        </w:rPr>
+        <w:t xml:space="preserve">? </w:t>
+      </w:r>
+    </w:p>
+    <w:p>
+      <w:pPr>
+        <w:pStyle w:val="ListParagraph"/>
+        <w:numPr>
+          <w:ilvl w:val="6"/>
+          <w:numId w:val="2"/>
+        </w:numPr>
+        <w:spacing w:line="360" w:lineRule="auto"/>
+        <w:ind w:left="567" w:hanging="283"/>
+        <w:jc w:val="both"/>
+        <w:rPr>
+          <w:rFonts w:ascii="Times New Roman" w:hAnsi="Times New Roman" w:cs="Times New Roman"/>
+          <w:lang w:val="sv-SE"/>
+        </w:rPr>
+      </w:pPr>
+      <w:r>
+        <w:rPr>
+          <w:rFonts w:ascii="Times New Roman" w:hAnsi="Times New Roman" w:cs="Times New Roman"/>
+          <w:lang w:val="sv-SE"/>
+        </w:rPr>
+        <w:lastRenderedPageBreak/>
+        <w:t xml:space="preserve">Bagaimana pengaruh perubahan profil </w:t>
+      </w:r>
+      <w:r>
+        <w:rPr>
+          <w:rFonts w:ascii="Times New Roman" w:hAnsi="Times New Roman" w:cs="Times New Roman"/>
+          <w:i/>
+          <w:iCs/>
+          <w:lang w:val="sv-SE"/>
+        </w:rPr>
+        <w:t>taper</w:t>
+      </w:r>
+      <w:r>
+        <w:rPr>
+          <w:rFonts w:ascii="Times New Roman" w:hAnsi="Times New Roman" w:cs="Times New Roman"/>
+          <w:lang w:val="sv-SE"/>
+        </w:rPr>
+        <w:t xml:space="preserve"> dan variasi struktur </w:t>
+      </w:r>
+      <w:r>
+        <w:rPr>
+          <w:rFonts w:ascii="Times New Roman" w:hAnsi="Times New Roman" w:cs="Times New Roman"/>
+          <w:i/>
+          <w:iCs/>
+          <w:lang w:val="sv-SE"/>
+        </w:rPr>
+        <w:t>step-constant</w:t>
+      </w:r>
+      <w:r>
+        <w:rPr>
+          <w:rFonts w:ascii="Times New Roman" w:hAnsi="Times New Roman" w:cs="Times New Roman"/>
+          <w:lang w:val="sv-SE"/>
+        </w:rPr>
+        <w:t xml:space="preserve"> terhadap karakteristik elektromagnetik, distribusi arus, dan peningkatan direksionalitas pola radiasi antena? </w:t>
+      </w:r>
+    </w:p>
+    <w:p>
+      <w:pPr>
+        <w:pStyle w:val="ListParagraph"/>
+        <w:numPr>
+          <w:ilvl w:val="6"/>
+          <w:numId w:val="2"/>
+        </w:numPr>
+        <w:spacing w:line="360" w:lineRule="auto"/>
+        <w:ind w:left="567" w:hanging="283"/>
+        <w:jc w:val="both"/>
+        <w:rPr>
+          <w:rFonts w:ascii="Times New Roman" w:hAnsi="Times New Roman" w:cs="Times New Roman"/>
+          <w:lang w:val="sv-SE"/>
+        </w:rPr>
+      </w:pPr>
+      <w:r>
+        <w:rPr>
+          <w:rFonts w:ascii="Times New Roman" w:hAnsi="Times New Roman" w:cs="Times New Roman"/>
+          <w:lang w:val="sv-SE"/>
+        </w:rPr>
+        <w:t xml:space="preserve">Apakah desain antena yang disimulasikan telah memenuhi kriteria kinerja dan spesifikasi teknis yang disyaratkan untuk sistem radar otomotif pada frekuensi </w:t>
+      </w:r>
+      <w:r>
+        <w:rPr>
+          <w:rFonts w:ascii="Times New Roman" w:hAnsi="Times New Roman" w:cs="Times New Roman"/>
+          <w:i/>
+          <w:iCs/>
+          <w:lang w:val="sv-SE"/>
+        </w:rPr>
+        <w:t>K-Band</w:t>
+      </w:r>
+      <w:r>
+        <w:rPr>
+          <w:rFonts w:ascii="Times New Roman" w:hAnsi="Times New Roman" w:cs="Times New Roman"/>
+          <w:lang w:val="sv-SE"/>
+        </w:rPr>
+        <w:t>?</w:t>
+      </w:r>
+    </w:p>
+    <w:p>
+      <w:pPr>
+        <w:pStyle w:val="Heading2"/>
+        <w:spacing w:line="360" w:lineRule="auto"/>
+        <w:ind w:hanging="720"/>
+        <w:rPr>
+          <w:sz w:val="24"/>
+          <w:szCs w:val="28"/>
+          <w:lang w:val="sv-SE"/>
+        </w:rPr>
+      </w:pPr>
+      <w:r>
+        <w:rPr>
+          <w:sz w:val="24"/>
+          <w:szCs w:val="28"/>
+          <w:lang w:val="sv-SE"/>
+        </w:rPr>
+        <w:t>Tujuan Penelitian</w:t>
+      </w:r>
+    </w:p>
+    <w:p>
+      <w:pPr>
+        <w:spacing w:line="360" w:lineRule="auto"/>
+        <w:rPr>
+          <w:rFonts w:ascii="Times New Roman" w:hAnsi="Times New Roman" w:cs="Times New Roman"/>
+          <w:lang w:val="sv-SE"/>
+        </w:rPr>
+      </w:pPr>
+      <w:r>
+        <w:rPr>
+          <w:rFonts w:ascii="Times New Roman" w:hAnsi="Times New Roman" w:cs="Times New Roman"/>
+          <w:lang w:val="sv-SE"/>
+        </w:rPr>
+        <w:t>Tujuan dari penelitian ini ialah sebagai berikut:</w:t>
+      </w:r>
+    </w:p>
+    <w:p>
+      <w:pPr>
+        <w:pStyle w:val="ListParagraph"/>
+        <w:numPr>
+          <w:ilvl w:val="0"/>
+          <w:numId w:val="3"/>
+        </w:numPr>
+        <w:spacing w:line="360" w:lineRule="auto"/>
+        <w:jc w:val="both"/>
+        <w:rPr>
+          <w:rFonts w:ascii="Times New Roman" w:hAnsi="Times New Roman" w:cs="Times New Roman"/>
+          <w:lang w:val="sv-SE"/>
+        </w:rPr>
+      </w:pPr>
+      <w:r>
+        <w:rPr>
+          <w:rFonts w:ascii="Times New Roman" w:hAnsi="Times New Roman" w:cs="Times New Roman"/>
+          <w:lang w:val="sv-SE"/>
+        </w:rPr>
+        <w:t xml:space="preserve">Mendesain dan mengoptimasi geometri </w:t>
+      </w:r>
+      <w:r>
+        <w:rPr>
+          <w:rFonts w:ascii="Times New Roman" w:hAnsi="Times New Roman" w:cs="Times New Roman"/>
+          <w:i/>
+          <w:iCs/>
+          <w:lang w:val="sv-SE"/>
+        </w:rPr>
+        <w:t>Step-Constant Tapered Slot Antenna</w:t>
+      </w:r>
+      <w:r>
+        <w:rPr>
+          <w:rFonts w:ascii="Times New Roman" w:hAnsi="Times New Roman" w:cs="Times New Roman"/>
+          <w:lang w:val="sv-SE"/>
+        </w:rPr>
+        <w:t xml:space="preserve"> (STSA) agar bekerja pada pita frekuensi </w:t>
+      </w:r>
+      <w:r>
+        <w:rPr>
+          <w:rFonts w:ascii="Times New Roman" w:hAnsi="Times New Roman" w:cs="Times New Roman"/>
+          <w:i/>
+          <w:iCs/>
+          <w:lang w:val="sv-SE"/>
+        </w:rPr>
+        <w:t>K-Band</w:t>
+      </w:r>
+      <w:r>
+        <w:rPr>
+          <w:rFonts w:ascii="Times New Roman" w:hAnsi="Times New Roman" w:cs="Times New Roman"/>
+          <w:lang w:val="sv-SE"/>
+        </w:rPr>
+        <w:t xml:space="preserve"> untuk aplikasi radar otomotif. </w:t>
+      </w:r>
+    </w:p>
+    <w:p>
+      <w:pPr>
+        <w:pStyle w:val="ListParagraph"/>
+        <w:numPr>
+          <w:ilvl w:val="0"/>
+          <w:numId w:val="3"/>
+        </w:numPr>
+        <w:spacing w:line="360" w:lineRule="auto"/>
+        <w:jc w:val="both"/>
+        <w:rPr>
+          <w:rFonts w:ascii="Times New Roman" w:hAnsi="Times New Roman" w:cs="Times New Roman"/>
+          <w:lang w:val="sv-SE"/>
+        </w:rPr>
+      </w:pPr>
+      <w:r>
+        <w:rPr>
+          <w:rFonts w:ascii="Times New Roman" w:hAnsi="Times New Roman" w:cs="Times New Roman"/>
+          <w:lang w:val="sv-SE"/>
+        </w:rPr>
+        <w:t xml:space="preserve">Menganalisis pengaruh variasi profil </w:t>
+      </w:r>
+      <w:r>
+        <w:rPr>
+          <w:rFonts w:ascii="Times New Roman" w:hAnsi="Times New Roman" w:cs="Times New Roman"/>
+          <w:i/>
+          <w:iCs/>
+          <w:lang w:val="sv-SE"/>
+        </w:rPr>
+        <w:t>step-constant</w:t>
+      </w:r>
+      <w:r>
+        <w:rPr>
+          <w:rFonts w:ascii="Times New Roman" w:hAnsi="Times New Roman" w:cs="Times New Roman"/>
+          <w:lang w:val="sv-SE"/>
+        </w:rPr>
+        <w:t xml:space="preserve"> terhadap karakteristik elektromagnetik antena, meliputi distribusi arus permukaan, impedansi masukan, dan pola radiasi. </w:t>
+      </w:r>
+    </w:p>
+    <w:p>
+      <w:pPr>
+        <w:pStyle w:val="ListParagraph"/>
+        <w:numPr>
+          <w:ilvl w:val="0"/>
+          <w:numId w:val="3"/>
+        </w:numPr>
+        <w:spacing w:line="360" w:lineRule="auto"/>
+        <w:jc w:val="both"/>
+        <w:rPr>
+          <w:rFonts w:ascii="Times New Roman" w:hAnsi="Times New Roman" w:cs="Times New Roman"/>
+          <w:lang w:val="sv-SE"/>
+        </w:rPr>
+      </w:pPr>
+      <w:r>
+        <w:rPr>
+          <w:rFonts w:ascii="Times New Roman" w:hAnsi="Times New Roman" w:cs="Times New Roman"/>
+          <w:lang w:val="sv-SE"/>
+        </w:rPr>
+        <w:t xml:space="preserve">Mengevaluasi performa antena berdasarkan parameter utama, yaitu Return Loss, </w:t>
+      </w:r>
+      <w:r>
+        <w:rPr>
+          <w:rFonts w:ascii="Times New Roman" w:hAnsi="Times New Roman" w:cs="Times New Roman"/>
+          <w:i/>
+          <w:iCs/>
+          <w:lang w:val="sv-SE"/>
+        </w:rPr>
+        <w:t>Bandwidth</w:t>
+      </w:r>
+      <w:r>
+        <w:rPr>
+          <w:rFonts w:ascii="Times New Roman" w:hAnsi="Times New Roman" w:cs="Times New Roman"/>
+          <w:lang w:val="sv-SE"/>
+        </w:rPr>
+        <w:t xml:space="preserve">, </w:t>
+      </w:r>
+      <w:r>
+        <w:rPr>
+          <w:rFonts w:ascii="Times New Roman" w:hAnsi="Times New Roman" w:cs="Times New Roman"/>
+          <w:lang w:val="sv-SE"/>
+        </w:rPr>
+        <w:t xml:space="preserve">dan </w:t>
+      </w:r>
+      <w:r>
+        <w:rPr>
+          <w:rFonts w:ascii="Times New Roman" w:hAnsi="Times New Roman" w:cs="Times New Roman"/>
+          <w:i/>
+          <w:iCs/>
+          <w:lang w:val="sv-SE"/>
+        </w:rPr>
+        <w:t>Gain.</w:t>
+      </w:r>
+      <w:r>
+        <w:rPr>
+          <w:rFonts w:ascii="Times New Roman" w:hAnsi="Times New Roman" w:cs="Times New Roman"/>
+          <w:lang w:val="sv-SE"/>
+        </w:rPr>
+        <w:t xml:space="preserve"> </w:t>
+      </w:r>
+    </w:p>
+    <w:p>
+      <w:pPr>
+        <w:pStyle w:val="ListParagraph"/>
+        <w:numPr>
+          <w:ilvl w:val="0"/>
+          <w:numId w:val="3"/>
+        </w:numPr>
+        <w:spacing w:line="360" w:lineRule="auto"/>
+        <w:jc w:val="both"/>
+        <w:rPr>
+          <w:rFonts w:ascii="Times New Roman" w:hAnsi="Times New Roman" w:cs="Times New Roman"/>
+          <w:lang w:val="sv-SE"/>
+        </w:rPr>
+      </w:pPr>
+      <w:r>
+        <w:rPr>
+          <w:rFonts w:ascii="Times New Roman" w:hAnsi="Times New Roman" w:cs="Times New Roman"/>
+          <w:lang w:val="sv-SE"/>
+        </w:rPr>
+        <w:t xml:space="preserve">Menilai kesesuaian performa antena terhadap kebutuhan sistem radar otomotif jarak menengah pada pita </w:t>
+      </w:r>
+      <w:r>
+        <w:rPr>
+          <w:rFonts w:ascii="Times New Roman" w:hAnsi="Times New Roman" w:cs="Times New Roman"/>
+          <w:i/>
+          <w:iCs/>
+          <w:lang w:val="sv-SE"/>
+        </w:rPr>
+        <w:t>K-Band</w:t>
+      </w:r>
+      <w:r>
+        <w:rPr>
+          <w:rFonts w:ascii="Times New Roman" w:hAnsi="Times New Roman" w:cs="Times New Roman"/>
+          <w:lang w:val="sv-SE"/>
+        </w:rPr>
+        <w:t>.</w:t>
+      </w:r>
+    </w:p>
+    <w:p>
+      <w:pPr>
+        <w:pStyle w:val="Heading2"/>
+        <w:spacing w:line="360" w:lineRule="auto"/>
+        <w:ind w:hanging="720"/>
+        <w:rPr>
+          <w:sz w:val="24"/>
+          <w:szCs w:val="28"/>
+          <w:lang w:val="sv-SE"/>
+        </w:rPr>
+      </w:pPr>
+      <w:r>
+        <w:rPr>
+          <w:sz w:val="24"/>
+          <w:szCs w:val="28"/>
+          <w:lang w:val="sv-SE"/>
+        </w:rPr>
+        <w:t>Manfaat Penelitian</w:t>
+      </w:r>
+    </w:p>
+    <w:p>
+      <w:pPr>
+        <w:spacing w:after="0" w:line="360" w:lineRule="auto"/>
+        <w:jc w:val="both"/>
+        <w:rPr>
+          <w:rFonts w:ascii="Times New Roman" w:hAnsi="Times New Roman" w:cs="Times New Roman"/>
+          <w:lang w:val="sv-SE"/>
+        </w:rPr>
+      </w:pPr>
+      <w:r>
+        <w:rPr>
+          <w:rFonts w:ascii="Times New Roman" w:hAnsi="Times New Roman" w:cs="Times New Roman"/>
+          <w:lang w:val="sv-SE"/>
+        </w:rPr>
+        <w:t>Penelitian ini diharapkan dapat memberikan beberapa manfaat, baik secara akademis maupun praktis, sebagai berikut:</w:t>
+      </w:r>
+    </w:p>
+    <w:p>
+      <w:pPr>
+        <w:pStyle w:val="ListParagraph"/>
+        <w:numPr>
+          <w:ilvl w:val="0"/>
+          <w:numId w:val="5"/>
+        </w:numPr>
+        <w:spacing w:line="360" w:lineRule="auto"/>
+        <w:jc w:val="both"/>
+        <w:rPr>
+          <w:rFonts w:ascii="Times New Roman" w:hAnsi="Times New Roman" w:cs="Times New Roman"/>
+          <w:lang w:val="sv-SE"/>
+        </w:rPr>
+      </w:pPr>
+      <w:r>
+        <w:rPr>
+          <w:rFonts w:ascii="Times New Roman" w:hAnsi="Times New Roman" w:cs="Times New Roman"/>
+          <w:lang w:val="sv-SE"/>
+        </w:rPr>
+        <w:t>Manfaat Akademis</w:t>
+      </w:r>
+    </w:p>
+    <w:p>
+      <w:pPr>
+        <w:pStyle w:val="ListParagraph"/>
+        <w:spacing w:line="360" w:lineRule="auto"/>
+        <w:jc w:val="both"/>
+        <w:rPr>
+          <w:rFonts w:ascii="Times New Roman" w:hAnsi="Times New Roman" w:cs="Times New Roman"/>
+          <w:lang w:val="sv-SE"/>
+        </w:rPr>
+      </w:pPr>
+      <w:r>
+        <w:rPr>
+          <w:rFonts w:ascii="Times New Roman" w:hAnsi="Times New Roman" w:cs="Times New Roman"/>
+          <w:lang w:val="sv-SE"/>
+        </w:rPr>
+        <w:t xml:space="preserve">Penelitian ini diharapkan dapat memberikan kontribusi dalam pengembangan kajian di bidang antena gelombang mikro, khususnya pada desain </w:t>
+      </w:r>
+      <w:r>
+        <w:rPr>
+          <w:rFonts w:ascii="Times New Roman" w:hAnsi="Times New Roman" w:cs="Times New Roman"/>
+          <w:i/>
+          <w:iCs/>
+          <w:lang w:val="sv-SE"/>
+        </w:rPr>
+        <w:t>Tapered Slot Antenna</w:t>
+      </w:r>
+      <w:r>
+        <w:rPr>
+          <w:rFonts w:ascii="Times New Roman" w:hAnsi="Times New Roman" w:cs="Times New Roman"/>
+          <w:lang w:val="sv-SE"/>
+        </w:rPr>
+        <w:t xml:space="preserve"> dengan pendekatan </w:t>
       </w:r>
       <w:r>
         <w:rPr>
@@ -2226,198 +3471,1145 @@
           <w:rFonts w:ascii="Times New Roman" w:hAnsi="Times New Roman" w:cs="Times New Roman"/>
           <w:lang w:val="sv-SE"/>
         </w:rPr>
-        <w:t xml:space="preserve"> mampu menghasilkan </w:t>
-      </w:r>
-      <w:r>
-        <w:rPr>
-          <w:rFonts w:ascii="Times New Roman" w:hAnsi="Times New Roman" w:cs="Times New Roman"/>
-          <w:i/>
-          <w:iCs/>
-          <w:lang w:val="sv-SE"/>
-        </w:rPr>
-        <w:t>return loss</w:t>
-      </w:r>
-      <w:r>
-        <w:rPr>
-          <w:rFonts w:ascii="Times New Roman" w:hAnsi="Times New Roman" w:cs="Times New Roman"/>
-          <w:lang w:val="sv-SE"/>
-        </w:rPr>
-        <w:t xml:space="preserve"> yang baik, nilai VSWR di bawah 2, serta gain yang tinggi, sehingga berpotensi digunakan pada aplikasi radar </w:t>
-      </w:r>
-      <w:r>
-        <w:rPr>
-          <w:rFonts w:ascii="Times New Roman" w:hAnsi="Times New Roman" w:cs="Times New Roman"/>
-          <w:i/>
-          <w:iCs/>
-          <w:lang w:val="sv-SE"/>
-        </w:rPr>
-        <w:t>microwave</w:t>
-      </w:r>
-      <w:r>
-        <w:rPr>
-          <w:rFonts w:ascii="Times New Roman" w:hAnsi="Times New Roman" w:cs="Times New Roman"/>
-          <w:lang w:val="sv-SE"/>
-        </w:rPr>
-        <w:t xml:space="preserve"> dan sistem komunikasi frekuensi tinggi (Aktar et al., 2019; Prasanna et al., 2019; Chen et al., 2009).</w:t>
+        <w:t xml:space="preserve">. Hasil penelitian ini juga dapat menjadi referensi bagi penelitian selanjutnya yang berkaitan dengan pengembangan antena pada pita frekuensi </w:t>
+      </w:r>
+      <w:r>
+        <w:rPr>
+          <w:rFonts w:ascii="Times New Roman" w:hAnsi="Times New Roman" w:cs="Times New Roman"/>
+          <w:i/>
+          <w:iCs/>
+          <w:lang w:val="sv-SE"/>
+        </w:rPr>
+        <w:t>K-Band</w:t>
+      </w:r>
+      <w:r>
+        <w:rPr>
+          <w:rFonts w:ascii="Times New Roman" w:hAnsi="Times New Roman" w:cs="Times New Roman"/>
+          <w:lang w:val="sv-SE"/>
+        </w:rPr>
+        <w:t>, terutama untuk aplikasi sistem radar.</w:t>
+      </w:r>
+    </w:p>
+    <w:p>
+      <w:pPr>
+        <w:pStyle w:val="ListParagraph"/>
+        <w:numPr>
+          <w:ilvl w:val="0"/>
+          <w:numId w:val="5"/>
+        </w:numPr>
+        <w:spacing w:line="360" w:lineRule="auto"/>
+        <w:jc w:val="both"/>
+        <w:rPr>
+          <w:rFonts w:ascii="Times New Roman" w:hAnsi="Times New Roman" w:cs="Times New Roman"/>
+          <w:lang w:val="sv-SE"/>
+        </w:rPr>
+      </w:pPr>
+      <w:r>
+        <w:rPr>
+          <w:rFonts w:ascii="Times New Roman" w:hAnsi="Times New Roman" w:cs="Times New Roman"/>
+          <w:lang w:val="sv-SE"/>
+        </w:rPr>
+        <w:t>Manfaat Praktis</w:t>
+      </w:r>
+    </w:p>
+    <w:p>
+      <w:pPr>
+        <w:pStyle w:val="ListParagraph"/>
+        <w:spacing w:line="360" w:lineRule="auto"/>
+        <w:jc w:val="both"/>
+        <w:rPr>
+          <w:rFonts w:ascii="Times New Roman" w:hAnsi="Times New Roman" w:cs="Times New Roman"/>
+          <w:lang w:val="sv-SE"/>
+        </w:rPr>
+      </w:pPr>
+      <w:r>
+        <w:rPr>
+          <w:rFonts w:ascii="Times New Roman" w:hAnsi="Times New Roman" w:cs="Times New Roman"/>
+          <w:lang w:val="sv-SE"/>
+        </w:rPr>
+        <w:lastRenderedPageBreak/>
+        <w:t xml:space="preserve">Penelitian ini diharapkan dapat memberikan manfaat praktis dalam pengembangan teknologi antena untuk sistem radar berbasis gelombang mikro, khususnya pada aplikasi radar otomotif. </w:t>
+      </w:r>
+      <w:r>
+        <w:rPr>
+          <w:rFonts w:ascii="Times New Roman" w:hAnsi="Times New Roman" w:cs="Times New Roman"/>
+          <w:lang w:val="sv-SE"/>
+        </w:rPr>
+        <w:t xml:space="preserve">Desain antena </w:t>
+      </w:r>
+      <w:r>
+        <w:rPr>
+          <w:rFonts w:ascii="Times New Roman" w:hAnsi="Times New Roman" w:cs="Times New Roman"/>
+          <w:i/>
+          <w:iCs/>
+          <w:lang w:val="sv-SE"/>
+        </w:rPr>
+        <w:t xml:space="preserve">Step-Constant Tapered Slot </w:t>
+      </w:r>
+      <w:r>
+        <w:rPr>
+          <w:rFonts w:ascii="Times New Roman" w:hAnsi="Times New Roman" w:cs="Times New Roman"/>
+          <w:lang w:val="sv-SE"/>
+        </w:rPr>
+        <w:t xml:space="preserve">yang dikembangkan pada penelitian ini diharapkan mampu menghasilkan karakteristik impedansi yang baik, gain yang tinggi, serta pola radiasi yang stabil pada pita frekuensi </w:t>
+      </w:r>
+      <w:r>
+        <w:rPr>
+          <w:rFonts w:ascii="Times New Roman" w:hAnsi="Times New Roman" w:cs="Times New Roman"/>
+          <w:i/>
+          <w:iCs/>
+          <w:lang w:val="sv-SE"/>
+        </w:rPr>
+        <w:t>K-</w:t>
+      </w:r>
+      <w:r>
+        <w:rPr>
+          <w:rFonts w:ascii="Times New Roman" w:hAnsi="Times New Roman" w:cs="Times New Roman"/>
+          <w:i/>
+          <w:iCs/>
+          <w:lang w:val="sv-SE"/>
+        </w:rPr>
+        <w:t>Band</w:t>
+      </w:r>
+      <w:r>
+        <w:rPr>
+          <w:rFonts w:ascii="Times New Roman" w:hAnsi="Times New Roman" w:cs="Times New Roman"/>
+          <w:lang w:val="sv-SE"/>
+        </w:rPr>
+        <w:t>.</w:t>
+      </w:r>
+      <w:r>
+        <w:rPr>
+          <w:rFonts w:ascii="Times New Roman" w:hAnsi="Times New Roman" w:cs="Times New Roman"/>
+          <w:lang w:val="sv-SE"/>
+        </w:rPr>
+        <w:t>Dengan</w:t>
+      </w:r>
+      <w:r>
+        <w:rPr>
+          <w:rFonts w:ascii="Times New Roman" w:hAnsi="Times New Roman" w:cs="Times New Roman"/>
+          <w:lang w:val="sv-SE"/>
+        </w:rPr>
+        <w:t xml:space="preserve"> demikian, hasil penelitian ini berpotensi menjadi salah satu referensi dalam perancangan antena radar yang lebih efisien, mudah difabrikasi, dan dapat mendukung kebutuhan sistem radar pada kendaraan modern, terutama pada teknologi </w:t>
+      </w:r>
+      <w:r>
+        <w:rPr>
+          <w:rFonts w:ascii="Times New Roman" w:hAnsi="Times New Roman" w:cs="Times New Roman"/>
+          <w:i/>
+          <w:iCs/>
+          <w:lang w:val="sv-SE"/>
+        </w:rPr>
+        <w:t>Advanced Driver Assistance System (ADAS)</w:t>
+      </w:r>
+      <w:r>
+        <w:rPr>
+          <w:rFonts w:ascii="Times New Roman" w:hAnsi="Times New Roman" w:cs="Times New Roman"/>
+          <w:lang w:val="sv-SE"/>
+        </w:rPr>
+        <w:t>.</w:t>
       </w:r>
     </w:p>
     <w:p>
       <w:pPr>
         <w:pStyle w:val="Heading2"/>
+        <w:spacing w:line="360" w:lineRule="auto"/>
         <w:ind w:hanging="720"/>
         <w:rPr>
-          <w:lang w:val="sv-SE"/>
-        </w:rPr>
-      </w:pPr>
-      <w:r>
-        <w:rPr>
-          <w:lang w:val="sv-SE"/>
-        </w:rPr>
+          <w:sz w:val="24"/>
+          <w:szCs w:val="28"/>
+          <w:lang w:val="sv-SE"/>
+        </w:rPr>
+      </w:pPr>
+      <w:r>
+        <w:rPr>
+          <w:sz w:val="24"/>
+          <w:szCs w:val="28"/>
+          <w:lang w:val="sv-SE"/>
+        </w:rPr>
+        <w:t>Ruang Lingkup Penelitian</w:t>
+      </w:r>
+    </w:p>
+    <w:p>
+      <w:pPr>
+        <w:spacing w:after="0" w:line="360" w:lineRule="auto"/>
+        <w:jc w:val="both"/>
+        <w:rPr>
+          <w:rFonts w:ascii="Times New Roman" w:hAnsi="Times New Roman" w:cs="Times New Roman"/>
+          <w:lang w:val="sv-SE"/>
+        </w:rPr>
+      </w:pPr>
+      <w:r>
+        <w:rPr>
+          <w:rFonts w:ascii="Times New Roman" w:hAnsi="Times New Roman" w:cs="Times New Roman"/>
+          <w:lang w:val="sv-SE"/>
+        </w:rPr>
+        <w:t xml:space="preserve">Agar penelitian ini lebih terarah dan fokus pada tujuan yang ingin dicapai, maka penulis menetapkan batasan-batasan masalah sebagai berikut: </w:t>
+      </w:r>
+    </w:p>
+    <w:p>
+      <w:pPr>
+        <w:pStyle w:val="ListParagraph"/>
+        <w:numPr>
+          <w:ilvl w:val="0"/>
+          <w:numId w:val="4"/>
+        </w:numPr>
+        <w:spacing w:line="360" w:lineRule="auto"/>
+        <w:jc w:val="both"/>
+        <w:rPr>
+          <w:rFonts w:ascii="Times New Roman" w:hAnsi="Times New Roman" w:cs="Times New Roman"/>
+          <w:lang w:val="sv-SE"/>
+        </w:rPr>
+      </w:pPr>
+      <w:r>
+        <w:rPr>
+          <w:rFonts w:ascii="Times New Roman" w:hAnsi="Times New Roman" w:cs="Times New Roman"/>
+          <w:lang w:val="sv-SE"/>
+        </w:rPr>
+        <w:t xml:space="preserve">Desain antena yang dikaji adalah Antena </w:t>
+      </w:r>
+      <w:r>
+        <w:rPr>
+          <w:rFonts w:ascii="Times New Roman" w:hAnsi="Times New Roman" w:cs="Times New Roman"/>
+          <w:i/>
+          <w:iCs/>
+          <w:lang w:val="sv-SE"/>
+        </w:rPr>
+        <w:t>Tapered Slo</w:t>
+      </w:r>
+      <w:r>
+        <w:rPr>
+          <w:rFonts w:ascii="Times New Roman" w:hAnsi="Times New Roman" w:cs="Times New Roman"/>
+          <w:lang w:val="sv-SE"/>
+        </w:rPr>
+        <w:t xml:space="preserve">t (TSA) dengan profil geometri </w:t>
+      </w:r>
+      <w:r>
+        <w:rPr>
+          <w:rFonts w:ascii="Times New Roman" w:hAnsi="Times New Roman" w:cs="Times New Roman"/>
+          <w:i/>
+          <w:iCs/>
+          <w:lang w:val="sv-SE"/>
+        </w:rPr>
+        <w:t>Step-Constant</w:t>
+      </w:r>
+      <w:r>
+        <w:rPr>
+          <w:rFonts w:ascii="Times New Roman" w:hAnsi="Times New Roman" w:cs="Times New Roman"/>
+          <w:lang w:val="sv-SE"/>
+        </w:rPr>
+        <w:t>, bukan profil eksponensial standar ataupun jenis antena lain (seperti Patch atau Horn).</w:t>
+      </w:r>
+    </w:p>
+    <w:p>
+      <w:pPr>
+        <w:pStyle w:val="ListParagraph"/>
+        <w:numPr>
+          <w:ilvl w:val="0"/>
+          <w:numId w:val="4"/>
+        </w:numPr>
+        <w:spacing w:line="360" w:lineRule="auto"/>
+        <w:jc w:val="both"/>
+        <w:rPr>
+          <w:rFonts w:ascii="Times New Roman" w:hAnsi="Times New Roman" w:cs="Times New Roman"/>
+          <w:lang w:val="sv-SE"/>
+        </w:rPr>
+      </w:pPr>
+      <w:r>
+        <w:rPr>
+          <w:rFonts w:ascii="Times New Roman" w:hAnsi="Times New Roman" w:cs="Times New Roman"/>
+          <w:lang w:val="sv-SE"/>
+        </w:rPr>
+        <w:t>Antena dirancang untuk beroperasi pada frekuensi tengah 19 GHz dengan rentang frekuensi kerja (</w:t>
+      </w:r>
+      <w:r>
+        <w:rPr>
+          <w:rFonts w:ascii="Times New Roman" w:hAnsi="Times New Roman" w:cs="Times New Roman"/>
+          <w:i/>
+          <w:iCs/>
+          <w:lang w:val="sv-SE"/>
+        </w:rPr>
+        <w:t>bandwidth</w:t>
+      </w:r>
+      <w:r>
+        <w:rPr>
+          <w:rFonts w:ascii="Times New Roman" w:hAnsi="Times New Roman" w:cs="Times New Roman"/>
+          <w:lang w:val="sv-SE"/>
+        </w:rPr>
+        <w:t>) yang disesuaikan untuk alokasi radar otomotif umumnya pada frekuensi K-Band.</w:t>
+      </w:r>
+    </w:p>
+    <w:p>
+      <w:pPr>
+        <w:pStyle w:val="ListParagraph"/>
+        <w:numPr>
+          <w:ilvl w:val="0"/>
+          <w:numId w:val="4"/>
+        </w:numPr>
+        <w:spacing w:line="360" w:lineRule="auto"/>
+        <w:jc w:val="both"/>
+        <w:rPr>
+          <w:rFonts w:ascii="Times New Roman" w:hAnsi="Times New Roman" w:cs="Times New Roman"/>
+          <w:lang w:val="sv-SE"/>
+        </w:rPr>
+      </w:pPr>
+      <w:r>
+        <w:rPr>
+          <w:rFonts w:ascii="Times New Roman" w:hAnsi="Times New Roman" w:cs="Times New Roman"/>
+          <w:lang w:val="sv-SE"/>
+        </w:rPr>
+        <w:t>Penelitian ini terbatas pada perancangan dan simulasi menggunakan perangkat lunak CST Studio Suite. Penelitian ini mencakup fabrikasi, pengukuran di anechoic chamber</w:t>
+      </w:r>
+    </w:p>
+    <w:p>
+      <w:pPr>
+        <w:pStyle w:val="ListParagraph"/>
+        <w:numPr>
+          <w:ilvl w:val="0"/>
+          <w:numId w:val="4"/>
+        </w:numPr>
+        <w:spacing w:line="360" w:lineRule="auto"/>
+        <w:jc w:val="both"/>
+        <w:rPr>
+          <w:rFonts w:ascii="Times New Roman" w:hAnsi="Times New Roman" w:cs="Times New Roman"/>
+          <w:lang w:val="sv-SE"/>
+        </w:rPr>
+      </w:pPr>
+      <w:r>
+        <w:rPr>
+          <w:rFonts w:ascii="Times New Roman" w:hAnsi="Times New Roman" w:cs="Times New Roman"/>
+          <w:lang w:val="sv-SE"/>
+        </w:rPr>
+        <w:t xml:space="preserve">Parameter yang dianalisis difokuskan pada karakteristik elektromagnetik antena, meliputi: </w:t>
+      </w:r>
+      <w:r>
+        <w:rPr>
+          <w:rFonts w:ascii="Times New Roman" w:hAnsi="Times New Roman" w:cs="Times New Roman"/>
+          <w:i/>
+          <w:iCs/>
+          <w:lang w:val="sv-SE"/>
+        </w:rPr>
+        <w:t>Return Loss</w:t>
+      </w:r>
+      <w:r>
+        <w:rPr>
+          <w:rFonts w:ascii="Times New Roman" w:hAnsi="Times New Roman" w:cs="Times New Roman"/>
+          <w:lang w:val="sv-SE"/>
+        </w:rPr>
+        <w:t>,</w:t>
+      </w:r>
+      <w:r>
+        <w:rPr>
+          <w:rFonts w:ascii="Times New Roman" w:hAnsi="Times New Roman" w:cs="Times New Roman"/>
+          <w:i/>
+          <w:iCs/>
+          <w:lang w:val="sv-SE"/>
+        </w:rPr>
+        <w:t>Voltage Standing Wave Ratio</w:t>
+      </w:r>
+      <w:r>
+        <w:rPr>
+          <w:rFonts w:ascii="Times New Roman" w:hAnsi="Times New Roman" w:cs="Times New Roman"/>
+          <w:lang w:val="sv-SE"/>
+        </w:rPr>
+        <w:t xml:space="preserve"> (VSWR), </w:t>
+      </w:r>
+      <w:r>
+        <w:rPr>
+          <w:rFonts w:ascii="Times New Roman" w:hAnsi="Times New Roman" w:cs="Times New Roman"/>
+          <w:i/>
+          <w:iCs/>
+          <w:lang w:val="sv-SE"/>
+        </w:rPr>
+        <w:t>Gain</w:t>
+      </w:r>
+      <w:r>
+        <w:rPr>
+          <w:rFonts w:ascii="Times New Roman" w:hAnsi="Times New Roman" w:cs="Times New Roman"/>
+          <w:lang w:val="sv-SE"/>
+        </w:rPr>
+        <w:t>,</w:t>
+      </w:r>
+      <w:r>
+        <w:rPr>
+          <w:rFonts w:ascii="Times New Roman" w:hAnsi="Times New Roman" w:cs="Times New Roman"/>
+          <w:lang w:val="sv-SE"/>
+        </w:rPr>
+        <w:t xml:space="preserve"> dan </w:t>
+      </w:r>
+      <w:r>
+        <w:rPr>
+          <w:rFonts w:ascii="Times New Roman" w:hAnsi="Times New Roman" w:cs="Times New Roman"/>
+          <w:i/>
+          <w:iCs/>
+          <w:lang w:val="sv-SE"/>
+        </w:rPr>
+        <w:t>Bandwidth</w:t>
+      </w:r>
+      <w:r>
+        <w:rPr>
+          <w:rFonts w:ascii="Times New Roman" w:hAnsi="Times New Roman" w:cs="Times New Roman"/>
+          <w:lang w:val="sv-SE"/>
+        </w:rPr>
+        <w:t xml:space="preserve">. </w:t>
+      </w:r>
+      <w:r>
+        <w:rPr>
+          <w:lang w:val="sv-SE"/>
+        </w:rPr>
+        <w:br w:type="page"/>
+      </w:r>
+    </w:p>
+    <w:p>
+      <w:pPr>
+        <w:pStyle w:val="Heading"/>
+        <w:spacing w:line="360" w:lineRule="auto"/>
+        <w:jc w:val="center"/>
+        <w:rPr>
+          <w:lang w:val="sv-SE"/>
+        </w:rPr>
+        <w:sectPr>
+          <w:headerReference w:type="default" r:id="rId9"/>
+          <w:headerReference w:type="first" r:id="rId10"/>
+          <w:footerReference w:type="first" r:id="rId11"/>
+          <w:pgSz w:w="11906" w:h="16838" w:code="9"/>
+          <w:pgMar w:top="2268" w:right="1701" w:bottom="1701" w:left="2268" w:header="1417" w:footer="720" w:gutter="0"/>
+          <w:pgNumType w:start="1"/>
+          <w:cols w:space="720"/>
+          <w:titlePg/>
+          <w:docGrid w:linePitch="360"/>
+        </w:sectPr>
+      </w:pPr>
+    </w:p>
+    <w:p>
+      <w:pPr>
+        <w:pStyle w:val="Heading"/>
+        <w:spacing w:line="360" w:lineRule="auto"/>
+        <w:jc w:val="center"/>
+      </w:pPr>
+      <w:r>
         <w:lastRenderedPageBreak/>
-        <w:t>Rumusan Masalah</w:t>
-      </w:r>
-    </w:p>
-    <w:p>
-      <w:pPr>
-        <w:pStyle w:val="Heading2"/>
-        <w:ind w:hanging="720"/>
-        <w:rPr>
-          <w:lang w:val="sv-SE"/>
-        </w:rPr>
-      </w:pPr>
-      <w:r>
-        <w:rPr>
-          <w:lang w:val="sv-SE"/>
-        </w:rPr>
-        <w:t>Tujuan Penelitian</w:t>
-      </w:r>
-    </w:p>
-    <w:p>
-      <w:pPr>
-        <w:pStyle w:val="Heading2"/>
-        <w:ind w:hanging="720"/>
-        <w:rPr>
-          <w:lang w:val="sv-SE"/>
-        </w:rPr>
-      </w:pPr>
-      <w:r>
-        <w:rPr>
-          <w:lang w:val="sv-SE"/>
-        </w:rPr>
-        <w:t>Manfaat Penelitian</w:t>
-      </w:r>
-    </w:p>
-    <w:p>
-      <w:pPr>
-        <w:pStyle w:val="Heading2"/>
-        <w:ind w:hanging="720"/>
-        <w:rPr>
-          <w:lang w:val="sv-SE"/>
-        </w:rPr>
-      </w:pPr>
-      <w:r>
-        <w:rPr>
-          <w:lang w:val="sv-SE"/>
-        </w:rPr>
-        <w:t>Ruang Lingkup Penelitian</w:t>
-      </w:r>
-    </w:p>
-    <w:p>
-      <w:pPr>
-        <w:rPr>
-          <w:rFonts w:ascii="Times New Roman" w:eastAsiaTheme="majorEastAsia" w:hAnsi="Times New Roman" w:cstheme="majorBidi"/>
-          <w:b/>
-          <w:color w:val="000000" w:themeColor="text1"/>
-          <w:sz w:val="28"/>
-          <w:szCs w:val="32"/>
-          <w:lang w:val="sv-SE"/>
-        </w:rPr>
-      </w:pPr>
-      <w:r>
-        <w:rPr>
-          <w:lang w:val="sv-SE"/>
-        </w:rPr>
-        <w:br w:type="page"/>
+        <w:t>DAFTAR PUSTAKA</w:t>
       </w:r>
     </w:p>
     <w:p>
       <w:pPr>
         <w:pStyle w:val="Bibliography"/>
-        <w:rPr>
-          <w:rFonts w:ascii="Times New Roman" w:hAnsi="Times New Roman" w:cs="Times New Roman"/>
-          <w:sz w:val="28"/>
-        </w:rPr>
-      </w:pPr>
-      <w:r>
-        <w:rPr>
-          <w:lang w:val="sv-SE"/>
+        <w:spacing w:line="360" w:lineRule="auto"/>
+        <w:jc w:val="both"/>
+        <w:rPr>
+          <w:rFonts w:ascii="Times New Roman" w:hAnsi="Times New Roman" w:cs="Times New Roman"/>
+          <w:sz w:val="28"/>
+        </w:rPr>
+      </w:pPr>
+      <w:r>
+        <w:rPr>
+          <w:lang w:val="sv-SE"/>
+        </w:rPr>
+        <w:fldChar w:fldCharType="begin"/>
+      </w:r>
+      <w:r>
+        <w:instrText xml:space="preserve"> ADDIN ZOTERO_BIBL {"uncited":[],"omitted":[],"custom":[]} CSL_BIBLIOGRAPHY </w:instrText>
+      </w:r>
+      <w:r>
+        <w:rPr>
+          <w:lang w:val="sv-SE"/>
+        </w:rPr>
+        <w:fldChar w:fldCharType="separate"/>
+      </w:r>
+      <w:r>
+        <w:rPr>
+          <w:rFonts w:ascii="Times New Roman" w:hAnsi="Times New Roman" w:cs="Times New Roman"/>
+          <w:sz w:val="28"/>
+        </w:rPr>
+        <w:t xml:space="preserve">Abd El-Hameed, A. S., Ouf, E. G., Elboushi, A., Seliem, A. G., &amp; Izumi, Y. (2023). An Improved Performance Radar Sensor for K-Band Automotive Radars. </w:t>
+      </w:r>
+      <w:r>
+        <w:rPr>
+          <w:rFonts w:ascii="Times New Roman" w:hAnsi="Times New Roman" w:cs="Times New Roman"/>
+          <w:i/>
+          <w:iCs/>
+          <w:sz w:val="28"/>
+        </w:rPr>
+        <w:t>Sensors</w:t>
+      </w:r>
+      <w:r>
+        <w:rPr>
+          <w:rFonts w:ascii="Times New Roman" w:hAnsi="Times New Roman" w:cs="Times New Roman"/>
+          <w:sz w:val="28"/>
+        </w:rPr>
+        <w:t xml:space="preserve">, </w:t>
+      </w:r>
+      <w:r>
+        <w:rPr>
+          <w:rFonts w:ascii="Times New Roman" w:hAnsi="Times New Roman" w:cs="Times New Roman"/>
+          <w:i/>
+          <w:iCs/>
+          <w:sz w:val="28"/>
+        </w:rPr>
+        <w:t>23</w:t>
+      </w:r>
+      <w:r>
+        <w:rPr>
+          <w:rFonts w:ascii="Times New Roman" w:hAnsi="Times New Roman" w:cs="Times New Roman"/>
+          <w:sz w:val="28"/>
+        </w:rPr>
+        <w:t>(16), 7070. https://doi.org/10.3390/s23167070</w:t>
+      </w:r>
+    </w:p>
+    <w:p>
+      <w:pPr>
+        <w:pStyle w:val="Bibliography"/>
+        <w:spacing w:line="360" w:lineRule="auto"/>
+        <w:jc w:val="both"/>
+        <w:rPr>
+          <w:rFonts w:ascii="Times New Roman" w:hAnsi="Times New Roman" w:cs="Times New Roman"/>
+          <w:sz w:val="28"/>
+        </w:rPr>
+      </w:pPr>
+      <w:r>
+        <w:rPr>
+          <w:rFonts w:ascii="Times New Roman" w:hAnsi="Times New Roman" w:cs="Times New Roman"/>
+          <w:sz w:val="28"/>
+        </w:rPr>
+        <w:t xml:space="preserve">Aktar, M., Rana, Md. M., Hossain, Md. S., &amp; Hossain, Md. B. (2019). Design and Implementation of Step-Constant Tapered Slot Antennas for UWB Application. </w:t>
+      </w:r>
+      <w:r>
+        <w:rPr>
+          <w:rFonts w:ascii="Times New Roman" w:hAnsi="Times New Roman" w:cs="Times New Roman"/>
+          <w:i/>
+          <w:iCs/>
+          <w:sz w:val="28"/>
+        </w:rPr>
+        <w:t>Journal of Sensor Technology</w:t>
+      </w:r>
+      <w:r>
+        <w:rPr>
+          <w:rFonts w:ascii="Times New Roman" w:hAnsi="Times New Roman" w:cs="Times New Roman"/>
+          <w:sz w:val="28"/>
+        </w:rPr>
+        <w:t xml:space="preserve">, </w:t>
+      </w:r>
+      <w:r>
+        <w:rPr>
+          <w:rFonts w:ascii="Times New Roman" w:hAnsi="Times New Roman" w:cs="Times New Roman"/>
+          <w:i/>
+          <w:iCs/>
+          <w:sz w:val="28"/>
+        </w:rPr>
+        <w:t>09</w:t>
+      </w:r>
+      <w:r>
+        <w:rPr>
+          <w:rFonts w:ascii="Times New Roman" w:hAnsi="Times New Roman" w:cs="Times New Roman"/>
+          <w:sz w:val="28"/>
+        </w:rPr>
+        <w:t>(04), 91–100. https://doi.org/10.4236/jst.2019.94008</w:t>
+      </w:r>
+    </w:p>
+    <w:p>
+      <w:pPr>
+        <w:pStyle w:val="Bibliography"/>
+        <w:spacing w:line="360" w:lineRule="auto"/>
+        <w:jc w:val="both"/>
+        <w:rPr>
+          <w:rFonts w:ascii="Times New Roman" w:hAnsi="Times New Roman" w:cs="Times New Roman"/>
+          <w:sz w:val="28"/>
+        </w:rPr>
+      </w:pPr>
+      <w:r>
+        <w:rPr>
+          <w:rFonts w:ascii="Times New Roman" w:hAnsi="Times New Roman" w:cs="Times New Roman"/>
+          <w:sz w:val="28"/>
+        </w:rPr>
+        <w:t xml:space="preserve">Balanis, C. A. (2005). </w:t>
+      </w:r>
+      <w:r>
+        <w:rPr>
+          <w:rFonts w:ascii="Times New Roman" w:hAnsi="Times New Roman" w:cs="Times New Roman"/>
+          <w:i/>
+          <w:iCs/>
+          <w:sz w:val="28"/>
+        </w:rPr>
+        <w:t>Antenna theory: Analysis and design</w:t>
+      </w:r>
+      <w:r>
+        <w:rPr>
+          <w:rFonts w:ascii="Times New Roman" w:hAnsi="Times New Roman" w:cs="Times New Roman"/>
+          <w:sz w:val="28"/>
+        </w:rPr>
+        <w:t xml:space="preserve"> (3. ed). Wiley-Interscience.</w:t>
+      </w:r>
+    </w:p>
+    <w:p>
+      <w:pPr>
+        <w:pStyle w:val="Bibliography"/>
+        <w:spacing w:line="360" w:lineRule="auto"/>
+        <w:jc w:val="both"/>
+        <w:rPr>
+          <w:rFonts w:ascii="Times New Roman" w:hAnsi="Times New Roman" w:cs="Times New Roman"/>
+          <w:sz w:val="28"/>
+        </w:rPr>
+      </w:pPr>
+      <w:r>
+        <w:rPr>
+          <w:rFonts w:ascii="Times New Roman" w:hAnsi="Times New Roman" w:cs="Times New Roman"/>
+          <w:sz w:val="28"/>
+        </w:rPr>
+        <w:t xml:space="preserve">Biswas, P., Sur, S. N., Bera, R., Imoize, A. L., &amp; Li, C.-T. (2025). Advanced Signal Processing and Modeling Techniques for Automotive Radar: Challenges and Innovations in ADAS Applications. </w:t>
+      </w:r>
+      <w:r>
+        <w:rPr>
+          <w:rFonts w:ascii="Times New Roman" w:hAnsi="Times New Roman" w:cs="Times New Roman"/>
+          <w:i/>
+          <w:iCs/>
+          <w:sz w:val="28"/>
+        </w:rPr>
+        <w:t>Computer Modeling in Engineering &amp; Sciences</w:t>
+      </w:r>
+      <w:r>
+        <w:rPr>
+          <w:rFonts w:ascii="Times New Roman" w:hAnsi="Times New Roman" w:cs="Times New Roman"/>
+          <w:sz w:val="28"/>
+        </w:rPr>
+        <w:t xml:space="preserve">, </w:t>
+      </w:r>
+      <w:r>
+        <w:rPr>
+          <w:rFonts w:ascii="Times New Roman" w:hAnsi="Times New Roman" w:cs="Times New Roman"/>
+          <w:i/>
+          <w:iCs/>
+          <w:sz w:val="28"/>
+        </w:rPr>
+        <w:t>144</w:t>
+      </w:r>
+      <w:r>
+        <w:rPr>
+          <w:rFonts w:ascii="Times New Roman" w:hAnsi="Times New Roman" w:cs="Times New Roman"/>
+          <w:sz w:val="28"/>
+        </w:rPr>
+        <w:t>(1), 83–146. https://doi.org/10.32604/cmes.2025.067724</w:t>
+      </w:r>
+    </w:p>
+    <w:p>
+      <w:pPr>
+        <w:pStyle w:val="Bibliography"/>
+        <w:spacing w:line="360" w:lineRule="auto"/>
+        <w:jc w:val="both"/>
+        <w:rPr>
+          <w:rFonts w:ascii="Times New Roman" w:hAnsi="Times New Roman" w:cs="Times New Roman"/>
+          <w:sz w:val="28"/>
+        </w:rPr>
+      </w:pPr>
+      <w:r>
+        <w:rPr>
+          <w:rFonts w:ascii="Times New Roman" w:hAnsi="Times New Roman" w:cs="Times New Roman"/>
+          <w:sz w:val="28"/>
+        </w:rPr>
+        <w:t xml:space="preserve">Dae-Heon Lee, Hae-Yong Yang, &amp; Young-Ki Cho. (2012). Tapered Slot Antenna With Band-Notched Function for Ultrawideband Radios. </w:t>
+      </w:r>
+      <w:r>
+        <w:rPr>
+          <w:rFonts w:ascii="Times New Roman" w:hAnsi="Times New Roman" w:cs="Times New Roman"/>
+          <w:i/>
+          <w:iCs/>
+          <w:sz w:val="28"/>
+        </w:rPr>
+        <w:t>IEEE Antennas and Wireless Propagation Letters</w:t>
+      </w:r>
+      <w:r>
+        <w:rPr>
+          <w:rFonts w:ascii="Times New Roman" w:hAnsi="Times New Roman" w:cs="Times New Roman"/>
+          <w:sz w:val="28"/>
+        </w:rPr>
+        <w:t xml:space="preserve">, </w:t>
+      </w:r>
+      <w:r>
+        <w:rPr>
+          <w:rFonts w:ascii="Times New Roman" w:hAnsi="Times New Roman" w:cs="Times New Roman"/>
+          <w:i/>
+          <w:iCs/>
+          <w:sz w:val="28"/>
+        </w:rPr>
+        <w:t>11</w:t>
+      </w:r>
+      <w:r>
+        <w:rPr>
+          <w:rFonts w:ascii="Times New Roman" w:hAnsi="Times New Roman" w:cs="Times New Roman"/>
+          <w:sz w:val="28"/>
+        </w:rPr>
+        <w:t>, 682–685. https://doi.org/10.1109/LAWP.2012.2204718</w:t>
+      </w:r>
+    </w:p>
+    <w:p>
+      <w:pPr>
+        <w:pStyle w:val="Bibliography"/>
+        <w:spacing w:line="360" w:lineRule="auto"/>
+        <w:jc w:val="both"/>
+        <w:rPr>
+          <w:rFonts w:ascii="Times New Roman" w:hAnsi="Times New Roman" w:cs="Times New Roman"/>
+          <w:sz w:val="28"/>
+        </w:rPr>
+      </w:pPr>
+      <w:r>
+        <w:rPr>
+          <w:rFonts w:ascii="Times New Roman" w:hAnsi="Times New Roman" w:cs="Times New Roman"/>
+          <w:sz w:val="28"/>
+        </w:rPr>
+        <w:t xml:space="preserve">Darimireddy, N. K., Mohan Rao, U., Park, C.-W., Fofana, I., Sujatha, M., &amp; Verma, A. K. (2021). Perspectives of Convertors and Communication Aspects in Automated Vehicles, Part 2: Printed Antennas and Sensors for Automotive Radars. </w:t>
+      </w:r>
+      <w:r>
+        <w:rPr>
+          <w:rFonts w:ascii="Times New Roman" w:hAnsi="Times New Roman" w:cs="Times New Roman"/>
+          <w:i/>
+          <w:iCs/>
+          <w:sz w:val="28"/>
+        </w:rPr>
+        <w:t>Energies</w:t>
+      </w:r>
+      <w:r>
+        <w:rPr>
+          <w:rFonts w:ascii="Times New Roman" w:hAnsi="Times New Roman" w:cs="Times New Roman"/>
+          <w:sz w:val="28"/>
+        </w:rPr>
+        <w:t xml:space="preserve">, </w:t>
+      </w:r>
+      <w:r>
+        <w:rPr>
+          <w:rFonts w:ascii="Times New Roman" w:hAnsi="Times New Roman" w:cs="Times New Roman"/>
+          <w:i/>
+          <w:iCs/>
+          <w:sz w:val="28"/>
+        </w:rPr>
+        <w:t>14</w:t>
+      </w:r>
+      <w:r>
+        <w:rPr>
+          <w:rFonts w:ascii="Times New Roman" w:hAnsi="Times New Roman" w:cs="Times New Roman"/>
+          <w:sz w:val="28"/>
+        </w:rPr>
+        <w:t>(6), 1656. https://doi.org/10.3390/en14061656</w:t>
+      </w:r>
+    </w:p>
+    <w:p>
+      <w:pPr>
+        <w:pStyle w:val="Bibliography"/>
+        <w:spacing w:line="360" w:lineRule="auto"/>
+        <w:jc w:val="both"/>
+        <w:rPr>
+          <w:rFonts w:ascii="Times New Roman" w:hAnsi="Times New Roman" w:cs="Times New Roman"/>
+          <w:sz w:val="28"/>
+        </w:rPr>
+      </w:pPr>
+      <w:r>
+        <w:rPr>
+          <w:rFonts w:ascii="Times New Roman" w:hAnsi="Times New Roman" w:cs="Times New Roman"/>
+          <w:sz w:val="28"/>
         </w:rPr>
         <w:lastRenderedPageBreak/>
-        <w:fldChar w:fldCharType="begin"/>
-      </w:r>
-      <w:r>
-        <w:instrText xml:space="preserve"> ADDIN ZOTERO_BIBL {"uncited":[],"omitted":[],"custom":[]} CSL_BIBLIOGRAPHY </w:instrText>
-      </w:r>
-      <w:r>
-        <w:rPr>
-          <w:lang w:val="sv-SE"/>
-        </w:rPr>
-        <w:fldChar w:fldCharType="separate"/>
-      </w:r>
-      <w:r>
-        <w:rPr>
-          <w:rFonts w:ascii="Times New Roman" w:hAnsi="Times New Roman" w:cs="Times New Roman"/>
-          <w:sz w:val="28"/>
-        </w:rPr>
-        <w:t xml:space="preserve">Abd El-Hameed, A. S., </w:t>
-      </w:r>
-      <w:proofErr w:type="spellStart"/>
-      <w:r>
-        <w:rPr>
-          <w:rFonts w:ascii="Times New Roman" w:hAnsi="Times New Roman" w:cs="Times New Roman"/>
-          <w:sz w:val="28"/>
-        </w:rPr>
-        <w:t>Ouf</w:t>
-      </w:r>
-      <w:proofErr w:type="spellEnd"/>
-      <w:r>
-        <w:rPr>
-          <w:rFonts w:ascii="Times New Roman" w:hAnsi="Times New Roman" w:cs="Times New Roman"/>
-          <w:sz w:val="28"/>
-        </w:rPr>
-        <w:t xml:space="preserve">, E. G., </w:t>
-      </w:r>
-      <w:proofErr w:type="spellStart"/>
-      <w:r>
-        <w:rPr>
-          <w:rFonts w:ascii="Times New Roman" w:hAnsi="Times New Roman" w:cs="Times New Roman"/>
-          <w:sz w:val="28"/>
-        </w:rPr>
-        <w:t>Elboushi</w:t>
-      </w:r>
-      <w:proofErr w:type="spellEnd"/>
-      <w:r>
-        <w:rPr>
-          <w:rFonts w:ascii="Times New Roman" w:hAnsi="Times New Roman" w:cs="Times New Roman"/>
-          <w:sz w:val="28"/>
-        </w:rPr>
-        <w:t xml:space="preserve">, A., </w:t>
-      </w:r>
-      <w:proofErr w:type="spellStart"/>
-      <w:r>
-        <w:rPr>
-          <w:rFonts w:ascii="Times New Roman" w:hAnsi="Times New Roman" w:cs="Times New Roman"/>
-          <w:sz w:val="28"/>
-        </w:rPr>
-        <w:t>Seliem</w:t>
-      </w:r>
-      <w:proofErr w:type="spellEnd"/>
-      <w:r>
-        <w:rPr>
-          <w:rFonts w:ascii="Times New Roman" w:hAnsi="Times New Roman" w:cs="Times New Roman"/>
-          <w:sz w:val="28"/>
-        </w:rPr>
-        <w:t xml:space="preserve">, A. G., &amp; Izumi, Y. (2023). An Improved Performance Radar Sensor for K-Band Automotive Radars. </w:t>
+        <w:t xml:space="preserve">Ellgardt, A., &amp; Wikstrom, A. (2009). A Single Polarized Triangular Grid Tapered-Slot Array Antenna. </w:t>
+      </w:r>
+      <w:r>
+        <w:rPr>
+          <w:rFonts w:ascii="Times New Roman" w:hAnsi="Times New Roman" w:cs="Times New Roman"/>
+          <w:i/>
+          <w:iCs/>
+          <w:sz w:val="28"/>
+        </w:rPr>
+        <w:t>IEEE Transactions on Antennas and Propagation</w:t>
+      </w:r>
+      <w:r>
+        <w:rPr>
+          <w:rFonts w:ascii="Times New Roman" w:hAnsi="Times New Roman" w:cs="Times New Roman"/>
+          <w:sz w:val="28"/>
+        </w:rPr>
+        <w:t xml:space="preserve">, </w:t>
+      </w:r>
+      <w:r>
+        <w:rPr>
+          <w:rFonts w:ascii="Times New Roman" w:hAnsi="Times New Roman" w:cs="Times New Roman"/>
+          <w:i/>
+          <w:iCs/>
+          <w:sz w:val="28"/>
+        </w:rPr>
+        <w:t>57</w:t>
+      </w:r>
+      <w:r>
+        <w:rPr>
+          <w:rFonts w:ascii="Times New Roman" w:hAnsi="Times New Roman" w:cs="Times New Roman"/>
+          <w:sz w:val="28"/>
+        </w:rPr>
+        <w:t>(9), 2599–2607. https://doi.org/10.1109/TAP.2009.2027044</w:t>
+      </w:r>
+    </w:p>
+    <w:p>
+      <w:pPr>
+        <w:pStyle w:val="Bibliography"/>
+        <w:spacing w:line="360" w:lineRule="auto"/>
+        <w:jc w:val="both"/>
+        <w:rPr>
+          <w:rFonts w:ascii="Times New Roman" w:hAnsi="Times New Roman" w:cs="Times New Roman"/>
+          <w:sz w:val="28"/>
+        </w:rPr>
+      </w:pPr>
+      <w:r>
+        <w:rPr>
+          <w:rFonts w:ascii="Times New Roman" w:hAnsi="Times New Roman" w:cs="Times New Roman"/>
+          <w:sz w:val="28"/>
+        </w:rPr>
+        <w:t xml:space="preserve">Hasch, J., Topak, E., Schnabel, R., Zwick, T., Weigel, R., &amp; Waldschmidt, C. (2012). Millimeter-Wave Technology for Automotive Radar Sensors in the 77 GHz Frequency Band. </w:t>
+      </w:r>
+      <w:r>
+        <w:rPr>
+          <w:rFonts w:ascii="Times New Roman" w:hAnsi="Times New Roman" w:cs="Times New Roman"/>
+          <w:i/>
+          <w:iCs/>
+          <w:sz w:val="28"/>
+        </w:rPr>
+        <w:t>IEEE Transactions on Microwave Theory and Techniques</w:t>
+      </w:r>
+      <w:r>
+        <w:rPr>
+          <w:rFonts w:ascii="Times New Roman" w:hAnsi="Times New Roman" w:cs="Times New Roman"/>
+          <w:sz w:val="28"/>
+        </w:rPr>
+        <w:t xml:space="preserve">, </w:t>
+      </w:r>
+      <w:r>
+        <w:rPr>
+          <w:rFonts w:ascii="Times New Roman" w:hAnsi="Times New Roman" w:cs="Times New Roman"/>
+          <w:i/>
+          <w:iCs/>
+          <w:sz w:val="28"/>
+        </w:rPr>
+        <w:t>60</w:t>
+      </w:r>
+      <w:r>
+        <w:rPr>
+          <w:rFonts w:ascii="Times New Roman" w:hAnsi="Times New Roman" w:cs="Times New Roman"/>
+          <w:sz w:val="28"/>
+        </w:rPr>
+        <w:t>(3), 845–860. https://doi.org/10.1109/TMTT.2011.2178427</w:t>
+      </w:r>
+    </w:p>
+    <w:p>
+      <w:pPr>
+        <w:pStyle w:val="Bibliography"/>
+        <w:spacing w:line="360" w:lineRule="auto"/>
+        <w:jc w:val="both"/>
+        <w:rPr>
+          <w:rFonts w:ascii="Times New Roman" w:hAnsi="Times New Roman" w:cs="Times New Roman"/>
+          <w:sz w:val="28"/>
+        </w:rPr>
+      </w:pPr>
+      <w:r>
+        <w:rPr>
+          <w:rFonts w:ascii="Times New Roman" w:hAnsi="Times New Roman" w:cs="Times New Roman"/>
+          <w:sz w:val="28"/>
+        </w:rPr>
+        <w:t xml:space="preserve">Mahafza, B. R. (2000). </w:t>
+      </w:r>
+      <w:r>
+        <w:rPr>
+          <w:rFonts w:ascii="Times New Roman" w:hAnsi="Times New Roman" w:cs="Times New Roman"/>
+          <w:i/>
+          <w:iCs/>
+          <w:sz w:val="28"/>
+        </w:rPr>
+        <w:t>Radar systems analysis and design using MATLAB</w:t>
+      </w:r>
+      <w:r>
+        <w:rPr>
+          <w:rFonts w:ascii="Times New Roman" w:hAnsi="Times New Roman" w:cs="Times New Roman"/>
+          <w:sz w:val="28"/>
+        </w:rPr>
+        <w:t>. Chapman &amp; Hall/CRC.</w:t>
+      </w:r>
+    </w:p>
+    <w:p>
+      <w:pPr>
+        <w:pStyle w:val="Bibliography"/>
+        <w:spacing w:line="360" w:lineRule="auto"/>
+        <w:jc w:val="both"/>
+        <w:rPr>
+          <w:rFonts w:ascii="Times New Roman" w:hAnsi="Times New Roman" w:cs="Times New Roman"/>
+          <w:sz w:val="28"/>
+        </w:rPr>
+      </w:pPr>
+      <w:r>
+        <w:rPr>
+          <w:rFonts w:ascii="Times New Roman" w:hAnsi="Times New Roman" w:cs="Times New Roman"/>
+          <w:sz w:val="28"/>
+        </w:rPr>
+        <w:t xml:space="preserve">Moon-Sik Lee &amp; Yong-Hoon Kim. (2010). Design and Performance of a 24-GHz Switch-Antenna Array FMCW Radar System for Automotive Applications. </w:t>
+      </w:r>
+      <w:r>
+        <w:rPr>
+          <w:rFonts w:ascii="Times New Roman" w:hAnsi="Times New Roman" w:cs="Times New Roman"/>
+          <w:i/>
+          <w:iCs/>
+          <w:sz w:val="28"/>
+        </w:rPr>
+        <w:t>IEEE Transactions on Vehicular Technology</w:t>
+      </w:r>
+      <w:r>
+        <w:rPr>
+          <w:rFonts w:ascii="Times New Roman" w:hAnsi="Times New Roman" w:cs="Times New Roman"/>
+          <w:sz w:val="28"/>
+        </w:rPr>
+        <w:t xml:space="preserve">, </w:t>
+      </w:r>
+      <w:r>
+        <w:rPr>
+          <w:rFonts w:ascii="Times New Roman" w:hAnsi="Times New Roman" w:cs="Times New Roman"/>
+          <w:i/>
+          <w:iCs/>
+          <w:sz w:val="28"/>
+        </w:rPr>
+        <w:t>59</w:t>
+      </w:r>
+      <w:r>
+        <w:rPr>
+          <w:rFonts w:ascii="Times New Roman" w:hAnsi="Times New Roman" w:cs="Times New Roman"/>
+          <w:sz w:val="28"/>
+        </w:rPr>
+        <w:t>(5), 2290–2297. https://doi.org/10.1109/TVT.2010.2045665</w:t>
+      </w:r>
+    </w:p>
+    <w:p>
+      <w:pPr>
+        <w:pStyle w:val="Bibliography"/>
+        <w:spacing w:line="360" w:lineRule="auto"/>
+        <w:jc w:val="both"/>
+        <w:rPr>
+          <w:rFonts w:ascii="Times New Roman" w:hAnsi="Times New Roman" w:cs="Times New Roman"/>
+          <w:sz w:val="28"/>
+        </w:rPr>
+      </w:pPr>
+      <w:r>
+        <w:rPr>
+          <w:rFonts w:ascii="Times New Roman" w:hAnsi="Times New Roman" w:cs="Times New Roman"/>
+          <w:sz w:val="28"/>
+        </w:rPr>
+        <w:t xml:space="preserve">Ni, C., Wang, W. W., Zheng, Y. C., Ding, J., Cao, K., &amp; Liu, B. (2023). A Millimeter-Wave Antipodal Linearly Tapered Slot Antenna Array for 5G Wireless Communication. </w:t>
+      </w:r>
+      <w:r>
+        <w:rPr>
+          <w:rFonts w:ascii="Times New Roman" w:hAnsi="Times New Roman" w:cs="Times New Roman"/>
+          <w:i/>
+          <w:iCs/>
+          <w:sz w:val="28"/>
+        </w:rPr>
+        <w:t>International Journal of Antennas and Propagation</w:t>
+      </w:r>
+      <w:r>
+        <w:rPr>
+          <w:rFonts w:ascii="Times New Roman" w:hAnsi="Times New Roman" w:cs="Times New Roman"/>
+          <w:sz w:val="28"/>
+        </w:rPr>
+        <w:t xml:space="preserve">, </w:t>
+      </w:r>
+      <w:r>
+        <w:rPr>
+          <w:rFonts w:ascii="Times New Roman" w:hAnsi="Times New Roman" w:cs="Times New Roman"/>
+          <w:i/>
+          <w:iCs/>
+          <w:sz w:val="28"/>
+        </w:rPr>
+        <w:t>2023</w:t>
+      </w:r>
+      <w:r>
+        <w:rPr>
+          <w:rFonts w:ascii="Times New Roman" w:hAnsi="Times New Roman" w:cs="Times New Roman"/>
+          <w:sz w:val="28"/>
+        </w:rPr>
+        <w:t>, 1–12. https://doi.org/10.1155/2023/6227251</w:t>
+      </w:r>
+    </w:p>
+    <w:p>
+      <w:pPr>
+        <w:pStyle w:val="Bibliography"/>
+        <w:spacing w:line="360" w:lineRule="auto"/>
+        <w:jc w:val="both"/>
+        <w:rPr>
+          <w:rFonts w:ascii="Times New Roman" w:hAnsi="Times New Roman" w:cs="Times New Roman"/>
+          <w:sz w:val="28"/>
+        </w:rPr>
+      </w:pPr>
+      <w:r>
+        <w:rPr>
+          <w:rFonts w:ascii="Times New Roman" w:hAnsi="Times New Roman" w:cs="Times New Roman"/>
+          <w:sz w:val="28"/>
+        </w:rPr>
+        <w:t xml:space="preserve">Ohm, S., Kang, E., Lim, T. H., &amp; Choo, H. (2023). Design of a Dual-Polarization All-Metal Vivaldi Array Antenna Using a Metal 3D Printing Method for High-Power Jamming Systems. </w:t>
+      </w:r>
+      <w:r>
+        <w:rPr>
+          <w:rFonts w:ascii="Times New Roman" w:hAnsi="Times New Roman" w:cs="Times New Roman"/>
+          <w:i/>
+          <w:iCs/>
+          <w:sz w:val="28"/>
+        </w:rPr>
+        <w:t>IEEE Access</w:t>
+      </w:r>
+      <w:r>
+        <w:rPr>
+          <w:rFonts w:ascii="Times New Roman" w:hAnsi="Times New Roman" w:cs="Times New Roman"/>
+          <w:sz w:val="28"/>
+        </w:rPr>
+        <w:t xml:space="preserve">, </w:t>
+      </w:r>
+      <w:r>
+        <w:rPr>
+          <w:rFonts w:ascii="Times New Roman" w:hAnsi="Times New Roman" w:cs="Times New Roman"/>
+          <w:i/>
+          <w:iCs/>
+          <w:sz w:val="28"/>
+        </w:rPr>
+        <w:t>11</w:t>
+      </w:r>
+      <w:r>
+        <w:rPr>
+          <w:rFonts w:ascii="Times New Roman" w:hAnsi="Times New Roman" w:cs="Times New Roman"/>
+          <w:sz w:val="28"/>
+        </w:rPr>
+        <w:t>, 35175–35181. https://doi.org/10.1109/ACCESS.2023.3262463</w:t>
+      </w:r>
+    </w:p>
+    <w:p>
+      <w:pPr>
+        <w:pStyle w:val="Bibliography"/>
+        <w:spacing w:line="360" w:lineRule="auto"/>
+        <w:jc w:val="both"/>
+        <w:rPr>
+          <w:rFonts w:ascii="Times New Roman" w:hAnsi="Times New Roman" w:cs="Times New Roman"/>
+          <w:sz w:val="28"/>
+        </w:rPr>
+      </w:pPr>
+      <w:r>
+        <w:rPr>
+          <w:rFonts w:ascii="Times New Roman" w:hAnsi="Times New Roman" w:cs="Times New Roman"/>
+          <w:sz w:val="28"/>
+        </w:rPr>
+        <w:lastRenderedPageBreak/>
+        <w:t xml:space="preserve">Patole, S. M., Torlak, M., Wang, D., &amp; Ali, M. (2017). Automotive radars: A review of signal processing techniques. </w:t>
+      </w:r>
+      <w:r>
+        <w:rPr>
+          <w:rFonts w:ascii="Times New Roman" w:hAnsi="Times New Roman" w:cs="Times New Roman"/>
+          <w:i/>
+          <w:iCs/>
+          <w:sz w:val="28"/>
+        </w:rPr>
+        <w:t>IEEE Signal Processing Magazine</w:t>
+      </w:r>
+      <w:r>
+        <w:rPr>
+          <w:rFonts w:ascii="Times New Roman" w:hAnsi="Times New Roman" w:cs="Times New Roman"/>
+          <w:sz w:val="28"/>
+        </w:rPr>
+        <w:t xml:space="preserve">, </w:t>
+      </w:r>
+      <w:r>
+        <w:rPr>
+          <w:rFonts w:ascii="Times New Roman" w:hAnsi="Times New Roman" w:cs="Times New Roman"/>
+          <w:i/>
+          <w:iCs/>
+          <w:sz w:val="28"/>
+        </w:rPr>
+        <w:t>34</w:t>
+      </w:r>
+      <w:r>
+        <w:rPr>
+          <w:rFonts w:ascii="Times New Roman" w:hAnsi="Times New Roman" w:cs="Times New Roman"/>
+          <w:sz w:val="28"/>
+        </w:rPr>
+        <w:t>(2), 22–35. https://doi.org/10.1109/MSP.2016.2628914</w:t>
+      </w:r>
+    </w:p>
+    <w:p>
+      <w:pPr>
+        <w:pStyle w:val="Bibliography"/>
+        <w:spacing w:line="360" w:lineRule="auto"/>
+        <w:jc w:val="both"/>
+        <w:rPr>
+          <w:rFonts w:ascii="Times New Roman" w:hAnsi="Times New Roman" w:cs="Times New Roman"/>
+          <w:sz w:val="28"/>
+        </w:rPr>
+      </w:pPr>
+      <w:r>
+        <w:rPr>
+          <w:rFonts w:ascii="Times New Roman" w:hAnsi="Times New Roman" w:cs="Times New Roman"/>
+          <w:sz w:val="28"/>
+        </w:rPr>
+        <w:t xml:space="preserve">Shen, J., Xu, Z., &amp; Zheng, T. (2010). Design and mutual coupling analysis on wideband wide-angle scan step-constant tapered slot antenna array. </w:t>
+      </w:r>
+      <w:r>
+        <w:rPr>
+          <w:rFonts w:ascii="Times New Roman" w:hAnsi="Times New Roman" w:cs="Times New Roman"/>
+          <w:i/>
+          <w:iCs/>
+          <w:sz w:val="28"/>
+        </w:rPr>
+        <w:t>2010 IEEE International Conference on Ultra-Wideband</w:t>
+      </w:r>
+      <w:r>
+        <w:rPr>
+          <w:rFonts w:ascii="Times New Roman" w:hAnsi="Times New Roman" w:cs="Times New Roman"/>
+          <w:sz w:val="28"/>
+        </w:rPr>
+        <w:t>, 1–4. https://doi.org/10.1109/ICUWB.2010.5614085</w:t>
+      </w:r>
+    </w:p>
+    <w:p>
+      <w:pPr>
+        <w:pStyle w:val="Bibliography"/>
+        <w:spacing w:line="360" w:lineRule="auto"/>
+        <w:jc w:val="both"/>
+        <w:rPr>
+          <w:rFonts w:ascii="Times New Roman" w:hAnsi="Times New Roman" w:cs="Times New Roman"/>
+          <w:sz w:val="28"/>
+        </w:rPr>
+      </w:pPr>
+      <w:r>
+        <w:rPr>
+          <w:rFonts w:ascii="Times New Roman" w:hAnsi="Times New Roman" w:cs="Times New Roman"/>
+          <w:sz w:val="28"/>
+        </w:rPr>
+        <w:t xml:space="preserve">Skolnik, M. I. (1986). </w:t>
+      </w:r>
+      <w:r>
+        <w:rPr>
+          <w:rFonts w:ascii="Times New Roman" w:hAnsi="Times New Roman" w:cs="Times New Roman"/>
+          <w:i/>
+          <w:iCs/>
+          <w:sz w:val="28"/>
+        </w:rPr>
+        <w:t>Introduction to radar systems: International student edition</w:t>
+      </w:r>
+      <w:r>
+        <w:rPr>
+          <w:rFonts w:ascii="Times New Roman" w:hAnsi="Times New Roman" w:cs="Times New Roman"/>
+          <w:sz w:val="28"/>
+        </w:rPr>
+        <w:t xml:space="preserve"> (2nd ed., 9th print). McGraw-Hill.</w:t>
+      </w:r>
+    </w:p>
+    <w:p>
+      <w:pPr>
+        <w:pStyle w:val="Bibliography"/>
+        <w:spacing w:line="360" w:lineRule="auto"/>
+        <w:jc w:val="both"/>
+        <w:rPr>
+          <w:rFonts w:ascii="Times New Roman" w:hAnsi="Times New Roman" w:cs="Times New Roman"/>
+          <w:sz w:val="28"/>
+        </w:rPr>
+      </w:pPr>
+      <w:r>
+        <w:rPr>
+          <w:rFonts w:ascii="Times New Roman" w:hAnsi="Times New Roman" w:cs="Times New Roman"/>
+          <w:sz w:val="28"/>
+        </w:rPr>
+        <w:t xml:space="preserve">Tseng, V., &amp; Chang, C.-Y. (2019). Linear Tapered Slot Antenna for Ultra-Wideband Radar Sensor: Design Consideration and Recommendation. </w:t>
       </w:r>
       <w:r>
         <w:rPr>
@@ -2442,87 +4634,91 @@
           <w:iCs/>
           <w:sz w:val="28"/>
         </w:rPr>
-        <w:t>23</w:t>
-      </w:r>
-      <w:r>
-        <w:rPr>
-          <w:rFonts w:ascii="Times New Roman" w:hAnsi="Times New Roman" w:cs="Times New Roman"/>
-          <w:sz w:val="28"/>
-        </w:rPr>
-        <w:t>(16), 7070. https://doi.org/10.3390/s23167070</w:t>
+        <w:t>19</w:t>
+      </w:r>
+      <w:r>
+        <w:rPr>
+          <w:rFonts w:ascii="Times New Roman" w:hAnsi="Times New Roman" w:cs="Times New Roman"/>
+          <w:sz w:val="28"/>
+        </w:rPr>
+        <w:t>(5), 1212. https://doi.org/10.3390/s19051212</w:t>
       </w:r>
     </w:p>
     <w:p>
       <w:pPr>
         <w:pStyle w:val="Bibliography"/>
-        <w:rPr>
-          <w:rFonts w:ascii="Times New Roman" w:hAnsi="Times New Roman" w:cs="Times New Roman"/>
-          <w:sz w:val="28"/>
-        </w:rPr>
-      </w:pPr>
-      <w:r>
-        <w:rPr>
-          <w:rFonts w:ascii="Times New Roman" w:hAnsi="Times New Roman" w:cs="Times New Roman"/>
-          <w:sz w:val="28"/>
-        </w:rPr>
-        <w:t xml:space="preserve">Balanis, C. A. (2005). </w:t>
-      </w:r>
-      <w:r>
-        <w:rPr>
-          <w:rFonts w:ascii="Times New Roman" w:hAnsi="Times New Roman" w:cs="Times New Roman"/>
-          <w:i/>
-          <w:iCs/>
-          <w:sz w:val="28"/>
-        </w:rPr>
-        <w:t>Antenna theory: Analysis and design</w:t>
-      </w:r>
-      <w:r>
-        <w:rPr>
-          <w:rFonts w:ascii="Times New Roman" w:hAnsi="Times New Roman" w:cs="Times New Roman"/>
-          <w:sz w:val="28"/>
-        </w:rPr>
-        <w:t xml:space="preserve"> (3. ed). Wiley-Interscience.</w:t>
+        <w:spacing w:line="360" w:lineRule="auto"/>
+        <w:jc w:val="both"/>
+        <w:rPr>
+          <w:rFonts w:ascii="Times New Roman" w:hAnsi="Times New Roman" w:cs="Times New Roman"/>
+          <w:sz w:val="28"/>
+        </w:rPr>
+      </w:pPr>
+      <w:r>
+        <w:rPr>
+          <w:rFonts w:ascii="Times New Roman" w:hAnsi="Times New Roman" w:cs="Times New Roman"/>
+          <w:sz w:val="28"/>
+        </w:rPr>
+        <w:t xml:space="preserve">Viadero-Monasterio, F., Alonso-Rentería, L., Pérez-Oria, J., &amp; Viadero-Rueda, F. (2024). Radar-Based Pedestrian and Vehicle Detection and Identification for Driving Assistance. </w:t>
+      </w:r>
+      <w:r>
+        <w:rPr>
+          <w:rFonts w:ascii="Times New Roman" w:hAnsi="Times New Roman" w:cs="Times New Roman"/>
+          <w:i/>
+          <w:iCs/>
+          <w:sz w:val="28"/>
+        </w:rPr>
+        <w:t>Vehicles</w:t>
+      </w:r>
+      <w:r>
+        <w:rPr>
+          <w:rFonts w:ascii="Times New Roman" w:hAnsi="Times New Roman" w:cs="Times New Roman"/>
+          <w:sz w:val="28"/>
+        </w:rPr>
+        <w:t xml:space="preserve">, </w:t>
+      </w:r>
+      <w:r>
+        <w:rPr>
+          <w:rFonts w:ascii="Times New Roman" w:hAnsi="Times New Roman" w:cs="Times New Roman"/>
+          <w:i/>
+          <w:iCs/>
+          <w:sz w:val="28"/>
+        </w:rPr>
+        <w:t>6</w:t>
+      </w:r>
+      <w:r>
+        <w:rPr>
+          <w:rFonts w:ascii="Times New Roman" w:hAnsi="Times New Roman" w:cs="Times New Roman"/>
+          <w:sz w:val="28"/>
+        </w:rPr>
+        <w:t>(3), 1185–1199. https://doi.org/10.3390/vehicles6030056</w:t>
       </w:r>
     </w:p>
     <w:p>
       <w:pPr>
         <w:pStyle w:val="Bibliography"/>
-        <w:rPr>
-          <w:rFonts w:ascii="Times New Roman" w:hAnsi="Times New Roman" w:cs="Times New Roman"/>
-          <w:sz w:val="28"/>
-        </w:rPr>
-      </w:pPr>
-      <w:r>
-        <w:rPr>
-          <w:rFonts w:ascii="Times New Roman" w:hAnsi="Times New Roman" w:cs="Times New Roman"/>
-          <w:sz w:val="28"/>
-        </w:rPr>
-        <w:t xml:space="preserve">Biswas, P., Sur, S. N., Bera, R., </w:t>
-      </w:r>
-      <w:proofErr w:type="spellStart"/>
-      <w:r>
-        <w:rPr>
-          <w:rFonts w:ascii="Times New Roman" w:hAnsi="Times New Roman" w:cs="Times New Roman"/>
-          <w:sz w:val="28"/>
-        </w:rPr>
-        <w:t>Imoize</w:t>
-      </w:r>
-      <w:proofErr w:type="spellEnd"/>
-      <w:r>
-        <w:rPr>
-          <w:rFonts w:ascii="Times New Roman" w:hAnsi="Times New Roman" w:cs="Times New Roman"/>
-          <w:sz w:val="28"/>
-        </w:rPr>
-        <w:t xml:space="preserve">, A. L., &amp; Li, C.-T. (2025). Advanced Signal Processing and Modeling Techniques for Automotive Radar: Challenges and Innovations in ADAS Applications. </w:t>
-      </w:r>
-      <w:r>
-        <w:rPr>
-          <w:rFonts w:ascii="Times New Roman" w:hAnsi="Times New Roman" w:cs="Times New Roman"/>
-          <w:i/>
-          <w:iCs/>
-          <w:sz w:val="28"/>
-        </w:rPr>
-        <w:t>Computer Modeling in Engineering &amp; Sciences</w:t>
+        <w:spacing w:line="360" w:lineRule="auto"/>
+        <w:jc w:val="both"/>
+        <w:rPr>
+          <w:rFonts w:ascii="Times New Roman" w:hAnsi="Times New Roman" w:cs="Times New Roman"/>
+          <w:sz w:val="28"/>
+        </w:rPr>
+      </w:pPr>
+      <w:r>
+        <w:rPr>
+          <w:rFonts w:ascii="Times New Roman" w:hAnsi="Times New Roman" w:cs="Times New Roman"/>
+          <w:sz w:val="28"/>
+        </w:rPr>
+        <w:t xml:space="preserve">Waldschmidt, C., Hasch, J., &amp; Menzel, W. (2021). Automotive Radar—From First Efforts to Future Systems. </w:t>
+      </w:r>
+      <w:r>
+        <w:rPr>
+          <w:rFonts w:ascii="Times New Roman" w:hAnsi="Times New Roman" w:cs="Times New Roman"/>
+          <w:i/>
+          <w:iCs/>
+          <w:sz w:val="28"/>
+        </w:rPr>
+        <w:t>IEEE Journal of Microwaves</w:t>
       </w:r>
       <w:r>
         <w:rPr>
@@ -2538,628 +4734,32 @@
           <w:iCs/>
           <w:sz w:val="28"/>
         </w:rPr>
-        <w:t>144</w:t>
-      </w:r>
-      <w:r>
-        <w:rPr>
-          <w:rFonts w:ascii="Times New Roman" w:hAnsi="Times New Roman" w:cs="Times New Roman"/>
-          <w:sz w:val="28"/>
-        </w:rPr>
-        <w:t>(1), 83–146. https://doi.org/10.32604/cmes.2025.067724</w:t>
+        <w:t>1</w:t>
+      </w:r>
+      <w:r>
+        <w:rPr>
+          <w:rFonts w:ascii="Times New Roman" w:hAnsi="Times New Roman" w:cs="Times New Roman"/>
+          <w:sz w:val="28"/>
+        </w:rPr>
+        <w:t>(1), 135–148. https://doi.org/10.1109/JMW.2020.3033616</w:t>
       </w:r>
     </w:p>
     <w:p>
       <w:pPr>
         <w:pStyle w:val="Bibliography"/>
-        <w:rPr>
-          <w:rFonts w:ascii="Times New Roman" w:hAnsi="Times New Roman" w:cs="Times New Roman"/>
-          <w:sz w:val="28"/>
-        </w:rPr>
-      </w:pPr>
-      <w:proofErr w:type="spellStart"/>
-      <w:r>
-        <w:rPr>
-          <w:rFonts w:ascii="Times New Roman" w:hAnsi="Times New Roman" w:cs="Times New Roman"/>
-          <w:sz w:val="28"/>
-        </w:rPr>
-        <w:t>Darimireddy</w:t>
-      </w:r>
-      <w:proofErr w:type="spellEnd"/>
-      <w:r>
-        <w:rPr>
-          <w:rFonts w:ascii="Times New Roman" w:hAnsi="Times New Roman" w:cs="Times New Roman"/>
-          <w:sz w:val="28"/>
-        </w:rPr>
-        <w:t xml:space="preserve">, N. K., Mohan Rao, U., Park, C.-W., Fofana, I., Sujatha, M., &amp; Verma, A. K. (2021). Perspectives of Convertors and Communication Aspects in Automated Vehicles, Part 2: Printed Antennas and Sensors for Automotive Radars. </w:t>
-      </w:r>
-      <w:r>
-        <w:rPr>
-          <w:rFonts w:ascii="Times New Roman" w:hAnsi="Times New Roman" w:cs="Times New Roman"/>
-          <w:i/>
-          <w:iCs/>
-          <w:sz w:val="28"/>
-        </w:rPr>
-        <w:t>Energies</w:t>
-      </w:r>
-      <w:r>
-        <w:rPr>
-          <w:rFonts w:ascii="Times New Roman" w:hAnsi="Times New Roman" w:cs="Times New Roman"/>
-          <w:sz w:val="28"/>
-        </w:rPr>
-        <w:t xml:space="preserve">, </w:t>
-      </w:r>
-      <w:r>
-        <w:rPr>
-          <w:rFonts w:ascii="Times New Roman" w:hAnsi="Times New Roman" w:cs="Times New Roman"/>
-          <w:i/>
-          <w:iCs/>
-          <w:sz w:val="28"/>
-        </w:rPr>
-        <w:t>14</w:t>
-      </w:r>
-      <w:r>
-        <w:rPr>
-          <w:rFonts w:ascii="Times New Roman" w:hAnsi="Times New Roman" w:cs="Times New Roman"/>
-          <w:sz w:val="28"/>
-        </w:rPr>
-        <w:t>(6), 1656. https://doi.org/10.3390/en14061656</w:t>
-      </w:r>
-    </w:p>
-    <w:p>
-      <w:pPr>
-        <w:pStyle w:val="Bibliography"/>
-        <w:rPr>
-          <w:rFonts w:ascii="Times New Roman" w:hAnsi="Times New Roman" w:cs="Times New Roman"/>
-          <w:sz w:val="28"/>
-        </w:rPr>
-      </w:pPr>
-      <w:r>
-        <w:rPr>
-          <w:rFonts w:ascii="Times New Roman" w:hAnsi="Times New Roman" w:cs="Times New Roman"/>
-          <w:sz w:val="28"/>
-        </w:rPr>
-        <w:t xml:space="preserve">Ellgardt, A., &amp; Wikstrom, A. (2009). A Single Polarized Triangular Grid Tapered-Slot Array Antenna. </w:t>
-      </w:r>
-      <w:r>
-        <w:rPr>
-          <w:rFonts w:ascii="Times New Roman" w:hAnsi="Times New Roman" w:cs="Times New Roman"/>
-          <w:i/>
-          <w:iCs/>
-          <w:sz w:val="28"/>
-        </w:rPr>
-        <w:t>IEEE Transactions on Antennas and Propagation</w:t>
-      </w:r>
-      <w:r>
-        <w:rPr>
-          <w:rFonts w:ascii="Times New Roman" w:hAnsi="Times New Roman" w:cs="Times New Roman"/>
-          <w:sz w:val="28"/>
-        </w:rPr>
-        <w:t xml:space="preserve">, </w:t>
-      </w:r>
-      <w:r>
-        <w:rPr>
-          <w:rFonts w:ascii="Times New Roman" w:hAnsi="Times New Roman" w:cs="Times New Roman"/>
-          <w:i/>
-          <w:iCs/>
-          <w:sz w:val="28"/>
-        </w:rPr>
-        <w:t>57</w:t>
-      </w:r>
-      <w:r>
-        <w:rPr>
-          <w:rFonts w:ascii="Times New Roman" w:hAnsi="Times New Roman" w:cs="Times New Roman"/>
-          <w:sz w:val="28"/>
-        </w:rPr>
-        <w:t>(9), 2599–2607. https://doi.org/10.1109/TAP.2009.2027044</w:t>
-      </w:r>
-    </w:p>
-    <w:p>
-      <w:pPr>
-        <w:pStyle w:val="Bibliography"/>
-        <w:rPr>
-          <w:rFonts w:ascii="Times New Roman" w:hAnsi="Times New Roman" w:cs="Times New Roman"/>
-          <w:sz w:val="28"/>
-        </w:rPr>
-      </w:pPr>
-      <w:r>
-        <w:rPr>
-          <w:rFonts w:ascii="Times New Roman" w:hAnsi="Times New Roman" w:cs="Times New Roman"/>
-          <w:sz w:val="28"/>
-        </w:rPr>
-        <w:lastRenderedPageBreak/>
-        <w:t xml:space="preserve">Hasch, J., </w:t>
-      </w:r>
-      <w:proofErr w:type="spellStart"/>
-      <w:r>
-        <w:rPr>
-          <w:rFonts w:ascii="Times New Roman" w:hAnsi="Times New Roman" w:cs="Times New Roman"/>
-          <w:sz w:val="28"/>
-        </w:rPr>
-        <w:t>Topak</w:t>
-      </w:r>
-      <w:proofErr w:type="spellEnd"/>
-      <w:r>
-        <w:rPr>
-          <w:rFonts w:ascii="Times New Roman" w:hAnsi="Times New Roman" w:cs="Times New Roman"/>
-          <w:sz w:val="28"/>
-        </w:rPr>
-        <w:t xml:space="preserve">, E., Schnabel, R., Zwick, T., Weigel, R., &amp; Waldschmidt, C. (2012). Millimeter-Wave Technology for Automotive Radar Sensors in the 77 GHz Frequency Band. </w:t>
-      </w:r>
-      <w:r>
-        <w:rPr>
-          <w:rFonts w:ascii="Times New Roman" w:hAnsi="Times New Roman" w:cs="Times New Roman"/>
-          <w:i/>
-          <w:iCs/>
-          <w:sz w:val="28"/>
-        </w:rPr>
-        <w:t>IEEE Transactions on Microwave Theory and Techniques</w:t>
-      </w:r>
-      <w:r>
-        <w:rPr>
-          <w:rFonts w:ascii="Times New Roman" w:hAnsi="Times New Roman" w:cs="Times New Roman"/>
-          <w:sz w:val="28"/>
-        </w:rPr>
-        <w:t xml:space="preserve">, </w:t>
-      </w:r>
-      <w:r>
-        <w:rPr>
-          <w:rFonts w:ascii="Times New Roman" w:hAnsi="Times New Roman" w:cs="Times New Roman"/>
-          <w:i/>
-          <w:iCs/>
-          <w:sz w:val="28"/>
-        </w:rPr>
-        <w:t>60</w:t>
-      </w:r>
-      <w:r>
-        <w:rPr>
-          <w:rFonts w:ascii="Times New Roman" w:hAnsi="Times New Roman" w:cs="Times New Roman"/>
-          <w:sz w:val="28"/>
-        </w:rPr>
-        <w:t>(3), 845–860. https://doi.org/10.1109/TMTT.2011.2178427</w:t>
-      </w:r>
-    </w:p>
-    <w:p>
-      <w:pPr>
-        <w:pStyle w:val="Bibliography"/>
-        <w:rPr>
-          <w:rFonts w:ascii="Times New Roman" w:hAnsi="Times New Roman" w:cs="Times New Roman"/>
-          <w:sz w:val="28"/>
-        </w:rPr>
-      </w:pPr>
-      <w:proofErr w:type="spellStart"/>
-      <w:r>
-        <w:rPr>
-          <w:rFonts w:ascii="Times New Roman" w:hAnsi="Times New Roman" w:cs="Times New Roman"/>
-          <w:sz w:val="28"/>
-        </w:rPr>
-        <w:t>Mahafza</w:t>
-      </w:r>
-      <w:proofErr w:type="spellEnd"/>
-      <w:r>
-        <w:rPr>
-          <w:rFonts w:ascii="Times New Roman" w:hAnsi="Times New Roman" w:cs="Times New Roman"/>
-          <w:sz w:val="28"/>
-        </w:rPr>
-        <w:t xml:space="preserve">, B. R. (2000). </w:t>
-      </w:r>
-      <w:r>
-        <w:rPr>
-          <w:rFonts w:ascii="Times New Roman" w:hAnsi="Times New Roman" w:cs="Times New Roman"/>
-          <w:i/>
-          <w:iCs/>
-          <w:sz w:val="28"/>
-        </w:rPr>
-        <w:t>Radar systems analysis and design using MATLAB</w:t>
-      </w:r>
-      <w:r>
-        <w:rPr>
-          <w:rFonts w:ascii="Times New Roman" w:hAnsi="Times New Roman" w:cs="Times New Roman"/>
-          <w:sz w:val="28"/>
-        </w:rPr>
-        <w:t>. Chapman &amp; Hall/CRC.</w:t>
-      </w:r>
-    </w:p>
-    <w:p>
-      <w:pPr>
-        <w:pStyle w:val="Bibliography"/>
-        <w:rPr>
-          <w:rFonts w:ascii="Times New Roman" w:hAnsi="Times New Roman" w:cs="Times New Roman"/>
-          <w:sz w:val="28"/>
-        </w:rPr>
-      </w:pPr>
-      <w:r>
-        <w:rPr>
-          <w:rFonts w:ascii="Times New Roman" w:hAnsi="Times New Roman" w:cs="Times New Roman"/>
-          <w:sz w:val="28"/>
-        </w:rPr>
-        <w:t xml:space="preserve">Moon-Sik Lee &amp; Yong-Hoon Kim. (2010). Design and Performance of a 24-GHz Switch-Antenna Array FMCW Radar System for Automotive Applications. </w:t>
-      </w:r>
-      <w:r>
-        <w:rPr>
-          <w:rFonts w:ascii="Times New Roman" w:hAnsi="Times New Roman" w:cs="Times New Roman"/>
-          <w:i/>
-          <w:iCs/>
-          <w:sz w:val="28"/>
-        </w:rPr>
-        <w:t>IEEE Transactions on Vehicular Technology</w:t>
-      </w:r>
-      <w:r>
-        <w:rPr>
-          <w:rFonts w:ascii="Times New Roman" w:hAnsi="Times New Roman" w:cs="Times New Roman"/>
-          <w:sz w:val="28"/>
-        </w:rPr>
-        <w:t xml:space="preserve">, </w:t>
-      </w:r>
-      <w:r>
-        <w:rPr>
-          <w:rFonts w:ascii="Times New Roman" w:hAnsi="Times New Roman" w:cs="Times New Roman"/>
-          <w:i/>
-          <w:iCs/>
-          <w:sz w:val="28"/>
-        </w:rPr>
-        <w:t>59</w:t>
-      </w:r>
-      <w:r>
-        <w:rPr>
-          <w:rFonts w:ascii="Times New Roman" w:hAnsi="Times New Roman" w:cs="Times New Roman"/>
-          <w:sz w:val="28"/>
-        </w:rPr>
-        <w:t>(5), 2290–2297. https://doi.org/10.1109/TVT.2010.2045665</w:t>
-      </w:r>
-    </w:p>
-    <w:p>
-      <w:pPr>
-        <w:pStyle w:val="Bibliography"/>
-        <w:rPr>
-          <w:rFonts w:ascii="Times New Roman" w:hAnsi="Times New Roman" w:cs="Times New Roman"/>
-          <w:sz w:val="28"/>
-        </w:rPr>
-      </w:pPr>
-      <w:r>
-        <w:rPr>
-          <w:rFonts w:ascii="Times New Roman" w:hAnsi="Times New Roman" w:cs="Times New Roman"/>
-          <w:sz w:val="28"/>
-        </w:rPr>
-        <w:t xml:space="preserve">Ni, C., Wang, W. W., Zheng, Y. C., Ding, J., Cao, K., &amp; Liu, B. (2023). A Millimeter-Wave Antipodal Linearly Tapered Slot Antenna Array for 5G Wireless Communication. </w:t>
-      </w:r>
-      <w:r>
-        <w:rPr>
-          <w:rFonts w:ascii="Times New Roman" w:hAnsi="Times New Roman" w:cs="Times New Roman"/>
-          <w:i/>
-          <w:iCs/>
-          <w:sz w:val="28"/>
-        </w:rPr>
-        <w:t>International Journal of Antennas and Propagation</w:t>
-      </w:r>
-      <w:r>
-        <w:rPr>
-          <w:rFonts w:ascii="Times New Roman" w:hAnsi="Times New Roman" w:cs="Times New Roman"/>
-          <w:sz w:val="28"/>
-        </w:rPr>
-        <w:t xml:space="preserve">, </w:t>
-      </w:r>
-      <w:r>
-        <w:rPr>
-          <w:rFonts w:ascii="Times New Roman" w:hAnsi="Times New Roman" w:cs="Times New Roman"/>
-          <w:i/>
-          <w:iCs/>
-          <w:sz w:val="28"/>
-        </w:rPr>
-        <w:t>2023</w:t>
-      </w:r>
-      <w:r>
-        <w:rPr>
-          <w:rFonts w:ascii="Times New Roman" w:hAnsi="Times New Roman" w:cs="Times New Roman"/>
-          <w:sz w:val="28"/>
-        </w:rPr>
-        <w:t>, 1–12. https://doi.org/10.1155/2023/6227251</w:t>
-      </w:r>
-    </w:p>
-    <w:p>
-      <w:pPr>
-        <w:pStyle w:val="Bibliography"/>
-        <w:rPr>
-          <w:rFonts w:ascii="Times New Roman" w:hAnsi="Times New Roman" w:cs="Times New Roman"/>
-          <w:sz w:val="28"/>
-        </w:rPr>
-      </w:pPr>
-      <w:r>
-        <w:rPr>
-          <w:rFonts w:ascii="Times New Roman" w:hAnsi="Times New Roman" w:cs="Times New Roman"/>
-          <w:sz w:val="28"/>
-        </w:rPr>
-        <w:t xml:space="preserve">Patole, S. M., Torlak, M., Wang, D., &amp; Ali, M. (2017). Automotive radars: A review of signal processing techniques. </w:t>
-      </w:r>
-      <w:r>
-        <w:rPr>
-          <w:rFonts w:ascii="Times New Roman" w:hAnsi="Times New Roman" w:cs="Times New Roman"/>
-          <w:i/>
-          <w:iCs/>
-          <w:sz w:val="28"/>
-        </w:rPr>
-        <w:t xml:space="preserve">IEEE Signal </w:t>
-      </w:r>
-      <w:r>
-        <w:rPr>
-          <w:rFonts w:ascii="Times New Roman" w:hAnsi="Times New Roman" w:cs="Times New Roman"/>
-          <w:i/>
-          <w:iCs/>
-          <w:sz w:val="28"/>
-        </w:rPr>
-        <w:lastRenderedPageBreak/>
-        <w:t>Processing Magazine</w:t>
-      </w:r>
-      <w:r>
-        <w:rPr>
-          <w:rFonts w:ascii="Times New Roman" w:hAnsi="Times New Roman" w:cs="Times New Roman"/>
-          <w:sz w:val="28"/>
-        </w:rPr>
-        <w:t xml:space="preserve">, </w:t>
-      </w:r>
-      <w:r>
-        <w:rPr>
-          <w:rFonts w:ascii="Times New Roman" w:hAnsi="Times New Roman" w:cs="Times New Roman"/>
-          <w:i/>
-          <w:iCs/>
-          <w:sz w:val="28"/>
-        </w:rPr>
-        <w:t>34</w:t>
-      </w:r>
-      <w:r>
-        <w:rPr>
-          <w:rFonts w:ascii="Times New Roman" w:hAnsi="Times New Roman" w:cs="Times New Roman"/>
-          <w:sz w:val="28"/>
-        </w:rPr>
-        <w:t>(2), 22–35. https://doi.org/10.1109/MSP.2016.2628914</w:t>
-      </w:r>
-    </w:p>
-    <w:p>
-      <w:pPr>
-        <w:pStyle w:val="Bibliography"/>
-        <w:rPr>
-          <w:rFonts w:ascii="Times New Roman" w:hAnsi="Times New Roman" w:cs="Times New Roman"/>
-          <w:sz w:val="28"/>
-        </w:rPr>
-      </w:pPr>
-      <w:r>
-        <w:rPr>
-          <w:rFonts w:ascii="Times New Roman" w:hAnsi="Times New Roman" w:cs="Times New Roman"/>
-          <w:sz w:val="28"/>
-        </w:rPr>
-        <w:t xml:space="preserve">Skolnik, M. I. (1986). </w:t>
-      </w:r>
-      <w:r>
-        <w:rPr>
-          <w:rFonts w:ascii="Times New Roman" w:hAnsi="Times New Roman" w:cs="Times New Roman"/>
-          <w:i/>
-          <w:iCs/>
-          <w:sz w:val="28"/>
-        </w:rPr>
-        <w:t>Introduction to radar systems: International student edition</w:t>
-      </w:r>
-      <w:r>
-        <w:rPr>
-          <w:rFonts w:ascii="Times New Roman" w:hAnsi="Times New Roman" w:cs="Times New Roman"/>
-          <w:sz w:val="28"/>
-        </w:rPr>
-        <w:t xml:space="preserve"> (2nd ed., 9th print). McGraw-Hill.</w:t>
-      </w:r>
-    </w:p>
-    <w:p>
-      <w:pPr>
-        <w:pStyle w:val="Bibliography"/>
-        <w:rPr>
-          <w:rFonts w:ascii="Times New Roman" w:hAnsi="Times New Roman" w:cs="Times New Roman"/>
-          <w:sz w:val="28"/>
-        </w:rPr>
-      </w:pPr>
-      <w:r>
-        <w:rPr>
-          <w:rFonts w:ascii="Times New Roman" w:hAnsi="Times New Roman" w:cs="Times New Roman"/>
-          <w:sz w:val="28"/>
-        </w:rPr>
-        <w:t xml:space="preserve">Tseng, V., &amp; Chang, C.-Y. (2019). Linear Tapered Slot Antenna for Ultra-Wideband Radar Sensor: Design Consideration and Recommendation. </w:t>
-      </w:r>
-      <w:r>
-        <w:rPr>
-          <w:rFonts w:ascii="Times New Roman" w:hAnsi="Times New Roman" w:cs="Times New Roman"/>
-          <w:i/>
-          <w:iCs/>
-          <w:sz w:val="28"/>
-        </w:rPr>
-        <w:t>Sensors</w:t>
-      </w:r>
-      <w:r>
-        <w:rPr>
-          <w:rFonts w:ascii="Times New Roman" w:hAnsi="Times New Roman" w:cs="Times New Roman"/>
-          <w:sz w:val="28"/>
-        </w:rPr>
-        <w:t xml:space="preserve">, </w:t>
-      </w:r>
-      <w:r>
-        <w:rPr>
-          <w:rFonts w:ascii="Times New Roman" w:hAnsi="Times New Roman" w:cs="Times New Roman"/>
-          <w:i/>
-          <w:iCs/>
-          <w:sz w:val="28"/>
-        </w:rPr>
-        <w:t>19</w:t>
-      </w:r>
-      <w:r>
-        <w:rPr>
-          <w:rFonts w:ascii="Times New Roman" w:hAnsi="Times New Roman" w:cs="Times New Roman"/>
-          <w:sz w:val="28"/>
-        </w:rPr>
-        <w:t>(5), 1212. https://doi.org/10.3390/s19051212</w:t>
-      </w:r>
-    </w:p>
-    <w:p>
-      <w:pPr>
-        <w:pStyle w:val="Bibliography"/>
-        <w:rPr>
-          <w:rFonts w:ascii="Times New Roman" w:hAnsi="Times New Roman" w:cs="Times New Roman"/>
-          <w:sz w:val="28"/>
-        </w:rPr>
-      </w:pPr>
-      <w:proofErr w:type="spellStart"/>
-      <w:r>
-        <w:rPr>
-          <w:rFonts w:ascii="Times New Roman" w:hAnsi="Times New Roman" w:cs="Times New Roman"/>
-          <w:sz w:val="28"/>
-        </w:rPr>
-        <w:t>Viadero</w:t>
-      </w:r>
-      <w:proofErr w:type="spellEnd"/>
-      <w:r>
-        <w:rPr>
-          <w:rFonts w:ascii="Times New Roman" w:hAnsi="Times New Roman" w:cs="Times New Roman"/>
-          <w:sz w:val="28"/>
-        </w:rPr>
-        <w:t>-Monasterio, F., Alonso-</w:t>
-      </w:r>
-      <w:proofErr w:type="spellStart"/>
-      <w:r>
-        <w:rPr>
-          <w:rFonts w:ascii="Times New Roman" w:hAnsi="Times New Roman" w:cs="Times New Roman"/>
-          <w:sz w:val="28"/>
-        </w:rPr>
-        <w:t>Rentería</w:t>
-      </w:r>
-      <w:proofErr w:type="spellEnd"/>
-      <w:r>
-        <w:rPr>
-          <w:rFonts w:ascii="Times New Roman" w:hAnsi="Times New Roman" w:cs="Times New Roman"/>
-          <w:sz w:val="28"/>
-        </w:rPr>
-        <w:t xml:space="preserve">, L., Pérez-Oria, J., &amp; </w:t>
-      </w:r>
-      <w:proofErr w:type="spellStart"/>
-      <w:r>
-        <w:rPr>
-          <w:rFonts w:ascii="Times New Roman" w:hAnsi="Times New Roman" w:cs="Times New Roman"/>
-          <w:sz w:val="28"/>
-        </w:rPr>
-        <w:t>Viadero</w:t>
-      </w:r>
-      <w:proofErr w:type="spellEnd"/>
-      <w:r>
-        <w:rPr>
-          <w:rFonts w:ascii="Times New Roman" w:hAnsi="Times New Roman" w:cs="Times New Roman"/>
-          <w:sz w:val="28"/>
-        </w:rPr>
-        <w:t xml:space="preserve">-Rueda, F. (2024). Radar-Based Pedestrian and Vehicle Detection and Identification for Driving Assistance. </w:t>
-      </w:r>
-      <w:r>
-        <w:rPr>
-          <w:rFonts w:ascii="Times New Roman" w:hAnsi="Times New Roman" w:cs="Times New Roman"/>
-          <w:i/>
-          <w:iCs/>
-          <w:sz w:val="28"/>
-        </w:rPr>
-        <w:t>Vehicles</w:t>
-      </w:r>
-      <w:r>
-        <w:rPr>
-          <w:rFonts w:ascii="Times New Roman" w:hAnsi="Times New Roman" w:cs="Times New Roman"/>
-          <w:sz w:val="28"/>
-        </w:rPr>
-        <w:t xml:space="preserve">, </w:t>
-      </w:r>
-      <w:r>
-        <w:rPr>
-          <w:rFonts w:ascii="Times New Roman" w:hAnsi="Times New Roman" w:cs="Times New Roman"/>
-          <w:i/>
-          <w:iCs/>
-          <w:sz w:val="28"/>
-        </w:rPr>
-        <w:t>6</w:t>
-      </w:r>
-      <w:r>
-        <w:rPr>
-          <w:rFonts w:ascii="Times New Roman" w:hAnsi="Times New Roman" w:cs="Times New Roman"/>
-          <w:sz w:val="28"/>
-        </w:rPr>
-        <w:t>(3), 1185–1199. https://doi.org/10.3390/vehicles6030056</w:t>
-      </w:r>
-    </w:p>
-    <w:p>
-      <w:pPr>
-        <w:pStyle w:val="Bibliography"/>
-        <w:rPr>
-          <w:rFonts w:ascii="Times New Roman" w:hAnsi="Times New Roman" w:cs="Times New Roman"/>
-          <w:sz w:val="28"/>
-        </w:rPr>
-      </w:pPr>
-      <w:r>
-        <w:rPr>
-          <w:rFonts w:ascii="Times New Roman" w:hAnsi="Times New Roman" w:cs="Times New Roman"/>
-          <w:sz w:val="28"/>
-        </w:rPr>
-        <w:t xml:space="preserve">Waldschmidt, C., Hasch, J., &amp; Menzel, W. (2021). Automotive Radar—From First Efforts to Future Systems. </w:t>
-      </w:r>
-      <w:r>
-        <w:rPr>
-          <w:rFonts w:ascii="Times New Roman" w:hAnsi="Times New Roman" w:cs="Times New Roman"/>
-          <w:i/>
-          <w:iCs/>
-          <w:sz w:val="28"/>
-        </w:rPr>
-        <w:t>IEEE Journal of Microwaves</w:t>
-      </w:r>
-      <w:r>
-        <w:rPr>
-          <w:rFonts w:ascii="Times New Roman" w:hAnsi="Times New Roman" w:cs="Times New Roman"/>
-          <w:sz w:val="28"/>
-        </w:rPr>
-        <w:t xml:space="preserve">, </w:t>
-      </w:r>
-      <w:r>
-        <w:rPr>
-          <w:rFonts w:ascii="Times New Roman" w:hAnsi="Times New Roman" w:cs="Times New Roman"/>
-          <w:i/>
-          <w:iCs/>
-          <w:sz w:val="28"/>
-        </w:rPr>
-        <w:t>1</w:t>
-      </w:r>
-      <w:r>
-        <w:rPr>
-          <w:rFonts w:ascii="Times New Roman" w:hAnsi="Times New Roman" w:cs="Times New Roman"/>
-          <w:sz w:val="28"/>
-        </w:rPr>
-        <w:t>(1), 135–148. https://doi.org/10.1109/JMW.2020.3033616</w:t>
-      </w:r>
-    </w:p>
-    <w:p>
-      <w:pPr>
-        <w:pStyle w:val="Bibliography"/>
-        <w:rPr>
-          <w:rFonts w:ascii="Times New Roman" w:hAnsi="Times New Roman" w:cs="Times New Roman"/>
-          <w:sz w:val="28"/>
-        </w:rPr>
-      </w:pPr>
-      <w:r>
-        <w:rPr>
-          <w:rFonts w:ascii="Times New Roman" w:hAnsi="Times New Roman" w:cs="Times New Roman"/>
-          <w:sz w:val="28"/>
-        </w:rPr>
-        <w:t xml:space="preserve">Wood, I., </w:t>
-      </w:r>
-      <w:proofErr w:type="spellStart"/>
-      <w:r>
-        <w:rPr>
-          <w:rFonts w:ascii="Times New Roman" w:hAnsi="Times New Roman" w:cs="Times New Roman"/>
-          <w:sz w:val="28"/>
-        </w:rPr>
-        <w:t>Dousset</w:t>
-      </w:r>
-      <w:proofErr w:type="spellEnd"/>
-      <w:r>
-        <w:rPr>
-          <w:rFonts w:ascii="Times New Roman" w:hAnsi="Times New Roman" w:cs="Times New Roman"/>
-          <w:sz w:val="28"/>
-        </w:rPr>
-        <w:t xml:space="preserve">, D., Bornemann, J., &amp; Claude, S. (2007). Linear tapered slot antenna with substrate integrated waveguide feed. </w:t>
+        <w:spacing w:line="360" w:lineRule="auto"/>
+        <w:jc w:val="both"/>
+        <w:rPr>
+          <w:rFonts w:ascii="Times New Roman" w:hAnsi="Times New Roman" w:cs="Times New Roman"/>
+          <w:sz w:val="28"/>
+        </w:rPr>
+      </w:pPr>
+      <w:r>
+        <w:rPr>
+          <w:rFonts w:ascii="Times New Roman" w:hAnsi="Times New Roman" w:cs="Times New Roman"/>
+          <w:sz w:val="28"/>
+        </w:rPr>
+        <w:t xml:space="preserve">Wood, I., Dousset, D., Bornemann, J., &amp; Claude, S. (2007). Linear tapered slot antenna with substrate integrated waveguide feed. </w:t>
       </w:r>
       <w:r>
         <w:rPr>
@@ -3191,6 +4791,8 @@
     <w:p>
       <w:pPr>
         <w:pStyle w:val="Bibliography"/>
+        <w:spacing w:line="360" w:lineRule="auto"/>
+        <w:jc w:val="both"/>
         <w:rPr>
           <w:rFonts w:ascii="Times New Roman" w:hAnsi="Times New Roman" w:cs="Times New Roman"/>
           <w:sz w:val="28"/>
@@ -3239,49 +4841,19 @@
     <w:p>
       <w:pPr>
         <w:pStyle w:val="Bibliography"/>
-        <w:rPr>
-          <w:rFonts w:ascii="Times New Roman" w:hAnsi="Times New Roman" w:cs="Times New Roman"/>
-          <w:sz w:val="28"/>
-        </w:rPr>
-      </w:pPr>
-      <w:r>
-        <w:rPr>
-          <w:rFonts w:ascii="Times New Roman" w:hAnsi="Times New Roman" w:cs="Times New Roman"/>
-          <w:sz w:val="28"/>
-        </w:rPr>
-        <w:t xml:space="preserve">Zakeri, H., Parvaneh, M., Moradi, G., </w:t>
-      </w:r>
-      <w:proofErr w:type="spellStart"/>
-      <w:r>
-        <w:rPr>
-          <w:rFonts w:ascii="Times New Roman" w:hAnsi="Times New Roman" w:cs="Times New Roman"/>
-          <w:sz w:val="28"/>
-        </w:rPr>
-        <w:t>Alibakhshikenari</w:t>
-      </w:r>
-      <w:proofErr w:type="spellEnd"/>
-      <w:r>
-        <w:rPr>
-          <w:rFonts w:ascii="Times New Roman" w:hAnsi="Times New Roman" w:cs="Times New Roman"/>
-          <w:sz w:val="28"/>
-        </w:rPr>
-        <w:t xml:space="preserve">, M., Virdee, B. S., &amp; </w:t>
-      </w:r>
-      <w:proofErr w:type="spellStart"/>
-      <w:r>
-        <w:rPr>
-          <w:rFonts w:ascii="Times New Roman" w:hAnsi="Times New Roman" w:cs="Times New Roman"/>
-          <w:sz w:val="28"/>
-        </w:rPr>
-        <w:t>Dalarsson</w:t>
-      </w:r>
-      <w:proofErr w:type="spellEnd"/>
-      <w:r>
-        <w:rPr>
-          <w:rFonts w:ascii="Times New Roman" w:hAnsi="Times New Roman" w:cs="Times New Roman"/>
-          <w:sz w:val="28"/>
-        </w:rPr>
-        <w:t xml:space="preserve">, M. (2026). Array antenna with series-fed configuration providing high radiation performances for automotive radar in IoT applications. </w:t>
+        <w:spacing w:line="360" w:lineRule="auto"/>
+        <w:jc w:val="both"/>
+        <w:rPr>
+          <w:rFonts w:ascii="Times New Roman" w:hAnsi="Times New Roman" w:cs="Times New Roman"/>
+          <w:sz w:val="28"/>
+        </w:rPr>
+      </w:pPr>
+      <w:r>
+        <w:rPr>
+          <w:rFonts w:ascii="Times New Roman" w:hAnsi="Times New Roman" w:cs="Times New Roman"/>
+          <w:sz w:val="28"/>
+        </w:rPr>
+        <w:t xml:space="preserve">Zakeri, H., Parvaneh, M., Moradi, G., Alibakhshikenari, M., Virdee, B. S., &amp; Dalarsson, M. (2026). Array antenna with series-fed configuration providing high radiation performances for automotive radar in IoT applications. </w:t>
       </w:r>
       <w:r>
         <w:rPr>
@@ -3319,33 +4891,19 @@
     <w:p>
       <w:pPr>
         <w:pStyle w:val="Bibliography"/>
-        <w:rPr>
-          <w:rFonts w:ascii="Times New Roman" w:hAnsi="Times New Roman" w:cs="Times New Roman"/>
-          <w:sz w:val="28"/>
-        </w:rPr>
-      </w:pPr>
-      <w:r>
-        <w:rPr>
-          <w:rFonts w:ascii="Times New Roman" w:hAnsi="Times New Roman" w:cs="Times New Roman"/>
-          <w:sz w:val="28"/>
-        </w:rPr>
-        <w:t xml:space="preserve">Zihao Liu, </w:t>
-      </w:r>
-      <w:proofErr w:type="spellStart"/>
-      <w:r>
-        <w:rPr>
-          <w:rFonts w:ascii="Times New Roman" w:hAnsi="Times New Roman" w:cs="Times New Roman"/>
-          <w:sz w:val="28"/>
-        </w:rPr>
-        <w:t>Yongzhong</w:t>
-      </w:r>
-      <w:proofErr w:type="spellEnd"/>
-      <w:r>
-        <w:rPr>
-          <w:rFonts w:ascii="Times New Roman" w:hAnsi="Times New Roman" w:cs="Times New Roman"/>
-          <w:sz w:val="28"/>
-        </w:rPr>
-        <w:t xml:space="preserve"> Zhu, &amp; Jian Zhou. (2016). Improved design of Vivaldi antenna with loading resistance for wideband applications. </w:t>
+        <w:spacing w:line="360" w:lineRule="auto"/>
+        <w:jc w:val="both"/>
+        <w:rPr>
+          <w:rFonts w:ascii="Times New Roman" w:hAnsi="Times New Roman" w:cs="Times New Roman"/>
+          <w:sz w:val="28"/>
+        </w:rPr>
+      </w:pPr>
+      <w:r>
+        <w:rPr>
+          <w:rFonts w:ascii="Times New Roman" w:hAnsi="Times New Roman" w:cs="Times New Roman"/>
+          <w:sz w:val="28"/>
+        </w:rPr>
+        <w:t xml:space="preserve">Zihao Liu, Yongzhong Zhu, &amp; Jian Zhou. (2016). Improved design of Vivaldi antenna with loading resistance for wideband applications. </w:t>
       </w:r>
       <w:r>
         <w:rPr>
@@ -3371,6 +4929,7 @@
           <w:ilvl w:val="0"/>
           <w:numId w:val="0"/>
         </w:numPr>
+        <w:spacing w:line="360" w:lineRule="auto"/>
         <w:jc w:val="both"/>
         <w:rPr>
           <w:lang w:val="sv-SE"/>
@@ -3384,6 +4943,9 @@
       </w:r>
     </w:p>
     <w:sectPr>
+      <w:headerReference w:type="default" r:id="rId12"/>
+      <w:footerReference w:type="default" r:id="rId13"/>
+      <w:headerReference w:type="first" r:id="rId14"/>
       <w:pgSz w:w="11906" w:h="16838" w:code="9"/>
       <w:pgMar w:top="2268" w:right="1701" w:bottom="1701" w:left="2268" w:header="720" w:footer="720" w:gutter="0"/>
       <w:cols w:space="720"/>
@@ -3393,9 +4955,465 @@
 </w:document>
 </file>
 
+<file path=word/endnotes.xml><?xml version="1.0" encoding="utf-8"?>
+<w:endnotes xmlns:wpc="http://schemas.microsoft.com/office/word/2010/wordprocessingCanvas" xmlns:cx="http://schemas.microsoft.com/office/drawing/2014/chartex" xmlns:cx1="http://schemas.microsoft.com/office/drawing/2015/9/8/chartex" xmlns:cx2="http://schemas.microsoft.com/office/drawing/2015/10/21/chartex" xmlns:cx3="http://schemas.microsoft.com/office/drawing/2016/5/9/chartex" xmlns:cx4="http://schemas.microsoft.com/office/drawing/2016/5/10/chartex" xmlns:cx5="http://schemas.microsoft.com/office/drawing/2016/5/11/chartex" xmlns:cx6="http://schemas.microsoft.com/office/drawing/2016/5/12/chartex" xmlns:cx7="http://schemas.microsoft.com/office/drawing/2016/5/13/chartex" xmlns:cx8="http://schemas.microsoft.com/office/drawing/2016/5/14/chartex" xmlns:mc="http://schemas.openxmlformats.org/markup-compatibility/2006" xmlns:aink="http://schemas.microsoft.com/office/drawing/2016/ink" xmlns:am3d="http://schemas.microsoft.com/office/drawing/2017/model3d" xmlns:o="urn:schemas-microsoft-com:office:office" xmlns:oel="http://schemas.microsoft.com/office/2019/extlst" xmlns:r="http://schemas.openxmlformats.org/officeDocument/2006/relationships" xmlns:m="http://schemas.openxmlformats.org/officeDocument/2006/math" xmlns:v="urn:schemas-microsoft-com:vml" xmlns:wp14="http://schemas.microsoft.com/office/word/2010/wordprocessingDrawing" xmlns:wp="http://schemas.openxmlformats.org/drawingml/2006/wordprocessingDrawing" xmlns:w10="urn:schemas-microsoft-com:office:word" xmlns:w="http://schemas.openxmlformats.org/wordprocessingml/2006/main" xmlns:w14="http://schemas.microsoft.com/office/word/2010/wordml" xmlns:w15="http://schemas.microsoft.com/office/word/2012/wordml" xmlns:w16cex="http://schemas.microsoft.com/office/word/2018/wordml/cex" xmlns:w16cid="http://schemas.microsoft.com/office/word/2016/wordml/cid" xmlns:w16="http://schemas.microsoft.com/office/word/2018/wordml" xmlns:w16du="http://schemas.microsoft.com/office/word/2023/wordml/word16du" xmlns:w16sdtdh="http://schemas.microsoft.com/office/word/2020/wordml/sdtdatahash" xmlns:w16sdtfl="http://schemas.microsoft.com/office/word/2024/wordml/sdtformatlock" xmlns:w16se="http://schemas.microsoft.com/office/word/2015/wordml/symex" xmlns:wpg="http://schemas.microsoft.com/office/word/2010/wordprocessingGroup" xmlns:wpi="http://schemas.microsoft.com/office/word/2010/wordprocessingInk" xmlns:wne="http://schemas.microsoft.com/office/word/2006/wordml" xmlns:wps="http://schemas.microsoft.com/office/word/2010/wordprocessingShape" mc:Ignorable="w14 w15 w16se w16cid w16 w16cex w16sdtdh w16sdtfl w16du wp14">
+  <w:endnote w:type="separator" w:id="-1">
+    <w:p>
+      <w:pPr>
+        <w:spacing w:after="0" w:line="240" w:lineRule="auto"/>
+      </w:pPr>
+      <w:r>
+        <w:separator/>
+      </w:r>
+    </w:p>
+  </w:endnote>
+  <w:endnote w:type="continuationSeparator" w:id="0">
+    <w:p>
+      <w:pPr>
+        <w:spacing w:after="0" w:line="240" w:lineRule="auto"/>
+      </w:pPr>
+      <w:r>
+        <w:continuationSeparator/>
+      </w:r>
+    </w:p>
+  </w:endnote>
+</w:endnotes>
+</file>
+
+<file path=word/footer1.xml><?xml version="1.0" encoding="utf-8"?>
+<w:ftr xmlns:wpc="http://schemas.microsoft.com/office/word/2010/wordprocessingCanvas" xmlns:cx="http://schemas.microsoft.com/office/drawing/2014/chartex" xmlns:cx1="http://schemas.microsoft.com/office/drawing/2015/9/8/chartex" xmlns:cx2="http://schemas.microsoft.com/office/drawing/2015/10/21/chartex" xmlns:cx3="http://schemas.microsoft.com/office/drawing/2016/5/9/chartex" xmlns:cx4="http://schemas.microsoft.com/office/drawing/2016/5/10/chartex" xmlns:cx5="http://schemas.microsoft.com/office/drawing/2016/5/11/chartex" xmlns:cx6="http://schemas.microsoft.com/office/drawing/2016/5/12/chartex" xmlns:cx7="http://schemas.microsoft.com/office/drawing/2016/5/13/chartex" xmlns:cx8="http://schemas.microsoft.com/office/drawing/2016/5/14/chartex" xmlns:mc="http://schemas.openxmlformats.org/markup-compatibility/2006" xmlns:aink="http://schemas.microsoft.com/office/drawing/2016/ink" xmlns:am3d="http://schemas.microsoft.com/office/drawing/2017/model3d" xmlns:o="urn:schemas-microsoft-com:office:office" xmlns:oel="http://schemas.microsoft.com/office/2019/extlst" xmlns:r="http://schemas.openxmlformats.org/officeDocument/2006/relationships" xmlns:m="http://schemas.openxmlformats.org/officeDocument/2006/math" xmlns:v="urn:schemas-microsoft-com:vml" xmlns:wp14="http://schemas.microsoft.com/office/word/2010/wordprocessingDrawing" xmlns:wp="http://schemas.openxmlformats.org/drawingml/2006/wordprocessingDrawing" xmlns:w10="urn:schemas-microsoft-com:office:word" xmlns:w="http://schemas.openxmlformats.org/wordprocessingml/2006/main" xmlns:w14="http://schemas.microsoft.com/office/word/2010/wordml" xmlns:w15="http://schemas.microsoft.com/office/word/2012/wordml" xmlns:w16cex="http://schemas.microsoft.com/office/word/2018/wordml/cex" xmlns:w16cid="http://schemas.microsoft.com/office/word/2016/wordml/cid" xmlns:w16="http://schemas.microsoft.com/office/word/2018/wordml" xmlns:w16du="http://schemas.microsoft.com/office/word/2023/wordml/word16du" xmlns:w16sdtdh="http://schemas.microsoft.com/office/word/2020/wordml/sdtdatahash" xmlns:w16sdtfl="http://schemas.microsoft.com/office/word/2024/wordml/sdtformatlock" xmlns:w16se="http://schemas.microsoft.com/office/word/2015/wordml/symex" xmlns:wpg="http://schemas.microsoft.com/office/word/2010/wordprocessingGroup" xmlns:wpi="http://schemas.microsoft.com/office/word/2010/wordprocessingInk" xmlns:wne="http://schemas.microsoft.com/office/word/2006/wordml" xmlns:wps="http://schemas.microsoft.com/office/word/2010/wordprocessingShape" mc:Ignorable="w14 w15 w16se w16cid w16 w16cex w16sdtdh w16sdtfl w16du wp14">
+  <w:sdt>
+    <w:sdtPr>
+      <w:id w:val="-1614748583"/>
+      <w:docPartObj>
+        <w:docPartGallery w:val="Page Numbers (Bottom of Page)"/>
+        <w:docPartUnique/>
+      </w:docPartObj>
+    </w:sdtPr>
+    <w:sdtEndPr>
+      <w:rPr>
+        <w:rFonts w:ascii="Times New Roman" w:hAnsi="Times New Roman" w:cs="Times New Roman"/>
+        <w:noProof/>
+      </w:rPr>
+    </w:sdtEndPr>
+    <w:sdtContent>
+      <w:p>
+        <w:pPr>
+          <w:pStyle w:val="Footer"/>
+          <w:jc w:val="center"/>
+          <w:rPr>
+            <w:rFonts w:ascii="Times New Roman" w:hAnsi="Times New Roman" w:cs="Times New Roman"/>
+          </w:rPr>
+        </w:pPr>
+        <w:r>
+          <w:rPr>
+            <w:rFonts w:ascii="Times New Roman" w:hAnsi="Times New Roman" w:cs="Times New Roman"/>
+          </w:rPr>
+          <w:fldChar w:fldCharType="begin"/>
+        </w:r>
+        <w:r>
+          <w:rPr>
+            <w:rFonts w:ascii="Times New Roman" w:hAnsi="Times New Roman" w:cs="Times New Roman"/>
+          </w:rPr>
+          <w:instrText xml:space="preserve"> PAGE   \* MERGEFORMAT </w:instrText>
+        </w:r>
+        <w:r>
+          <w:rPr>
+            <w:rFonts w:ascii="Times New Roman" w:hAnsi="Times New Roman" w:cs="Times New Roman"/>
+          </w:rPr>
+          <w:fldChar w:fldCharType="separate"/>
+        </w:r>
+        <w:r>
+          <w:rPr>
+            <w:rFonts w:ascii="Times New Roman" w:hAnsi="Times New Roman" w:cs="Times New Roman"/>
+            <w:noProof/>
+          </w:rPr>
+          <w:t>2</w:t>
+        </w:r>
+        <w:r>
+          <w:rPr>
+            <w:rFonts w:ascii="Times New Roman" w:hAnsi="Times New Roman" w:cs="Times New Roman"/>
+            <w:noProof/>
+          </w:rPr>
+          <w:fldChar w:fldCharType="end"/>
+        </w:r>
+      </w:p>
+    </w:sdtContent>
+  </w:sdt>
+  <w:p>
+    <w:pPr>
+      <w:pStyle w:val="Footer"/>
+    </w:pPr>
+  </w:p>
+</w:ftr>
+</file>
+
+<file path=word/footer2.xml><?xml version="1.0" encoding="utf-8"?>
+<w:ftr xmlns:wpc="http://schemas.microsoft.com/office/word/2010/wordprocessingCanvas" xmlns:cx="http://schemas.microsoft.com/office/drawing/2014/chartex" xmlns:cx1="http://schemas.microsoft.com/office/drawing/2015/9/8/chartex" xmlns:cx2="http://schemas.microsoft.com/office/drawing/2015/10/21/chartex" xmlns:cx3="http://schemas.microsoft.com/office/drawing/2016/5/9/chartex" xmlns:cx4="http://schemas.microsoft.com/office/drawing/2016/5/10/chartex" xmlns:cx5="http://schemas.microsoft.com/office/drawing/2016/5/11/chartex" xmlns:cx6="http://schemas.microsoft.com/office/drawing/2016/5/12/chartex" xmlns:cx7="http://schemas.microsoft.com/office/drawing/2016/5/13/chartex" xmlns:cx8="http://schemas.microsoft.com/office/drawing/2016/5/14/chartex" xmlns:mc="http://schemas.openxmlformats.org/markup-compatibility/2006" xmlns:aink="http://schemas.microsoft.com/office/drawing/2016/ink" xmlns:am3d="http://schemas.microsoft.com/office/drawing/2017/model3d" xmlns:o="urn:schemas-microsoft-com:office:office" xmlns:oel="http://schemas.microsoft.com/office/2019/extlst" xmlns:r="http://schemas.openxmlformats.org/officeDocument/2006/relationships" xmlns:m="http://schemas.openxmlformats.org/officeDocument/2006/math" xmlns:v="urn:schemas-microsoft-com:vml" xmlns:wp14="http://schemas.microsoft.com/office/word/2010/wordprocessingDrawing" xmlns:wp="http://schemas.openxmlformats.org/drawingml/2006/wordprocessingDrawing" xmlns:w10="urn:schemas-microsoft-com:office:word" xmlns:w="http://schemas.openxmlformats.org/wordprocessingml/2006/main" xmlns:w14="http://schemas.microsoft.com/office/word/2010/wordml" xmlns:w15="http://schemas.microsoft.com/office/word/2012/wordml" xmlns:w16cex="http://schemas.microsoft.com/office/word/2018/wordml/cex" xmlns:w16cid="http://schemas.microsoft.com/office/word/2016/wordml/cid" xmlns:w16="http://schemas.microsoft.com/office/word/2018/wordml" xmlns:w16du="http://schemas.microsoft.com/office/word/2023/wordml/word16du" xmlns:w16sdtdh="http://schemas.microsoft.com/office/word/2020/wordml/sdtdatahash" xmlns:w16sdtfl="http://schemas.microsoft.com/office/word/2024/wordml/sdtformatlock" xmlns:w16se="http://schemas.microsoft.com/office/word/2015/wordml/symex" xmlns:wpg="http://schemas.microsoft.com/office/word/2010/wordprocessingGroup" xmlns:wpi="http://schemas.microsoft.com/office/word/2010/wordprocessingInk" xmlns:wne="http://schemas.microsoft.com/office/word/2006/wordml" xmlns:wps="http://schemas.microsoft.com/office/word/2010/wordprocessingShape" mc:Ignorable="w14 w15 w16se w16cid w16 w16cex w16sdtdh w16sdtfl w16du wp14">
+  <w:sdt>
+    <w:sdtPr>
+      <w:id w:val="-642123211"/>
+      <w:docPartObj>
+        <w:docPartGallery w:val="Page Numbers (Bottom of Page)"/>
+        <w:docPartUnique/>
+      </w:docPartObj>
+    </w:sdtPr>
+    <w:sdtEndPr>
+      <w:rPr>
+        <w:rFonts w:ascii="Times New Roman" w:hAnsi="Times New Roman" w:cs="Times New Roman"/>
+        <w:noProof/>
+      </w:rPr>
+    </w:sdtEndPr>
+    <w:sdtContent>
+      <w:p>
+        <w:pPr>
+          <w:pStyle w:val="Footer"/>
+          <w:jc w:val="center"/>
+          <w:rPr>
+            <w:rFonts w:ascii="Times New Roman" w:hAnsi="Times New Roman" w:cs="Times New Roman"/>
+          </w:rPr>
+        </w:pPr>
+        <w:r>
+          <w:rPr>
+            <w:rFonts w:ascii="Times New Roman" w:hAnsi="Times New Roman" w:cs="Times New Roman"/>
+          </w:rPr>
+          <w:fldChar w:fldCharType="begin"/>
+        </w:r>
+        <w:r>
+          <w:rPr>
+            <w:rFonts w:ascii="Times New Roman" w:hAnsi="Times New Roman" w:cs="Times New Roman"/>
+          </w:rPr>
+          <w:instrText xml:space="preserve"> PAGE   \* MERGEFORMAT </w:instrText>
+        </w:r>
+        <w:r>
+          <w:rPr>
+            <w:rFonts w:ascii="Times New Roman" w:hAnsi="Times New Roman" w:cs="Times New Roman"/>
+          </w:rPr>
+          <w:fldChar w:fldCharType="separate"/>
+        </w:r>
+        <w:r>
+          <w:rPr>
+            <w:rFonts w:ascii="Times New Roman" w:hAnsi="Times New Roman" w:cs="Times New Roman"/>
+            <w:noProof/>
+          </w:rPr>
+          <w:t>2</w:t>
+        </w:r>
+        <w:r>
+          <w:rPr>
+            <w:rFonts w:ascii="Times New Roman" w:hAnsi="Times New Roman" w:cs="Times New Roman"/>
+            <w:noProof/>
+          </w:rPr>
+          <w:fldChar w:fldCharType="end"/>
+        </w:r>
+      </w:p>
+    </w:sdtContent>
+  </w:sdt>
+  <w:p>
+    <w:pPr>
+      <w:pStyle w:val="Footer"/>
+    </w:pPr>
+  </w:p>
+</w:ftr>
+</file>
+
+<file path=word/footnotes.xml><?xml version="1.0" encoding="utf-8"?>
+<w:footnotes xmlns:wpc="http://schemas.microsoft.com/office/word/2010/wordprocessingCanvas" xmlns:cx="http://schemas.microsoft.com/office/drawing/2014/chartex" xmlns:cx1="http://schemas.microsoft.com/office/drawing/2015/9/8/chartex" xmlns:cx2="http://schemas.microsoft.com/office/drawing/2015/10/21/chartex" xmlns:cx3="http://schemas.microsoft.com/office/drawing/2016/5/9/chartex" xmlns:cx4="http://schemas.microsoft.com/office/drawing/2016/5/10/chartex" xmlns:cx5="http://schemas.microsoft.com/office/drawing/2016/5/11/chartex" xmlns:cx6="http://schemas.microsoft.com/office/drawing/2016/5/12/chartex" xmlns:cx7="http://schemas.microsoft.com/office/drawing/2016/5/13/chartex" xmlns:cx8="http://schemas.microsoft.com/office/drawing/2016/5/14/chartex" xmlns:mc="http://schemas.openxmlformats.org/markup-compatibility/2006" xmlns:aink="http://schemas.microsoft.com/office/drawing/2016/ink" xmlns:am3d="http://schemas.microsoft.com/office/drawing/2017/model3d" xmlns:o="urn:schemas-microsoft-com:office:office" xmlns:oel="http://schemas.microsoft.com/office/2019/extlst" xmlns:r="http://schemas.openxmlformats.org/officeDocument/2006/relationships" xmlns:m="http://schemas.openxmlformats.org/officeDocument/2006/math" xmlns:v="urn:schemas-microsoft-com:vml" xmlns:wp14="http://schemas.microsoft.com/office/word/2010/wordprocessingDrawing" xmlns:wp="http://schemas.openxmlformats.org/drawingml/2006/wordprocessingDrawing" xmlns:w10="urn:schemas-microsoft-com:office:word" xmlns:w="http://schemas.openxmlformats.org/wordprocessingml/2006/main" xmlns:w14="http://schemas.microsoft.com/office/word/2010/wordml" xmlns:w15="http://schemas.microsoft.com/office/word/2012/wordml" xmlns:w16cex="http://schemas.microsoft.com/office/word/2018/wordml/cex" xmlns:w16cid="http://schemas.microsoft.com/office/word/2016/wordml/cid" xmlns:w16="http://schemas.microsoft.com/office/word/2018/wordml" xmlns:w16du="http://schemas.microsoft.com/office/word/2023/wordml/word16du" xmlns:w16sdtdh="http://schemas.microsoft.com/office/word/2020/wordml/sdtdatahash" xmlns:w16sdtfl="http://schemas.microsoft.com/office/word/2024/wordml/sdtformatlock" xmlns:w16se="http://schemas.microsoft.com/office/word/2015/wordml/symex" xmlns:wpg="http://schemas.microsoft.com/office/word/2010/wordprocessingGroup" xmlns:wpi="http://schemas.microsoft.com/office/word/2010/wordprocessingInk" xmlns:wne="http://schemas.microsoft.com/office/word/2006/wordml" xmlns:wps="http://schemas.microsoft.com/office/word/2010/wordprocessingShape" mc:Ignorable="w14 w15 w16se w16cid w16 w16cex w16sdtdh w16sdtfl w16du wp14">
+  <w:footnote w:type="separator" w:id="-1">
+    <w:p>
+      <w:pPr>
+        <w:spacing w:after="0" w:line="240" w:lineRule="auto"/>
+      </w:pPr>
+      <w:r>
+        <w:separator/>
+      </w:r>
+    </w:p>
+  </w:footnote>
+  <w:footnote w:type="continuationSeparator" w:id="0">
+    <w:p>
+      <w:pPr>
+        <w:spacing w:after="0" w:line="240" w:lineRule="auto"/>
+      </w:pPr>
+      <w:r>
+        <w:continuationSeparator/>
+      </w:r>
+    </w:p>
+  </w:footnote>
+</w:footnotes>
+</file>
+
+<file path=word/header1.xml><?xml version="1.0" encoding="utf-8"?>
+<w:hdr xmlns:wpc="http://schemas.microsoft.com/office/word/2010/wordprocessingCanvas" xmlns:cx="http://schemas.microsoft.com/office/drawing/2014/chartex" xmlns:cx1="http://schemas.microsoft.com/office/drawing/2015/9/8/chartex" xmlns:cx2="http://schemas.microsoft.com/office/drawing/2015/10/21/chartex" xmlns:cx3="http://schemas.microsoft.com/office/drawing/2016/5/9/chartex" xmlns:cx4="http://schemas.microsoft.com/office/drawing/2016/5/10/chartex" xmlns:cx5="http://schemas.microsoft.com/office/drawing/2016/5/11/chartex" xmlns:cx6="http://schemas.microsoft.com/office/drawing/2016/5/12/chartex" xmlns:cx7="http://schemas.microsoft.com/office/drawing/2016/5/13/chartex" xmlns:cx8="http://schemas.microsoft.com/office/drawing/2016/5/14/chartex" xmlns:mc="http://schemas.openxmlformats.org/markup-compatibility/2006" xmlns:aink="http://schemas.microsoft.com/office/drawing/2016/ink" xmlns:am3d="http://schemas.microsoft.com/office/drawing/2017/model3d" xmlns:o="urn:schemas-microsoft-com:office:office" xmlns:oel="http://schemas.microsoft.com/office/2019/extlst" xmlns:r="http://schemas.openxmlformats.org/officeDocument/2006/relationships" xmlns:m="http://schemas.openxmlformats.org/officeDocument/2006/math" xmlns:v="urn:schemas-microsoft-com:vml" xmlns:wp14="http://schemas.microsoft.com/office/word/2010/wordprocessingDrawing" xmlns:wp="http://schemas.openxmlformats.org/drawingml/2006/wordprocessingDrawing" xmlns:w10="urn:schemas-microsoft-com:office:word" xmlns:w="http://schemas.openxmlformats.org/wordprocessingml/2006/main" xmlns:w14="http://schemas.microsoft.com/office/word/2010/wordml" xmlns:w15="http://schemas.microsoft.com/office/word/2012/wordml" xmlns:w16cex="http://schemas.microsoft.com/office/word/2018/wordml/cex" xmlns:w16cid="http://schemas.microsoft.com/office/word/2016/wordml/cid" xmlns:w16="http://schemas.microsoft.com/office/word/2018/wordml" xmlns:w16du="http://schemas.microsoft.com/office/word/2023/wordml/word16du" xmlns:w16sdtdh="http://schemas.microsoft.com/office/word/2020/wordml/sdtdatahash" xmlns:w16sdtfl="http://schemas.microsoft.com/office/word/2024/wordml/sdtformatlock" xmlns:w16se="http://schemas.microsoft.com/office/word/2015/wordml/symex" xmlns:wpg="http://schemas.microsoft.com/office/word/2010/wordprocessingGroup" xmlns:wpi="http://schemas.microsoft.com/office/word/2010/wordprocessingInk" xmlns:wne="http://schemas.microsoft.com/office/word/2006/wordml" xmlns:wps="http://schemas.microsoft.com/office/word/2010/wordprocessingShape" mc:Ignorable="w14 w15 w16se w16cid w16 w16cex w16sdtdh w16sdtfl w16du wp14">
+  <w:sdt>
+    <w:sdtPr>
+      <w:id w:val="999702599"/>
+      <w:docPartObj>
+        <w:docPartGallery w:val="Page Numbers (Top of Page)"/>
+        <w:docPartUnique/>
+      </w:docPartObj>
+    </w:sdtPr>
+    <w:sdtEndPr>
+      <w:rPr>
+        <w:rFonts w:ascii="Times New Roman" w:hAnsi="Times New Roman" w:cs="Times New Roman"/>
+        <w:noProof/>
+      </w:rPr>
+    </w:sdtEndPr>
+    <w:sdtContent>
+      <w:p>
+        <w:pPr>
+          <w:pStyle w:val="Header"/>
+          <w:jc w:val="right"/>
+          <w:rPr>
+            <w:rFonts w:ascii="Times New Roman" w:hAnsi="Times New Roman" w:cs="Times New Roman"/>
+          </w:rPr>
+        </w:pPr>
+        <w:r>
+          <w:rPr>
+            <w:rFonts w:ascii="Times New Roman" w:hAnsi="Times New Roman" w:cs="Times New Roman"/>
+          </w:rPr>
+          <w:fldChar w:fldCharType="begin"/>
+        </w:r>
+        <w:r>
+          <w:rPr>
+            <w:rFonts w:ascii="Times New Roman" w:hAnsi="Times New Roman" w:cs="Times New Roman"/>
+          </w:rPr>
+          <w:instrText xml:space="preserve"> PAGE   \* MERGEFORMAT </w:instrText>
+        </w:r>
+        <w:r>
+          <w:rPr>
+            <w:rFonts w:ascii="Times New Roman" w:hAnsi="Times New Roman" w:cs="Times New Roman"/>
+          </w:rPr>
+          <w:fldChar w:fldCharType="separate"/>
+        </w:r>
+        <w:r>
+          <w:rPr>
+            <w:rFonts w:ascii="Times New Roman" w:hAnsi="Times New Roman" w:cs="Times New Roman"/>
+            <w:noProof/>
+          </w:rPr>
+          <w:t>2</w:t>
+        </w:r>
+        <w:r>
+          <w:rPr>
+            <w:rFonts w:ascii="Times New Roman" w:hAnsi="Times New Roman" w:cs="Times New Roman"/>
+            <w:noProof/>
+          </w:rPr>
+          <w:fldChar w:fldCharType="end"/>
+        </w:r>
+      </w:p>
+    </w:sdtContent>
+  </w:sdt>
+  <w:p>
+    <w:pPr>
+      <w:pStyle w:val="Header"/>
+    </w:pPr>
+  </w:p>
+</w:hdr>
+</file>
+
+<file path=word/header2.xml><?xml version="1.0" encoding="utf-8"?>
+<w:hdr xmlns:wpc="http://schemas.microsoft.com/office/word/2010/wordprocessingCanvas" xmlns:cx="http://schemas.microsoft.com/office/drawing/2014/chartex" xmlns:cx1="http://schemas.microsoft.com/office/drawing/2015/9/8/chartex" xmlns:cx2="http://schemas.microsoft.com/office/drawing/2015/10/21/chartex" xmlns:cx3="http://schemas.microsoft.com/office/drawing/2016/5/9/chartex" xmlns:cx4="http://schemas.microsoft.com/office/drawing/2016/5/10/chartex" xmlns:cx5="http://schemas.microsoft.com/office/drawing/2016/5/11/chartex" xmlns:cx6="http://schemas.microsoft.com/office/drawing/2016/5/12/chartex" xmlns:cx7="http://schemas.microsoft.com/office/drawing/2016/5/13/chartex" xmlns:cx8="http://schemas.microsoft.com/office/drawing/2016/5/14/chartex" xmlns:mc="http://schemas.openxmlformats.org/markup-compatibility/2006" xmlns:aink="http://schemas.microsoft.com/office/drawing/2016/ink" xmlns:am3d="http://schemas.microsoft.com/office/drawing/2017/model3d" xmlns:o="urn:schemas-microsoft-com:office:office" xmlns:oel="http://schemas.microsoft.com/office/2019/extlst" xmlns:r="http://schemas.openxmlformats.org/officeDocument/2006/relationships" xmlns:m="http://schemas.openxmlformats.org/officeDocument/2006/math" xmlns:v="urn:schemas-microsoft-com:vml" xmlns:wp14="http://schemas.microsoft.com/office/word/2010/wordprocessingDrawing" xmlns:wp="http://schemas.openxmlformats.org/drawingml/2006/wordprocessingDrawing" xmlns:w10="urn:schemas-microsoft-com:office:word" xmlns:w="http://schemas.openxmlformats.org/wordprocessingml/2006/main" xmlns:w14="http://schemas.microsoft.com/office/word/2010/wordml" xmlns:w15="http://schemas.microsoft.com/office/word/2012/wordml" xmlns:w16cex="http://schemas.microsoft.com/office/word/2018/wordml/cex" xmlns:w16cid="http://schemas.microsoft.com/office/word/2016/wordml/cid" xmlns:w16="http://schemas.microsoft.com/office/word/2018/wordml" xmlns:w16du="http://schemas.microsoft.com/office/word/2023/wordml/word16du" xmlns:w16sdtdh="http://schemas.microsoft.com/office/word/2020/wordml/sdtdatahash" xmlns:w16sdtfl="http://schemas.microsoft.com/office/word/2024/wordml/sdtformatlock" xmlns:w16se="http://schemas.microsoft.com/office/word/2015/wordml/symex" xmlns:wpg="http://schemas.microsoft.com/office/word/2010/wordprocessingGroup" xmlns:wpi="http://schemas.microsoft.com/office/word/2010/wordprocessingInk" xmlns:wne="http://schemas.microsoft.com/office/word/2006/wordml" xmlns:wps="http://schemas.microsoft.com/office/word/2010/wordprocessingShape" mc:Ignorable="w14 w15 w16se w16cid w16 w16cex w16sdtdh w16sdtfl w16du wp14">
+  <w:p>
+    <w:pPr>
+      <w:pStyle w:val="Header"/>
+    </w:pPr>
+  </w:p>
+</w:hdr>
+</file>
+
+<file path=word/header3.xml><?xml version="1.0" encoding="utf-8"?>
+<w:hdr xmlns:wpc="http://schemas.microsoft.com/office/word/2010/wordprocessingCanvas" xmlns:cx="http://schemas.microsoft.com/office/drawing/2014/chartex" xmlns:cx1="http://schemas.microsoft.com/office/drawing/2015/9/8/chartex" xmlns:cx2="http://schemas.microsoft.com/office/drawing/2015/10/21/chartex" xmlns:cx3="http://schemas.microsoft.com/office/drawing/2016/5/9/chartex" xmlns:cx4="http://schemas.microsoft.com/office/drawing/2016/5/10/chartex" xmlns:cx5="http://schemas.microsoft.com/office/drawing/2016/5/11/chartex" xmlns:cx6="http://schemas.microsoft.com/office/drawing/2016/5/12/chartex" xmlns:cx7="http://schemas.microsoft.com/office/drawing/2016/5/13/chartex" xmlns:cx8="http://schemas.microsoft.com/office/drawing/2016/5/14/chartex" xmlns:mc="http://schemas.openxmlformats.org/markup-compatibility/2006" xmlns:aink="http://schemas.microsoft.com/office/drawing/2016/ink" xmlns:am3d="http://schemas.microsoft.com/office/drawing/2017/model3d" xmlns:o="urn:schemas-microsoft-com:office:office" xmlns:oel="http://schemas.microsoft.com/office/2019/extlst" xmlns:r="http://schemas.openxmlformats.org/officeDocument/2006/relationships" xmlns:m="http://schemas.openxmlformats.org/officeDocument/2006/math" xmlns:v="urn:schemas-microsoft-com:vml" xmlns:wp14="http://schemas.microsoft.com/office/word/2010/wordprocessingDrawing" xmlns:wp="http://schemas.openxmlformats.org/drawingml/2006/wordprocessingDrawing" xmlns:w10="urn:schemas-microsoft-com:office:word" xmlns:w="http://schemas.openxmlformats.org/wordprocessingml/2006/main" xmlns:w14="http://schemas.microsoft.com/office/word/2010/wordml" xmlns:w15="http://schemas.microsoft.com/office/word/2012/wordml" xmlns:w16cex="http://schemas.microsoft.com/office/word/2018/wordml/cex" xmlns:w16cid="http://schemas.microsoft.com/office/word/2016/wordml/cid" xmlns:w16="http://schemas.microsoft.com/office/word/2018/wordml" xmlns:w16du="http://schemas.microsoft.com/office/word/2023/wordml/word16du" xmlns:w16sdtdh="http://schemas.microsoft.com/office/word/2020/wordml/sdtdatahash" xmlns:w16sdtfl="http://schemas.microsoft.com/office/word/2024/wordml/sdtformatlock" xmlns:w16se="http://schemas.microsoft.com/office/word/2015/wordml/symex" xmlns:wpg="http://schemas.microsoft.com/office/word/2010/wordprocessingGroup" xmlns:wpi="http://schemas.microsoft.com/office/word/2010/wordprocessingInk" xmlns:wne="http://schemas.microsoft.com/office/word/2006/wordml" xmlns:wps="http://schemas.microsoft.com/office/word/2010/wordprocessingShape" mc:Ignorable="w14 w15 w16se w16cid w16 w16cex w16sdtdh w16sdtfl w16du wp14">
+  <w:p>
+    <w:pPr>
+      <w:pStyle w:val="Header"/>
+    </w:pPr>
+  </w:p>
+</w:hdr>
+</file>
+
+<file path=word/header4.xml><?xml version="1.0" encoding="utf-8"?>
+<w:hdr xmlns:wpc="http://schemas.microsoft.com/office/word/2010/wordprocessingCanvas" xmlns:cx="http://schemas.microsoft.com/office/drawing/2014/chartex" xmlns:cx1="http://schemas.microsoft.com/office/drawing/2015/9/8/chartex" xmlns:cx2="http://schemas.microsoft.com/office/drawing/2015/10/21/chartex" xmlns:cx3="http://schemas.microsoft.com/office/drawing/2016/5/9/chartex" xmlns:cx4="http://schemas.microsoft.com/office/drawing/2016/5/10/chartex" xmlns:cx5="http://schemas.microsoft.com/office/drawing/2016/5/11/chartex" xmlns:cx6="http://schemas.microsoft.com/office/drawing/2016/5/12/chartex" xmlns:cx7="http://schemas.microsoft.com/office/drawing/2016/5/13/chartex" xmlns:cx8="http://schemas.microsoft.com/office/drawing/2016/5/14/chartex" xmlns:mc="http://schemas.openxmlformats.org/markup-compatibility/2006" xmlns:aink="http://schemas.microsoft.com/office/drawing/2016/ink" xmlns:am3d="http://schemas.microsoft.com/office/drawing/2017/model3d" xmlns:o="urn:schemas-microsoft-com:office:office" xmlns:oel="http://schemas.microsoft.com/office/2019/extlst" xmlns:r="http://schemas.openxmlformats.org/officeDocument/2006/relationships" xmlns:m="http://schemas.openxmlformats.org/officeDocument/2006/math" xmlns:v="urn:schemas-microsoft-com:vml" xmlns:wp14="http://schemas.microsoft.com/office/word/2010/wordprocessingDrawing" xmlns:wp="http://schemas.openxmlformats.org/drawingml/2006/wordprocessingDrawing" xmlns:w10="urn:schemas-microsoft-com:office:word" xmlns:w="http://schemas.openxmlformats.org/wordprocessingml/2006/main" xmlns:w14="http://schemas.microsoft.com/office/word/2010/wordml" xmlns:w15="http://schemas.microsoft.com/office/word/2012/wordml" xmlns:w16cex="http://schemas.microsoft.com/office/word/2018/wordml/cex" xmlns:w16cid="http://schemas.microsoft.com/office/word/2016/wordml/cid" xmlns:w16="http://schemas.microsoft.com/office/word/2018/wordml" xmlns:w16du="http://schemas.microsoft.com/office/word/2023/wordml/word16du" xmlns:w16sdtdh="http://schemas.microsoft.com/office/word/2020/wordml/sdtdatahash" xmlns:w16sdtfl="http://schemas.microsoft.com/office/word/2024/wordml/sdtformatlock" xmlns:w16se="http://schemas.microsoft.com/office/word/2015/wordml/symex" xmlns:wpg="http://schemas.microsoft.com/office/word/2010/wordprocessingGroup" xmlns:wpi="http://schemas.microsoft.com/office/word/2010/wordprocessingInk" xmlns:wne="http://schemas.microsoft.com/office/word/2006/wordml" xmlns:wps="http://schemas.microsoft.com/office/word/2010/wordprocessingShape" mc:Ignorable="w14 w15 w16se w16cid w16 w16cex w16sdtdh w16sdtfl w16du wp14">
+  <w:p>
+    <w:pPr>
+      <w:pStyle w:val="Header"/>
+    </w:pPr>
+  </w:p>
+</w:hdr>
+</file>
+
 <file path=word/numbering.xml><?xml version="1.0" encoding="utf-8"?>
 <w:numbering xmlns:wpc="http://schemas.microsoft.com/office/word/2010/wordprocessingCanvas" xmlns:cx="http://schemas.microsoft.com/office/drawing/2014/chartex" xmlns:cx1="http://schemas.microsoft.com/office/drawing/2015/9/8/chartex" xmlns:cx2="http://schemas.microsoft.com/office/drawing/2015/10/21/chartex" xmlns:cx3="http://schemas.microsoft.com/office/drawing/2016/5/9/chartex" xmlns:cx4="http://schemas.microsoft.com/office/drawing/2016/5/10/chartex" xmlns:cx5="http://schemas.microsoft.com/office/drawing/2016/5/11/chartex" xmlns:cx6="http://schemas.microsoft.com/office/drawing/2016/5/12/chartex" xmlns:cx7="http://schemas.microsoft.com/office/drawing/2016/5/13/chartex" xmlns:cx8="http://schemas.microsoft.com/office/drawing/2016/5/14/chartex" xmlns:mc="http://schemas.openxmlformats.org/markup-compatibility/2006" xmlns:aink="http://schemas.microsoft.com/office/drawing/2016/ink" xmlns:am3d="http://schemas.microsoft.com/office/drawing/2017/model3d" xmlns:o="urn:schemas-microsoft-com:office:office" xmlns:oel="http://schemas.microsoft.com/office/2019/extlst" xmlns:r="http://schemas.openxmlformats.org/officeDocument/2006/relationships" xmlns:m="http://schemas.openxmlformats.org/officeDocument/2006/math" xmlns:v="urn:schemas-microsoft-com:vml" xmlns:wp14="http://schemas.microsoft.com/office/word/2010/wordprocessingDrawing" xmlns:wp="http://schemas.openxmlformats.org/drawingml/2006/wordprocessingDrawing" xmlns:w10="urn:schemas-microsoft-com:office:word" xmlns:w="http://schemas.openxmlformats.org/wordprocessingml/2006/main" xmlns:w14="http://schemas.microsoft.com/office/word/2010/wordml" xmlns:w15="http://schemas.microsoft.com/office/word/2012/wordml" xmlns:w16cex="http://schemas.microsoft.com/office/word/2018/wordml/cex" xmlns:w16cid="http://schemas.microsoft.com/office/word/2016/wordml/cid" xmlns:w16="http://schemas.microsoft.com/office/word/2018/wordml" xmlns:w16du="http://schemas.microsoft.com/office/word/2023/wordml/word16du" xmlns:w16sdtdh="http://schemas.microsoft.com/office/word/2020/wordml/sdtdatahash" xmlns:w16sdtfl="http://schemas.microsoft.com/office/word/2024/wordml/sdtformatlock" xmlns:w16se="http://schemas.microsoft.com/office/word/2015/wordml/symex" xmlns:wpg="http://schemas.microsoft.com/office/word/2010/wordprocessingGroup" xmlns:wpi="http://schemas.microsoft.com/office/word/2010/wordprocessingInk" xmlns:wne="http://schemas.microsoft.com/office/word/2006/wordml" xmlns:wps="http://schemas.microsoft.com/office/word/2010/wordprocessingShape" mc:Ignorable="w14 w15 w16se w16cid w16 w16cex w16sdtdh w16sdtfl w16du wp14">
   <w:abstractNum w:abstractNumId="0" w15:restartNumberingAfterBreak="0">
+    <w:nsid w:val="134C6CD7"/>
+    <w:multiLevelType w:val="hybridMultilevel"/>
+    <w:tmpl w:val="9BAA4E88"/>
+    <w:lvl w:ilvl="0" w:tplc="0409000F">
+      <w:start w:val="1"/>
+      <w:numFmt w:val="decimal"/>
+      <w:lvlText w:val="%1."/>
+      <w:lvlJc w:val="left"/>
+      <w:pPr>
+        <w:ind w:left="720" w:hanging="360"/>
+      </w:pPr>
+    </w:lvl>
+    <w:lvl w:ilvl="1" w:tplc="04090019" w:tentative="1">
+      <w:start w:val="1"/>
+      <w:numFmt w:val="lowerLetter"/>
+      <w:lvlText w:val="%2."/>
+      <w:lvlJc w:val="left"/>
+      <w:pPr>
+        <w:ind w:left="1440" w:hanging="360"/>
+      </w:pPr>
+    </w:lvl>
+    <w:lvl w:ilvl="2" w:tplc="0409001B" w:tentative="1">
+      <w:start w:val="1"/>
+      <w:numFmt w:val="lowerRoman"/>
+      <w:lvlText w:val="%3."/>
+      <w:lvlJc w:val="right"/>
+      <w:pPr>
+        <w:ind w:left="2160" w:hanging="180"/>
+      </w:pPr>
+    </w:lvl>
+    <w:lvl w:ilvl="3" w:tplc="0409000F" w:tentative="1">
+      <w:start w:val="1"/>
+      <w:numFmt w:val="decimal"/>
+      <w:lvlText w:val="%4."/>
+      <w:lvlJc w:val="left"/>
+      <w:pPr>
+        <w:ind w:left="2880" w:hanging="360"/>
+      </w:pPr>
+    </w:lvl>
+    <w:lvl w:ilvl="4" w:tplc="04090019" w:tentative="1">
+      <w:start w:val="1"/>
+      <w:numFmt w:val="lowerLetter"/>
+      <w:lvlText w:val="%5."/>
+      <w:lvlJc w:val="left"/>
+      <w:pPr>
+        <w:ind w:left="3600" w:hanging="360"/>
+      </w:pPr>
+    </w:lvl>
+    <w:lvl w:ilvl="5" w:tplc="0409001B" w:tentative="1">
+      <w:start w:val="1"/>
+      <w:numFmt w:val="lowerRoman"/>
+      <w:lvlText w:val="%6."/>
+      <w:lvlJc w:val="right"/>
+      <w:pPr>
+        <w:ind w:left="4320" w:hanging="180"/>
+      </w:pPr>
+    </w:lvl>
+    <w:lvl w:ilvl="6" w:tplc="0409000F" w:tentative="1">
+      <w:start w:val="1"/>
+      <w:numFmt w:val="decimal"/>
+      <w:lvlText w:val="%7."/>
+      <w:lvlJc w:val="left"/>
+      <w:pPr>
+        <w:ind w:left="5040" w:hanging="360"/>
+      </w:pPr>
+    </w:lvl>
+    <w:lvl w:ilvl="7" w:tplc="04090019" w:tentative="1">
+      <w:start w:val="1"/>
+      <w:numFmt w:val="lowerLetter"/>
+      <w:lvlText w:val="%8."/>
+      <w:lvlJc w:val="left"/>
+      <w:pPr>
+        <w:ind w:left="5760" w:hanging="360"/>
+      </w:pPr>
+    </w:lvl>
+    <w:lvl w:ilvl="8" w:tplc="0409001B" w:tentative="1">
+      <w:start w:val="1"/>
+      <w:numFmt w:val="lowerRoman"/>
+      <w:lvlText w:val="%9."/>
+      <w:lvlJc w:val="right"/>
+      <w:pPr>
+        <w:ind w:left="6480" w:hanging="180"/>
+      </w:pPr>
+    </w:lvl>
+  </w:abstractNum>
+  <w:abstractNum w:abstractNumId="1" w15:restartNumberingAfterBreak="0">
+    <w:nsid w:val="142A4766"/>
+    <w:multiLevelType w:val="hybridMultilevel"/>
+    <w:tmpl w:val="ADFE5588"/>
+    <w:lvl w:ilvl="0" w:tplc="0409000F">
+      <w:start w:val="1"/>
+      <w:numFmt w:val="decimal"/>
+      <w:lvlText w:val="%1."/>
+      <w:lvlJc w:val="left"/>
+      <w:pPr>
+        <w:ind w:left="720" w:hanging="360"/>
+      </w:pPr>
+    </w:lvl>
+    <w:lvl w:ilvl="1" w:tplc="04090019" w:tentative="1">
+      <w:start w:val="1"/>
+      <w:numFmt w:val="lowerLetter"/>
+      <w:lvlText w:val="%2."/>
+      <w:lvlJc w:val="left"/>
+      <w:pPr>
+        <w:ind w:left="1440" w:hanging="360"/>
+      </w:pPr>
+    </w:lvl>
+    <w:lvl w:ilvl="2" w:tplc="0409001B" w:tentative="1">
+      <w:start w:val="1"/>
+      <w:numFmt w:val="lowerRoman"/>
+      <w:lvlText w:val="%3."/>
+      <w:lvlJc w:val="right"/>
+      <w:pPr>
+        <w:ind w:left="2160" w:hanging="180"/>
+      </w:pPr>
+    </w:lvl>
+    <w:lvl w:ilvl="3" w:tplc="0409000F" w:tentative="1">
+      <w:start w:val="1"/>
+      <w:numFmt w:val="decimal"/>
+      <w:lvlText w:val="%4."/>
+      <w:lvlJc w:val="left"/>
+      <w:pPr>
+        <w:ind w:left="2880" w:hanging="360"/>
+      </w:pPr>
+    </w:lvl>
+    <w:lvl w:ilvl="4" w:tplc="04090019" w:tentative="1">
+      <w:start w:val="1"/>
+      <w:numFmt w:val="lowerLetter"/>
+      <w:lvlText w:val="%5."/>
+      <w:lvlJc w:val="left"/>
+      <w:pPr>
+        <w:ind w:left="3600" w:hanging="360"/>
+      </w:pPr>
+    </w:lvl>
+    <w:lvl w:ilvl="5" w:tplc="0409001B" w:tentative="1">
+      <w:start w:val="1"/>
+      <w:numFmt w:val="lowerRoman"/>
+      <w:lvlText w:val="%6."/>
+      <w:lvlJc w:val="right"/>
+      <w:pPr>
+        <w:ind w:left="4320" w:hanging="180"/>
+      </w:pPr>
+    </w:lvl>
+    <w:lvl w:ilvl="6" w:tplc="0409000F" w:tentative="1">
+      <w:start w:val="1"/>
+      <w:numFmt w:val="decimal"/>
+      <w:lvlText w:val="%7."/>
+      <w:lvlJc w:val="left"/>
+      <w:pPr>
+        <w:ind w:left="5040" w:hanging="360"/>
+      </w:pPr>
+    </w:lvl>
+    <w:lvl w:ilvl="7" w:tplc="04090019" w:tentative="1">
+      <w:start w:val="1"/>
+      <w:numFmt w:val="lowerLetter"/>
+      <w:lvlText w:val="%8."/>
+      <w:lvlJc w:val="left"/>
+      <w:pPr>
+        <w:ind w:left="5760" w:hanging="360"/>
+      </w:pPr>
+    </w:lvl>
+    <w:lvl w:ilvl="8" w:tplc="0409001B" w:tentative="1">
+      <w:start w:val="1"/>
+      <w:numFmt w:val="lowerRoman"/>
+      <w:lvlText w:val="%9."/>
+      <w:lvlJc w:val="right"/>
+      <w:pPr>
+        <w:ind w:left="6480" w:hanging="180"/>
+      </w:pPr>
+    </w:lvl>
+  </w:abstractNum>
+  <w:abstractNum w:abstractNumId="2" w15:restartNumberingAfterBreak="0">
     <w:nsid w:val="24C1364E"/>
     <w:multiLevelType w:val="multilevel"/>
     <w:tmpl w:val="F13EA18C"/>
@@ -3516,7 +5534,93 @@
       </w:rPr>
     </w:lvl>
   </w:abstractNum>
-  <w:abstractNum w:abstractNumId="1" w15:restartNumberingAfterBreak="0">
+  <w:abstractNum w:abstractNumId="3" w15:restartNumberingAfterBreak="0">
+    <w:nsid w:val="331F744A"/>
+    <w:multiLevelType w:val="hybridMultilevel"/>
+    <w:tmpl w:val="02F0F440"/>
+    <w:lvl w:ilvl="0" w:tplc="0409000F">
+      <w:start w:val="1"/>
+      <w:numFmt w:val="decimal"/>
+      <w:lvlText w:val="%1."/>
+      <w:lvlJc w:val="left"/>
+      <w:pPr>
+        <w:ind w:left="720" w:hanging="360"/>
+      </w:pPr>
+    </w:lvl>
+    <w:lvl w:ilvl="1" w:tplc="04090019" w:tentative="1">
+      <w:start w:val="1"/>
+      <w:numFmt w:val="lowerLetter"/>
+      <w:lvlText w:val="%2."/>
+      <w:lvlJc w:val="left"/>
+      <w:pPr>
+        <w:ind w:left="1440" w:hanging="360"/>
+      </w:pPr>
+    </w:lvl>
+    <w:lvl w:ilvl="2" w:tplc="0409001B" w:tentative="1">
+      <w:start w:val="1"/>
+      <w:numFmt w:val="lowerRoman"/>
+      <w:lvlText w:val="%3."/>
+      <w:lvlJc w:val="right"/>
+      <w:pPr>
+        <w:ind w:left="2160" w:hanging="180"/>
+      </w:pPr>
+    </w:lvl>
+    <w:lvl w:ilvl="3" w:tplc="0409000F" w:tentative="1">
+      <w:start w:val="1"/>
+      <w:numFmt w:val="decimal"/>
+      <w:lvlText w:val="%4."/>
+      <w:lvlJc w:val="left"/>
+      <w:pPr>
+        <w:ind w:left="2880" w:hanging="360"/>
+      </w:pPr>
+    </w:lvl>
+    <w:lvl w:ilvl="4" w:tplc="04090019" w:tentative="1">
+      <w:start w:val="1"/>
+      <w:numFmt w:val="lowerLetter"/>
+      <w:lvlText w:val="%5."/>
+      <w:lvlJc w:val="left"/>
+      <w:pPr>
+        <w:ind w:left="3600" w:hanging="360"/>
+      </w:pPr>
+    </w:lvl>
+    <w:lvl w:ilvl="5" w:tplc="0409001B" w:tentative="1">
+      <w:start w:val="1"/>
+      <w:numFmt w:val="lowerRoman"/>
+      <w:lvlText w:val="%6."/>
+      <w:lvlJc w:val="right"/>
+      <w:pPr>
+        <w:ind w:left="4320" w:hanging="180"/>
+      </w:pPr>
+    </w:lvl>
+    <w:lvl w:ilvl="6" w:tplc="0409000F" w:tentative="1">
+      <w:start w:val="1"/>
+      <w:numFmt w:val="decimal"/>
+      <w:lvlText w:val="%7."/>
+      <w:lvlJc w:val="left"/>
+      <w:pPr>
+        <w:ind w:left="5040" w:hanging="360"/>
+      </w:pPr>
+    </w:lvl>
+    <w:lvl w:ilvl="7" w:tplc="04090019" w:tentative="1">
+      <w:start w:val="1"/>
+      <w:numFmt w:val="lowerLetter"/>
+      <w:lvlText w:val="%8."/>
+      <w:lvlJc w:val="left"/>
+      <w:pPr>
+        <w:ind w:left="5760" w:hanging="360"/>
+      </w:pPr>
+    </w:lvl>
+    <w:lvl w:ilvl="8" w:tplc="0409001B" w:tentative="1">
+      <w:start w:val="1"/>
+      <w:numFmt w:val="lowerRoman"/>
+      <w:lvlText w:val="%9."/>
+      <w:lvlJc w:val="right"/>
+      <w:pPr>
+        <w:ind w:left="6480" w:hanging="180"/>
+      </w:pPr>
+    </w:lvl>
+  </w:abstractNum>
+  <w:abstractNum w:abstractNumId="4" w15:restartNumberingAfterBreak="0">
     <w:nsid w:val="3B7E23B0"/>
     <w:multiLevelType w:val="hybridMultilevel"/>
     <w:tmpl w:val="3C5885B2"/>
@@ -3606,10 +5710,19 @@
     </w:lvl>
   </w:abstractNum>
   <w:num w:numId="1" w16cid:durableId="307904529">
-    <w:abstractNumId w:val="1"/>
+    <w:abstractNumId w:val="4"/>
   </w:num>
   <w:num w:numId="2" w16cid:durableId="140075979">
+    <w:abstractNumId w:val="2"/>
+  </w:num>
+  <w:num w:numId="3" w16cid:durableId="381948282">
+    <w:abstractNumId w:val="3"/>
+  </w:num>
+  <w:num w:numId="4" w16cid:durableId="2132820669">
     <w:abstractNumId w:val="0"/>
+  </w:num>
+  <w:num w:numId="5" w16cid:durableId="1458986867">
+    <w:abstractNumId w:val="1"/>
   </w:num>
 </w:numbering>
 </file>
@@ -4229,6 +6342,7 @@
   <w:style w:type="character" w:default="1" w:styleId="DefaultParagraphFont">
     <w:name w:val="Default Paragraph Font"/>
     <w:uiPriority w:val="1"/>
+    <w:semiHidden/>
     <w:unhideWhenUsed/>
   </w:style>
   <w:style w:type="table" w:default="1" w:styleId="TableNormal">
@@ -4555,6 +6669,76 @@
       <w:ind w:left="720" w:hanging="720"/>
     </w:pPr>
   </w:style>
+  <w:style w:type="paragraph" w:customStyle="1" w:styleId="Heading">
+    <w:name w:val="Heading"/>
+    <w:basedOn w:val="Heading1"/>
+    <w:link w:val="HeadingChar"/>
+    <w:qFormat/>
+    <w:rsid w:val="00331730"/>
+    <w:pPr>
+      <w:numPr>
+        <w:numId w:val="0"/>
+      </w:numPr>
+      <w:ind w:left="360" w:hanging="360"/>
+    </w:pPr>
+  </w:style>
+  <w:style w:type="character" w:customStyle="1" w:styleId="HeadingChar">
+    <w:name w:val="Heading Char"/>
+    <w:basedOn w:val="Heading1Char"/>
+    <w:link w:val="Heading"/>
+    <w:rsid w:val="00331730"/>
+    <w:rPr>
+      <w:rFonts w:ascii="Times New Roman" w:eastAsiaTheme="majorEastAsia" w:hAnsi="Times New Roman" w:cstheme="majorBidi"/>
+      <w:b/>
+      <w:color w:val="000000" w:themeColor="text1"/>
+      <w:sz w:val="28"/>
+      <w:szCs w:val="40"/>
+    </w:rPr>
+  </w:style>
+  <w:style w:type="paragraph" w:styleId="Header">
+    <w:name w:val="header"/>
+    <w:basedOn w:val="Normal"/>
+    <w:link w:val="HeaderChar"/>
+    <w:uiPriority w:val="99"/>
+    <w:unhideWhenUsed/>
+    <w:rsid w:val="00043993"/>
+    <w:pPr>
+      <w:tabs>
+        <w:tab w:val="center" w:pos="4680"/>
+        <w:tab w:val="right" w:pos="9360"/>
+      </w:tabs>
+      <w:spacing w:after="0" w:line="240" w:lineRule="auto"/>
+    </w:pPr>
+  </w:style>
+  <w:style w:type="character" w:customStyle="1" w:styleId="HeaderChar">
+    <w:name w:val="Header Char"/>
+    <w:basedOn w:val="DefaultParagraphFont"/>
+    <w:link w:val="Header"/>
+    <w:uiPriority w:val="99"/>
+    <w:rsid w:val="00043993"/>
+  </w:style>
+  <w:style w:type="paragraph" w:styleId="Footer">
+    <w:name w:val="footer"/>
+    <w:basedOn w:val="Normal"/>
+    <w:link w:val="FooterChar"/>
+    <w:uiPriority w:val="99"/>
+    <w:unhideWhenUsed/>
+    <w:rsid w:val="00043993"/>
+    <w:pPr>
+      <w:tabs>
+        <w:tab w:val="center" w:pos="4680"/>
+        <w:tab w:val="right" w:pos="9360"/>
+      </w:tabs>
+      <w:spacing w:after="0" w:line="240" w:lineRule="auto"/>
+    </w:pPr>
+  </w:style>
+  <w:style w:type="character" w:customStyle="1" w:styleId="FooterChar">
+    <w:name w:val="Footer Char"/>
+    <w:basedOn w:val="DefaultParagraphFont"/>
+    <w:link w:val="Footer"/>
+    <w:uiPriority w:val="99"/>
+    <w:rsid w:val="00043993"/>
+  </w:style>
 </w:styles>
 </file>
 
@@ -4871,4 +7055,16 @@
     </a:ext>
   </a:extLst>
 </a:theme>
+</file>
+
+<file path=customXml/item1.xml><?xml version="1.0" encoding="utf-8"?>
+<b:Sources xmlns:b="http://schemas.openxmlformats.org/officeDocument/2006/bibliography" xmlns="http://schemas.openxmlformats.org/officeDocument/2006/bibliography" SelectedStyle="\APASixthEditionOfficeOnline.xsl" StyleName="APA" Version="6"/>
+</file>
+
+<file path=customXml/itemProps1.xml><?xml version="1.0" encoding="utf-8"?>
+<ds:datastoreItem xmlns:ds="http://schemas.openxmlformats.org/officeDocument/2006/customXml" ds:itemID="{0E380C28-EA8D-44A7-94BB-2F5E2ADEDABB}">
+  <ds:schemaRefs>
+    <ds:schemaRef ds:uri="http://schemas.openxmlformats.org/officeDocument/2006/bibliography"/>
+  </ds:schemaRefs>
+</ds:datastoreItem>
 </file>
</xml_diff>

<commit_message>
Revisi desain bimbingan 23-April-2026
</commit_message>
<xml_diff>
--- a/BAB I Skripsi draf.docx
+++ b/BAB I Skripsi draf.docx
@@ -220,7 +220,7 @@
           <w:lang w:val="sv-SE"/>
         </w:rPr>
         <w:drawing>
-          <wp:inline distT="0" distB="0" distL="0" distR="0" wp14:anchorId="7983DE2D" wp14:editId="2AE969DF">
+          <wp:inline distT="0" distB="0" distL="0" distR="0" wp14:anchorId="7983DE2D" wp14:editId="6B64BC88">
             <wp:extent cx="1842447" cy="1842447"/>
             <wp:effectExtent l="0" t="0" r="5715" b="0"/>
             <wp:docPr id="95934836" name="Picture 1"/>
@@ -3852,6 +3852,45 @@
         </w:rPr>
         <w:t xml:space="preserve">. </w:t>
       </w:r>
+    </w:p>
+    <w:p>
+      <w:pPr>
+        <w:pStyle w:val="Heading1"/>
+        <w:ind w:left="0" w:firstLine="0"/>
+        <w:jc w:val="center"/>
+        <w:rPr>
+          <w:lang w:val="sv-SE"/>
+        </w:rPr>
+      </w:pPr>
+      <w:r>
+        <w:rPr>
+          <w:lang w:val="sv-SE"/>
+        </w:rPr>
+        <w:br w:type="page"/>
+      </w:r>
+      <w:r>
+        <w:rPr>
+          <w:lang w:val="sv-SE"/>
+        </w:rPr>
+        <w:lastRenderedPageBreak/>
+        <w:br/>
+        <w:t>KAJIAN PUSTAKA</w:t>
+      </w:r>
+    </w:p>
+    <w:p>
+      <w:pPr>
+        <w:pStyle w:val="Heading2"/>
+        <w:rPr>
+          <w:lang w:val="sv-SE"/>
+        </w:rPr>
+      </w:pPr>
+    </w:p>
+    <w:p>
+      <w:pPr>
+        <w:rPr>
+          <w:lang w:val="sv-SE"/>
+        </w:rPr>
+      </w:pPr>
       <w:r>
         <w:rPr>
           <w:lang w:val="sv-SE"/>
@@ -3863,7 +3902,7 @@
       <w:pPr>
         <w:pStyle w:val="Heading"/>
         <w:spacing w:line="360" w:lineRule="auto"/>
-        <w:jc w:val="center"/>
+        <w:ind w:left="0" w:firstLine="0"/>
         <w:rPr>
           <w:lang w:val="sv-SE"/>
         </w:rPr>

</xml_diff>

<commit_message>
Menulis BAB 2 tapi belum beres
</commit_message>
<xml_diff>
--- a/BAB I Skripsi draf.docx
+++ b/BAB I Skripsi draf.docx
@@ -220,7 +220,7 @@
           <w:lang w:val="sv-SE"/>
         </w:rPr>
         <w:drawing>
-          <wp:inline distT="0" distB="0" distL="0" distR="0" wp14:anchorId="7983DE2D" wp14:editId="6B64BC88">
+          <wp:inline distT="0" distB="0" distL="0" distR="0" wp14:anchorId="7983DE2D" wp14:editId="2E3195B2">
             <wp:extent cx="1842447" cy="1842447"/>
             <wp:effectExtent l="0" t="0" r="5715" b="0"/>
             <wp:docPr id="95934836" name="Picture 1"/>
@@ -3493,6 +3493,17 @@
     <w:p>
       <w:pPr>
         <w:pStyle w:val="ListParagraph"/>
+        <w:spacing w:line="360" w:lineRule="auto"/>
+        <w:jc w:val="both"/>
+        <w:rPr>
+          <w:rFonts w:ascii="Times New Roman" w:hAnsi="Times New Roman" w:cs="Times New Roman"/>
+          <w:lang w:val="sv-SE"/>
+        </w:rPr>
+      </w:pPr>
+    </w:p>
+    <w:p>
+      <w:pPr>
+        <w:pStyle w:val="ListParagraph"/>
         <w:numPr>
           <w:ilvl w:val="0"/>
           <w:numId w:val="5"/>
@@ -3509,6 +3520,7 @@
           <w:rFonts w:ascii="Times New Roman" w:hAnsi="Times New Roman" w:cs="Times New Roman"/>
           <w:lang w:val="sv-SE"/>
         </w:rPr>
+        <w:lastRenderedPageBreak/>
         <w:t>Manfaat Praktis</w:t>
       </w:r>
     </w:p>
@@ -3527,7 +3539,6 @@
           <w:rFonts w:ascii="Times New Roman" w:hAnsi="Times New Roman" w:cs="Times New Roman"/>
           <w:lang w:val="sv-SE"/>
         </w:rPr>
-        <w:lastRenderedPageBreak/>
         <w:t xml:space="preserve">Penelitian ini diharapkan dapat memberikan manfaat praktis dalam pengembangan teknologi antena untuk sistem radar berbasis gelombang mikro, khususnya pada aplikasi radar otomotif. </w:t>
       </w:r>
       <w:r>
@@ -3880,19 +3891,1496 @@
     <w:p>
       <w:pPr>
         <w:pStyle w:val="Heading2"/>
-        <w:rPr>
-          <w:lang w:val="sv-SE"/>
-        </w:rPr>
-      </w:pPr>
-    </w:p>
-    <w:p>
-      <w:pPr>
-        <w:rPr>
-          <w:lang w:val="sv-SE"/>
-        </w:rPr>
-      </w:pPr>
-      <w:r>
-        <w:rPr>
+        <w:ind w:hanging="720"/>
+        <w:rPr>
+          <w:sz w:val="24"/>
+          <w:szCs w:val="28"/>
+          <w:lang w:val="sv-SE"/>
+        </w:rPr>
+      </w:pPr>
+      <w:r>
+        <w:rPr>
+          <w:sz w:val="24"/>
+          <w:szCs w:val="28"/>
+          <w:lang w:val="sv-SE"/>
+        </w:rPr>
+        <w:t>Radar Otomotif</w:t>
+      </w:r>
+    </w:p>
+    <w:p>
+      <w:pPr>
+        <w:spacing w:after="0" w:line="360" w:lineRule="auto"/>
+        <w:jc w:val="both"/>
+        <w:rPr>
+          <w:rFonts w:ascii="Times New Roman" w:hAnsi="Times New Roman" w:cs="Times New Roman"/>
+          <w:lang w:val="sv-SE"/>
+        </w:rPr>
+      </w:pPr>
+      <w:r>
+        <w:rPr>
+          <w:rFonts w:ascii="Times New Roman" w:hAnsi="Times New Roman" w:cs="Times New Roman"/>
+          <w:lang w:val="sv-SE"/>
+        </w:rPr>
+        <w:t xml:space="preserve">Radar merupakan singkatan dari </w:t>
+      </w:r>
+      <w:r>
+        <w:rPr>
+          <w:rFonts w:ascii="Times New Roman" w:hAnsi="Times New Roman" w:cs="Times New Roman"/>
+          <w:i/>
+          <w:iCs/>
+          <w:lang w:val="sv-SE"/>
+        </w:rPr>
+        <w:t>Radio Detection and Ranging</w:t>
+      </w:r>
+      <w:r>
+        <w:rPr>
+          <w:rFonts w:ascii="Times New Roman" w:hAnsi="Times New Roman" w:cs="Times New Roman"/>
+          <w:lang w:val="sv-SE"/>
+        </w:rPr>
+        <w:t xml:space="preserve">, yaitu suatu sistem yang digunakan untuk mendeteksi serta mengidentifikasi keberadaan suatu objek dengan memanfaatkan gelombang elektromagnetik. Sistem radar bekerja dengan cara memancarkan sinyal gelombang elektromagnetik ke suatu area pengamatan, kemudian gelombang tersebut akan dipantulkan kembali oleh objek yang berada pada lintasan propagasi sinyal. Sinyal pantulan yang diterima kembali oleh radar dikenal sebagai sinyal </w:t>
+      </w:r>
+      <w:r>
+        <w:rPr>
+          <w:rFonts w:ascii="Times New Roman" w:hAnsi="Times New Roman" w:cs="Times New Roman"/>
+          <w:i/>
+          <w:iCs/>
+          <w:lang w:val="sv-SE"/>
+        </w:rPr>
+        <w:t>echo</w:t>
+      </w:r>
+      <w:r>
+        <w:rPr>
+          <w:rFonts w:ascii="Times New Roman" w:hAnsi="Times New Roman" w:cs="Times New Roman"/>
+          <w:lang w:val="sv-SE"/>
+        </w:rPr>
+        <w:t>, yang selanjutnya diproses oleh sistem penerima untuk memperoleh informasi mengenai karakteristik objek yang terdeteksi</w:t>
+      </w:r>
+      <w:r>
+        <w:rPr>
+          <w:rFonts w:ascii="Times New Roman" w:hAnsi="Times New Roman" w:cs="Times New Roman"/>
+          <w:lang w:val="sv-SE"/>
+        </w:rPr>
+        <w:t xml:space="preserve"> </w:t>
+      </w:r>
+      <w:r>
+        <w:rPr>
+          <w:rFonts w:ascii="Times New Roman" w:hAnsi="Times New Roman" w:cs="Times New Roman"/>
+          <w:lang w:val="sv-SE"/>
+        </w:rPr>
+        <w:fldChar w:fldCharType="begin"/>
+      </w:r>
+      <w:r>
+        <w:rPr>
+          <w:rFonts w:ascii="Times New Roman" w:hAnsi="Times New Roman" w:cs="Times New Roman"/>
+          <w:lang w:val="sv-SE"/>
+        </w:rPr>
+        <w:instrText xml:space="preserve"> ADDIN ZOTERO_ITEM CSL_CITATION {"citationID":"WuwJ5y43","properties":{"formattedCitation":"(Skolnik, 1986)","plainCitation":"(Skolnik, 1986)","noteIndex":0},"citationItems":[{"id":173,"uris":["http://zotero.org/users/local/GXnJfy3L/items/F9JKIGYT"],"itemData":{"id":173,"type":"book","edition":"2nd ed., 9th print","ISBN":"978-0-07-057909-5","language":"en","number-of-pages":"581","publisher":"McGraw-Hill","publisher-place":"New York","source":"K10plus ISBN","title":"Introduction to radar systems: international student edition","title-short":"Introduction to radar systems","author":[{"family":"Skolnik","given":"Merrill I."}],"issued":{"date-parts":[["1986"]]}}}],"schema":"https://github.com/citation-style-language/schema/raw/master/csl-citation.json"} </w:instrText>
+      </w:r>
+      <w:r>
+        <w:rPr>
+          <w:rFonts w:ascii="Times New Roman" w:hAnsi="Times New Roman" w:cs="Times New Roman"/>
+          <w:lang w:val="sv-SE"/>
+        </w:rPr>
+        <w:fldChar w:fldCharType="separate"/>
+      </w:r>
+      <w:r>
+        <w:rPr>
+          <w:rFonts w:ascii="Times New Roman" w:hAnsi="Times New Roman" w:cs="Times New Roman"/>
+          <w:lang w:val="sv-SE"/>
+        </w:rPr>
+        <w:t>(Skolnik, 1986)</w:t>
+      </w:r>
+      <w:r>
+        <w:rPr>
+          <w:rFonts w:ascii="Times New Roman" w:hAnsi="Times New Roman" w:cs="Times New Roman"/>
+          <w:lang w:val="sv-SE"/>
+        </w:rPr>
+        <w:fldChar w:fldCharType="end"/>
+      </w:r>
+      <w:r>
+        <w:rPr>
+          <w:rFonts w:ascii="Times New Roman" w:hAnsi="Times New Roman" w:cs="Times New Roman"/>
+          <w:lang w:val="sv-SE"/>
+        </w:rPr>
+        <w:t>.</w:t>
+      </w:r>
+      <w:r>
+        <w:rPr>
+          <w:rFonts w:ascii="Times New Roman" w:hAnsi="Times New Roman" w:cs="Times New Roman"/>
+          <w:lang w:val="sv-SE"/>
+        </w:rPr>
+        <w:t xml:space="preserve"> </w:t>
+      </w:r>
+      <w:r>
+        <w:rPr>
+          <w:rFonts w:ascii="Times New Roman" w:hAnsi="Times New Roman" w:cs="Times New Roman"/>
+          <w:lang w:val="sv-SE"/>
+        </w:rPr>
+        <w:t>Dalam sistem radar, informasi mengenai jarak suatu objek dapat diperoleh dengan menghitung waktu yang dibutuhkan oleh gelombang elektromagnetik untuk merambat dari pemancar menuju objek dan kembali ke antena penerima. Selain itu, perubahan frekuensi pada sinyal pantulan yang terjadi akibat efek Doppler dapat dimanfaatkan untuk menentukan kecepatan relatif objek terhadap rada</w:t>
+      </w:r>
+      <w:r>
+        <w:rPr>
+          <w:rFonts w:ascii="Times New Roman" w:hAnsi="Times New Roman" w:cs="Times New Roman"/>
+          <w:lang w:val="sv-SE"/>
+        </w:rPr>
+        <w:t>r</w:t>
+      </w:r>
+      <w:r>
+        <w:rPr>
+          <w:rFonts w:ascii="Times New Roman" w:hAnsi="Times New Roman" w:cs="Times New Roman"/>
+          <w:lang w:val="sv-SE"/>
+        </w:rPr>
+        <w:t xml:space="preserve"> </w:t>
+      </w:r>
+      <w:r>
+        <w:rPr>
+          <w:rFonts w:ascii="Times New Roman" w:hAnsi="Times New Roman" w:cs="Times New Roman"/>
+          <w:lang w:val="sv-SE"/>
+        </w:rPr>
+        <w:fldChar w:fldCharType="begin"/>
+      </w:r>
+      <w:r>
+        <w:rPr>
+          <w:rFonts w:ascii="Times New Roman" w:hAnsi="Times New Roman" w:cs="Times New Roman"/>
+          <w:lang w:val="sv-SE"/>
+        </w:rPr>
+        <w:instrText xml:space="preserve"> ADDIN ZOTERO_ITEM CSL_CITATION {"citationID":"yUFxmOW4","properties":{"formattedCitation":"(Richards dkk., 2010)","plainCitation":"(Richards dkk., 2010)","noteIndex":0},"citationItems":[{"id":238,"uris":["http://zotero.org/users/local/GXnJfy3L/items/J8LVVPZY"],"itemData":{"id":238,"type":"book","call-number":"621.384 8","ISBN":"978-1-891121-52-4","language":"en","publisher":"SciTech publ","publisher-place":"Raleigh (N.C.)","source":"BnF ISBN","title":"Principles of modern radar","author":[{"family":"Richards","given":"Mark A."},{"family":"Scheer","given":"James A."},{"family":"Holm","given":"William A."}],"issued":{"date-parts":[["2010"]]}}}],"schema":"https://github.com/citation-style-language/schema/raw/master/csl-citation.json"} </w:instrText>
+      </w:r>
+      <w:r>
+        <w:rPr>
+          <w:rFonts w:ascii="Times New Roman" w:hAnsi="Times New Roman" w:cs="Times New Roman"/>
+          <w:lang w:val="sv-SE"/>
+        </w:rPr>
+        <w:fldChar w:fldCharType="separate"/>
+      </w:r>
+      <w:r>
+        <w:rPr>
+          <w:rFonts w:ascii="Times New Roman" w:hAnsi="Times New Roman" w:cs="Times New Roman"/>
+          <w:lang w:val="sv-SE"/>
+        </w:rPr>
+        <w:t>(Richards dkk., 2010)</w:t>
+      </w:r>
+      <w:r>
+        <w:rPr>
+          <w:rFonts w:ascii="Times New Roman" w:hAnsi="Times New Roman" w:cs="Times New Roman"/>
+          <w:lang w:val="sv-SE"/>
+        </w:rPr>
+        <w:fldChar w:fldCharType="end"/>
+      </w:r>
+      <w:r>
+        <w:rPr>
+          <w:rFonts w:ascii="Times New Roman" w:hAnsi="Times New Roman" w:cs="Times New Roman"/>
+          <w:lang w:val="sv-SE"/>
+        </w:rPr>
+        <w:t>.</w:t>
+      </w:r>
+    </w:p>
+    <w:p>
+      <w:pPr>
+        <w:spacing w:line="360" w:lineRule="auto"/>
+        <w:ind w:firstLine="360"/>
+        <w:jc w:val="both"/>
+        <w:rPr>
+          <w:rFonts w:ascii="Times New Roman" w:hAnsi="Times New Roman" w:cs="Times New Roman"/>
+          <w:lang w:val="sv-SE"/>
+        </w:rPr>
+      </w:pPr>
+      <w:r>
+        <w:rPr>
+          <w:rFonts w:ascii="Times New Roman" w:hAnsi="Times New Roman" w:cs="Times New Roman"/>
+          <w:lang w:val="sv-SE"/>
+        </w:rPr>
+        <w:t xml:space="preserve">Seiring dengan perkembangan teknologi, penggunaan radar tidak hanya terbatas pada bidang militer dan penerbangan sipil, tetapi juga telah banyak diterapkan pada sektor transportasi modern, khususnya pada sistem radar otomotif. Pada kendaraan modern, radar digunakan untuk mendeteksi keberadaan kendaraan lain, pejalan kaki, maupun objek di sekitar kendaraan guna meningkatkan keselamatan berkendara. Sistem radar otomotif umumnya diintegrasikan dalam teknologi </w:t>
+      </w:r>
+      <w:r>
+        <w:rPr>
+          <w:rFonts w:ascii="Times New Roman" w:hAnsi="Times New Roman" w:cs="Times New Roman"/>
+          <w:i/>
+          <w:iCs/>
+          <w:lang w:val="sv-SE"/>
+        </w:rPr>
+        <w:t xml:space="preserve">Advanced Driver Assistance System </w:t>
+      </w:r>
+      <w:r>
+        <w:rPr>
+          <w:rFonts w:ascii="Times New Roman" w:hAnsi="Times New Roman" w:cs="Times New Roman"/>
+          <w:lang w:val="sv-SE"/>
+        </w:rPr>
+        <w:t>(ADAS)</w:t>
+      </w:r>
+      <w:r>
+        <w:rPr>
+          <w:rFonts w:ascii="Times New Roman" w:hAnsi="Times New Roman" w:cs="Times New Roman"/>
+          <w:lang w:val="sv-SE"/>
+        </w:rPr>
+        <w:t xml:space="preserve"> untuk mendukung berbagai fitur keselamatan seperti </w:t>
+      </w:r>
+      <w:r>
+        <w:rPr>
+          <w:rFonts w:ascii="Times New Roman" w:hAnsi="Times New Roman" w:cs="Times New Roman"/>
+          <w:i/>
+          <w:iCs/>
+          <w:lang w:val="sv-SE"/>
+        </w:rPr>
+        <w:t>adaptive cruise control</w:t>
+      </w:r>
+      <w:r>
+        <w:rPr>
+          <w:rFonts w:ascii="Times New Roman" w:hAnsi="Times New Roman" w:cs="Times New Roman"/>
+          <w:lang w:val="sv-SE"/>
+        </w:rPr>
+        <w:t xml:space="preserve">, </w:t>
+      </w:r>
+      <w:r>
+        <w:rPr>
+          <w:rFonts w:ascii="Times New Roman" w:hAnsi="Times New Roman" w:cs="Times New Roman"/>
+          <w:i/>
+          <w:iCs/>
+          <w:lang w:val="sv-SE"/>
+        </w:rPr>
+        <w:t>automatic emergency braking</w:t>
+      </w:r>
+      <w:r>
+        <w:rPr>
+          <w:rFonts w:ascii="Times New Roman" w:hAnsi="Times New Roman" w:cs="Times New Roman"/>
+          <w:lang w:val="sv-SE"/>
+        </w:rPr>
+        <w:t xml:space="preserve">, dan </w:t>
+      </w:r>
+      <w:r>
+        <w:rPr>
+          <w:rFonts w:ascii="Times New Roman" w:hAnsi="Times New Roman" w:cs="Times New Roman"/>
+          <w:i/>
+          <w:iCs/>
+          <w:lang w:val="sv-SE"/>
+        </w:rPr>
+        <w:t>collision avoidance system</w:t>
+      </w:r>
+      <w:r>
+        <w:rPr>
+          <w:rFonts w:ascii="Times New Roman" w:hAnsi="Times New Roman" w:cs="Times New Roman"/>
+          <w:lang w:val="sv-SE"/>
+        </w:rPr>
+        <w:t xml:space="preserve">. Melalui sistem ini, kendaraan dapat memantau kondisi lingkungan di sekitarnya secara </w:t>
+      </w:r>
+      <w:r>
+        <w:rPr>
+          <w:rFonts w:ascii="Times New Roman" w:hAnsi="Times New Roman" w:cs="Times New Roman"/>
+          <w:i/>
+          <w:iCs/>
+          <w:lang w:val="sv-SE"/>
+        </w:rPr>
+        <w:t>real-time</w:t>
+      </w:r>
+      <w:r>
+        <w:rPr>
+          <w:rFonts w:ascii="Times New Roman" w:hAnsi="Times New Roman" w:cs="Times New Roman"/>
+          <w:lang w:val="sv-SE"/>
+        </w:rPr>
+        <w:t xml:space="preserve"> sehingga mampu memberikan peringatan kepada pengemudi atau bahkan melakukan tindakan otomatis ketika terdeteksi potensi bahaya</w:t>
+      </w:r>
+      <w:r>
+        <w:rPr>
+          <w:rFonts w:ascii="Times New Roman" w:hAnsi="Times New Roman" w:cs="Times New Roman"/>
+          <w:lang w:val="sv-SE"/>
+        </w:rPr>
+        <w:t xml:space="preserve"> </w:t>
+      </w:r>
+      <w:r>
+        <w:rPr>
+          <w:rFonts w:ascii="Times New Roman" w:hAnsi="Times New Roman" w:cs="Times New Roman"/>
+          <w:i/>
+          <w:iCs/>
+          <w:lang w:val="sv-SE"/>
+        </w:rPr>
+        <w:fldChar w:fldCharType="begin"/>
+      </w:r>
+      <w:r>
+        <w:rPr>
+          <w:rFonts w:ascii="Times New Roman" w:hAnsi="Times New Roman" w:cs="Times New Roman"/>
+          <w:i/>
+          <w:iCs/>
+          <w:lang w:val="sv-SE"/>
+        </w:rPr>
+        <w:instrText xml:space="preserve"> ADDIN ZOTERO_ITEM CSL_CITATION {"citationID":"9rFzS2zp","properties":{"formattedCitation":"(Hasch dkk., 2012; Waldschmidt dkk., 2021)","plainCitation":"(Hasch dkk., 2012; Waldschmidt dkk., 2021)","noteIndex":0},"citationItems":[{"id":128,"uris":["http://zotero.org/users/local/GXnJfy3L/items/QMFXNRHU"],"itemData":{"id":128,"type":"article-journal","abstract":"The market for driver assistance systems based on millimeter-wave radar sensor technology is gaining momentum. In the near future, the full range of newly introduced car models will be equipped with radar based systems which leads to high volume production with low cost potential. This paper provides background and an overview of the state of the art of millimeterwave technology for automotive radar applications, including two actual silicon based fully integrated radar chips. Several advanced packaging concepts and antenna systems are presented and discussed in detail. Finally measurement results of the fully integrated radar front ends are shown.","container-title":"IEEE Transactions on Microwave Theory and Techniques","DOI":"10.1109/TMTT.2011.2178427","ISSN":"0018-9480, 1557-9670","issue":"3","journalAbbreviation":"IEEE Trans. Microwave Theory Techn.","language":"en","license":"https://ieeexplore.ieee.org/Xplorehelp/downloads/license-information/IEEE.html","page":"845-860","source":"DOI.org (Crossref)","title":"Millimeter-Wave Technology for Automotive Radar Sensors in the 77 GHz Frequency Band","volume":"60","author":[{"family":"Hasch","given":"Jürgen"},{"family":"Topak","given":"Eray"},{"family":"Schnabel","given":"Raik"},{"family":"Zwick","given":"Thomas"},{"family":"Weigel","given":"Robert"},{"family":"Waldschmidt","given":"Christian"}],"issued":{"date-parts":[["2012",3]]}}},{"id":220,"uris":["http://zotero.org/users/local/GXnJfy3L/items/6LY3NZNA"],"itemData":{"id":220,"type":"article-journal","abstract":"Although the beginning of research on automotive radar sensors goes back to the 1960s, automotive radar has remained one of the main drivers of innovation in millimeter wave technology over the past two decades. Today, millions of sensors are produced each year, which was made possible by inexpensive and mature millimeter wave technology. The technology maturity, in turn, enables research to be carried out on systems that are considerably more complex and powerful than was possible just a few years ago. The focus of research has thus shifted from purely hardware-oriented and device-level topics to sophisticated millimeter wave systems and RF signal processing topics. This opens up new research topics such as digital modulation schemes, radar networks, radar imaging, and machine learning. In this review paper, we sketch the path from the very beginning through the state of the art with sophisticated multiple-input multiple-output (MIMO) antenna arrays and mature assembly and interconnect concepts to today’s key research topics of automotive radar.","container-title":"IEEE Journal of Microwaves","DOI":"10.1109/JMW.2020.3033616","ISSN":"2692-8388","issue":"1","journalAbbreviation":"IEEE J. Microw.","language":"en","license":"https://creativecommons.org/licenses/by/4.0/legalcode","page":"135-148","source":"DOI.org (Crossref)","title":"Automotive Radar — From First Efforts to Future Systems","volume":"1","author":[{"family":"Waldschmidt","given":"Christian"},{"family":"Hasch","given":"Juergen"},{"family":"Menzel","given":"Wolfgang"}],"issued":{"date-parts":[["2021",1]]}}}],"schema":"https://github.com/citation-style-language/schema/raw/master/csl-citation.json"} </w:instrText>
+      </w:r>
+      <w:r>
+        <w:rPr>
+          <w:rFonts w:ascii="Times New Roman" w:hAnsi="Times New Roman" w:cs="Times New Roman"/>
+          <w:i/>
+          <w:iCs/>
+          <w:lang w:val="sv-SE"/>
+        </w:rPr>
+        <w:fldChar w:fldCharType="separate"/>
+      </w:r>
+      <w:r>
+        <w:rPr>
+          <w:rFonts w:ascii="Times New Roman" w:hAnsi="Times New Roman" w:cs="Times New Roman"/>
+          <w:lang w:val="sv-SE"/>
+        </w:rPr>
+        <w:t>(Hasch dkk., 2012; Waldschmidt dkk., 2021)</w:t>
+      </w:r>
+      <w:r>
+        <w:rPr>
+          <w:rFonts w:ascii="Times New Roman" w:hAnsi="Times New Roman" w:cs="Times New Roman"/>
+          <w:i/>
+          <w:iCs/>
+          <w:lang w:val="sv-SE"/>
+        </w:rPr>
+        <w:fldChar w:fldCharType="end"/>
+      </w:r>
+      <w:r>
+        <w:rPr>
+          <w:rFonts w:ascii="Times New Roman" w:hAnsi="Times New Roman" w:cs="Times New Roman"/>
+          <w:lang w:val="sv-SE"/>
+        </w:rPr>
+        <w:t>.</w:t>
+      </w:r>
+    </w:p>
+    <w:p>
+      <w:pPr>
+        <w:spacing w:line="360" w:lineRule="auto"/>
+        <w:ind w:firstLine="360"/>
+        <w:jc w:val="both"/>
+        <w:rPr>
+          <w:rFonts w:ascii="Times New Roman" w:hAnsi="Times New Roman" w:cs="Times New Roman"/>
+          <w:lang w:val="sv-SE"/>
+        </w:rPr>
+      </w:pPr>
+      <w:r>
+        <w:rPr>
+          <w:rFonts w:ascii="Times New Roman" w:hAnsi="Times New Roman" w:cs="Times New Roman"/>
+          <w:lang w:val="sv-SE"/>
+        </w:rPr>
+        <w:lastRenderedPageBreak/>
+        <w:t>Selain itu, radar otomotif memiliki beberapa keunggulan dibandingkan dengan sensor lainnya seperti kamera atau lidar. Radar mampu beroperasi dengan baik pada berbagai kondisi lingkungan, termasuk saat hujan, kabut, maupun pada kondisi pencahayaan yang rendah. Kemampuan tersebut menjadikan radar sebagai salah satu sensor yang sangat penting dalam sistem keselamatan kendaraan modern. Dengan memanfaatkan radar, sistem kendaraan dapat mengukur berbagai parameter seperti jarak objek, kecepatan relatif, serta arah pergerakan objek di sekitar kendaraan secara lebih akurat</w:t>
+      </w:r>
+      <w:r>
+        <w:rPr>
+          <w:rFonts w:ascii="Times New Roman" w:hAnsi="Times New Roman" w:cs="Times New Roman"/>
+          <w:lang w:val="sv-SE"/>
+        </w:rPr>
+        <w:t xml:space="preserve"> </w:t>
+      </w:r>
+      <w:r>
+        <w:rPr>
+          <w:rFonts w:ascii="Times New Roman" w:hAnsi="Times New Roman" w:cs="Times New Roman"/>
+          <w:lang w:val="sv-SE"/>
+        </w:rPr>
+        <w:fldChar w:fldCharType="begin"/>
+      </w:r>
+      <w:r>
+        <w:rPr>
+          <w:rFonts w:ascii="Times New Roman" w:hAnsi="Times New Roman" w:cs="Times New Roman"/>
+          <w:lang w:val="sv-SE"/>
+        </w:rPr>
+        <w:instrText xml:space="preserve"> ADDIN ZOTERO_ITEM CSL_CITATION {"citationID":"6NczcZtF","properties":{"formattedCitation":"(Yeong dkk., 2021)","plainCitation":"(Yeong dkk., 2021)","noteIndex":0},"citationItems":[{"id":243,"uris":["http://zotero.org/users/local/GXnJfy3L/items/TH9GI7TQ"],"itemData":{"id":243,"type":"article-journal","abstract":"With the signiﬁcant advancement of sensor and communication technology and the reliable application of obstacle detection techniques and algorithms, automated driving is becoming a pivotal technology that can revolutionize the future of transportation and mobility. Sensors are fundamental to the perception of vehicle surroundings in an automated driving system, and the use and performance of multiple integrated sensors can directly determine the safety and feasibility of automated driving vehicles. Sensor calibration is the foundation block of any autonomous system and its constituent sensors and must be performed correctly before sensor fusion and obstacle detection processes may be implemented. This paper evaluates the capabilities and the technical performance of sensors which are commonly employed in autonomous vehicles, primarily focusing on a large selection of vision cameras, LiDAR sensors, and radar sensors and the various conditions in which such sensors may operate in practice. We present an overview of the three primary categories of sensor calibration and review existing open-source calibration packages for multi-sensor calibration and their compatibility with numerous commercial sensors. We also summarize the three main approaches to sensor fusion and review current state-of-the-art multi-sensor fusion techniques and algorithms for object detection in autonomous driving applications. The current paper, therefore, provides an end-to-end review of the hardware and software methods required for sensor fusion object detection. We conclude by highlighting some of the challenges in the sensor fusion ﬁeld and propose possible future research directions for automated driving systems.","container-title":"Sensors","DOI":"10.3390/s21062140","ISSN":"1424-8220","issue":"6","journalAbbreviation":"Sensors","language":"en","page":"2140","source":"DOI.org (Crossref)","title":"Sensor and Sensor Fusion Technology in Autonomous Vehicles: A Review","title-short":"Sensor and Sensor Fusion Technology in Autonomous Vehicles","volume":"21","author":[{"family":"Yeong","given":"De Jong"},{"family":"Velasco-Hernandez","given":"Gustavo"},{"family":"Barry","given":"John"},{"family":"Walsh","given":"Joseph"}],"issued":{"date-parts":[["2021",3,18]]}}}],"schema":"https://github.com/citation-style-language/schema/raw/master/csl-citation.json"} </w:instrText>
+      </w:r>
+      <w:r>
+        <w:rPr>
+          <w:rFonts w:ascii="Times New Roman" w:hAnsi="Times New Roman" w:cs="Times New Roman"/>
+          <w:lang w:val="sv-SE"/>
+        </w:rPr>
+        <w:fldChar w:fldCharType="separate"/>
+      </w:r>
+      <w:r>
+        <w:rPr>
+          <w:rFonts w:ascii="Times New Roman" w:hAnsi="Times New Roman" w:cs="Times New Roman"/>
+          <w:lang w:val="sv-SE"/>
+        </w:rPr>
+        <w:t>(Yeong dkk., 2021)</w:t>
+      </w:r>
+      <w:r>
+        <w:rPr>
+          <w:rFonts w:ascii="Times New Roman" w:hAnsi="Times New Roman" w:cs="Times New Roman"/>
+          <w:lang w:val="sv-SE"/>
+        </w:rPr>
+        <w:fldChar w:fldCharType="end"/>
+      </w:r>
+      <w:r>
+        <w:rPr>
+          <w:rFonts w:ascii="Times New Roman" w:hAnsi="Times New Roman" w:cs="Times New Roman"/>
+          <w:lang w:val="sv-SE"/>
+        </w:rPr>
+        <w:t>.</w:t>
+      </w:r>
+      <w:r>
+        <w:rPr>
+          <w:rFonts w:ascii="Times New Roman" w:hAnsi="Times New Roman" w:cs="Times New Roman"/>
+          <w:i/>
+          <w:iCs/>
+          <w:lang w:val="sv-SE"/>
+        </w:rPr>
+        <w:t xml:space="preserve"> </w:t>
+      </w:r>
+    </w:p>
+    <w:p>
+      <w:pPr>
+        <w:spacing w:line="360" w:lineRule="auto"/>
+        <w:jc w:val="center"/>
+        <w:rPr>
+          <w:rFonts w:ascii="Times New Roman" w:hAnsi="Times New Roman" w:cs="Times New Roman"/>
+          <w:lang w:val="sv-SE"/>
+        </w:rPr>
+      </w:pPr>
+      <w:r>
+        <w:rPr>
+          <w:rFonts w:ascii="Times New Roman" w:hAnsi="Times New Roman" w:cs="Times New Roman"/>
+          <w:noProof/>
+          <w:lang w:val="sv-SE"/>
+        </w:rPr>
+        <w:drawing>
+          <wp:inline distT="0" distB="0" distL="0" distR="0" wp14:anchorId="35A7B415" wp14:editId="35512A93">
+            <wp:extent cx="4667534" cy="2061195"/>
+            <wp:effectExtent l="0" t="0" r="0" b="0"/>
+            <wp:docPr id="1195158447" name="Picture 1"/>
+            <wp:cNvGraphicFramePr>
+              <a:graphicFrameLocks xmlns:a="http://schemas.openxmlformats.org/drawingml/2006/main" noChangeAspect="1"/>
+            </wp:cNvGraphicFramePr>
+            <a:graphic xmlns:a="http://schemas.openxmlformats.org/drawingml/2006/main">
+              <a:graphicData uri="http://schemas.openxmlformats.org/drawingml/2006/picture">
+                <pic:pic xmlns:pic="http://schemas.openxmlformats.org/drawingml/2006/picture">
+                  <pic:nvPicPr>
+                    <pic:cNvPr id="1195158447" name=""/>
+                    <pic:cNvPicPr/>
+                  </pic:nvPicPr>
+                  <pic:blipFill>
+                    <a:blip r:embed="rId9"/>
+                    <a:stretch>
+                      <a:fillRect/>
+                    </a:stretch>
+                  </pic:blipFill>
+                  <pic:spPr>
+                    <a:xfrm>
+                      <a:off x="0" y="0"/>
+                      <a:ext cx="4676416" cy="2065117"/>
+                    </a:xfrm>
+                    <a:prstGeom prst="rect">
+                      <a:avLst/>
+                    </a:prstGeom>
+                  </pic:spPr>
+                </pic:pic>
+              </a:graphicData>
+            </a:graphic>
+          </wp:inline>
+        </w:drawing>
+      </w:r>
+    </w:p>
+    <w:p>
+      <w:pPr>
+        <w:spacing w:after="0" w:line="360" w:lineRule="auto"/>
+        <w:ind w:firstLine="360"/>
+        <w:jc w:val="both"/>
+        <w:rPr>
+          <w:rFonts w:ascii="Times New Roman" w:hAnsi="Times New Roman" w:cs="Times New Roman"/>
+          <w:lang w:val="sv-SE"/>
+        </w:rPr>
+      </w:pPr>
+      <w:r>
+        <w:rPr>
+          <w:rFonts w:ascii="Times New Roman" w:hAnsi="Times New Roman" w:cs="Times New Roman"/>
+          <w:lang w:val="sv-SE"/>
+        </w:rPr>
+        <w:t xml:space="preserve">Radar otomotif dapat diklasifikasikan berdasarkan jangkauan deteksinya menjadi beberapa kategori utama, yaitu </w:t>
+      </w:r>
+      <w:r>
+        <w:rPr>
+          <w:rFonts w:ascii="Times New Roman" w:hAnsi="Times New Roman" w:cs="Times New Roman"/>
+          <w:i/>
+          <w:iCs/>
+          <w:lang w:val="sv-SE"/>
+        </w:rPr>
+        <w:t>Short Range Radar</w:t>
+      </w:r>
+      <w:r>
+        <w:rPr>
+          <w:rFonts w:ascii="Times New Roman" w:hAnsi="Times New Roman" w:cs="Times New Roman"/>
+          <w:lang w:val="sv-SE"/>
+        </w:rPr>
+        <w:t xml:space="preserve"> (SRR), </w:t>
+      </w:r>
+      <w:r>
+        <w:rPr>
+          <w:rFonts w:ascii="Times New Roman" w:hAnsi="Times New Roman" w:cs="Times New Roman"/>
+          <w:i/>
+          <w:iCs/>
+          <w:lang w:val="sv-SE"/>
+        </w:rPr>
+        <w:t>Medium Range Radar</w:t>
+      </w:r>
+      <w:r>
+        <w:rPr>
+          <w:rFonts w:ascii="Times New Roman" w:hAnsi="Times New Roman" w:cs="Times New Roman"/>
+          <w:lang w:val="sv-SE"/>
+        </w:rPr>
+        <w:t xml:space="preserve"> (MRR), dan </w:t>
+      </w:r>
+      <w:r>
+        <w:rPr>
+          <w:rFonts w:ascii="Times New Roman" w:hAnsi="Times New Roman" w:cs="Times New Roman"/>
+          <w:i/>
+          <w:iCs/>
+          <w:lang w:val="sv-SE"/>
+        </w:rPr>
+        <w:t>Long Range Radar</w:t>
+      </w:r>
+      <w:r>
+        <w:rPr>
+          <w:rFonts w:ascii="Times New Roman" w:hAnsi="Times New Roman" w:cs="Times New Roman"/>
+          <w:lang w:val="sv-SE"/>
+        </w:rPr>
+        <w:t xml:space="preserve"> (LRR). Setiap jenis radar tersebut dirancang untuk memenuhi kebutuhan fungsi keselamatan kendaraan yang berbeda. </w:t>
+      </w:r>
+      <w:r>
+        <w:rPr>
+          <w:rFonts w:ascii="Times New Roman" w:hAnsi="Times New Roman" w:cs="Times New Roman"/>
+          <w:i/>
+          <w:iCs/>
+          <w:lang w:val="sv-SE"/>
+        </w:rPr>
+        <w:t>Short Range Radar</w:t>
+      </w:r>
+      <w:r>
+        <w:rPr>
+          <w:rFonts w:ascii="Times New Roman" w:hAnsi="Times New Roman" w:cs="Times New Roman"/>
+          <w:lang w:val="sv-SE"/>
+        </w:rPr>
+        <w:t xml:space="preserve"> umumnya digunakan untuk mendeteksi objek pada jarak dekat, seperti pada sistem </w:t>
+      </w:r>
+      <w:r>
+        <w:rPr>
+          <w:rFonts w:ascii="Times New Roman" w:hAnsi="Times New Roman" w:cs="Times New Roman"/>
+          <w:i/>
+          <w:iCs/>
+          <w:lang w:val="sv-SE"/>
+        </w:rPr>
+        <w:t>blind spot detection</w:t>
+      </w:r>
+      <w:r>
+        <w:rPr>
+          <w:rFonts w:ascii="Times New Roman" w:hAnsi="Times New Roman" w:cs="Times New Roman"/>
+          <w:lang w:val="sv-SE"/>
+        </w:rPr>
+        <w:t xml:space="preserve">, </w:t>
+      </w:r>
+      <w:r>
+        <w:rPr>
+          <w:rFonts w:ascii="Times New Roman" w:hAnsi="Times New Roman" w:cs="Times New Roman"/>
+          <w:i/>
+          <w:iCs/>
+          <w:lang w:val="sv-SE"/>
+        </w:rPr>
+        <w:t>parking assistance</w:t>
+      </w:r>
+      <w:r>
+        <w:rPr>
+          <w:rFonts w:ascii="Times New Roman" w:hAnsi="Times New Roman" w:cs="Times New Roman"/>
+          <w:lang w:val="sv-SE"/>
+        </w:rPr>
+        <w:t xml:space="preserve">, dan </w:t>
+      </w:r>
+      <w:r>
+        <w:rPr>
+          <w:rFonts w:ascii="Times New Roman" w:hAnsi="Times New Roman" w:cs="Times New Roman"/>
+          <w:i/>
+          <w:iCs/>
+          <w:lang w:val="sv-SE"/>
+        </w:rPr>
+        <w:t>cross-traffic alert</w:t>
+      </w:r>
+      <w:r>
+        <w:rPr>
+          <w:rFonts w:ascii="Times New Roman" w:hAnsi="Times New Roman" w:cs="Times New Roman"/>
+          <w:lang w:val="sv-SE"/>
+        </w:rPr>
+        <w:t xml:space="preserve">, dengan jangkauan deteksi sekitar puluhan meter. </w:t>
+      </w:r>
+      <w:r>
+        <w:rPr>
+          <w:rFonts w:ascii="Times New Roman" w:hAnsi="Times New Roman" w:cs="Times New Roman"/>
+          <w:i/>
+          <w:iCs/>
+          <w:lang w:val="sv-SE"/>
+        </w:rPr>
+        <w:t>Medium Range Radar</w:t>
+      </w:r>
+      <w:r>
+        <w:rPr>
+          <w:rFonts w:ascii="Times New Roman" w:hAnsi="Times New Roman" w:cs="Times New Roman"/>
+          <w:lang w:val="sv-SE"/>
+        </w:rPr>
+        <w:t xml:space="preserve"> digunakan untuk mendeteksi objek pada jarak menengah dan sering dimanfaatkan dalam sistem </w:t>
+      </w:r>
+      <w:r>
+        <w:rPr>
+          <w:rFonts w:ascii="Times New Roman" w:hAnsi="Times New Roman" w:cs="Times New Roman"/>
+          <w:i/>
+          <w:iCs/>
+          <w:lang w:val="sv-SE"/>
+        </w:rPr>
+        <w:t>lane change assistance</w:t>
+      </w:r>
+      <w:r>
+        <w:rPr>
+          <w:rFonts w:ascii="Times New Roman" w:hAnsi="Times New Roman" w:cs="Times New Roman"/>
+          <w:lang w:val="sv-SE"/>
+        </w:rPr>
+        <w:t xml:space="preserve"> atau pemantauan kendaraan di sekitar kendaraan utama. Sementara itu, </w:t>
+      </w:r>
+      <w:r>
+        <w:rPr>
+          <w:rFonts w:ascii="Times New Roman" w:hAnsi="Times New Roman" w:cs="Times New Roman"/>
+          <w:i/>
+          <w:iCs/>
+          <w:lang w:val="sv-SE"/>
+        </w:rPr>
+        <w:t>Long Range Radar</w:t>
+      </w:r>
+      <w:r>
+        <w:rPr>
+          <w:rFonts w:ascii="Times New Roman" w:hAnsi="Times New Roman" w:cs="Times New Roman"/>
+          <w:lang w:val="sv-SE"/>
+        </w:rPr>
+        <w:t xml:space="preserve"> memiliki jangkauan deteksi yang lebih jauh dan banyak digunakan pada fitur </w:t>
+      </w:r>
+      <w:r>
+        <w:rPr>
+          <w:rFonts w:ascii="Times New Roman" w:hAnsi="Times New Roman" w:cs="Times New Roman"/>
+          <w:i/>
+          <w:iCs/>
+          <w:lang w:val="sv-SE"/>
+        </w:rPr>
+        <w:t>adaptive cruise control</w:t>
+      </w:r>
+      <w:r>
+        <w:rPr>
+          <w:rFonts w:ascii="Times New Roman" w:hAnsi="Times New Roman" w:cs="Times New Roman"/>
+          <w:lang w:val="sv-SE"/>
+        </w:rPr>
+        <w:t xml:space="preserve"> serta sistem peringatan tabrakan depan untuk mendeteksi kendaraan yang berada jauh di depan kendaraan</w:t>
+      </w:r>
+      <w:r>
+        <w:rPr>
+          <w:rFonts w:ascii="Times New Roman" w:hAnsi="Times New Roman" w:cs="Times New Roman"/>
+          <w:lang w:val="sv-SE"/>
+        </w:rPr>
+        <w:t xml:space="preserve"> </w:t>
+      </w:r>
+      <w:r>
+        <w:rPr>
+          <w:rFonts w:ascii="Times New Roman" w:hAnsi="Times New Roman" w:cs="Times New Roman"/>
+          <w:lang w:val="sv-SE"/>
+        </w:rPr>
+        <w:fldChar w:fldCharType="begin"/>
+      </w:r>
+      <w:r>
+        <w:rPr>
+          <w:rFonts w:ascii="Times New Roman" w:hAnsi="Times New Roman" w:cs="Times New Roman"/>
+          <w:lang w:val="sv-SE"/>
+        </w:rPr>
+        <w:instrText xml:space="preserve"> ADDIN ZOTERO_ITEM CSL_CITATION {"citationID":"gqk8k41Y","properties":{"formattedCitation":"(Patole dkk., 2017; Rohde &amp; Schwarz, 2019; Yeong dkk., 2021)","plainCitation":"(Patole dkk., 2017; Rohde &amp; Schwarz, 2019; Yeong dkk., 2021)","noteIndex":0},"citationItems":[{"id":212,"uris":["http://zotero.org/users/local/GXnJfy3L/items/9FYBT54D"],"itemData":{"id":212,"type":"article-journal","container-title":"IEEE Signal Processing Magazine","DOI":"10.1109/MSP.2016.2628914","ISSN":"1053-5888","issue":"2","journalAbbreviation":"IEEE Signal Process. Mag.","language":"en","license":"https://ieeexplore.ieee.org/Xplorehelp/downloads/license-information/IEEE.html","page":"22-35","source":"DOI.org (Crossref)","title":"Automotive radars: A review of signal processing techniques","title-short":"Automotive radars","volume":"34","author":[{"family":"Patole","given":"Sujeet Milind"},{"family":"Torlak","given":"Murat"},{"family":"Wang","given":"Dan"},{"family":"Ali","given":"Murtaza"}],"issued":{"date-parts":[["2017",3]]}}},{"id":244,"uris":["http://zotero.org/users/local/GXnJfy3L/items/BA7FVL77"],"itemData":{"id":244,"type":"report","genre":"White Paper","title":"Automotive Radar Technology and Test Requirements","author":[{"literal":"Rohde"},{"literal":"Schwarz"}],"issued":{"date-parts":[["2019"]]}}},{"id":243,"uris":["http://zotero.org/users/local/GXnJfy3L/items/TH9GI7TQ"],"itemData":{"id":243,"type":"article-journal","abstract":"With the signiﬁcant advancement of sensor and communication technology and the reliable application of obstacle detection techniques and algorithms, automated driving is becoming a pivotal technology that can revolutionize the future of transportation and mobility. Sensors are fundamental to the perception of vehicle surroundings in an automated driving system, and the use and performance of multiple integrated sensors can directly determine the safety and feasibility of automated driving vehicles. Sensor calibration is the foundation block of any autonomous system and its constituent sensors and must be performed correctly before sensor fusion and obstacle detection processes may be implemented. This paper evaluates the capabilities and the technical performance of sensors which are commonly employed in autonomous vehicles, primarily focusing on a large</w:instrText>
+      </w:r>
+      <w:r>
+        <w:rPr>
+          <w:rFonts w:ascii="Times New Roman" w:hAnsi="Times New Roman" w:cs="Times New Roman"/>
+        </w:rPr>
+        <w:instrText xml:space="preserve"> selection of vision cameras, LiDAR sensors, and radar sensors and the various conditions in which such sensors may operate in practice. We present an overview of the three primary categories of sensor calibration and review existing open-source calibration packages for multi-sensor calibration and their compatibility with numerous commercial sensors. We also summarize the three main approaches to sensor fusion and review current state-of-the-art multi-sensor fusion techniques and algorithms for object detection in autonomous driving applications. The current paper, therefore, provides an end-to-end review of the hardware and software methods required for sensor fusion object detection. We conclude by highlighting some of the challenges in the sensor fusion </w:instrText>
+      </w:r>
+      <w:r>
+        <w:rPr>
+          <w:rFonts w:ascii="Times New Roman" w:hAnsi="Times New Roman" w:cs="Times New Roman"/>
+          <w:lang w:val="sv-SE"/>
+        </w:rPr>
+        <w:instrText>ﬁ</w:instrText>
+      </w:r>
+      <w:r>
+        <w:rPr>
+          <w:rFonts w:ascii="Times New Roman" w:hAnsi="Times New Roman" w:cs="Times New Roman"/>
+        </w:rPr>
+        <w:instrText xml:space="preserve">eld and propose possible future research directions for automated driving systems.","container-title":"Sensors","DOI":"10.3390/s21062140","ISSN":"1424-8220","issue":"6","journalAbbreviation":"Sensors","language":"en","page":"2140","source":"DOI.org (Crossref)","title":"Sensor and Sensor Fusion Technology in Autonomous Vehicles: A Review","title-short":"Sensor and Sensor Fusion Technology in Autonomous Vehicles","volume":"21","author":[{"family":"Yeong","given":"De Jong"},{"family":"Velasco-Hernandez","given":"Gustavo"},{"family":"Barry","given":"John"},{"family":"Walsh","given":"Joseph"}],"issued":{"date-parts":[["2021",3,18]]}}}],"schema":"https://github.com/citation-style-language/schema/raw/master/csl-citation.json"} </w:instrText>
+      </w:r>
+      <w:r>
+        <w:rPr>
+          <w:rFonts w:ascii="Times New Roman" w:hAnsi="Times New Roman" w:cs="Times New Roman"/>
+          <w:lang w:val="sv-SE"/>
+        </w:rPr>
+        <w:fldChar w:fldCharType="separate"/>
+      </w:r>
+      <w:r>
+        <w:rPr>
+          <w:rFonts w:ascii="Times New Roman" w:hAnsi="Times New Roman" w:cs="Times New Roman"/>
+        </w:rPr>
+        <w:t>(Patole dkk., 2017; Rohde &amp; Schwarz, 2019; Yeong dkk., 2021)</w:t>
+      </w:r>
+      <w:r>
+        <w:rPr>
+          <w:rFonts w:ascii="Times New Roman" w:hAnsi="Times New Roman" w:cs="Times New Roman"/>
+          <w:lang w:val="sv-SE"/>
+        </w:rPr>
+        <w:fldChar w:fldCharType="end"/>
+      </w:r>
+      <w:r>
+        <w:rPr>
+          <w:rFonts w:ascii="Times New Roman" w:hAnsi="Times New Roman" w:cs="Times New Roman"/>
+          <w:lang w:val="sv-SE"/>
+        </w:rPr>
+        <w:t>.</w:t>
+      </w:r>
+    </w:p>
+    <w:p>
+      <w:pPr>
+        <w:spacing w:line="360" w:lineRule="auto"/>
+        <w:ind w:firstLine="360"/>
+        <w:jc w:val="both"/>
+        <w:rPr>
+          <w:rFonts w:ascii="Times New Roman" w:hAnsi="Times New Roman" w:cs="Times New Roman"/>
+          <w:lang w:val="sv-SE"/>
+        </w:rPr>
+      </w:pPr>
+      <w:r>
+        <w:rPr>
+          <w:rFonts w:ascii="Times New Roman" w:hAnsi="Times New Roman" w:cs="Times New Roman"/>
+          <w:lang w:val="sv-SE"/>
+        </w:rPr>
+        <w:lastRenderedPageBreak/>
+        <w:t xml:space="preserve">Dalam sistem radar otomotif, antena merupakan salah satu komponen penting yang berfungsi untuk memancarkan dan menerima gelombang elektromagnetik. Kinerja antena sangat mempengaruhi performa sistem radar dalam mendeteksi objek di sekitar kendaraan. Oleh karena itu, antena yang digunakan pada radar otomotif perlu memiliki karakteristik seperti </w:t>
+      </w:r>
+      <w:r>
+        <w:rPr>
+          <w:rFonts w:ascii="Times New Roman" w:hAnsi="Times New Roman" w:cs="Times New Roman"/>
+          <w:i/>
+          <w:iCs/>
+          <w:lang w:val="sv-SE"/>
+        </w:rPr>
+        <w:t>bandwidth</w:t>
+      </w:r>
+      <w:r>
+        <w:rPr>
+          <w:rFonts w:ascii="Times New Roman" w:hAnsi="Times New Roman" w:cs="Times New Roman"/>
+          <w:lang w:val="sv-SE"/>
+        </w:rPr>
+        <w:t xml:space="preserve"> yang lebar, </w:t>
+      </w:r>
+      <w:r>
+        <w:rPr>
+          <w:rFonts w:ascii="Times New Roman" w:hAnsi="Times New Roman" w:cs="Times New Roman"/>
+          <w:i/>
+          <w:iCs/>
+          <w:lang w:val="sv-SE"/>
+        </w:rPr>
+        <w:t xml:space="preserve">gain </w:t>
+      </w:r>
+      <w:r>
+        <w:rPr>
+          <w:rFonts w:ascii="Times New Roman" w:hAnsi="Times New Roman" w:cs="Times New Roman"/>
+          <w:lang w:val="sv-SE"/>
+        </w:rPr>
+        <w:t>yang tinggi, serta pola radiasi yang terarah agar mampu meningkatkan akurasi deteksi objek.</w:t>
+      </w:r>
+    </w:p>
+    <w:p>
+      <w:pPr>
+        <w:pStyle w:val="Heading2"/>
+        <w:ind w:hanging="720"/>
+        <w:rPr>
+          <w:sz w:val="24"/>
+          <w:szCs w:val="24"/>
+          <w:lang w:val="sv-SE"/>
+        </w:rPr>
+      </w:pPr>
+      <w:r>
+        <w:rPr>
+          <w:sz w:val="24"/>
+          <w:szCs w:val="24"/>
+          <w:lang w:val="sv-SE"/>
+        </w:rPr>
+        <w:t>Antena Tapered Slot</w:t>
+      </w:r>
+    </w:p>
+    <w:p>
+      <w:pPr>
+        <w:spacing w:line="360" w:lineRule="auto"/>
+        <w:jc w:val="both"/>
+        <w:rPr>
+          <w:rFonts w:ascii="Times New Roman" w:hAnsi="Times New Roman" w:cs="Times New Roman"/>
+          <w:lang w:val="sv-SE"/>
+        </w:rPr>
+      </w:pPr>
+      <w:r>
+        <w:rPr>
+          <w:rFonts w:ascii="Times New Roman" w:hAnsi="Times New Roman" w:cs="Times New Roman"/>
+          <w:lang w:val="sv-SE"/>
+        </w:rPr>
+        <w:t>Antena mikrostrip merupakan salah satu jenis antena planar yang memiliki struktur sederhana, ringan, serta mudah direalisasikan menggunakan teknik fabrikasi pada papan sirkuit cetak</w:t>
+      </w:r>
+      <w:r>
+        <w:rPr>
+          <w:rFonts w:ascii="Times New Roman" w:hAnsi="Times New Roman" w:cs="Times New Roman"/>
+          <w:lang w:val="sv-SE"/>
+        </w:rPr>
+        <w:t>.</w:t>
+      </w:r>
+      <w:r>
+        <w:rPr>
+          <w:rFonts w:ascii="Times New Roman" w:hAnsi="Times New Roman" w:cs="Times New Roman"/>
+          <w:lang w:val="sv-SE"/>
+        </w:rPr>
+        <w:t xml:space="preserve"> </w:t>
+      </w:r>
+      <w:r>
+        <w:rPr>
+          <w:rFonts w:ascii="Times New Roman" w:hAnsi="Times New Roman" w:cs="Times New Roman"/>
+          <w:lang w:val="sv-SE"/>
+        </w:rPr>
+        <w:t>Karakteristik ini memungkinkan antena mikrostrip dapat dipasang pada berbagai jenis permukaan serta mudah diintegrasikan dengan perangkat elektronik dan sistem komunikasi modern</w:t>
+      </w:r>
+      <w:r>
+        <w:rPr>
+          <w:rFonts w:ascii="Times New Roman" w:hAnsi="Times New Roman" w:cs="Times New Roman"/>
+          <w:lang w:val="sv-SE"/>
+        </w:rPr>
+        <w:t xml:space="preserve"> </w:t>
+      </w:r>
+      <w:r>
+        <w:rPr>
+          <w:rFonts w:ascii="Times New Roman" w:hAnsi="Times New Roman" w:cs="Times New Roman"/>
+          <w:lang w:val="sv-SE"/>
+        </w:rPr>
+        <w:fldChar w:fldCharType="begin"/>
+      </w:r>
+      <w:r>
+        <w:rPr>
+          <w:rFonts w:ascii="Times New Roman" w:hAnsi="Times New Roman" w:cs="Times New Roman"/>
+          <w:lang w:val="sv-SE"/>
+        </w:rPr>
+        <w:instrText xml:space="preserve"> ADDIN ZOTERO_ITEM CSL_CITATION {"citationID":"0BVKu0YD","properties":{"formattedCitation":"(Balanis, 2005)","plainCitation":"(Balanis, 2005)","noteIndex":0},"citationItems":[{"id":218,"uris":["http://zotero.org/users/local/GXnJfy3L/items/2FG3RDRU"],"itemData":{"id":218,"type":"book","edition":"3. ed","ISBN":"978-0-471-66782-7","language":"en","number-of-pages":"1117","publisher":"Wiley-Interscience","publisher-place":"Hoboken, N.J","source":"K10plus ISBN","title":"Antenna theory: analysis and design","title-short":"Antenna theory","author":[{"family":"Balanis","given":"Constantine A."}],"issued":{"date-parts":[["2005"]]}}}],"schema":"https://github.com/citation-style-language/schema/raw/master/csl-citation.json"} </w:instrText>
+      </w:r>
+      <w:r>
+        <w:rPr>
+          <w:rFonts w:ascii="Times New Roman" w:hAnsi="Times New Roman" w:cs="Times New Roman"/>
+          <w:lang w:val="sv-SE"/>
+        </w:rPr>
+        <w:fldChar w:fldCharType="separate"/>
+      </w:r>
+      <w:r>
+        <w:rPr>
+          <w:rFonts w:ascii="Times New Roman" w:hAnsi="Times New Roman" w:cs="Times New Roman"/>
+          <w:lang w:val="sv-SE"/>
+        </w:rPr>
+        <w:t>(Balanis, 2005)</w:t>
+      </w:r>
+      <w:r>
+        <w:rPr>
+          <w:rFonts w:ascii="Times New Roman" w:hAnsi="Times New Roman" w:cs="Times New Roman"/>
+          <w:lang w:val="sv-SE"/>
+        </w:rPr>
+        <w:fldChar w:fldCharType="end"/>
+      </w:r>
+      <w:r>
+        <w:rPr>
+          <w:rFonts w:ascii="Times New Roman" w:hAnsi="Times New Roman" w:cs="Times New Roman"/>
+          <w:lang w:val="sv-SE"/>
+        </w:rPr>
+        <w:t>.</w:t>
+      </w:r>
+      <w:r>
+        <w:rPr>
+          <w:rFonts w:ascii="Times New Roman" w:hAnsi="Times New Roman" w:cs="Times New Roman"/>
+          <w:lang w:val="sv-SE"/>
+        </w:rPr>
+        <w:t xml:space="preserve"> A</w:t>
+      </w:r>
+      <w:r>
+        <w:rPr>
+          <w:rFonts w:ascii="Times New Roman" w:hAnsi="Times New Roman" w:cs="Times New Roman"/>
+          <w:lang w:val="sv-SE"/>
+        </w:rPr>
+        <w:t xml:space="preserve">ntena mikrostrip </w:t>
+      </w:r>
+      <w:r>
+        <w:rPr>
+          <w:rFonts w:ascii="Times New Roman" w:hAnsi="Times New Roman" w:cs="Times New Roman"/>
+          <w:lang w:val="sv-SE"/>
+        </w:rPr>
+        <w:t xml:space="preserve">memiliki </w:t>
+      </w:r>
+      <w:r>
+        <w:rPr>
+          <w:rFonts w:ascii="Times New Roman" w:hAnsi="Times New Roman" w:cs="Times New Roman"/>
+          <w:i/>
+          <w:iCs/>
+          <w:lang w:val="sv-SE"/>
+        </w:rPr>
+        <w:t>power</w:t>
+      </w:r>
+      <w:r>
+        <w:rPr>
+          <w:rFonts w:ascii="Times New Roman" w:hAnsi="Times New Roman" w:cs="Times New Roman"/>
+          <w:lang w:val="sv-SE"/>
+        </w:rPr>
+        <w:t xml:space="preserve"> yang rendah dan </w:t>
+      </w:r>
+      <w:r>
+        <w:rPr>
+          <w:rFonts w:ascii="Times New Roman" w:hAnsi="Times New Roman" w:cs="Times New Roman"/>
+          <w:lang w:val="sv-SE"/>
+        </w:rPr>
+        <w:t>umumnya bekerja pada rentang frekuensi gelombang mikro</w:t>
+      </w:r>
+      <w:r>
+        <w:rPr>
+          <w:rFonts w:ascii="Times New Roman" w:hAnsi="Times New Roman" w:cs="Times New Roman"/>
+          <w:lang w:val="sv-SE"/>
+        </w:rPr>
+        <w:t xml:space="preserve"> </w:t>
+      </w:r>
+      <m:oMath>
+        <m:r>
+          <w:rPr>
+            <w:rFonts w:ascii="Cambria Math" w:hAnsi="Cambria Math" w:cs="Times New Roman"/>
+            <w:lang w:val="sv-SE"/>
+          </w:rPr>
+          <m:t>(f&gt;1 GHz)</m:t>
+        </m:r>
+      </m:oMath>
+      <w:r>
+        <w:rPr>
+          <w:rFonts w:ascii="Times New Roman" w:hAnsi="Times New Roman" w:cs="Times New Roman"/>
+          <w:lang w:val="sv-SE"/>
+        </w:rPr>
+        <w:t xml:space="preserve">, </w:t>
+      </w:r>
+      <w:r>
+        <w:rPr>
+          <w:rFonts w:ascii="Times New Roman" w:hAnsi="Times New Roman" w:cs="Times New Roman"/>
+          <w:lang w:val="sv-SE"/>
+        </w:rPr>
+        <w:t>sehingga banyak digunakan pada berbagai aplikasi komunikasi nirkabel, sistem radar, dan perangkat telekomunikasi modern</w:t>
+      </w:r>
+      <w:r>
+        <w:rPr>
+          <w:rFonts w:ascii="Times New Roman" w:hAnsi="Times New Roman" w:cs="Times New Roman"/>
+          <w:lang w:val="sv-SE"/>
+        </w:rPr>
+        <w:t>.</w:t>
+      </w:r>
+      <w:r>
+        <w:rPr>
+          <w:rFonts w:ascii="Times New Roman" w:hAnsi="Times New Roman" w:cs="Times New Roman"/>
+          <w:lang w:val="sv-SE"/>
+        </w:rPr>
+        <w:t xml:space="preserve"> </w:t>
+      </w:r>
+      <w:r>
+        <w:rPr>
+          <w:rFonts w:ascii="Times New Roman" w:hAnsi="Times New Roman" w:cs="Times New Roman"/>
+          <w:lang w:val="sv-SE"/>
+        </w:rPr>
+        <w:t xml:space="preserve">Antena mikrostrip juga memiliki beberapa kekurangan yaitu bandwidth yang sempit, </w:t>
+      </w:r>
+      <w:r>
+        <w:rPr>
+          <w:rFonts w:ascii="Times New Roman" w:hAnsi="Times New Roman" w:cs="Times New Roman"/>
+          <w:i/>
+          <w:iCs/>
+          <w:lang w:val="sv-SE"/>
+        </w:rPr>
+        <w:t>gain</w:t>
+      </w:r>
+      <w:r>
+        <w:rPr>
+          <w:rFonts w:ascii="Times New Roman" w:hAnsi="Times New Roman" w:cs="Times New Roman"/>
+          <w:lang w:val="sv-SE"/>
+        </w:rPr>
+        <w:t xml:space="preserve"> dan </w:t>
+      </w:r>
+      <w:r>
+        <w:rPr>
+          <w:rFonts w:ascii="Times New Roman" w:hAnsi="Times New Roman" w:cs="Times New Roman"/>
+          <w:i/>
+          <w:iCs/>
+          <w:lang w:val="sv-SE"/>
+        </w:rPr>
+        <w:t>directivity</w:t>
+      </w:r>
+      <w:r>
+        <w:rPr>
+          <w:rFonts w:ascii="Times New Roman" w:hAnsi="Times New Roman" w:cs="Times New Roman"/>
+          <w:lang w:val="sv-SE"/>
+        </w:rPr>
+        <w:t xml:space="preserve"> yang kecil, serta efisiensi rendah</w:t>
+      </w:r>
+      <w:r>
+        <w:rPr>
+          <w:rFonts w:ascii="Times New Roman" w:hAnsi="Times New Roman" w:cs="Times New Roman"/>
+          <w:lang w:val="sv-SE"/>
+        </w:rPr>
+        <w:t xml:space="preserve"> </w:t>
+      </w:r>
+      <w:r>
+        <w:rPr>
+          <w:rFonts w:ascii="Times New Roman" w:hAnsi="Times New Roman" w:cs="Times New Roman"/>
+          <w:lang w:val="sv-SE"/>
+        </w:rPr>
+        <w:fldChar w:fldCharType="begin"/>
+      </w:r>
+      <w:r>
+        <w:rPr>
+          <w:rFonts w:ascii="Times New Roman" w:hAnsi="Times New Roman" w:cs="Times New Roman"/>
+          <w:lang w:val="sv-SE"/>
+        </w:rPr>
+        <w:instrText xml:space="preserve"> ADDIN ZOTERO_ITEM CSL_CITATION {"citationID":"Xc60kuN2","properties":{"formattedCitation":"(Pozar, 1992; Wong, 2002)","plainCitation":"(Pozar, 1992; Wong, 2002)","noteIndex":0},"citationItems":[{"id":248,"uris":["http://zotero.org/users/local/GXnJfy3L/items/836AASKT"],"itemData":{"id":248,"type":"article-journal","container-title":"Proceedings of the IEEE","DOI":"https://doi.org/10.1109/5.119568","issue":"1","page":"79-91","publisher":"IEEE","title":"Microstrip Antennas","volume":"80","author":[{"family":"Pozar","given":"David M."}],"issued":{"date-parts":[["1992",1]]}}},{"id":247,"uris":["http://zotero.org/users/local/GXnJfy3L/items/6FH5IDFG"],"itemData":{"id":247,"type":"book","DOI":"10.1002/0471221112","edition":"1","ISBN":"978-0-471-41717-0","language":"en","license":"http://doi.wiley.com/10.1002/tdm_license_1.1","publisher":"Wiley","source":"DOI.org (Crossref)","title":"Compact and Broadband Microstrip Antennas","URL":"https://onlinelibrary.wiley.com/doi/book/10.1002/0471221112","author":[{"family":"Wong","given":"Kin‐Lu"}],"accessed":{"date-parts":[["2026",4,27]]},"issued":{"date-parts":[["2002",2]]}}}],"schema":"https://github.com/citation-style-language/schema/raw/master/csl-citation.json"} </w:instrText>
+      </w:r>
+      <w:r>
+        <w:rPr>
+          <w:rFonts w:ascii="Times New Roman" w:hAnsi="Times New Roman" w:cs="Times New Roman"/>
+          <w:lang w:val="sv-SE"/>
+        </w:rPr>
+        <w:fldChar w:fldCharType="separate"/>
+      </w:r>
+      <w:r>
+        <w:rPr>
+          <w:rFonts w:ascii="Times New Roman" w:hAnsi="Times New Roman" w:cs="Times New Roman"/>
+          <w:lang w:val="sv-SE"/>
+        </w:rPr>
+        <w:t>(Pozar, 1992; Wong, 2002)</w:t>
+      </w:r>
+      <w:r>
+        <w:rPr>
+          <w:rFonts w:ascii="Times New Roman" w:hAnsi="Times New Roman" w:cs="Times New Roman"/>
+          <w:lang w:val="sv-SE"/>
+        </w:rPr>
+        <w:fldChar w:fldCharType="end"/>
+      </w:r>
+      <w:r>
+        <w:rPr>
+          <w:rFonts w:ascii="Times New Roman" w:hAnsi="Times New Roman" w:cs="Times New Roman"/>
+          <w:lang w:val="sv-SE"/>
+        </w:rPr>
+        <w:t xml:space="preserve">. Antena mikrostrip tersusun atas substrat dengan metal di bagian atas yang disebut dengan patch dan metal di bagian bawah substrat yang disebut dengan </w:t>
+      </w:r>
+      <w:r>
+        <w:rPr>
+          <w:rFonts w:ascii="Times New Roman" w:hAnsi="Times New Roman" w:cs="Times New Roman"/>
+          <w:i/>
+          <w:iCs/>
+          <w:lang w:val="sv-SE"/>
+        </w:rPr>
+        <w:t>ground plane</w:t>
+      </w:r>
+      <w:r>
+        <w:rPr>
+          <w:rFonts w:ascii="Times New Roman" w:hAnsi="Times New Roman" w:cs="Times New Roman"/>
+          <w:lang w:val="sv-SE"/>
+        </w:rPr>
+        <w:t xml:space="preserve"> seperti ditunjukkan pada gambar</w:t>
+      </w:r>
+    </w:p>
+    <w:p>
+      <w:pPr>
+        <w:spacing w:line="360" w:lineRule="auto"/>
+        <w:jc w:val="center"/>
+        <w:rPr>
+          <w:rFonts w:ascii="Times New Roman" w:hAnsi="Times New Roman" w:cs="Times New Roman"/>
+          <w:lang w:val="sv-SE"/>
+        </w:rPr>
+      </w:pPr>
+      <w:r>
+        <w:rPr>
+          <w:rFonts w:ascii="Times New Roman" w:hAnsi="Times New Roman" w:cs="Times New Roman"/>
+          <w:lang w:val="sv-SE"/>
+        </w:rPr>
+        <w:drawing>
+          <wp:inline distT="0" distB="0" distL="0" distR="0" wp14:anchorId="10A68D83" wp14:editId="43E0F14D">
+            <wp:extent cx="4085393" cy="2292823"/>
+            <wp:effectExtent l="0" t="0" r="0" b="0"/>
+            <wp:docPr id="591075029" name="Picture 1"/>
+            <wp:cNvGraphicFramePr>
+              <a:graphicFrameLocks xmlns:a="http://schemas.openxmlformats.org/drawingml/2006/main" noChangeAspect="1"/>
+            </wp:cNvGraphicFramePr>
+            <a:graphic xmlns:a="http://schemas.openxmlformats.org/drawingml/2006/main">
+              <a:graphicData uri="http://schemas.openxmlformats.org/drawingml/2006/picture">
+                <pic:pic xmlns:pic="http://schemas.openxmlformats.org/drawingml/2006/picture">
+                  <pic:nvPicPr>
+                    <pic:cNvPr id="591075029" name=""/>
+                    <pic:cNvPicPr/>
+                  </pic:nvPicPr>
+                  <pic:blipFill>
+                    <a:blip r:embed="rId10"/>
+                    <a:stretch>
+                      <a:fillRect/>
+                    </a:stretch>
+                  </pic:blipFill>
+                  <pic:spPr>
+                    <a:xfrm>
+                      <a:off x="0" y="0"/>
+                      <a:ext cx="4091283" cy="2296129"/>
+                    </a:xfrm>
+                    <a:prstGeom prst="rect">
+                      <a:avLst/>
+                    </a:prstGeom>
+                  </pic:spPr>
+                </pic:pic>
+              </a:graphicData>
+            </a:graphic>
+          </wp:inline>
+        </w:drawing>
+      </w:r>
+    </w:p>
+    <w:p>
+      <w:pPr>
+        <w:spacing w:after="0" w:line="360" w:lineRule="auto"/>
+        <w:ind w:firstLine="360"/>
+        <w:jc w:val="both"/>
+        <w:rPr>
+          <w:rFonts w:ascii="Times New Roman" w:hAnsi="Times New Roman" w:cs="Times New Roman"/>
+          <w:lang w:val="sv-SE"/>
+        </w:rPr>
+      </w:pPr>
+      <w:r>
+        <w:rPr>
+          <w:rFonts w:ascii="Times New Roman" w:hAnsi="Times New Roman" w:cs="Times New Roman"/>
+          <w:i/>
+          <w:iCs/>
+          <w:lang w:val="sv-SE"/>
+        </w:rPr>
+        <w:lastRenderedPageBreak/>
+        <w:t>Tapered Slot Antenna</w:t>
+      </w:r>
+      <w:r>
+        <w:rPr>
+          <w:rFonts w:ascii="Times New Roman" w:hAnsi="Times New Roman" w:cs="Times New Roman"/>
+          <w:lang w:val="sv-SE"/>
+        </w:rPr>
+        <w:t xml:space="preserve"> (TSA) merupakan salah satu jenis antena planar yang dirancang untuk beroperasi pada frekuensi tinggi, khususnya pada rentang frekuensi gelombang mikro hingga gelombang milimeter. Antena ini memiliki struktur berupa celah (</w:t>
+      </w:r>
+      <w:r>
+        <w:rPr>
+          <w:rFonts w:ascii="Times New Roman" w:hAnsi="Times New Roman" w:cs="Times New Roman"/>
+          <w:i/>
+          <w:iCs/>
+          <w:lang w:val="sv-SE"/>
+        </w:rPr>
+        <w:t>slot</w:t>
+      </w:r>
+      <w:r>
+        <w:rPr>
+          <w:rFonts w:ascii="Times New Roman" w:hAnsi="Times New Roman" w:cs="Times New Roman"/>
+          <w:lang w:val="sv-SE"/>
+        </w:rPr>
+        <w:t>) pada konduktor yang melebar secara bertahap sepanjang arah propagasi gelombang elektromagnetik. Struktur taper tersebut memungkinkan antena TSA menghasilkan karakteristik pita lebar (</w:t>
+      </w:r>
+      <w:r>
+        <w:rPr>
+          <w:rFonts w:ascii="Times New Roman" w:hAnsi="Times New Roman" w:cs="Times New Roman"/>
+          <w:i/>
+          <w:iCs/>
+          <w:lang w:val="sv-SE"/>
+        </w:rPr>
+        <w:t>wideband</w:t>
+      </w:r>
+      <w:r>
+        <w:rPr>
+          <w:rFonts w:ascii="Times New Roman" w:hAnsi="Times New Roman" w:cs="Times New Roman"/>
+          <w:lang w:val="sv-SE"/>
+        </w:rPr>
+        <w:t>) serta pola radiasi yang relatif stabil dan terarah, sehingga banyak digunakan pada berbagai aplikasi seperti sistem radar, komunikasi nirkabel, serta sistem sensor elektromagnetik</w:t>
+      </w:r>
+      <w:r>
+        <w:rPr>
+          <w:rFonts w:ascii="Times New Roman" w:hAnsi="Times New Roman" w:cs="Times New Roman"/>
+          <w:lang w:val="sv-SE"/>
+        </w:rPr>
+        <w:t xml:space="preserve"> </w:t>
+      </w:r>
+      <w:r>
+        <w:rPr>
+          <w:rFonts w:ascii="Times New Roman" w:hAnsi="Times New Roman" w:cs="Times New Roman"/>
+          <w:lang w:val="sv-SE"/>
+        </w:rPr>
+        <w:fldChar w:fldCharType="begin"/>
+      </w:r>
+      <w:r>
+        <w:rPr>
+          <w:rFonts w:ascii="Times New Roman" w:hAnsi="Times New Roman" w:cs="Times New Roman"/>
+          <w:lang w:val="sv-SE"/>
+        </w:rPr>
+        <w:instrText xml:space="preserve"> ADDIN ZOTERO_ITEM CSL_CITATION {"citationID":"uxoZeDix","properties":{"formattedCitation":"(Balanis, 2005; Yngvesson dkk., 1989)","plainCitation":"(Balanis, 2005; Yngvesson dkk., 1989)","noteIndex":0},"citationItems":[{"id":218,"uris":["http://zotero.org/users/local/GXnJfy3L/items/2FG3RDRU"],"itemData":{"id":218,"type":"book","edition":"3. ed","ISBN":"978-0-471-66782-7","language":"en","number-of-pages":"1117","publisher":"Wiley-Interscience","publisher-place":"Hoboken, N.J","source":"K10plus ISBN","title":"Antenna theory: analysis and design","title-short":"Antenna theory","author":[{"family":"Balanis","given":"Constantine A."}],"issued":{"date-parts":[["2005"]]}}},{"id":251,"uris":["http://zotero.org/users/local/GXnJfy3L/items/UGITI75N"],"itemData":{"id":251,"type":"article-journal","container-title":"IEEE Transactions on Microwave Theory and Techniques","DOI":"10.1109/22.20062","ISSN":"00189480","issue":"2","journalAbbreviation":"IEEE Trans. Microwave Theory Techn.","language":"en","license":"https://ieeexplore.ieee.org/Xplorehelp/downloads/license-information/IEEE.html","page":"365-374","source":"DOI.org (Crossref)","title":"The tapered slot antenna-a new integrated element for millimeter-wave applications","volume":"37","author":[{"family":"Yngvesson","given":"K.S."},{"family":"Korzeniowski","given":"T.L."},{"family":"Kim","given":"Y.-S."},{"family":"Kollberg","given":"E.L."},{"family":"Johansson","given":"J.F."}],"issued":{"date-parts":[["1989",2]]}}}],"schema":"https://github.com/citation-style-language/schema/raw/master/csl-citation.json"} </w:instrText>
+      </w:r>
+      <w:r>
+        <w:rPr>
+          <w:rFonts w:ascii="Times New Roman" w:hAnsi="Times New Roman" w:cs="Times New Roman"/>
+          <w:lang w:val="sv-SE"/>
+        </w:rPr>
+        <w:fldChar w:fldCharType="separate"/>
+      </w:r>
+      <w:r>
+        <w:rPr>
+          <w:rFonts w:ascii="Times New Roman" w:hAnsi="Times New Roman" w:cs="Times New Roman"/>
+          <w:lang w:val="sv-SE"/>
+        </w:rPr>
+        <w:t>(Balanis, 2005; Yngvesson dkk., 1989)</w:t>
+      </w:r>
+      <w:r>
+        <w:rPr>
+          <w:rFonts w:ascii="Times New Roman" w:hAnsi="Times New Roman" w:cs="Times New Roman"/>
+          <w:lang w:val="sv-SE"/>
+        </w:rPr>
+        <w:fldChar w:fldCharType="end"/>
+      </w:r>
+      <w:r>
+        <w:rPr>
+          <w:rFonts w:ascii="Times New Roman" w:hAnsi="Times New Roman" w:cs="Times New Roman"/>
+          <w:lang w:val="sv-SE"/>
+        </w:rPr>
+        <w:t>.</w:t>
+      </w:r>
+    </w:p>
+    <w:p>
+      <w:pPr>
+        <w:spacing w:line="360" w:lineRule="auto"/>
+        <w:ind w:firstLine="360"/>
+        <w:jc w:val="both"/>
+        <w:rPr>
+          <w:rFonts w:ascii="Times New Roman" w:hAnsi="Times New Roman" w:cs="Times New Roman"/>
+          <w:lang w:val="sv-SE"/>
+        </w:rPr>
+      </w:pPr>
+      <w:r>
+        <w:rPr>
+          <w:rFonts w:ascii="Times New Roman" w:hAnsi="Times New Roman" w:cs="Times New Roman"/>
+          <w:lang w:val="sv-SE"/>
+        </w:rPr>
+        <w:t xml:space="preserve">Antena </w:t>
+      </w:r>
+      <w:r>
+        <w:rPr>
+          <w:rFonts w:ascii="Times New Roman" w:hAnsi="Times New Roman" w:cs="Times New Roman"/>
+          <w:i/>
+          <w:iCs/>
+          <w:lang w:val="sv-SE"/>
+        </w:rPr>
+        <w:t>tapered slot</w:t>
+      </w:r>
+      <w:r>
+        <w:rPr>
+          <w:rFonts w:ascii="Times New Roman" w:hAnsi="Times New Roman" w:cs="Times New Roman"/>
+          <w:lang w:val="sv-SE"/>
+        </w:rPr>
+        <w:t xml:space="preserve"> sering juga dikenal sebagai antena Vivaldi, yang merupakan salah satu bentuk antena slot yang memiliki kemampuan bekerja pada rentang frekuensi yang luas. Antena ini pertama kali diperkenalkan oleh P. J. Gibson pada tahun 1979 sebagai antena broadband yang mampu menghasilkan pola radiasi yang baik pada berbagai frekuensi operasi</w:t>
+      </w:r>
+      <w:r>
+        <w:rPr>
+          <w:rFonts w:ascii="Times New Roman" w:hAnsi="Times New Roman" w:cs="Times New Roman"/>
+          <w:lang w:val="sv-SE"/>
+        </w:rPr>
+        <w:t xml:space="preserve">. </w:t>
+      </w:r>
+      <w:r>
+        <w:rPr>
+          <w:rFonts w:ascii="Times New Roman" w:hAnsi="Times New Roman" w:cs="Times New Roman"/>
+          <w:lang w:val="sv-SE"/>
+        </w:rPr>
+        <w:t>Sejak diperkenalkan, antena Vivaldi banyak dikembangkan dan digunakan dalam berbagai aplikasi frekuensi tinggi karena kemampuannya dalam menghasilkan bandwidth yang lebar, efisiensi radiasi yang baik, serta kemudahan dalam proses fabrikasi menggunakan teknologi mikrostrip</w:t>
+      </w:r>
+      <w:r>
+        <w:rPr>
+          <w:rFonts w:ascii="Times New Roman" w:hAnsi="Times New Roman" w:cs="Times New Roman"/>
+          <w:lang w:val="sv-SE"/>
+        </w:rPr>
+        <w:t>.</w:t>
+      </w:r>
+    </w:p>
+    <w:p>
+      <w:pPr>
+        <w:pStyle w:val="Heading2"/>
+        <w:ind w:hanging="720"/>
+        <w:rPr>
+          <w:sz w:val="24"/>
+          <w:szCs w:val="28"/>
+          <w:lang w:val="sv-SE"/>
+        </w:rPr>
+      </w:pPr>
+      <w:r>
+        <w:rPr>
+          <w:sz w:val="24"/>
+          <w:szCs w:val="28"/>
+          <w:lang w:val="sv-SE"/>
+        </w:rPr>
+        <w:t>Parameter Antena</w:t>
+      </w:r>
+    </w:p>
+    <w:p>
+      <w:pPr>
+        <w:pStyle w:val="Heading3"/>
+        <w:ind w:hanging="1080"/>
+        <w:rPr>
+          <w:i/>
+          <w:iCs/>
+          <w:sz w:val="24"/>
+          <w:szCs w:val="24"/>
+          <w:lang w:val="sv-SE"/>
+        </w:rPr>
+      </w:pPr>
+      <w:r>
+        <w:rPr>
+          <w:i/>
+          <w:iCs/>
+          <w:sz w:val="24"/>
+          <w:szCs w:val="24"/>
+          <w:lang w:val="sv-SE"/>
+        </w:rPr>
+        <w:t>Return Loss</w:t>
+      </w:r>
+    </w:p>
+    <w:p>
+      <w:pPr>
+        <w:spacing w:line="360" w:lineRule="auto"/>
+        <w:ind w:firstLine="360"/>
+        <w:jc w:val="both"/>
+        <w:rPr>
+          <w:rFonts w:ascii="Times New Roman" w:hAnsi="Times New Roman" w:cs="Times New Roman"/>
+        </w:rPr>
+      </w:pPr>
+      <w:r>
+        <w:rPr>
+          <w:rFonts w:ascii="Times New Roman" w:hAnsi="Times New Roman" w:cs="Times New Roman"/>
+          <w:lang w:val="sv-SE"/>
+        </w:rPr>
+        <w:t>R</w:t>
+      </w:r>
+      <w:r>
+        <w:rPr>
+          <w:rFonts w:ascii="Times New Roman" w:hAnsi="Times New Roman" w:cs="Times New Roman"/>
+          <w:lang w:val="sv-SE"/>
+        </w:rPr>
+        <w:t xml:space="preserve">eturn loss adalah ukuran dari seberapa baik sebuah sistem atau komponen transmisi (seperti kabel, antena, atau sirkuit) mampu menyerap atau memanfaatkan energi yang dikirimkan ke dalamnya dan seberapa sedikit energi yang dipantulkan kembali ke sumber asal. Return loss didefinisikan sebagai perbandingan antara daya sinyal yang dipancarkan ke dalam sistem dengan daya sinyal yang dipantulkan kembali ke sumber asal. Return loss diukur dalam desibel (dB). Semakin rendah nilai return loss, semakin kecil energi yang dipantulkan dan semakin baik sistem atau komponen tersebut menerima energi yang dikirimkan. Nilai return loss yang tinggi mengindikasikan efisiensi yang baik dalam transmisi energi, sedangkan nilai yang rendah menunjukkan adanya lebih banyak energi yang dipantulkan kembali ke sumber asal, yang dapat mengakibatkan kerugian sinyal dan mengurangi kinerja </w:t>
+      </w:r>
+      <w:r>
+        <w:rPr>
+          <w:rFonts w:ascii="Times New Roman" w:hAnsi="Times New Roman" w:cs="Times New Roman"/>
+          <w:lang w:val="sv-SE"/>
+        </w:rPr>
+        <w:lastRenderedPageBreak/>
+        <w:t xml:space="preserve">sistem. Return loss disebabkan karena adanya diskontinuitas antara saluran transmisi dengan impedansi masukan beban (antena). </w:t>
+      </w:r>
+      <w:proofErr w:type="spellStart"/>
+      <w:r>
+        <w:rPr>
+          <w:rFonts w:ascii="Times New Roman" w:hAnsi="Times New Roman" w:cs="Times New Roman"/>
+        </w:rPr>
+        <w:t>Hubungan</w:t>
+      </w:r>
+      <w:proofErr w:type="spellEnd"/>
+      <w:r>
+        <w:rPr>
+          <w:rFonts w:ascii="Times New Roman" w:hAnsi="Times New Roman" w:cs="Times New Roman"/>
+        </w:rPr>
+        <w:t xml:space="preserve"> </w:t>
+      </w:r>
+      <w:proofErr w:type="spellStart"/>
+      <w:r>
+        <w:rPr>
+          <w:rFonts w:ascii="Times New Roman" w:hAnsi="Times New Roman" w:cs="Times New Roman"/>
+        </w:rPr>
+        <w:t>antara</w:t>
+      </w:r>
+      <w:proofErr w:type="spellEnd"/>
+      <w:r>
+        <w:rPr>
+          <w:rFonts w:ascii="Times New Roman" w:hAnsi="Times New Roman" w:cs="Times New Roman"/>
+        </w:rPr>
+        <w:t xml:space="preserve"> </w:t>
+      </w:r>
+      <w:r>
+        <w:rPr>
+          <w:rFonts w:ascii="Cambria Math" w:hAnsi="Cambria Math" w:cs="Cambria Math"/>
+        </w:rPr>
+        <w:t>𝛤</w:t>
+      </w:r>
+      <w:r>
+        <w:rPr>
+          <w:rFonts w:ascii="Times New Roman" w:hAnsi="Times New Roman" w:cs="Times New Roman"/>
+        </w:rPr>
+        <w:t xml:space="preserve"> dan return loss </w:t>
+      </w:r>
+      <w:proofErr w:type="spellStart"/>
+      <w:r>
+        <w:rPr>
+          <w:rFonts w:ascii="Times New Roman" w:hAnsi="Times New Roman" w:cs="Times New Roman"/>
+        </w:rPr>
+        <w:t>dinyatakan</w:t>
+      </w:r>
+      <w:proofErr w:type="spellEnd"/>
+      <w:r>
+        <w:rPr>
+          <w:rFonts w:ascii="Times New Roman" w:hAnsi="Times New Roman" w:cs="Times New Roman"/>
+        </w:rPr>
+        <w:t xml:space="preserve"> </w:t>
+      </w:r>
+      <w:proofErr w:type="spellStart"/>
+      <w:r>
+        <w:rPr>
+          <w:rFonts w:ascii="Times New Roman" w:hAnsi="Times New Roman" w:cs="Times New Roman"/>
+        </w:rPr>
+        <w:t>dengan</w:t>
+      </w:r>
+      <w:proofErr w:type="spellEnd"/>
+      <w:r>
+        <w:rPr>
+          <w:rFonts w:ascii="Times New Roman" w:hAnsi="Times New Roman" w:cs="Times New Roman"/>
+        </w:rPr>
+        <w:t xml:space="preserve"> </w:t>
+      </w:r>
+      <w:proofErr w:type="spellStart"/>
+      <w:r>
+        <w:rPr>
+          <w:rFonts w:ascii="Times New Roman" w:hAnsi="Times New Roman" w:cs="Times New Roman"/>
+        </w:rPr>
+        <w:t>persamaan</w:t>
+      </w:r>
+      <w:proofErr w:type="spellEnd"/>
+      <w:r>
+        <w:rPr>
+          <w:rFonts w:ascii="Times New Roman" w:hAnsi="Times New Roman" w:cs="Times New Roman"/>
+        </w:rPr>
+        <w:t>.</w:t>
+      </w:r>
+    </w:p>
+    <w:p>
+      <w:pPr>
+        <w:spacing w:line="360" w:lineRule="auto"/>
+        <w:jc w:val="both"/>
+        <w:rPr>
+          <w:rFonts w:ascii="Times New Roman" w:hAnsi="Times New Roman" w:cs="Times New Roman"/>
+          <w:lang w:val="sv-SE"/>
+        </w:rPr>
+      </w:pPr>
+    </w:p>
+    <w:p>
+      <w:pPr>
+        <w:spacing w:line="360" w:lineRule="auto"/>
+        <w:ind w:firstLine="360"/>
+        <w:jc w:val="both"/>
+        <w:rPr>
+          <w:rFonts w:ascii="Times New Roman" w:hAnsi="Times New Roman" w:cs="Times New Roman"/>
+          <w:lang w:val="sv-SE"/>
+        </w:rPr>
+      </w:pPr>
+    </w:p>
+    <w:p>
+      <w:pPr>
+        <w:spacing w:line="360" w:lineRule="auto"/>
+        <w:ind w:firstLine="360"/>
+        <w:jc w:val="both"/>
+        <w:rPr>
+          <w:rFonts w:ascii="Times New Roman" w:hAnsi="Times New Roman" w:cs="Times New Roman"/>
+          <w:lang w:val="sv-SE"/>
+        </w:rPr>
+      </w:pPr>
+      <w:r>
+        <w:rPr>
+          <w:rFonts w:ascii="Times New Roman" w:hAnsi="Times New Roman" w:cs="Times New Roman"/>
           <w:lang w:val="sv-SE"/>
         </w:rPr>
         <w:br w:type="page"/>
@@ -3907,9 +5395,9 @@
           <w:lang w:val="sv-SE"/>
         </w:rPr>
         <w:sectPr>
-          <w:headerReference w:type="default" r:id="rId9"/>
-          <w:headerReference w:type="first" r:id="rId10"/>
-          <w:footerReference w:type="first" r:id="rId11"/>
+          <w:headerReference w:type="default" r:id="rId11"/>
+          <w:headerReference w:type="first" r:id="rId12"/>
+          <w:footerReference w:type="first" r:id="rId13"/>
           <w:pgSz w:w="11906" w:h="16838" w:code="9"/>
           <w:pgMar w:top="2268" w:right="1701" w:bottom="1701" w:left="2268" w:header="1417" w:footer="720" w:gutter="0"/>
           <w:pgNumType w:start="1"/>
@@ -3933,8 +5421,6 @@
     <w:p>
       <w:pPr>
         <w:pStyle w:val="Bibliography"/>
-        <w:spacing w:line="360" w:lineRule="auto"/>
-        <w:jc w:val="both"/>
         <w:rPr>
           <w:rFonts w:ascii="Times New Roman" w:hAnsi="Times New Roman" w:cs="Times New Roman"/>
           <w:sz w:val="28"/>
@@ -3960,7 +5446,55 @@
           <w:rFonts w:ascii="Times New Roman" w:hAnsi="Times New Roman" w:cs="Times New Roman"/>
           <w:sz w:val="28"/>
         </w:rPr>
-        <w:t xml:space="preserve">Abd El-Hameed, A. S., Ouf, E. G., Elboushi, A., Seliem, A. G., &amp; Izumi, Y. (2023). An Improved Performance Radar Sensor for K-Band Automotive Radars. </w:t>
+        <w:t xml:space="preserve">Abd El-Hameed, A. S., </w:t>
+      </w:r>
+      <w:proofErr w:type="spellStart"/>
+      <w:r>
+        <w:rPr>
+          <w:rFonts w:ascii="Times New Roman" w:hAnsi="Times New Roman" w:cs="Times New Roman"/>
+          <w:sz w:val="28"/>
+        </w:rPr>
+        <w:t>Ouf</w:t>
+      </w:r>
+      <w:proofErr w:type="spellEnd"/>
+      <w:r>
+        <w:rPr>
+          <w:rFonts w:ascii="Times New Roman" w:hAnsi="Times New Roman" w:cs="Times New Roman"/>
+          <w:sz w:val="28"/>
+        </w:rPr>
+        <w:t xml:space="preserve">, E. G., </w:t>
+      </w:r>
+      <w:proofErr w:type="spellStart"/>
+      <w:r>
+        <w:rPr>
+          <w:rFonts w:ascii="Times New Roman" w:hAnsi="Times New Roman" w:cs="Times New Roman"/>
+          <w:sz w:val="28"/>
+        </w:rPr>
+        <w:t>Elboushi</w:t>
+      </w:r>
+      <w:proofErr w:type="spellEnd"/>
+      <w:r>
+        <w:rPr>
+          <w:rFonts w:ascii="Times New Roman" w:hAnsi="Times New Roman" w:cs="Times New Roman"/>
+          <w:sz w:val="28"/>
+        </w:rPr>
+        <w:t xml:space="preserve">, A., </w:t>
+      </w:r>
+      <w:proofErr w:type="spellStart"/>
+      <w:r>
+        <w:rPr>
+          <w:rFonts w:ascii="Times New Roman" w:hAnsi="Times New Roman" w:cs="Times New Roman"/>
+          <w:sz w:val="28"/>
+        </w:rPr>
+        <w:t>Seliem</w:t>
+      </w:r>
+      <w:proofErr w:type="spellEnd"/>
+      <w:r>
+        <w:rPr>
+          <w:rFonts w:ascii="Times New Roman" w:hAnsi="Times New Roman" w:cs="Times New Roman"/>
+          <w:sz w:val="28"/>
+        </w:rPr>
+        <w:t xml:space="preserve">, A. G., &amp; Izumi, Y. (2023). An Improved Performance Radar Sensor for K-Band Automotive Radars. </w:t>
       </w:r>
       <w:r>
         <w:rPr>
@@ -3998,8 +5532,6 @@
     <w:p>
       <w:pPr>
         <w:pStyle w:val="Bibliography"/>
-        <w:spacing w:line="360" w:lineRule="auto"/>
-        <w:jc w:val="both"/>
         <w:rPr>
           <w:rFonts w:ascii="Times New Roman" w:hAnsi="Times New Roman" w:cs="Times New Roman"/>
           <w:sz w:val="28"/>
@@ -4048,8 +5580,6 @@
     <w:p>
       <w:pPr>
         <w:pStyle w:val="Bibliography"/>
-        <w:spacing w:line="360" w:lineRule="auto"/>
-        <w:jc w:val="both"/>
         <w:rPr>
           <w:rFonts w:ascii="Times New Roman" w:hAnsi="Times New Roman" w:cs="Times New Roman"/>
           <w:sz w:val="28"/>
@@ -4082,19 +5612,33 @@
     <w:p>
       <w:pPr>
         <w:pStyle w:val="Bibliography"/>
-        <w:spacing w:line="360" w:lineRule="auto"/>
-        <w:jc w:val="both"/>
-        <w:rPr>
-          <w:rFonts w:ascii="Times New Roman" w:hAnsi="Times New Roman" w:cs="Times New Roman"/>
-          <w:sz w:val="28"/>
-        </w:rPr>
-      </w:pPr>
-      <w:r>
-        <w:rPr>
-          <w:rFonts w:ascii="Times New Roman" w:hAnsi="Times New Roman" w:cs="Times New Roman"/>
-          <w:sz w:val="28"/>
-        </w:rPr>
-        <w:t xml:space="preserve">Biswas, P., Sur, S. N., Bera, R., Imoize, A. L., &amp; Li, C.-T. (2025). Advanced Signal Processing and Modeling Techniques for Automotive Radar: Challenges and Innovations in ADAS Applications. </w:t>
+        <w:rPr>
+          <w:rFonts w:ascii="Times New Roman" w:hAnsi="Times New Roman" w:cs="Times New Roman"/>
+          <w:sz w:val="28"/>
+        </w:rPr>
+      </w:pPr>
+      <w:r>
+        <w:rPr>
+          <w:rFonts w:ascii="Times New Roman" w:hAnsi="Times New Roman" w:cs="Times New Roman"/>
+          <w:sz w:val="28"/>
+        </w:rPr>
+        <w:t xml:space="preserve">Biswas, P., Sur, S. N., Bera, R., </w:t>
+      </w:r>
+      <w:proofErr w:type="spellStart"/>
+      <w:r>
+        <w:rPr>
+          <w:rFonts w:ascii="Times New Roman" w:hAnsi="Times New Roman" w:cs="Times New Roman"/>
+          <w:sz w:val="28"/>
+        </w:rPr>
+        <w:t>Imoize</w:t>
+      </w:r>
+      <w:proofErr w:type="spellEnd"/>
+      <w:r>
+        <w:rPr>
+          <w:rFonts w:ascii="Times New Roman" w:hAnsi="Times New Roman" w:cs="Times New Roman"/>
+          <w:sz w:val="28"/>
+        </w:rPr>
+        <w:t xml:space="preserve">, A. L., &amp; Li, C.-T. (2025). Advanced Signal Processing and Modeling Techniques for Automotive Radar: Challenges and Innovations in ADAS Applications. </w:t>
       </w:r>
       <w:r>
         <w:rPr>
@@ -4132,19 +5676,33 @@
     <w:p>
       <w:pPr>
         <w:pStyle w:val="Bibliography"/>
-        <w:spacing w:line="360" w:lineRule="auto"/>
-        <w:jc w:val="both"/>
-        <w:rPr>
-          <w:rFonts w:ascii="Times New Roman" w:hAnsi="Times New Roman" w:cs="Times New Roman"/>
-          <w:sz w:val="28"/>
-        </w:rPr>
-      </w:pPr>
-      <w:r>
-        <w:rPr>
-          <w:rFonts w:ascii="Times New Roman" w:hAnsi="Times New Roman" w:cs="Times New Roman"/>
-          <w:sz w:val="28"/>
-        </w:rPr>
-        <w:t xml:space="preserve">Dae-Heon Lee, Hae-Yong Yang, &amp; Young-Ki Cho. (2012). Tapered Slot Antenna With Band-Notched Function for Ultrawideband Radios. </w:t>
+        <w:rPr>
+          <w:rFonts w:ascii="Times New Roman" w:hAnsi="Times New Roman" w:cs="Times New Roman"/>
+          <w:sz w:val="28"/>
+        </w:rPr>
+      </w:pPr>
+      <w:r>
+        <w:rPr>
+          <w:rFonts w:ascii="Times New Roman" w:hAnsi="Times New Roman" w:cs="Times New Roman"/>
+          <w:sz w:val="28"/>
+        </w:rPr>
+        <w:t xml:space="preserve">Dae-Heon Lee, Hae-Yong Yang, &amp; Young-Ki Cho. (2012). Tapered Slot Antenna </w:t>
+      </w:r>
+      <w:proofErr w:type="gramStart"/>
+      <w:r>
+        <w:rPr>
+          <w:rFonts w:ascii="Times New Roman" w:hAnsi="Times New Roman" w:cs="Times New Roman"/>
+          <w:sz w:val="28"/>
+        </w:rPr>
+        <w:t>With</w:t>
+      </w:r>
+      <w:proofErr w:type="gramEnd"/>
+      <w:r>
+        <w:rPr>
+          <w:rFonts w:ascii="Times New Roman" w:hAnsi="Times New Roman" w:cs="Times New Roman"/>
+          <w:sz w:val="28"/>
+        </w:rPr>
+        <w:t xml:space="preserve"> Band-Notched Function for Ultrawideband Radios. </w:t>
       </w:r>
       <w:r>
         <w:rPr>
@@ -4182,19 +5740,27 @@
     <w:p>
       <w:pPr>
         <w:pStyle w:val="Bibliography"/>
-        <w:spacing w:line="360" w:lineRule="auto"/>
-        <w:jc w:val="both"/>
-        <w:rPr>
-          <w:rFonts w:ascii="Times New Roman" w:hAnsi="Times New Roman" w:cs="Times New Roman"/>
-          <w:sz w:val="28"/>
-        </w:rPr>
-      </w:pPr>
-      <w:r>
-        <w:rPr>
-          <w:rFonts w:ascii="Times New Roman" w:hAnsi="Times New Roman" w:cs="Times New Roman"/>
-          <w:sz w:val="28"/>
-        </w:rPr>
-        <w:t xml:space="preserve">Darimireddy, N. K., Mohan Rao, U., Park, C.-W., Fofana, I., Sujatha, M., &amp; Verma, A. K. (2021). Perspectives of Convertors and Communication Aspects in Automated Vehicles, Part 2: Printed Antennas and Sensors for Automotive Radars. </w:t>
+        <w:rPr>
+          <w:rFonts w:ascii="Times New Roman" w:hAnsi="Times New Roman" w:cs="Times New Roman"/>
+          <w:sz w:val="28"/>
+        </w:rPr>
+      </w:pPr>
+      <w:proofErr w:type="spellStart"/>
+      <w:r>
+        <w:rPr>
+          <w:rFonts w:ascii="Times New Roman" w:hAnsi="Times New Roman" w:cs="Times New Roman"/>
+          <w:sz w:val="28"/>
+        </w:rPr>
+        <w:lastRenderedPageBreak/>
+        <w:t>Darimireddy</w:t>
+      </w:r>
+      <w:proofErr w:type="spellEnd"/>
+      <w:r>
+        <w:rPr>
+          <w:rFonts w:ascii="Times New Roman" w:hAnsi="Times New Roman" w:cs="Times New Roman"/>
+          <w:sz w:val="28"/>
+        </w:rPr>
+        <w:t xml:space="preserve">, N. K., Mohan Rao, U., Park, C.-W., Fofana, I., Sujatha, M., &amp; Verma, A. K. (2021). Perspectives of Convertors and Communication Aspects in Automated Vehicles, Part 2: Printed Antennas and Sensors for Automotive Radars. </w:t>
       </w:r>
       <w:r>
         <w:rPr>
@@ -4232,29 +5798,189 @@
     <w:p>
       <w:pPr>
         <w:pStyle w:val="Bibliography"/>
-        <w:spacing w:line="360" w:lineRule="auto"/>
-        <w:jc w:val="both"/>
-        <w:rPr>
-          <w:rFonts w:ascii="Times New Roman" w:hAnsi="Times New Roman" w:cs="Times New Roman"/>
-          <w:sz w:val="28"/>
-        </w:rPr>
-      </w:pPr>
-      <w:r>
-        <w:rPr>
-          <w:rFonts w:ascii="Times New Roman" w:hAnsi="Times New Roman" w:cs="Times New Roman"/>
+        <w:rPr>
+          <w:rFonts w:ascii="Times New Roman" w:hAnsi="Times New Roman" w:cs="Times New Roman"/>
+          <w:sz w:val="28"/>
+        </w:rPr>
+      </w:pPr>
+      <w:r>
+        <w:rPr>
+          <w:rFonts w:ascii="Times New Roman" w:hAnsi="Times New Roman" w:cs="Times New Roman"/>
+          <w:sz w:val="28"/>
+        </w:rPr>
+        <w:t xml:space="preserve">Ellgardt, A., &amp; Wikstrom, A. (2009). A Single Polarized Triangular Grid Tapered-Slot Array Antenna. </w:t>
+      </w:r>
+      <w:r>
+        <w:rPr>
+          <w:rFonts w:ascii="Times New Roman" w:hAnsi="Times New Roman" w:cs="Times New Roman"/>
+          <w:i/>
+          <w:iCs/>
+          <w:sz w:val="28"/>
+        </w:rPr>
+        <w:t>IEEE Transactions on Antennas and Propagation</w:t>
+      </w:r>
+      <w:r>
+        <w:rPr>
+          <w:rFonts w:ascii="Times New Roman" w:hAnsi="Times New Roman" w:cs="Times New Roman"/>
+          <w:sz w:val="28"/>
+        </w:rPr>
+        <w:t xml:space="preserve">, </w:t>
+      </w:r>
+      <w:r>
+        <w:rPr>
+          <w:rFonts w:ascii="Times New Roman" w:hAnsi="Times New Roman" w:cs="Times New Roman"/>
+          <w:i/>
+          <w:iCs/>
+          <w:sz w:val="28"/>
+        </w:rPr>
+        <w:t>57</w:t>
+      </w:r>
+      <w:r>
+        <w:rPr>
+          <w:rFonts w:ascii="Times New Roman" w:hAnsi="Times New Roman" w:cs="Times New Roman"/>
+          <w:sz w:val="28"/>
+        </w:rPr>
+        <w:t>(9), 2599–2607. https://doi.org/10.1109/TAP.2009.2027044</w:t>
+      </w:r>
+    </w:p>
+    <w:p>
+      <w:pPr>
+        <w:pStyle w:val="Bibliography"/>
+        <w:rPr>
+          <w:rFonts w:ascii="Times New Roman" w:hAnsi="Times New Roman" w:cs="Times New Roman"/>
+          <w:sz w:val="28"/>
+        </w:rPr>
+      </w:pPr>
+      <w:r>
+        <w:rPr>
+          <w:rFonts w:ascii="Times New Roman" w:hAnsi="Times New Roman" w:cs="Times New Roman"/>
+          <w:sz w:val="28"/>
+        </w:rPr>
+        <w:t xml:space="preserve">Hasch, J., </w:t>
+      </w:r>
+      <w:proofErr w:type="spellStart"/>
+      <w:r>
+        <w:rPr>
+          <w:rFonts w:ascii="Times New Roman" w:hAnsi="Times New Roman" w:cs="Times New Roman"/>
+          <w:sz w:val="28"/>
+        </w:rPr>
+        <w:t>Topak</w:t>
+      </w:r>
+      <w:proofErr w:type="spellEnd"/>
+      <w:r>
+        <w:rPr>
+          <w:rFonts w:ascii="Times New Roman" w:hAnsi="Times New Roman" w:cs="Times New Roman"/>
+          <w:sz w:val="28"/>
+        </w:rPr>
+        <w:t xml:space="preserve">, E., Schnabel, R., Zwick, T., Weigel, R., &amp; Waldschmidt, C. (2012). Millimeter-Wave Technology for Automotive Radar Sensors in the 77 GHz Frequency Band. </w:t>
+      </w:r>
+      <w:r>
+        <w:rPr>
+          <w:rFonts w:ascii="Times New Roman" w:hAnsi="Times New Roman" w:cs="Times New Roman"/>
+          <w:i/>
+          <w:iCs/>
+          <w:sz w:val="28"/>
+        </w:rPr>
+        <w:t>IEEE Transactions on Microwave Theory and Techniques</w:t>
+      </w:r>
+      <w:r>
+        <w:rPr>
+          <w:rFonts w:ascii="Times New Roman" w:hAnsi="Times New Roman" w:cs="Times New Roman"/>
+          <w:sz w:val="28"/>
+        </w:rPr>
+        <w:t xml:space="preserve">, </w:t>
+      </w:r>
+      <w:r>
+        <w:rPr>
+          <w:rFonts w:ascii="Times New Roman" w:hAnsi="Times New Roman" w:cs="Times New Roman"/>
+          <w:i/>
+          <w:iCs/>
+          <w:sz w:val="28"/>
+        </w:rPr>
+        <w:t>60</w:t>
+      </w:r>
+      <w:r>
+        <w:rPr>
+          <w:rFonts w:ascii="Times New Roman" w:hAnsi="Times New Roman" w:cs="Times New Roman"/>
+          <w:sz w:val="28"/>
+        </w:rPr>
+        <w:t>(3), 845–860. https://doi.org/10.1109/TMTT.2011.2178427</w:t>
+      </w:r>
+    </w:p>
+    <w:p>
+      <w:pPr>
+        <w:pStyle w:val="Bibliography"/>
+        <w:rPr>
+          <w:rFonts w:ascii="Times New Roman" w:hAnsi="Times New Roman" w:cs="Times New Roman"/>
+          <w:sz w:val="28"/>
+        </w:rPr>
+      </w:pPr>
+      <w:proofErr w:type="spellStart"/>
+      <w:r>
+        <w:rPr>
+          <w:rFonts w:ascii="Times New Roman" w:hAnsi="Times New Roman" w:cs="Times New Roman"/>
+          <w:sz w:val="28"/>
+        </w:rPr>
+        <w:t>Mahafza</w:t>
+      </w:r>
+      <w:proofErr w:type="spellEnd"/>
+      <w:r>
+        <w:rPr>
+          <w:rFonts w:ascii="Times New Roman" w:hAnsi="Times New Roman" w:cs="Times New Roman"/>
+          <w:sz w:val="28"/>
+        </w:rPr>
+        <w:t xml:space="preserve">, B. R. (2000). </w:t>
+      </w:r>
+      <w:r>
+        <w:rPr>
+          <w:rFonts w:ascii="Times New Roman" w:hAnsi="Times New Roman" w:cs="Times New Roman"/>
+          <w:i/>
+          <w:iCs/>
+          <w:sz w:val="28"/>
+        </w:rPr>
+        <w:t>Radar systems analysis and design using MATLAB</w:t>
+      </w:r>
+      <w:r>
+        <w:rPr>
+          <w:rFonts w:ascii="Times New Roman" w:hAnsi="Times New Roman" w:cs="Times New Roman"/>
+          <w:sz w:val="28"/>
+        </w:rPr>
+        <w:t>. Chapman &amp; Hall/CRC.</w:t>
+      </w:r>
+    </w:p>
+    <w:p>
+      <w:pPr>
+        <w:pStyle w:val="Bibliography"/>
+        <w:rPr>
+          <w:rFonts w:ascii="Times New Roman" w:hAnsi="Times New Roman" w:cs="Times New Roman"/>
+          <w:sz w:val="28"/>
+        </w:rPr>
+      </w:pPr>
+      <w:r>
+        <w:rPr>
+          <w:rFonts w:ascii="Times New Roman" w:hAnsi="Times New Roman" w:cs="Times New Roman"/>
+          <w:sz w:val="28"/>
+        </w:rPr>
+        <w:t xml:space="preserve">Moon-Sik Lee &amp; Yong-Hoon Kim. (2010). Design and Performance of a 24-GHz Switch-Antenna Array FMCW Radar System for Automotive Applications. </w:t>
+      </w:r>
+      <w:r>
+        <w:rPr>
+          <w:rFonts w:ascii="Times New Roman" w:hAnsi="Times New Roman" w:cs="Times New Roman"/>
+          <w:i/>
+          <w:iCs/>
+          <w:sz w:val="28"/>
+        </w:rPr>
+        <w:t xml:space="preserve">IEEE Transactions on Vehicular </w:t>
+      </w:r>
+      <w:r>
+        <w:rPr>
+          <w:rFonts w:ascii="Times New Roman" w:hAnsi="Times New Roman" w:cs="Times New Roman"/>
+          <w:i/>
+          <w:iCs/>
           <w:sz w:val="28"/>
         </w:rPr>
         <w:lastRenderedPageBreak/>
-        <w:t xml:space="preserve">Ellgardt, A., &amp; Wikstrom, A. (2009). A Single Polarized Triangular Grid Tapered-Slot Array Antenna. </w:t>
-      </w:r>
-      <w:r>
-        <w:rPr>
-          <w:rFonts w:ascii="Times New Roman" w:hAnsi="Times New Roman" w:cs="Times New Roman"/>
-          <w:i/>
-          <w:iCs/>
-          <w:sz w:val="28"/>
-        </w:rPr>
-        <w:t>IEEE Transactions on Antennas and Propagation</w:t>
+        <w:t>Technology</w:t>
       </w:r>
       <w:r>
         <w:rPr>
@@ -4270,41 +5996,39 @@
           <w:iCs/>
           <w:sz w:val="28"/>
         </w:rPr>
-        <w:t>57</w:t>
-      </w:r>
-      <w:r>
-        <w:rPr>
-          <w:rFonts w:ascii="Times New Roman" w:hAnsi="Times New Roman" w:cs="Times New Roman"/>
-          <w:sz w:val="28"/>
-        </w:rPr>
-        <w:t>(9), 2599–2607. https://doi.org/10.1109/TAP.2009.2027044</w:t>
+        <w:t>59</w:t>
+      </w:r>
+      <w:r>
+        <w:rPr>
+          <w:rFonts w:ascii="Times New Roman" w:hAnsi="Times New Roman" w:cs="Times New Roman"/>
+          <w:sz w:val="28"/>
+        </w:rPr>
+        <w:t>(5), 2290–2297. https://doi.org/10.1109/TVT.2010.2045665</w:t>
       </w:r>
     </w:p>
     <w:p>
       <w:pPr>
         <w:pStyle w:val="Bibliography"/>
-        <w:spacing w:line="360" w:lineRule="auto"/>
-        <w:jc w:val="both"/>
-        <w:rPr>
-          <w:rFonts w:ascii="Times New Roman" w:hAnsi="Times New Roman" w:cs="Times New Roman"/>
-          <w:sz w:val="28"/>
-        </w:rPr>
-      </w:pPr>
-      <w:r>
-        <w:rPr>
-          <w:rFonts w:ascii="Times New Roman" w:hAnsi="Times New Roman" w:cs="Times New Roman"/>
-          <w:sz w:val="28"/>
-        </w:rPr>
-        <w:t xml:space="preserve">Hasch, J., Topak, E., Schnabel, R., Zwick, T., Weigel, R., &amp; Waldschmidt, C. (2012). Millimeter-Wave Technology for Automotive Radar Sensors in the 77 GHz Frequency Band. </w:t>
-      </w:r>
-      <w:r>
-        <w:rPr>
-          <w:rFonts w:ascii="Times New Roman" w:hAnsi="Times New Roman" w:cs="Times New Roman"/>
-          <w:i/>
-          <w:iCs/>
-          <w:sz w:val="28"/>
-        </w:rPr>
-        <w:t>IEEE Transactions on Microwave Theory and Techniques</w:t>
+        <w:rPr>
+          <w:rFonts w:ascii="Times New Roman" w:hAnsi="Times New Roman" w:cs="Times New Roman"/>
+          <w:sz w:val="28"/>
+        </w:rPr>
+      </w:pPr>
+      <w:r>
+        <w:rPr>
+          <w:rFonts w:ascii="Times New Roman" w:hAnsi="Times New Roman" w:cs="Times New Roman"/>
+          <w:sz w:val="28"/>
+        </w:rPr>
+        <w:t xml:space="preserve">Ni, C., Wang, W. W., Zheng, Y. C., Ding, J., Cao, K., &amp; Liu, B. (2023). A Millimeter-Wave Antipodal Linearly Tapered Slot Antenna Array for 5G Wireless Communication. </w:t>
+      </w:r>
+      <w:r>
+        <w:rPr>
+          <w:rFonts w:ascii="Times New Roman" w:hAnsi="Times New Roman" w:cs="Times New Roman"/>
+          <w:i/>
+          <w:iCs/>
+          <w:sz w:val="28"/>
+        </w:rPr>
+        <w:t>International Journal of Antennas and Propagation</w:t>
       </w:r>
       <w:r>
         <w:rPr>
@@ -4320,75 +6044,87 @@
           <w:iCs/>
           <w:sz w:val="28"/>
         </w:rPr>
-        <w:t>60</w:t>
-      </w:r>
-      <w:r>
-        <w:rPr>
-          <w:rFonts w:ascii="Times New Roman" w:hAnsi="Times New Roman" w:cs="Times New Roman"/>
-          <w:sz w:val="28"/>
-        </w:rPr>
-        <w:t>(3), 845–860. https://doi.org/10.1109/TMTT.2011.2178427</w:t>
+        <w:t>2023</w:t>
+      </w:r>
+      <w:r>
+        <w:rPr>
+          <w:rFonts w:ascii="Times New Roman" w:hAnsi="Times New Roman" w:cs="Times New Roman"/>
+          <w:sz w:val="28"/>
+        </w:rPr>
+        <w:t>, 1–12. https://doi.org/10.1155/2023/6227251</w:t>
       </w:r>
     </w:p>
     <w:p>
       <w:pPr>
         <w:pStyle w:val="Bibliography"/>
-        <w:spacing w:line="360" w:lineRule="auto"/>
-        <w:jc w:val="both"/>
-        <w:rPr>
-          <w:rFonts w:ascii="Times New Roman" w:hAnsi="Times New Roman" w:cs="Times New Roman"/>
-          <w:sz w:val="28"/>
-        </w:rPr>
-      </w:pPr>
-      <w:r>
-        <w:rPr>
-          <w:rFonts w:ascii="Times New Roman" w:hAnsi="Times New Roman" w:cs="Times New Roman"/>
-          <w:sz w:val="28"/>
-        </w:rPr>
-        <w:t xml:space="preserve">Mahafza, B. R. (2000). </w:t>
-      </w:r>
-      <w:r>
-        <w:rPr>
-          <w:rFonts w:ascii="Times New Roman" w:hAnsi="Times New Roman" w:cs="Times New Roman"/>
-          <w:i/>
-          <w:iCs/>
-          <w:sz w:val="28"/>
-        </w:rPr>
-        <w:t>Radar systems analysis and design using MATLAB</w:t>
-      </w:r>
-      <w:r>
-        <w:rPr>
-          <w:rFonts w:ascii="Times New Roman" w:hAnsi="Times New Roman" w:cs="Times New Roman"/>
-          <w:sz w:val="28"/>
-        </w:rPr>
-        <w:t>. Chapman &amp; Hall/CRC.</w:t>
+        <w:rPr>
+          <w:rFonts w:ascii="Times New Roman" w:hAnsi="Times New Roman" w:cs="Times New Roman"/>
+          <w:sz w:val="28"/>
+        </w:rPr>
+      </w:pPr>
+      <w:r>
+        <w:rPr>
+          <w:rFonts w:ascii="Times New Roman" w:hAnsi="Times New Roman" w:cs="Times New Roman"/>
+          <w:sz w:val="28"/>
+        </w:rPr>
+        <w:t xml:space="preserve">Ohm, S., Kang, E., Lim, T. H., &amp; Choo, H. (2023). Design of a Dual-Polarization All-Metal Vivaldi Array Antenna Using a Metal 3D Printing Method for High-Power Jamming Systems. </w:t>
+      </w:r>
+      <w:r>
+        <w:rPr>
+          <w:rFonts w:ascii="Times New Roman" w:hAnsi="Times New Roman" w:cs="Times New Roman"/>
+          <w:i/>
+          <w:iCs/>
+          <w:sz w:val="28"/>
+        </w:rPr>
+        <w:t>IEEE Access</w:t>
+      </w:r>
+      <w:r>
+        <w:rPr>
+          <w:rFonts w:ascii="Times New Roman" w:hAnsi="Times New Roman" w:cs="Times New Roman"/>
+          <w:sz w:val="28"/>
+        </w:rPr>
+        <w:t xml:space="preserve">, </w:t>
+      </w:r>
+      <w:r>
+        <w:rPr>
+          <w:rFonts w:ascii="Times New Roman" w:hAnsi="Times New Roman" w:cs="Times New Roman"/>
+          <w:i/>
+          <w:iCs/>
+          <w:sz w:val="28"/>
+        </w:rPr>
+        <w:t>11</w:t>
+      </w:r>
+      <w:r>
+        <w:rPr>
+          <w:rFonts w:ascii="Times New Roman" w:hAnsi="Times New Roman" w:cs="Times New Roman"/>
+          <w:sz w:val="28"/>
+        </w:rPr>
+        <w:t>, 35175–35181. https://doi.org/10.1109/ACCESS.2023.3262463</w:t>
       </w:r>
     </w:p>
     <w:p>
       <w:pPr>
         <w:pStyle w:val="Bibliography"/>
-        <w:spacing w:line="360" w:lineRule="auto"/>
-        <w:jc w:val="both"/>
-        <w:rPr>
-          <w:rFonts w:ascii="Times New Roman" w:hAnsi="Times New Roman" w:cs="Times New Roman"/>
-          <w:sz w:val="28"/>
-        </w:rPr>
-      </w:pPr>
-      <w:r>
-        <w:rPr>
-          <w:rFonts w:ascii="Times New Roman" w:hAnsi="Times New Roman" w:cs="Times New Roman"/>
-          <w:sz w:val="28"/>
-        </w:rPr>
-        <w:t xml:space="preserve">Moon-Sik Lee &amp; Yong-Hoon Kim. (2010). Design and Performance of a 24-GHz Switch-Antenna Array FMCW Radar System for Automotive Applications. </w:t>
-      </w:r>
-      <w:r>
-        <w:rPr>
-          <w:rFonts w:ascii="Times New Roman" w:hAnsi="Times New Roman" w:cs="Times New Roman"/>
-          <w:i/>
-          <w:iCs/>
-          <w:sz w:val="28"/>
-        </w:rPr>
-        <w:t>IEEE Transactions on Vehicular Technology</w:t>
+        <w:rPr>
+          <w:rFonts w:ascii="Times New Roman" w:hAnsi="Times New Roman" w:cs="Times New Roman"/>
+          <w:sz w:val="28"/>
+        </w:rPr>
+      </w:pPr>
+      <w:r>
+        <w:rPr>
+          <w:rFonts w:ascii="Times New Roman" w:hAnsi="Times New Roman" w:cs="Times New Roman"/>
+          <w:sz w:val="28"/>
+        </w:rPr>
+        <w:t xml:space="preserve">Patole, S. M., Torlak, M., Wang, D., &amp; Ali, M. (2017). Automotive radars: A review of signal processing techniques. </w:t>
+      </w:r>
+      <w:r>
+        <w:rPr>
+          <w:rFonts w:ascii="Times New Roman" w:hAnsi="Times New Roman" w:cs="Times New Roman"/>
+          <w:i/>
+          <w:iCs/>
+          <w:sz w:val="28"/>
+        </w:rPr>
+        <w:t>IEEE Signal Processing Magazine</w:t>
       </w:r>
       <w:r>
         <w:rPr>
@@ -4404,41 +6140,39 @@
           <w:iCs/>
           <w:sz w:val="28"/>
         </w:rPr>
-        <w:t>59</w:t>
-      </w:r>
-      <w:r>
-        <w:rPr>
-          <w:rFonts w:ascii="Times New Roman" w:hAnsi="Times New Roman" w:cs="Times New Roman"/>
-          <w:sz w:val="28"/>
-        </w:rPr>
-        <w:t>(5), 2290–2297. https://doi.org/10.1109/TVT.2010.2045665</w:t>
+        <w:t>34</w:t>
+      </w:r>
+      <w:r>
+        <w:rPr>
+          <w:rFonts w:ascii="Times New Roman" w:hAnsi="Times New Roman" w:cs="Times New Roman"/>
+          <w:sz w:val="28"/>
+        </w:rPr>
+        <w:t>(2), 22–35. https://doi.org/10.1109/MSP.2016.2628914</w:t>
       </w:r>
     </w:p>
     <w:p>
       <w:pPr>
         <w:pStyle w:val="Bibliography"/>
-        <w:spacing w:line="360" w:lineRule="auto"/>
-        <w:jc w:val="both"/>
-        <w:rPr>
-          <w:rFonts w:ascii="Times New Roman" w:hAnsi="Times New Roman" w:cs="Times New Roman"/>
-          <w:sz w:val="28"/>
-        </w:rPr>
-      </w:pPr>
-      <w:r>
-        <w:rPr>
-          <w:rFonts w:ascii="Times New Roman" w:hAnsi="Times New Roman" w:cs="Times New Roman"/>
-          <w:sz w:val="28"/>
-        </w:rPr>
-        <w:t xml:space="preserve">Ni, C., Wang, W. W., Zheng, Y. C., Ding, J., Cao, K., &amp; Liu, B. (2023). A Millimeter-Wave Antipodal Linearly Tapered Slot Antenna Array for 5G Wireless Communication. </w:t>
-      </w:r>
-      <w:r>
-        <w:rPr>
-          <w:rFonts w:ascii="Times New Roman" w:hAnsi="Times New Roman" w:cs="Times New Roman"/>
-          <w:i/>
-          <w:iCs/>
-          <w:sz w:val="28"/>
-        </w:rPr>
-        <w:t>International Journal of Antennas and Propagation</w:t>
+        <w:rPr>
+          <w:rFonts w:ascii="Times New Roman" w:hAnsi="Times New Roman" w:cs="Times New Roman"/>
+          <w:sz w:val="28"/>
+        </w:rPr>
+      </w:pPr>
+      <w:r>
+        <w:rPr>
+          <w:rFonts w:ascii="Times New Roman" w:hAnsi="Times New Roman" w:cs="Times New Roman"/>
+          <w:sz w:val="28"/>
+        </w:rPr>
+        <w:t xml:space="preserve">Pozar, D. M. (1992). Microstrip Antennas. </w:t>
+      </w:r>
+      <w:r>
+        <w:rPr>
+          <w:rFonts w:ascii="Times New Roman" w:hAnsi="Times New Roman" w:cs="Times New Roman"/>
+          <w:i/>
+          <w:iCs/>
+          <w:sz w:val="28"/>
+        </w:rPr>
+        <w:t>Proceedings of the IEEE</w:t>
       </w:r>
       <w:r>
         <w:rPr>
@@ -4454,41 +6188,168 @@
           <w:iCs/>
           <w:sz w:val="28"/>
         </w:rPr>
-        <w:t>2023</w:t>
-      </w:r>
-      <w:r>
-        <w:rPr>
-          <w:rFonts w:ascii="Times New Roman" w:hAnsi="Times New Roman" w:cs="Times New Roman"/>
-          <w:sz w:val="28"/>
-        </w:rPr>
-        <w:t>, 1–12. https://doi.org/10.1155/2023/6227251</w:t>
+        <w:t>80</w:t>
+      </w:r>
+      <w:r>
+        <w:rPr>
+          <w:rFonts w:ascii="Times New Roman" w:hAnsi="Times New Roman" w:cs="Times New Roman"/>
+          <w:sz w:val="28"/>
+        </w:rPr>
+        <w:t>(1), 79–91. https://doi.org/10.1109/5.119568</w:t>
       </w:r>
     </w:p>
     <w:p>
       <w:pPr>
         <w:pStyle w:val="Bibliography"/>
-        <w:spacing w:line="360" w:lineRule="auto"/>
-        <w:jc w:val="both"/>
-        <w:rPr>
-          <w:rFonts w:ascii="Times New Roman" w:hAnsi="Times New Roman" w:cs="Times New Roman"/>
-          <w:sz w:val="28"/>
-        </w:rPr>
-      </w:pPr>
-      <w:r>
-        <w:rPr>
-          <w:rFonts w:ascii="Times New Roman" w:hAnsi="Times New Roman" w:cs="Times New Roman"/>
-          <w:sz w:val="28"/>
-        </w:rPr>
-        <w:t xml:space="preserve">Ohm, S., Kang, E., Lim, T. H., &amp; Choo, H. (2023). Design of a Dual-Polarization All-Metal Vivaldi Array Antenna Using a Metal 3D Printing Method for High-Power Jamming Systems. </w:t>
-      </w:r>
-      <w:r>
-        <w:rPr>
-          <w:rFonts w:ascii="Times New Roman" w:hAnsi="Times New Roman" w:cs="Times New Roman"/>
-          <w:i/>
-          <w:iCs/>
-          <w:sz w:val="28"/>
-        </w:rPr>
-        <w:t>IEEE Access</w:t>
+        <w:rPr>
+          <w:rFonts w:ascii="Times New Roman" w:hAnsi="Times New Roman" w:cs="Times New Roman"/>
+          <w:sz w:val="28"/>
+        </w:rPr>
+      </w:pPr>
+      <w:r>
+        <w:rPr>
+          <w:rFonts w:ascii="Times New Roman" w:hAnsi="Times New Roman" w:cs="Times New Roman"/>
+          <w:sz w:val="28"/>
+        </w:rPr>
+        <w:t xml:space="preserve">Richards, M. A., Scheer, J. A., &amp; Holm, W. A. (2010). </w:t>
+      </w:r>
+      <w:r>
+        <w:rPr>
+          <w:rFonts w:ascii="Times New Roman" w:hAnsi="Times New Roman" w:cs="Times New Roman"/>
+          <w:i/>
+          <w:iCs/>
+          <w:sz w:val="28"/>
+        </w:rPr>
+        <w:t>Principles of modern radar</w:t>
+      </w:r>
+      <w:r>
+        <w:rPr>
+          <w:rFonts w:ascii="Times New Roman" w:hAnsi="Times New Roman" w:cs="Times New Roman"/>
+          <w:sz w:val="28"/>
+        </w:rPr>
+        <w:t>. SciTech publ.</w:t>
+      </w:r>
+    </w:p>
+    <w:p>
+      <w:pPr>
+        <w:pStyle w:val="Bibliography"/>
+        <w:rPr>
+          <w:rFonts w:ascii="Times New Roman" w:hAnsi="Times New Roman" w:cs="Times New Roman"/>
+          <w:sz w:val="28"/>
+        </w:rPr>
+      </w:pPr>
+      <w:r>
+        <w:rPr>
+          <w:rFonts w:ascii="Times New Roman" w:hAnsi="Times New Roman" w:cs="Times New Roman"/>
+          <w:sz w:val="28"/>
+        </w:rPr>
+        <w:lastRenderedPageBreak/>
+        <w:t xml:space="preserve">Rohde &amp; Schwarz. (2019). </w:t>
+      </w:r>
+      <w:r>
+        <w:rPr>
+          <w:rFonts w:ascii="Times New Roman" w:hAnsi="Times New Roman" w:cs="Times New Roman"/>
+          <w:i/>
+          <w:iCs/>
+          <w:sz w:val="28"/>
+        </w:rPr>
+        <w:t>Automotive Radar Technology and Test Requirements</w:t>
+      </w:r>
+      <w:r>
+        <w:rPr>
+          <w:rFonts w:ascii="Times New Roman" w:hAnsi="Times New Roman" w:cs="Times New Roman"/>
+          <w:sz w:val="28"/>
+        </w:rPr>
+        <w:t xml:space="preserve"> [White Paper].</w:t>
+      </w:r>
+    </w:p>
+    <w:p>
+      <w:pPr>
+        <w:pStyle w:val="Bibliography"/>
+        <w:rPr>
+          <w:rFonts w:ascii="Times New Roman" w:hAnsi="Times New Roman" w:cs="Times New Roman"/>
+          <w:sz w:val="28"/>
+        </w:rPr>
+      </w:pPr>
+      <w:r>
+        <w:rPr>
+          <w:rFonts w:ascii="Times New Roman" w:hAnsi="Times New Roman" w:cs="Times New Roman"/>
+          <w:sz w:val="28"/>
+        </w:rPr>
+        <w:t xml:space="preserve">Shen, J., Xu, Z., &amp; Zheng, T. (2010). Design and mutual coupling analysis on wideband wide-angle scan step-constant tapered slot antenna array. </w:t>
+      </w:r>
+      <w:r>
+        <w:rPr>
+          <w:rFonts w:ascii="Times New Roman" w:hAnsi="Times New Roman" w:cs="Times New Roman"/>
+          <w:i/>
+          <w:iCs/>
+          <w:sz w:val="28"/>
+        </w:rPr>
+        <w:t>2010 IEEE International Conference on Ultra-Wideband</w:t>
+      </w:r>
+      <w:r>
+        <w:rPr>
+          <w:rFonts w:ascii="Times New Roman" w:hAnsi="Times New Roman" w:cs="Times New Roman"/>
+          <w:sz w:val="28"/>
+        </w:rPr>
+        <w:t>, 1–4. https://doi.org/10.1109/ICUWB.2010.5614085</w:t>
+      </w:r>
+    </w:p>
+    <w:p>
+      <w:pPr>
+        <w:pStyle w:val="Bibliography"/>
+        <w:rPr>
+          <w:rFonts w:ascii="Times New Roman" w:hAnsi="Times New Roman" w:cs="Times New Roman"/>
+          <w:sz w:val="28"/>
+        </w:rPr>
+      </w:pPr>
+      <w:r>
+        <w:rPr>
+          <w:rFonts w:ascii="Times New Roman" w:hAnsi="Times New Roman" w:cs="Times New Roman"/>
+          <w:sz w:val="28"/>
+        </w:rPr>
+        <w:t xml:space="preserve">Skolnik, M. I. (1986). </w:t>
+      </w:r>
+      <w:r>
+        <w:rPr>
+          <w:rFonts w:ascii="Times New Roman" w:hAnsi="Times New Roman" w:cs="Times New Roman"/>
+          <w:i/>
+          <w:iCs/>
+          <w:sz w:val="28"/>
+        </w:rPr>
+        <w:t>Introduction to radar systems: International student edition</w:t>
+      </w:r>
+      <w:r>
+        <w:rPr>
+          <w:rFonts w:ascii="Times New Roman" w:hAnsi="Times New Roman" w:cs="Times New Roman"/>
+          <w:sz w:val="28"/>
+        </w:rPr>
+        <w:t xml:space="preserve"> (2nd ed., 9th print). McGraw-Hill.</w:t>
+      </w:r>
+    </w:p>
+    <w:p>
+      <w:pPr>
+        <w:pStyle w:val="Bibliography"/>
+        <w:rPr>
+          <w:rFonts w:ascii="Times New Roman" w:hAnsi="Times New Roman" w:cs="Times New Roman"/>
+          <w:sz w:val="28"/>
+        </w:rPr>
+      </w:pPr>
+      <w:r>
+        <w:rPr>
+          <w:rFonts w:ascii="Times New Roman" w:hAnsi="Times New Roman" w:cs="Times New Roman"/>
+          <w:sz w:val="28"/>
+        </w:rPr>
+        <w:t xml:space="preserve">Tseng, V., &amp; Chang, C.-Y. (2019). Linear Tapered Slot Antenna for Ultra-Wideband Radar Sensor: Design Consideration and Recommendation. </w:t>
+      </w:r>
+      <w:r>
+        <w:rPr>
+          <w:rFonts w:ascii="Times New Roman" w:hAnsi="Times New Roman" w:cs="Times New Roman"/>
+          <w:i/>
+          <w:iCs/>
+          <w:sz w:val="28"/>
+        </w:rPr>
+        <w:t>Sensors</w:t>
       </w:r>
       <w:r>
         <w:rPr>
@@ -4504,21 +6365,156 @@
           <w:iCs/>
           <w:sz w:val="28"/>
         </w:rPr>
-        <w:t>11</w:t>
-      </w:r>
-      <w:r>
-        <w:rPr>
-          <w:rFonts w:ascii="Times New Roman" w:hAnsi="Times New Roman" w:cs="Times New Roman"/>
-          <w:sz w:val="28"/>
-        </w:rPr>
-        <w:t>, 35175–35181. https://doi.org/10.1109/ACCESS.2023.3262463</w:t>
+        <w:t>19</w:t>
+      </w:r>
+      <w:r>
+        <w:rPr>
+          <w:rFonts w:ascii="Times New Roman" w:hAnsi="Times New Roman" w:cs="Times New Roman"/>
+          <w:sz w:val="28"/>
+        </w:rPr>
+        <w:t>(5), 1212. https://doi.org/10.3390/s19051212</w:t>
       </w:r>
     </w:p>
     <w:p>
       <w:pPr>
         <w:pStyle w:val="Bibliography"/>
-        <w:spacing w:line="360" w:lineRule="auto"/>
-        <w:jc w:val="both"/>
+        <w:rPr>
+          <w:rFonts w:ascii="Times New Roman" w:hAnsi="Times New Roman" w:cs="Times New Roman"/>
+          <w:sz w:val="28"/>
+        </w:rPr>
+      </w:pPr>
+      <w:proofErr w:type="spellStart"/>
+      <w:r>
+        <w:rPr>
+          <w:rFonts w:ascii="Times New Roman" w:hAnsi="Times New Roman" w:cs="Times New Roman"/>
+          <w:sz w:val="28"/>
+        </w:rPr>
+        <w:t>Viadero</w:t>
+      </w:r>
+      <w:proofErr w:type="spellEnd"/>
+      <w:r>
+        <w:rPr>
+          <w:rFonts w:ascii="Times New Roman" w:hAnsi="Times New Roman" w:cs="Times New Roman"/>
+          <w:sz w:val="28"/>
+        </w:rPr>
+        <w:t>-Monasterio, F., Alonso-</w:t>
+      </w:r>
+      <w:proofErr w:type="spellStart"/>
+      <w:r>
+        <w:rPr>
+          <w:rFonts w:ascii="Times New Roman" w:hAnsi="Times New Roman" w:cs="Times New Roman"/>
+          <w:sz w:val="28"/>
+        </w:rPr>
+        <w:t>Rentería</w:t>
+      </w:r>
+      <w:proofErr w:type="spellEnd"/>
+      <w:r>
+        <w:rPr>
+          <w:rFonts w:ascii="Times New Roman" w:hAnsi="Times New Roman" w:cs="Times New Roman"/>
+          <w:sz w:val="28"/>
+        </w:rPr>
+        <w:t xml:space="preserve">, L., Pérez-Oria, J., &amp; </w:t>
+      </w:r>
+      <w:proofErr w:type="spellStart"/>
+      <w:r>
+        <w:rPr>
+          <w:rFonts w:ascii="Times New Roman" w:hAnsi="Times New Roman" w:cs="Times New Roman"/>
+          <w:sz w:val="28"/>
+        </w:rPr>
+        <w:t>Viadero</w:t>
+      </w:r>
+      <w:proofErr w:type="spellEnd"/>
+      <w:r>
+        <w:rPr>
+          <w:rFonts w:ascii="Times New Roman" w:hAnsi="Times New Roman" w:cs="Times New Roman"/>
+          <w:sz w:val="28"/>
+        </w:rPr>
+        <w:t xml:space="preserve">-Rueda, F. (2024). Radar-Based Pedestrian and Vehicle Detection and Identification for Driving Assistance. </w:t>
+      </w:r>
+      <w:r>
+        <w:rPr>
+          <w:rFonts w:ascii="Times New Roman" w:hAnsi="Times New Roman" w:cs="Times New Roman"/>
+          <w:i/>
+          <w:iCs/>
+          <w:sz w:val="28"/>
+        </w:rPr>
+        <w:t>Vehicles</w:t>
+      </w:r>
+      <w:r>
+        <w:rPr>
+          <w:rFonts w:ascii="Times New Roman" w:hAnsi="Times New Roman" w:cs="Times New Roman"/>
+          <w:sz w:val="28"/>
+        </w:rPr>
+        <w:t xml:space="preserve">, </w:t>
+      </w:r>
+      <w:r>
+        <w:rPr>
+          <w:rFonts w:ascii="Times New Roman" w:hAnsi="Times New Roman" w:cs="Times New Roman"/>
+          <w:i/>
+          <w:iCs/>
+          <w:sz w:val="28"/>
+        </w:rPr>
+        <w:t>6</w:t>
+      </w:r>
+      <w:r>
+        <w:rPr>
+          <w:rFonts w:ascii="Times New Roman" w:hAnsi="Times New Roman" w:cs="Times New Roman"/>
+          <w:sz w:val="28"/>
+        </w:rPr>
+        <w:t>(3), 1185–1199. https://doi.org/10.3390/vehicles6030056</w:t>
+      </w:r>
+    </w:p>
+    <w:p>
+      <w:pPr>
+        <w:pStyle w:val="Bibliography"/>
+        <w:rPr>
+          <w:rFonts w:ascii="Times New Roman" w:hAnsi="Times New Roman" w:cs="Times New Roman"/>
+          <w:sz w:val="28"/>
+        </w:rPr>
+      </w:pPr>
+      <w:r>
+        <w:rPr>
+          <w:rFonts w:ascii="Times New Roman" w:hAnsi="Times New Roman" w:cs="Times New Roman"/>
+          <w:sz w:val="28"/>
+        </w:rPr>
+        <w:t xml:space="preserve">Waldschmidt, C., Hasch, J., &amp; Menzel, W. (2021). Automotive Radar—From First Efforts to Future Systems. </w:t>
+      </w:r>
+      <w:r>
+        <w:rPr>
+          <w:rFonts w:ascii="Times New Roman" w:hAnsi="Times New Roman" w:cs="Times New Roman"/>
+          <w:i/>
+          <w:iCs/>
+          <w:sz w:val="28"/>
+        </w:rPr>
+        <w:t>IEEE Journal of Microwaves</w:t>
+      </w:r>
+      <w:r>
+        <w:rPr>
+          <w:rFonts w:ascii="Times New Roman" w:hAnsi="Times New Roman" w:cs="Times New Roman"/>
+          <w:sz w:val="28"/>
+        </w:rPr>
+        <w:t xml:space="preserve">, </w:t>
+      </w:r>
+      <w:r>
+        <w:rPr>
+          <w:rFonts w:ascii="Times New Roman" w:hAnsi="Times New Roman" w:cs="Times New Roman"/>
+          <w:i/>
+          <w:iCs/>
+          <w:sz w:val="28"/>
+        </w:rPr>
+        <w:t>1</w:t>
+      </w:r>
+      <w:r>
+        <w:rPr>
+          <w:rFonts w:ascii="Times New Roman" w:hAnsi="Times New Roman" w:cs="Times New Roman"/>
+          <w:sz w:val="28"/>
+        </w:rPr>
+        <w:t>(1), 135–148. https://doi.org/10.1109/JMW.2020.3033616</w:t>
+      </w:r>
+    </w:p>
+    <w:p>
+      <w:pPr>
+        <w:pStyle w:val="Bibliography"/>
         <w:rPr>
           <w:rFonts w:ascii="Times New Roman" w:hAnsi="Times New Roman" w:cs="Times New Roman"/>
           <w:sz w:val="28"/>
@@ -4530,16 +6526,96 @@
           <w:sz w:val="28"/>
         </w:rPr>
         <w:lastRenderedPageBreak/>
-        <w:t xml:space="preserve">Patole, S. M., Torlak, M., Wang, D., &amp; Ali, M. (2017). Automotive radars: A review of signal processing techniques. </w:t>
-      </w:r>
-      <w:r>
-        <w:rPr>
-          <w:rFonts w:ascii="Times New Roman" w:hAnsi="Times New Roman" w:cs="Times New Roman"/>
-          <w:i/>
-          <w:iCs/>
-          <w:sz w:val="28"/>
-        </w:rPr>
-        <w:t>IEEE Signal Processing Magazine</w:t>
+        <w:t xml:space="preserve">Wong, K. (2002). </w:t>
+      </w:r>
+      <w:r>
+        <w:rPr>
+          <w:rFonts w:ascii="Times New Roman" w:hAnsi="Times New Roman" w:cs="Times New Roman"/>
+          <w:i/>
+          <w:iCs/>
+          <w:sz w:val="28"/>
+        </w:rPr>
+        <w:t>Compact and Broadband Microstrip Antennas</w:t>
+      </w:r>
+      <w:r>
+        <w:rPr>
+          <w:rFonts w:ascii="Times New Roman" w:hAnsi="Times New Roman" w:cs="Times New Roman"/>
+          <w:sz w:val="28"/>
+        </w:rPr>
+        <w:t xml:space="preserve"> (1 ed.). Wiley. https://doi.org/10.1002/0471221112</w:t>
+      </w:r>
+    </w:p>
+    <w:p>
+      <w:pPr>
+        <w:pStyle w:val="Bibliography"/>
+        <w:rPr>
+          <w:rFonts w:ascii="Times New Roman" w:hAnsi="Times New Roman" w:cs="Times New Roman"/>
+          <w:sz w:val="28"/>
+        </w:rPr>
+      </w:pPr>
+      <w:r>
+        <w:rPr>
+          <w:rFonts w:ascii="Times New Roman" w:hAnsi="Times New Roman" w:cs="Times New Roman"/>
+          <w:sz w:val="28"/>
+        </w:rPr>
+        <w:t xml:space="preserve">Wood, I., </w:t>
+      </w:r>
+      <w:proofErr w:type="spellStart"/>
+      <w:r>
+        <w:rPr>
+          <w:rFonts w:ascii="Times New Roman" w:hAnsi="Times New Roman" w:cs="Times New Roman"/>
+          <w:sz w:val="28"/>
+        </w:rPr>
+        <w:t>Dousset</w:t>
+      </w:r>
+      <w:proofErr w:type="spellEnd"/>
+      <w:r>
+        <w:rPr>
+          <w:rFonts w:ascii="Times New Roman" w:hAnsi="Times New Roman" w:cs="Times New Roman"/>
+          <w:sz w:val="28"/>
+        </w:rPr>
+        <w:t xml:space="preserve">, D., Bornemann, J., &amp; Claude, S. (2007). Linear tapered slot antenna with substrate integrated waveguide feed. </w:t>
+      </w:r>
+      <w:r>
+        <w:rPr>
+          <w:rFonts w:ascii="Times New Roman" w:hAnsi="Times New Roman" w:cs="Times New Roman"/>
+          <w:i/>
+          <w:iCs/>
+          <w:sz w:val="28"/>
+        </w:rPr>
+        <w:t>2007 IEEE Antennas and Propagation Society International Symposium</w:t>
+      </w:r>
+      <w:r>
+        <w:rPr>
+          <w:rFonts w:ascii="Times New Roman" w:hAnsi="Times New Roman" w:cs="Times New Roman"/>
+          <w:sz w:val="28"/>
+        </w:rPr>
+        <w:t>, 4761–4764. https://doi.org/10.1109/APS.2007.4396608</w:t>
+      </w:r>
+    </w:p>
+    <w:p>
+      <w:pPr>
+        <w:pStyle w:val="Bibliography"/>
+        <w:rPr>
+          <w:rFonts w:ascii="Times New Roman" w:hAnsi="Times New Roman" w:cs="Times New Roman"/>
+          <w:sz w:val="28"/>
+        </w:rPr>
+      </w:pPr>
+      <w:r>
+        <w:rPr>
+          <w:rFonts w:ascii="Times New Roman" w:hAnsi="Times New Roman" w:cs="Times New Roman"/>
+          <w:sz w:val="28"/>
+        </w:rPr>
+        <w:t xml:space="preserve">Yao, S., Guan, R., Peng, Z., Xu, C., Shi, Y., Ding, W., Lim, E. G., Yue, Y., Seo, H., Man, K. L., Ma, J., Zhu, X., &amp; Yue, Y. (2025). Exploring Radar Data Representations in Autonomous Driving: A Comprehensive Review. </w:t>
+      </w:r>
+      <w:r>
+        <w:rPr>
+          <w:rFonts w:ascii="Times New Roman" w:hAnsi="Times New Roman" w:cs="Times New Roman"/>
+          <w:i/>
+          <w:iCs/>
+          <w:sz w:val="28"/>
+        </w:rPr>
+        <w:t>IEEE Transactions on Intelligent Transportation Systems</w:t>
       </w:r>
       <w:r>
         <w:rPr>
@@ -4555,109 +6631,166 @@
           <w:iCs/>
           <w:sz w:val="28"/>
         </w:rPr>
-        <w:t>34</w:t>
-      </w:r>
-      <w:r>
-        <w:rPr>
-          <w:rFonts w:ascii="Times New Roman" w:hAnsi="Times New Roman" w:cs="Times New Roman"/>
-          <w:sz w:val="28"/>
-        </w:rPr>
-        <w:t>(2), 22–35. https://doi.org/10.1109/MSP.2016.2628914</w:t>
+        <w:t>26</w:t>
+      </w:r>
+      <w:r>
+        <w:rPr>
+          <w:rFonts w:ascii="Times New Roman" w:hAnsi="Times New Roman" w:cs="Times New Roman"/>
+          <w:sz w:val="28"/>
+        </w:rPr>
+        <w:t>(6), 7401–7425. https://doi.org/10.1109/TITS.2025.3554781</w:t>
       </w:r>
     </w:p>
     <w:p>
       <w:pPr>
         <w:pStyle w:val="Bibliography"/>
-        <w:spacing w:line="360" w:lineRule="auto"/>
-        <w:jc w:val="both"/>
-        <w:rPr>
-          <w:rFonts w:ascii="Times New Roman" w:hAnsi="Times New Roman" w:cs="Times New Roman"/>
-          <w:sz w:val="28"/>
-        </w:rPr>
-      </w:pPr>
-      <w:r>
-        <w:rPr>
-          <w:rFonts w:ascii="Times New Roman" w:hAnsi="Times New Roman" w:cs="Times New Roman"/>
-          <w:sz w:val="28"/>
-        </w:rPr>
-        <w:t xml:space="preserve">Shen, J., Xu, Z., &amp; Zheng, T. (2010). Design and mutual coupling analysis on wideband wide-angle scan step-constant tapered slot antenna array. </w:t>
-      </w:r>
-      <w:r>
-        <w:rPr>
-          <w:rFonts w:ascii="Times New Roman" w:hAnsi="Times New Roman" w:cs="Times New Roman"/>
-          <w:i/>
-          <w:iCs/>
-          <w:sz w:val="28"/>
-        </w:rPr>
-        <w:t>2010 IEEE International Conference on Ultra-Wideband</w:t>
-      </w:r>
-      <w:r>
-        <w:rPr>
-          <w:rFonts w:ascii="Times New Roman" w:hAnsi="Times New Roman" w:cs="Times New Roman"/>
-          <w:sz w:val="28"/>
-        </w:rPr>
-        <w:t>, 1–4. https://doi.org/10.1109/ICUWB.2010.5614085</w:t>
+        <w:rPr>
+          <w:rFonts w:ascii="Times New Roman" w:hAnsi="Times New Roman" w:cs="Times New Roman"/>
+          <w:sz w:val="28"/>
+          <w:lang w:val="sv-SE"/>
+        </w:rPr>
+      </w:pPr>
+      <w:r>
+        <w:rPr>
+          <w:rFonts w:ascii="Times New Roman" w:hAnsi="Times New Roman" w:cs="Times New Roman"/>
+          <w:sz w:val="28"/>
+        </w:rPr>
+        <w:t xml:space="preserve">Yeong, D. J., Velasco-Hernandez, G., Barry, J., &amp; Walsh, J. (2021). Sensor and Sensor Fusion Technology in Autonomous Vehicles: A Review. </w:t>
+      </w:r>
+      <w:r>
+        <w:rPr>
+          <w:rFonts w:ascii="Times New Roman" w:hAnsi="Times New Roman" w:cs="Times New Roman"/>
+          <w:i/>
+          <w:iCs/>
+          <w:sz w:val="28"/>
+          <w:lang w:val="sv-SE"/>
+        </w:rPr>
+        <w:t>Sensors</w:t>
+      </w:r>
+      <w:r>
+        <w:rPr>
+          <w:rFonts w:ascii="Times New Roman" w:hAnsi="Times New Roman" w:cs="Times New Roman"/>
+          <w:sz w:val="28"/>
+          <w:lang w:val="sv-SE"/>
+        </w:rPr>
+        <w:t xml:space="preserve">, </w:t>
+      </w:r>
+      <w:r>
+        <w:rPr>
+          <w:rFonts w:ascii="Times New Roman" w:hAnsi="Times New Roman" w:cs="Times New Roman"/>
+          <w:i/>
+          <w:iCs/>
+          <w:sz w:val="28"/>
+          <w:lang w:val="sv-SE"/>
+        </w:rPr>
+        <w:t>21</w:t>
+      </w:r>
+      <w:r>
+        <w:rPr>
+          <w:rFonts w:ascii="Times New Roman" w:hAnsi="Times New Roman" w:cs="Times New Roman"/>
+          <w:sz w:val="28"/>
+          <w:lang w:val="sv-SE"/>
+        </w:rPr>
+        <w:t>(6), 2140. https://doi.org/10.3390/s21062140</w:t>
       </w:r>
     </w:p>
     <w:p>
       <w:pPr>
         <w:pStyle w:val="Bibliography"/>
-        <w:spacing w:line="360" w:lineRule="auto"/>
-        <w:jc w:val="both"/>
-        <w:rPr>
-          <w:rFonts w:ascii="Times New Roman" w:hAnsi="Times New Roman" w:cs="Times New Roman"/>
-          <w:sz w:val="28"/>
-        </w:rPr>
-      </w:pPr>
-      <w:r>
-        <w:rPr>
-          <w:rFonts w:ascii="Times New Roman" w:hAnsi="Times New Roman" w:cs="Times New Roman"/>
-          <w:sz w:val="28"/>
-        </w:rPr>
-        <w:t xml:space="preserve">Skolnik, M. I. (1986). </w:t>
-      </w:r>
-      <w:r>
-        <w:rPr>
-          <w:rFonts w:ascii="Times New Roman" w:hAnsi="Times New Roman" w:cs="Times New Roman"/>
-          <w:i/>
-          <w:iCs/>
-          <w:sz w:val="28"/>
-        </w:rPr>
-        <w:t>Introduction to radar systems: International student edition</w:t>
-      </w:r>
-      <w:r>
-        <w:rPr>
-          <w:rFonts w:ascii="Times New Roman" w:hAnsi="Times New Roman" w:cs="Times New Roman"/>
-          <w:sz w:val="28"/>
-        </w:rPr>
-        <w:t xml:space="preserve"> (2nd ed., 9th print). McGraw-Hill.</w:t>
+        <w:rPr>
+          <w:rFonts w:ascii="Times New Roman" w:hAnsi="Times New Roman" w:cs="Times New Roman"/>
+          <w:sz w:val="28"/>
+        </w:rPr>
+      </w:pPr>
+      <w:r>
+        <w:rPr>
+          <w:rFonts w:ascii="Times New Roman" w:hAnsi="Times New Roman" w:cs="Times New Roman"/>
+          <w:sz w:val="28"/>
+          <w:lang w:val="sv-SE"/>
+        </w:rPr>
+        <w:t xml:space="preserve">Yngvesson, K. S., Korzeniowski, T. L., Kim, Y.-S., Kollberg, E. L., &amp; Johansson, J. F. (1989). </w:t>
+      </w:r>
+      <w:r>
+        <w:rPr>
+          <w:rFonts w:ascii="Times New Roman" w:hAnsi="Times New Roman" w:cs="Times New Roman"/>
+          <w:sz w:val="28"/>
+        </w:rPr>
+        <w:t xml:space="preserve">The tapered slot antenna-a new integrated element for millimeter-wave applications. </w:t>
+      </w:r>
+      <w:r>
+        <w:rPr>
+          <w:rFonts w:ascii="Times New Roman" w:hAnsi="Times New Roman" w:cs="Times New Roman"/>
+          <w:i/>
+          <w:iCs/>
+          <w:sz w:val="28"/>
+        </w:rPr>
+        <w:t xml:space="preserve">IEEE </w:t>
+      </w:r>
+      <w:r>
+        <w:rPr>
+          <w:rFonts w:ascii="Times New Roman" w:hAnsi="Times New Roman" w:cs="Times New Roman"/>
+          <w:i/>
+          <w:iCs/>
+          <w:sz w:val="28"/>
+        </w:rPr>
+        <w:lastRenderedPageBreak/>
+        <w:t>Transactions on Microwave Theory and Techniques</w:t>
+      </w:r>
+      <w:r>
+        <w:rPr>
+          <w:rFonts w:ascii="Times New Roman" w:hAnsi="Times New Roman" w:cs="Times New Roman"/>
+          <w:sz w:val="28"/>
+        </w:rPr>
+        <w:t xml:space="preserve">, </w:t>
+      </w:r>
+      <w:r>
+        <w:rPr>
+          <w:rFonts w:ascii="Times New Roman" w:hAnsi="Times New Roman" w:cs="Times New Roman"/>
+          <w:i/>
+          <w:iCs/>
+          <w:sz w:val="28"/>
+        </w:rPr>
+        <w:t>37</w:t>
+      </w:r>
+      <w:r>
+        <w:rPr>
+          <w:rFonts w:ascii="Times New Roman" w:hAnsi="Times New Roman" w:cs="Times New Roman"/>
+          <w:sz w:val="28"/>
+        </w:rPr>
+        <w:t>(2), 365–374. https://doi.org/10.1109/22.20062</w:t>
       </w:r>
     </w:p>
     <w:p>
       <w:pPr>
         <w:pStyle w:val="Bibliography"/>
-        <w:spacing w:line="360" w:lineRule="auto"/>
-        <w:jc w:val="both"/>
-        <w:rPr>
-          <w:rFonts w:ascii="Times New Roman" w:hAnsi="Times New Roman" w:cs="Times New Roman"/>
-          <w:sz w:val="28"/>
-        </w:rPr>
-      </w:pPr>
-      <w:r>
-        <w:rPr>
-          <w:rFonts w:ascii="Times New Roman" w:hAnsi="Times New Roman" w:cs="Times New Roman"/>
-          <w:sz w:val="28"/>
-        </w:rPr>
-        <w:t xml:space="preserve">Tseng, V., &amp; Chang, C.-Y. (2019). Linear Tapered Slot Antenna for Ultra-Wideband Radar Sensor: Design Consideration and Recommendation. </w:t>
-      </w:r>
-      <w:r>
-        <w:rPr>
-          <w:rFonts w:ascii="Times New Roman" w:hAnsi="Times New Roman" w:cs="Times New Roman"/>
-          <w:i/>
-          <w:iCs/>
-          <w:sz w:val="28"/>
-        </w:rPr>
-        <w:t>Sensors</w:t>
+        <w:rPr>
+          <w:rFonts w:ascii="Times New Roman" w:hAnsi="Times New Roman" w:cs="Times New Roman"/>
+          <w:sz w:val="28"/>
+        </w:rPr>
+      </w:pPr>
+      <w:r>
+        <w:rPr>
+          <w:rFonts w:ascii="Times New Roman" w:hAnsi="Times New Roman" w:cs="Times New Roman"/>
+          <w:sz w:val="28"/>
+          <w:lang w:val="sv-SE"/>
+        </w:rPr>
+        <w:t xml:space="preserve">Zakeri, H., Parvaneh, M., Moradi, G., Alibakhshikenari, M., Virdee, B. S., &amp; Dalarsson, M. (2026). </w:t>
+      </w:r>
+      <w:r>
+        <w:rPr>
+          <w:rFonts w:ascii="Times New Roman" w:hAnsi="Times New Roman" w:cs="Times New Roman"/>
+          <w:sz w:val="28"/>
+        </w:rPr>
+        <w:t xml:space="preserve">Array antenna with series-fed configuration providing high radiation performances for automotive radar in IoT applications. </w:t>
+      </w:r>
+      <w:r>
+        <w:rPr>
+          <w:rFonts w:ascii="Times New Roman" w:hAnsi="Times New Roman" w:cs="Times New Roman"/>
+          <w:i/>
+          <w:iCs/>
+          <w:sz w:val="28"/>
+        </w:rPr>
+        <w:t>Scientific Reports</w:t>
       </w:r>
       <w:r>
         <w:rPr>
@@ -4673,276 +6806,46 @@
           <w:iCs/>
           <w:sz w:val="28"/>
         </w:rPr>
-        <w:t>19</w:t>
-      </w:r>
-      <w:r>
-        <w:rPr>
-          <w:rFonts w:ascii="Times New Roman" w:hAnsi="Times New Roman" w:cs="Times New Roman"/>
-          <w:sz w:val="28"/>
-        </w:rPr>
-        <w:t>(5), 1212. https://doi.org/10.3390/s19051212</w:t>
+        <w:t>16</w:t>
+      </w:r>
+      <w:r>
+        <w:rPr>
+          <w:rFonts w:ascii="Times New Roman" w:hAnsi="Times New Roman" w:cs="Times New Roman"/>
+          <w:sz w:val="28"/>
+        </w:rPr>
+        <w:t>(1), 11116. https://doi.org/10.1038/s41598-026-40981-x</w:t>
       </w:r>
     </w:p>
     <w:p>
       <w:pPr>
         <w:pStyle w:val="Bibliography"/>
-        <w:spacing w:line="360" w:lineRule="auto"/>
-        <w:jc w:val="both"/>
-        <w:rPr>
-          <w:rFonts w:ascii="Times New Roman" w:hAnsi="Times New Roman" w:cs="Times New Roman"/>
-          <w:sz w:val="28"/>
-        </w:rPr>
-      </w:pPr>
-      <w:r>
-        <w:rPr>
-          <w:rFonts w:ascii="Times New Roman" w:hAnsi="Times New Roman" w:cs="Times New Roman"/>
-          <w:sz w:val="28"/>
-        </w:rPr>
-        <w:t xml:space="preserve">Viadero-Monasterio, F., Alonso-Rentería, L., Pérez-Oria, J., &amp; Viadero-Rueda, F. (2024). Radar-Based Pedestrian and Vehicle Detection and Identification for Driving Assistance. </w:t>
-      </w:r>
-      <w:r>
-        <w:rPr>
-          <w:rFonts w:ascii="Times New Roman" w:hAnsi="Times New Roman" w:cs="Times New Roman"/>
-          <w:i/>
-          <w:iCs/>
-          <w:sz w:val="28"/>
-        </w:rPr>
-        <w:t>Vehicles</w:t>
-      </w:r>
-      <w:r>
-        <w:rPr>
-          <w:rFonts w:ascii="Times New Roman" w:hAnsi="Times New Roman" w:cs="Times New Roman"/>
-          <w:sz w:val="28"/>
-        </w:rPr>
-        <w:t xml:space="preserve">, </w:t>
-      </w:r>
-      <w:r>
-        <w:rPr>
-          <w:rFonts w:ascii="Times New Roman" w:hAnsi="Times New Roman" w:cs="Times New Roman"/>
-          <w:i/>
-          <w:iCs/>
-          <w:sz w:val="28"/>
-        </w:rPr>
-        <w:t>6</w:t>
-      </w:r>
-      <w:r>
-        <w:rPr>
-          <w:rFonts w:ascii="Times New Roman" w:hAnsi="Times New Roman" w:cs="Times New Roman"/>
-          <w:sz w:val="28"/>
-        </w:rPr>
-        <w:t>(3), 1185–1199. https://doi.org/10.3390/vehicles6030056</w:t>
-      </w:r>
-    </w:p>
-    <w:p>
-      <w:pPr>
-        <w:pStyle w:val="Bibliography"/>
-        <w:spacing w:line="360" w:lineRule="auto"/>
-        <w:jc w:val="both"/>
-        <w:rPr>
-          <w:rFonts w:ascii="Times New Roman" w:hAnsi="Times New Roman" w:cs="Times New Roman"/>
-          <w:sz w:val="28"/>
-        </w:rPr>
-      </w:pPr>
-      <w:r>
-        <w:rPr>
-          <w:rFonts w:ascii="Times New Roman" w:hAnsi="Times New Roman" w:cs="Times New Roman"/>
-          <w:sz w:val="28"/>
-        </w:rPr>
-        <w:t xml:space="preserve">Waldschmidt, C., Hasch, J., &amp; Menzel, W. (2021). Automotive Radar—From First Efforts to Future Systems. </w:t>
-      </w:r>
-      <w:r>
-        <w:rPr>
-          <w:rFonts w:ascii="Times New Roman" w:hAnsi="Times New Roman" w:cs="Times New Roman"/>
-          <w:i/>
-          <w:iCs/>
-          <w:sz w:val="28"/>
-        </w:rPr>
-        <w:t>IEEE Journal of Microwaves</w:t>
-      </w:r>
-      <w:r>
-        <w:rPr>
-          <w:rFonts w:ascii="Times New Roman" w:hAnsi="Times New Roman" w:cs="Times New Roman"/>
-          <w:sz w:val="28"/>
-        </w:rPr>
-        <w:t xml:space="preserve">, </w:t>
-      </w:r>
-      <w:r>
-        <w:rPr>
-          <w:rFonts w:ascii="Times New Roman" w:hAnsi="Times New Roman" w:cs="Times New Roman"/>
-          <w:i/>
-          <w:iCs/>
-          <w:sz w:val="28"/>
-        </w:rPr>
-        <w:t>1</w:t>
-      </w:r>
-      <w:r>
-        <w:rPr>
-          <w:rFonts w:ascii="Times New Roman" w:hAnsi="Times New Roman" w:cs="Times New Roman"/>
-          <w:sz w:val="28"/>
-        </w:rPr>
-        <w:t>(1), 135–148. https://doi.org/10.1109/JMW.2020.3033616</w:t>
-      </w:r>
-    </w:p>
-    <w:p>
-      <w:pPr>
-        <w:pStyle w:val="Bibliography"/>
-        <w:spacing w:line="360" w:lineRule="auto"/>
-        <w:jc w:val="both"/>
-        <w:rPr>
-          <w:rFonts w:ascii="Times New Roman" w:hAnsi="Times New Roman" w:cs="Times New Roman"/>
-          <w:sz w:val="28"/>
-        </w:rPr>
-      </w:pPr>
-      <w:r>
-        <w:rPr>
-          <w:rFonts w:ascii="Times New Roman" w:hAnsi="Times New Roman" w:cs="Times New Roman"/>
-          <w:sz w:val="28"/>
-        </w:rPr>
-        <w:t xml:space="preserve">Wood, I., Dousset, D., Bornemann, J., &amp; Claude, S. (2007). Linear tapered slot antenna with substrate integrated waveguide feed. </w:t>
-      </w:r>
-      <w:r>
-        <w:rPr>
-          <w:rFonts w:ascii="Times New Roman" w:hAnsi="Times New Roman" w:cs="Times New Roman"/>
-          <w:i/>
-          <w:iCs/>
-          <w:sz w:val="28"/>
-        </w:rPr>
-        <w:t xml:space="preserve">2007 IEEE Antennas and Propagation Society International </w:t>
-      </w:r>
-      <w:r>
-        <w:rPr>
-          <w:rFonts w:ascii="Times New Roman" w:hAnsi="Times New Roman" w:cs="Times New Roman"/>
-          <w:i/>
-          <w:iCs/>
-          <w:sz w:val="28"/>
-        </w:rPr>
-        <w:lastRenderedPageBreak/>
-        <w:t>Symposium</w:t>
-      </w:r>
-      <w:r>
-        <w:rPr>
-          <w:rFonts w:ascii="Times New Roman" w:hAnsi="Times New Roman" w:cs="Times New Roman"/>
-          <w:sz w:val="28"/>
-        </w:rPr>
-        <w:t>, 4761–4764. https://doi.org/10.1109/APS.2007.4396608</w:t>
-      </w:r>
-    </w:p>
-    <w:p>
-      <w:pPr>
-        <w:pStyle w:val="Bibliography"/>
-        <w:spacing w:line="360" w:lineRule="auto"/>
-        <w:jc w:val="both"/>
-        <w:rPr>
-          <w:rFonts w:ascii="Times New Roman" w:hAnsi="Times New Roman" w:cs="Times New Roman"/>
-          <w:sz w:val="28"/>
-        </w:rPr>
-      </w:pPr>
-      <w:r>
-        <w:rPr>
-          <w:rFonts w:ascii="Times New Roman" w:hAnsi="Times New Roman" w:cs="Times New Roman"/>
-          <w:sz w:val="28"/>
-        </w:rPr>
-        <w:t xml:space="preserve">Yao, S., Guan, R., Peng, Z., Xu, C., Shi, Y., Ding, W., Lim, E. G., Yue, Y., Seo, H., Man, K. L., Ma, J., Zhu, X., &amp; Yue, Y. (2025). Exploring Radar Data Representations in Autonomous Driving: A Comprehensive Review. </w:t>
-      </w:r>
-      <w:r>
-        <w:rPr>
-          <w:rFonts w:ascii="Times New Roman" w:hAnsi="Times New Roman" w:cs="Times New Roman"/>
-          <w:i/>
-          <w:iCs/>
-          <w:sz w:val="28"/>
-        </w:rPr>
-        <w:t>IEEE Transactions on Intelligent Transportation Systems</w:t>
-      </w:r>
-      <w:r>
-        <w:rPr>
-          <w:rFonts w:ascii="Times New Roman" w:hAnsi="Times New Roman" w:cs="Times New Roman"/>
-          <w:sz w:val="28"/>
-        </w:rPr>
-        <w:t xml:space="preserve">, </w:t>
-      </w:r>
-      <w:r>
-        <w:rPr>
-          <w:rFonts w:ascii="Times New Roman" w:hAnsi="Times New Roman" w:cs="Times New Roman"/>
-          <w:i/>
-          <w:iCs/>
-          <w:sz w:val="28"/>
-        </w:rPr>
-        <w:t>26</w:t>
-      </w:r>
-      <w:r>
-        <w:rPr>
-          <w:rFonts w:ascii="Times New Roman" w:hAnsi="Times New Roman" w:cs="Times New Roman"/>
-          <w:sz w:val="28"/>
-        </w:rPr>
-        <w:t>(6), 7401–7425. https://doi.org/10.1109/TITS.2025.3554781</w:t>
-      </w:r>
-    </w:p>
-    <w:p>
-      <w:pPr>
-        <w:pStyle w:val="Bibliography"/>
-        <w:spacing w:line="360" w:lineRule="auto"/>
-        <w:jc w:val="both"/>
-        <w:rPr>
-          <w:rFonts w:ascii="Times New Roman" w:hAnsi="Times New Roman" w:cs="Times New Roman"/>
-          <w:sz w:val="28"/>
-        </w:rPr>
-      </w:pPr>
-      <w:r>
-        <w:rPr>
-          <w:rFonts w:ascii="Times New Roman" w:hAnsi="Times New Roman" w:cs="Times New Roman"/>
-          <w:sz w:val="28"/>
-        </w:rPr>
-        <w:t xml:space="preserve">Zakeri, H., Parvaneh, M., Moradi, G., Alibakhshikenari, M., Virdee, B. S., &amp; Dalarsson, M. (2026). Array antenna with series-fed configuration providing high radiation performances for automotive radar in IoT applications. </w:t>
-      </w:r>
-      <w:r>
-        <w:rPr>
-          <w:rFonts w:ascii="Times New Roman" w:hAnsi="Times New Roman" w:cs="Times New Roman"/>
-          <w:i/>
-          <w:iCs/>
-          <w:sz w:val="28"/>
-        </w:rPr>
-        <w:t>Scientific Reports</w:t>
-      </w:r>
-      <w:r>
-        <w:rPr>
-          <w:rFonts w:ascii="Times New Roman" w:hAnsi="Times New Roman" w:cs="Times New Roman"/>
-          <w:sz w:val="28"/>
-        </w:rPr>
-        <w:t xml:space="preserve">, </w:t>
-      </w:r>
-      <w:r>
-        <w:rPr>
-          <w:rFonts w:ascii="Times New Roman" w:hAnsi="Times New Roman" w:cs="Times New Roman"/>
-          <w:i/>
-          <w:iCs/>
-          <w:sz w:val="28"/>
-        </w:rPr>
-        <w:t>16</w:t>
-      </w:r>
-      <w:r>
-        <w:rPr>
-          <w:rFonts w:ascii="Times New Roman" w:hAnsi="Times New Roman" w:cs="Times New Roman"/>
-          <w:sz w:val="28"/>
-        </w:rPr>
-        <w:t>(1), 11116. https://doi.org/10.1038/s41598-026-40981-x</w:t>
-      </w:r>
-    </w:p>
-    <w:p>
-      <w:pPr>
-        <w:pStyle w:val="Bibliography"/>
-        <w:spacing w:line="360" w:lineRule="auto"/>
-        <w:jc w:val="both"/>
-        <w:rPr>
-          <w:rFonts w:ascii="Times New Roman" w:hAnsi="Times New Roman" w:cs="Times New Roman"/>
-          <w:sz w:val="28"/>
-        </w:rPr>
-      </w:pPr>
-      <w:r>
-        <w:rPr>
-          <w:rFonts w:ascii="Times New Roman" w:hAnsi="Times New Roman" w:cs="Times New Roman"/>
-          <w:sz w:val="28"/>
-        </w:rPr>
-        <w:t xml:space="preserve">Zihao Liu, Yongzhong Zhu, &amp; Jian Zhou. (2016). Improved design of Vivaldi antenna with loading resistance for wideband applications. </w:t>
+        <w:rPr>
+          <w:rFonts w:ascii="Times New Roman" w:hAnsi="Times New Roman" w:cs="Times New Roman"/>
+          <w:sz w:val="28"/>
+        </w:rPr>
+      </w:pPr>
+      <w:r>
+        <w:rPr>
+          <w:rFonts w:ascii="Times New Roman" w:hAnsi="Times New Roman" w:cs="Times New Roman"/>
+          <w:sz w:val="28"/>
+        </w:rPr>
+        <w:t xml:space="preserve">Zihao Liu, </w:t>
+      </w:r>
+      <w:proofErr w:type="spellStart"/>
+      <w:r>
+        <w:rPr>
+          <w:rFonts w:ascii="Times New Roman" w:hAnsi="Times New Roman" w:cs="Times New Roman"/>
+          <w:sz w:val="28"/>
+        </w:rPr>
+        <w:t>Yongzhong</w:t>
+      </w:r>
+      <w:proofErr w:type="spellEnd"/>
+      <w:r>
+        <w:rPr>
+          <w:rFonts w:ascii="Times New Roman" w:hAnsi="Times New Roman" w:cs="Times New Roman"/>
+          <w:sz w:val="28"/>
+        </w:rPr>
+        <w:t xml:space="preserve"> Zhu, &amp; Jian Zhou. (2016). Improved design of Vivaldi antenna with loading resistance for wideband applications. </w:t>
       </w:r>
       <w:r>
         <w:rPr>
@@ -4982,9 +6885,9 @@
       </w:r>
     </w:p>
     <w:sectPr>
-      <w:headerReference w:type="default" r:id="rId12"/>
-      <w:footerReference w:type="default" r:id="rId13"/>
-      <w:headerReference w:type="first" r:id="rId14"/>
+      <w:headerReference w:type="default" r:id="rId14"/>
+      <w:footerReference w:type="default" r:id="rId15"/>
+      <w:headerReference w:type="first" r:id="rId16"/>
       <w:pgSz w:w="11906" w:h="16838" w:code="9"/>
       <w:pgMar w:top="2268" w:right="1701" w:bottom="1701" w:left="2268" w:header="720" w:footer="720" w:gutter="0"/>
       <w:cols w:space="720"/>
@@ -5455,7 +7358,7 @@
   <w:abstractNum w:abstractNumId="2" w15:restartNumberingAfterBreak="0">
     <w:nsid w:val="24C1364E"/>
     <w:multiLevelType w:val="multilevel"/>
-    <w:tmpl w:val="F13EA18C"/>
+    <w:tmpl w:val="A088EA24"/>
     <w:lvl w:ilvl="0">
       <w:start w:val="1"/>
       <w:numFmt w:val="upperRoman"/>
@@ -5498,6 +7401,8 @@
       </w:pPr>
       <w:rPr>
         <w:rFonts w:hint="default"/>
+        <w:i w:val="0"/>
+        <w:iCs w:val="0"/>
       </w:rPr>
     </w:lvl>
     <w:lvl w:ilvl="3">
@@ -6381,7 +8286,6 @@
   <w:style w:type="character" w:default="1" w:styleId="DefaultParagraphFont">
     <w:name w:val="Default Paragraph Font"/>
     <w:uiPriority w:val="1"/>
-    <w:semiHidden/>
     <w:unhideWhenUsed/>
   </w:style>
   <w:style w:type="table" w:default="1" w:styleId="TableNormal">
@@ -6778,6 +8682,16 @@
     <w:uiPriority w:val="99"/>
     <w:rsid w:val="00043993"/>
   </w:style>
+  <w:style w:type="character" w:styleId="PlaceholderText">
+    <w:name w:val="Placeholder Text"/>
+    <w:basedOn w:val="DefaultParagraphFont"/>
+    <w:uiPriority w:val="99"/>
+    <w:semiHidden/>
+    <w:rsid w:val="00A81645"/>
+    <w:rPr>
+      <w:color w:val="666666"/>
+    </w:rPr>
+  </w:style>
 </w:styles>
 </file>
 

</xml_diff>